<commit_message>
Start creating loan classes
</commit_message>
<xml_diff>
--- a/Optimization.docx
+++ b/Optimization.docx
@@ -2,6 +2,29 @@
 <file path=word/document.xml><?xml version="1.0" encoding="utf-8"?>
 <w:document xmlns:wpc="http://schemas.microsoft.com/office/word/2010/wordprocessingCanvas" xmlns:cx="http://schemas.microsoft.com/office/drawing/2014/chartex" xmlns:cx1="http://schemas.microsoft.com/office/drawing/2015/9/8/chartex" xmlns:cx2="http://schemas.microsoft.com/office/drawing/2015/10/21/chartex" xmlns:cx3="http://schemas.microsoft.com/office/drawing/2016/5/9/chartex" xmlns:cx4="http://schemas.microsoft.com/office/drawing/2016/5/10/chartex" xmlns:cx5="http://schemas.microsoft.com/office/drawing/2016/5/11/chartex" xmlns:cx6="http://schemas.microsoft.com/office/drawing/2016/5/12/chartex" xmlns:cx7="http://schemas.microsoft.com/office/drawing/2016/5/13/chartex" xmlns:cx8="http://schemas.microsoft.com/office/drawing/2016/5/14/chartex" xmlns:mc="http://schemas.openxmlformats.org/markup-compatibility/2006" xmlns:aink="http://schemas.microsoft.com/office/drawing/2016/ink" xmlns:am3d="http://schemas.microsoft.com/office/drawing/2017/model3d" xmlns:o="urn:schemas-microsoft-com:office:office" xmlns:oel="http://schemas.microsoft.com/office/2019/extlst" xmlns:r="http://schemas.openxmlformats.org/officeDocument/2006/relationships" xmlns:m="http://schemas.openxmlformats.org/officeDocument/2006/math" xmlns:v="urn:schemas-microsoft-com:vml" xmlns:wp14="http://schemas.microsoft.com/office/word/2010/wordprocessingDrawing" xmlns:wp="http://schemas.openxmlformats.org/drawingml/2006/wordprocessingDrawing" xmlns:w10="urn:schemas-microsoft-com:office:word" xmlns:w="http://schemas.openxmlformats.org/wordprocessingml/2006/main" xmlns:w14="http://schemas.microsoft.com/office/word/2010/wordml" xmlns:w15="http://schemas.microsoft.com/office/word/2012/wordml" xmlns:w16cex="http://schemas.microsoft.com/office/word/2018/wordml/cex" xmlns:w16cid="http://schemas.microsoft.com/office/word/2016/wordml/cid" xmlns:w16="http://schemas.microsoft.com/office/word/2018/wordml" xmlns:w16du="http://schemas.microsoft.com/office/word/2023/wordml/word16du" xmlns:w16sdtdh="http://schemas.microsoft.com/office/word/2020/wordml/sdtdatahash" xmlns:w16sdtfl="http://schemas.microsoft.com/office/word/2024/wordml/sdtformatlock" xmlns:w16se="http://schemas.microsoft.com/office/word/2015/wordml/symex" xmlns:wpg="http://schemas.microsoft.com/office/word/2010/wordprocessingGroup" xmlns:wpi="http://schemas.microsoft.com/office/word/2010/wordprocessingInk" xmlns:wne="http://schemas.microsoft.com/office/word/2006/wordml" xmlns:wps="http://schemas.microsoft.com/office/word/2010/wordprocessingShape" mc:Ignorable="w14 w15 w16se w16cid w16 w16cex w16sdtdh w16sdtfl w16du wp14">
   <w:body>
+    <w:p>
+      <w:pPr>
+        <w:pStyle w:val="Heading1"/>
+        <w:jc w:val="center"/>
+        <w:rPr>
+          <w:b/>
+          <w:bCs/>
+          <w:color w:val="EE0000"/>
+          <w:sz w:val="52"/>
+          <w:szCs w:val="52"/>
+        </w:rPr>
+      </w:pPr>
+      <w:r>
+        <w:rPr>
+          <w:b/>
+          <w:bCs/>
+          <w:color w:val="EE0000"/>
+          <w:sz w:val="52"/>
+          <w:szCs w:val="52"/>
+        </w:rPr>
+        <w:t>Problems</w:t>
+      </w:r>
+    </w:p>
     <w:p>
       <w:pPr>
         <w:rPr>
@@ -3192,7 +3215,6 @@
           <w:sz w:val="17"/>
           <w:szCs w:val="17"/>
         </w:rPr>
-        <w:lastRenderedPageBreak/>
         <w:t xml:space="preserve"> 9. </w:t>
       </w:r>
       <w:r>
@@ -3619,6 +3641,7 @@
     </w:p>
     <w:p>
       <w:r>
+        <w:lastRenderedPageBreak/>
         <w:t xml:space="preserve">This assumes Id lives on Person (which it appears to, based on </w:t>
       </w:r>
       <w:proofErr w:type="spellStart"/>
@@ -5201,7 +5224,6 @@
           <w:sz w:val="17"/>
           <w:szCs w:val="17"/>
         </w:rPr>
-        <w:lastRenderedPageBreak/>
         <w:t xml:space="preserve"> 6. </w:t>
       </w:r>
       <w:r>
@@ -6888,6 +6910,7 @@
           <w:sz w:val="17"/>
           <w:szCs w:val="17"/>
         </w:rPr>
+        <w:lastRenderedPageBreak/>
         <w:t xml:space="preserve"> 6. </w:t>
       </w:r>
       <w:r>
@@ -8964,7 +8987,6 @@
           <w:b/>
           <w:bCs/>
         </w:rPr>
-        <w:lastRenderedPageBreak/>
         <w:t>Generic Search Consolidation</w:t>
       </w:r>
     </w:p>
@@ -11158,6 +11180,7 @@
           <w:sz w:val="17"/>
           <w:szCs w:val="17"/>
         </w:rPr>
+        <w:lastRenderedPageBreak/>
         <w:t xml:space="preserve">10. </w:t>
       </w:r>
       <w:r>
@@ -14273,7 +14296,6 @@
           <w:sz w:val="17"/>
           <w:szCs w:val="17"/>
         </w:rPr>
-        <w:lastRenderedPageBreak/>
         <w:t xml:space="preserve">22. </w:t>
       </w:r>
       <w:r>
@@ -14759,15 +14781,3221 @@
         </w:pBdr>
       </w:pPr>
     </w:p>
+    <w:p>
+      <w:pPr>
+        <w:pStyle w:val="Heading1"/>
+        <w:jc w:val="center"/>
+        <w:rPr>
+          <w:b/>
+          <w:bCs/>
+          <w:color w:val="EE0000"/>
+          <w:sz w:val="52"/>
+          <w:szCs w:val="52"/>
+        </w:rPr>
+      </w:pPr>
+      <w:r>
+        <w:rPr>
+          <w:b/>
+          <w:bCs/>
+          <w:color w:val="EE0000"/>
+          <w:sz w:val="52"/>
+          <w:szCs w:val="52"/>
+        </w:rPr>
+        <w:t>Future works</w:t>
+      </w:r>
+    </w:p>
+    <w:p>
+      <w:pPr>
+        <w:rPr>
+          <w:b/>
+          <w:bCs/>
+        </w:rPr>
+      </w:pPr>
+      <w:r>
+        <w:rPr>
+          <w:b/>
+          <w:bCs/>
+        </w:rPr>
+        <w:t>Category 1: Core Business Logic (Missing along with Loan)</w:t>
+      </w:r>
+    </w:p>
+    <w:p>
+      <w:pPr>
+        <w:rPr>
+          <w:b/>
+          <w:bCs/>
+        </w:rPr>
+      </w:pPr>
+      <w:r>
+        <w:rPr>
+          <w:b/>
+          <w:bCs/>
+        </w:rPr>
+        <w:t>1. Loan/Borrowing Workflow (You already know this)</w:t>
+      </w:r>
+    </w:p>
+    <w:p>
+      <w:pPr>
+        <w:numPr>
+          <w:ilvl w:val="0"/>
+          <w:numId w:val="1"/>
+        </w:numPr>
+      </w:pPr>
+      <w:r>
+        <w:rPr>
+          <w:b/>
+          <w:bCs/>
+        </w:rPr>
+        <w:t>Properties:</w:t>
+      </w:r>
+      <w:r>
+        <w:t> </w:t>
+      </w:r>
+      <w:proofErr w:type="spellStart"/>
+      <w:r>
+        <w:t>LoanId</w:t>
+      </w:r>
+      <w:proofErr w:type="spellEnd"/>
+      <w:r>
+        <w:t xml:space="preserve">, </w:t>
+      </w:r>
+      <w:proofErr w:type="spellStart"/>
+      <w:r>
+        <w:t>BookId</w:t>
+      </w:r>
+      <w:proofErr w:type="spellEnd"/>
+      <w:r>
+        <w:t xml:space="preserve">, </w:t>
+      </w:r>
+      <w:proofErr w:type="spellStart"/>
+      <w:r>
+        <w:t>UserId</w:t>
+      </w:r>
+      <w:proofErr w:type="spellEnd"/>
+      <w:r>
+        <w:t xml:space="preserve"> (Member), </w:t>
+      </w:r>
+      <w:proofErr w:type="spellStart"/>
+      <w:r>
+        <w:t>LoanDate</w:t>
+      </w:r>
+      <w:proofErr w:type="spellEnd"/>
+      <w:r>
+        <w:t xml:space="preserve">, </w:t>
+      </w:r>
+      <w:proofErr w:type="spellStart"/>
+      <w:r>
+        <w:t>DueDate</w:t>
+      </w:r>
+      <w:proofErr w:type="spellEnd"/>
+      <w:r>
+        <w:t xml:space="preserve">, </w:t>
+      </w:r>
+      <w:proofErr w:type="spellStart"/>
+      <w:r>
+        <w:t>ReturnDate</w:t>
+      </w:r>
+      <w:proofErr w:type="spellEnd"/>
+      <w:r>
+        <w:t xml:space="preserve">, Status (Active/Returned/Overdue), </w:t>
+      </w:r>
+      <w:proofErr w:type="spellStart"/>
+      <w:r>
+        <w:t>FineAmount</w:t>
+      </w:r>
+      <w:proofErr w:type="spellEnd"/>
+      <w:r>
+        <w:t>.</w:t>
+      </w:r>
+    </w:p>
+    <w:p>
+      <w:pPr>
+        <w:numPr>
+          <w:ilvl w:val="0"/>
+          <w:numId w:val="1"/>
+        </w:numPr>
+      </w:pPr>
+      <w:r>
+        <w:rPr>
+          <w:b/>
+          <w:bCs/>
+        </w:rPr>
+        <w:t>Methods:</w:t>
+      </w:r>
+      <w:r>
+        <w:t> </w:t>
+      </w:r>
+      <w:proofErr w:type="spellStart"/>
+      <w:proofErr w:type="gramStart"/>
+      <w:r>
+        <w:t>BorrowBook</w:t>
+      </w:r>
+      <w:proofErr w:type="spellEnd"/>
+      <w:r>
+        <w:t>(</w:t>
+      </w:r>
+      <w:proofErr w:type="gramEnd"/>
+      <w:r>
+        <w:t>), </w:t>
+      </w:r>
+      <w:proofErr w:type="spellStart"/>
+      <w:proofErr w:type="gramStart"/>
+      <w:r>
+        <w:t>ReturnBook</w:t>
+      </w:r>
+      <w:proofErr w:type="spellEnd"/>
+      <w:r>
+        <w:t>(</w:t>
+      </w:r>
+      <w:proofErr w:type="gramEnd"/>
+      <w:r>
+        <w:t>), </w:t>
+      </w:r>
+      <w:proofErr w:type="spellStart"/>
+      <w:proofErr w:type="gramStart"/>
+      <w:r>
+        <w:t>RenewLoan</w:t>
+      </w:r>
+      <w:proofErr w:type="spellEnd"/>
+      <w:r>
+        <w:t>(</w:t>
+      </w:r>
+      <w:proofErr w:type="gramEnd"/>
+      <w:r>
+        <w:t>).</w:t>
+      </w:r>
+    </w:p>
+    <w:p>
+      <w:pPr>
+        <w:rPr>
+          <w:b/>
+          <w:bCs/>
+        </w:rPr>
+      </w:pPr>
+      <w:r>
+        <w:rPr>
+          <w:b/>
+          <w:bCs/>
+        </w:rPr>
+        <w:t>2. Fine / Fee Management (Essential)</w:t>
+      </w:r>
+    </w:p>
+    <w:p>
+      <w:pPr>
+        <w:numPr>
+          <w:ilvl w:val="0"/>
+          <w:numId w:val="2"/>
+        </w:numPr>
+      </w:pPr>
+      <w:r>
+        <w:t>A book returned after the </w:t>
+      </w:r>
+      <w:proofErr w:type="spellStart"/>
+      <w:r>
+        <w:t>DueDate</w:t>
+      </w:r>
+      <w:proofErr w:type="spellEnd"/>
+      <w:r>
+        <w:t> incurs a fine.</w:t>
+      </w:r>
+    </w:p>
+    <w:p>
+      <w:pPr>
+        <w:numPr>
+          <w:ilvl w:val="0"/>
+          <w:numId w:val="2"/>
+        </w:numPr>
+      </w:pPr>
+      <w:r>
+        <w:rPr>
+          <w:b/>
+          <w:bCs/>
+        </w:rPr>
+        <w:t>What's missing:</w:t>
+      </w:r>
+      <w:r>
+        <w:t> A </w:t>
+      </w:r>
+      <w:proofErr w:type="spellStart"/>
+      <w:r>
+        <w:t>FineService</w:t>
+      </w:r>
+      <w:proofErr w:type="spellEnd"/>
+      <w:r>
+        <w:t> or </w:t>
+      </w:r>
+      <w:proofErr w:type="spellStart"/>
+      <w:r>
+        <w:t>FineCalculator</w:t>
+      </w:r>
+      <w:proofErr w:type="spellEnd"/>
+      <w:r>
+        <w:t>.</w:t>
+      </w:r>
+    </w:p>
+    <w:p>
+      <w:pPr>
+        <w:numPr>
+          <w:ilvl w:val="0"/>
+          <w:numId w:val="2"/>
+        </w:numPr>
+      </w:pPr>
+      <w:r>
+        <w:rPr>
+          <w:b/>
+          <w:bCs/>
+        </w:rPr>
+        <w:t>Properties:</w:t>
+      </w:r>
+      <w:r>
+        <w:t> Daily fine rate (e.g., $1 per day), Max fine cap.</w:t>
+      </w:r>
+    </w:p>
+    <w:p>
+      <w:pPr>
+        <w:numPr>
+          <w:ilvl w:val="0"/>
+          <w:numId w:val="2"/>
+        </w:numPr>
+      </w:pPr>
+      <w:r>
+        <w:rPr>
+          <w:b/>
+          <w:bCs/>
+        </w:rPr>
+        <w:t>Method:</w:t>
+      </w:r>
+      <w:r>
+        <w:t> </w:t>
+      </w:r>
+      <w:proofErr w:type="spellStart"/>
+      <w:r>
+        <w:t>CalculateFine</w:t>
+      </w:r>
+      <w:proofErr w:type="spellEnd"/>
+      <w:r>
+        <w:t>(loan) – computed automatically when </w:t>
+      </w:r>
+      <w:proofErr w:type="spellStart"/>
+      <w:r>
+        <w:t>ReturnBook</w:t>
+      </w:r>
+      <w:proofErr w:type="spellEnd"/>
+      <w:r>
+        <w:t> is called.</w:t>
+      </w:r>
+    </w:p>
+    <w:p>
+      <w:pPr>
+        <w:rPr>
+          <w:b/>
+          <w:bCs/>
+        </w:rPr>
+      </w:pPr>
+      <w:r>
+        <w:rPr>
+          <w:b/>
+          <w:bCs/>
+        </w:rPr>
+        <w:t>3. Borrowing Limits (Business Rules)</w:t>
+      </w:r>
+    </w:p>
+    <w:p>
+      <w:pPr>
+        <w:numPr>
+          <w:ilvl w:val="0"/>
+          <w:numId w:val="3"/>
+        </w:numPr>
+      </w:pPr>
+      <w:r>
+        <w:rPr>
+          <w:b/>
+          <w:bCs/>
+        </w:rPr>
+        <w:lastRenderedPageBreak/>
+        <w:t>Rule:</w:t>
+      </w:r>
+      <w:r>
+        <w:t> A Member cannot borrow more than </w:t>
+      </w:r>
+      <w:r>
+        <w:rPr>
+          <w:i/>
+          <w:iCs/>
+        </w:rPr>
+        <w:t>X</w:t>
+      </w:r>
+      <w:r>
+        <w:t> books at the same time (e.g., 5 books).</w:t>
+      </w:r>
+    </w:p>
+    <w:p>
+      <w:pPr>
+        <w:numPr>
+          <w:ilvl w:val="0"/>
+          <w:numId w:val="3"/>
+        </w:numPr>
+      </w:pPr>
+      <w:r>
+        <w:rPr>
+          <w:b/>
+          <w:bCs/>
+        </w:rPr>
+        <w:t>Where to check:</w:t>
+      </w:r>
+      <w:r>
+        <w:t> In </w:t>
+      </w:r>
+      <w:proofErr w:type="spellStart"/>
+      <w:r>
+        <w:t>LoanService.BorrowBook</w:t>
+      </w:r>
+      <w:proofErr w:type="spellEnd"/>
+      <w:r>
+        <w:t>(), you must count the member's active loans and reject if they hit the limit.</w:t>
+      </w:r>
+    </w:p>
+    <w:p>
+      <w:pPr>
+        <w:rPr>
+          <w:b/>
+          <w:bCs/>
+        </w:rPr>
+      </w:pPr>
+      <w:r>
+        <w:rPr>
+          <w:b/>
+          <w:bCs/>
+        </w:rPr>
+        <w:t>4. Book Status / Availability Integrity</w:t>
+      </w:r>
+    </w:p>
+    <w:p>
+      <w:pPr>
+        <w:numPr>
+          <w:ilvl w:val="0"/>
+          <w:numId w:val="4"/>
+        </w:numPr>
+      </w:pPr>
+      <w:r>
+        <w:t>Currently, you have </w:t>
+      </w:r>
+      <w:proofErr w:type="spellStart"/>
+      <w:r>
+        <w:t>AvailableCopies</w:t>
+      </w:r>
+      <w:proofErr w:type="spellEnd"/>
+      <w:r>
+        <w:t> in Book. When a book is borrowed, you call </w:t>
+      </w:r>
+      <w:proofErr w:type="spellStart"/>
+      <w:proofErr w:type="gramStart"/>
+      <w:r>
+        <w:t>BorrowCopy</w:t>
+      </w:r>
+      <w:proofErr w:type="spellEnd"/>
+      <w:r>
+        <w:t>(</w:t>
+      </w:r>
+      <w:proofErr w:type="gramEnd"/>
+      <w:r>
+        <w:t>).</w:t>
+      </w:r>
+    </w:p>
+    <w:p>
+      <w:pPr>
+        <w:numPr>
+          <w:ilvl w:val="0"/>
+          <w:numId w:val="4"/>
+        </w:numPr>
+      </w:pPr>
+      <w:r>
+        <w:rPr>
+          <w:b/>
+          <w:bCs/>
+        </w:rPr>
+        <w:t>Missing validation:</w:t>
+      </w:r>
+      <w:r>
+        <w:t> Ensure a user doesn't try to borrow the </w:t>
+      </w:r>
+      <w:r>
+        <w:rPr>
+          <w:i/>
+          <w:iCs/>
+        </w:rPr>
+        <w:t>same book</w:t>
+      </w:r>
+      <w:r>
+        <w:t> if they already have an active loan for that specific book (prevent duplicates).</w:t>
+      </w:r>
+    </w:p>
+    <w:p>
+      <w:r>
+        <w:pict w14:anchorId="12492F6A">
+          <v:rect id="_x0000_i1043" style="width:0;height:.75pt" o:hralign="center" o:hrstd="t" o:hr="t" fillcolor="#a0a0a0" stroked="f"/>
+        </w:pict>
+      </w:r>
+    </w:p>
+    <w:p>
+      <w:pPr>
+        <w:rPr>
+          <w:b/>
+          <w:bCs/>
+        </w:rPr>
+      </w:pPr>
+      <w:r>
+        <w:rPr>
+          <w:b/>
+          <w:bCs/>
+        </w:rPr>
+        <w:t>Category 2: System Foundation (Crucial for Console)</w:t>
+      </w:r>
+    </w:p>
+    <w:p>
+      <w:pPr>
+        <w:rPr>
+          <w:b/>
+          <w:bCs/>
+        </w:rPr>
+      </w:pPr>
+      <w:r>
+        <w:rPr>
+          <w:b/>
+          <w:bCs/>
+        </w:rPr>
+        <w:t>5. Authentication / Login (The "Current User")</w:t>
+      </w:r>
+    </w:p>
+    <w:p>
+      <w:pPr>
+        <w:numPr>
+          <w:ilvl w:val="0"/>
+          <w:numId w:val="5"/>
+        </w:numPr>
+      </w:pPr>
+      <w:r>
+        <w:t>You have User with roles (Admin, Librarian, Member), but your console app currently runs as an omniscient "super admin".</w:t>
+      </w:r>
+    </w:p>
+    <w:p>
+      <w:pPr>
+        <w:numPr>
+          <w:ilvl w:val="0"/>
+          <w:numId w:val="5"/>
+        </w:numPr>
+      </w:pPr>
+      <w:r>
+        <w:rPr>
+          <w:b/>
+          <w:bCs/>
+        </w:rPr>
+        <w:t>What's missing:</w:t>
+      </w:r>
+      <w:r>
+        <w:t> A login screen at the start of </w:t>
+      </w:r>
+      <w:proofErr w:type="spellStart"/>
+      <w:r>
+        <w:t>Program.cs</w:t>
+      </w:r>
+      <w:proofErr w:type="spellEnd"/>
+      <w:r>
+        <w:t>.</w:t>
+      </w:r>
+    </w:p>
+    <w:p>
+      <w:pPr>
+        <w:numPr>
+          <w:ilvl w:val="0"/>
+          <w:numId w:val="5"/>
+        </w:numPr>
+      </w:pPr>
+      <w:r>
+        <w:rPr>
+          <w:b/>
+          <w:bCs/>
+        </w:rPr>
+        <w:t>What to add:</w:t>
+      </w:r>
+    </w:p>
+    <w:p>
+      <w:pPr>
+        <w:numPr>
+          <w:ilvl w:val="1"/>
+          <w:numId w:val="5"/>
+        </w:numPr>
+      </w:pPr>
+      <w:proofErr w:type="spellStart"/>
+      <w:r>
+        <w:t>SessionManager</w:t>
+      </w:r>
+      <w:proofErr w:type="spellEnd"/>
+      <w:r>
+        <w:t> or </w:t>
+      </w:r>
+      <w:proofErr w:type="spellStart"/>
+      <w:r>
+        <w:t>AppState</w:t>
+      </w:r>
+      <w:proofErr w:type="spellEnd"/>
+      <w:r>
+        <w:t xml:space="preserve"> with a public static User </w:t>
+      </w:r>
+      <w:proofErr w:type="spellStart"/>
+      <w:r>
+        <w:t>CurrentUser</w:t>
+      </w:r>
+      <w:proofErr w:type="spellEnd"/>
+      <w:r>
+        <w:t xml:space="preserve"> </w:t>
+      </w:r>
+      <w:proofErr w:type="gramStart"/>
+      <w:r>
+        <w:t>{ get</w:t>
+      </w:r>
+      <w:proofErr w:type="gramEnd"/>
+      <w:r>
+        <w:t>; private set</w:t>
+      </w:r>
+      <w:proofErr w:type="gramStart"/>
+      <w:r>
+        <w:t>; }</w:t>
+      </w:r>
+      <w:proofErr w:type="gramEnd"/>
+      <w:r>
+        <w:t>.</w:t>
+      </w:r>
+    </w:p>
+    <w:p>
+      <w:pPr>
+        <w:numPr>
+          <w:ilvl w:val="1"/>
+          <w:numId w:val="5"/>
+        </w:numPr>
+      </w:pPr>
+      <w:r>
+        <w:t>A login method that lists all users, asks for an ID, and sets the </w:t>
+      </w:r>
+      <w:proofErr w:type="spellStart"/>
+      <w:r>
+        <w:t>CurrentUser</w:t>
+      </w:r>
+      <w:proofErr w:type="spellEnd"/>
+      <w:r>
+        <w:t>.</w:t>
+      </w:r>
+    </w:p>
+    <w:p>
+      <w:pPr>
+        <w:numPr>
+          <w:ilvl w:val="1"/>
+          <w:numId w:val="5"/>
+        </w:numPr>
+      </w:pPr>
+      <w:r>
+        <w:rPr>
+          <w:b/>
+          <w:bCs/>
+        </w:rPr>
+        <w:t>Why it matters:</w:t>
+      </w:r>
+      <w:r>
+        <w:t> Without this, your Roles (Admin, Librarian, Member) are just decorative properties. You cannot test "Member" restrictions without logging in as one.</w:t>
+      </w:r>
+    </w:p>
+    <w:p>
+      <w:pPr>
+        <w:rPr>
+          <w:b/>
+          <w:bCs/>
+        </w:rPr>
+      </w:pPr>
+      <w:r>
+        <w:rPr>
+          <w:b/>
+          <w:bCs/>
+        </w:rPr>
+        <w:t>6. Authorization Enforcement (Role-Based Access Control)</w:t>
+      </w:r>
+    </w:p>
+    <w:p>
+      <w:pPr>
+        <w:numPr>
+          <w:ilvl w:val="0"/>
+          <w:numId w:val="6"/>
+        </w:numPr>
+      </w:pPr>
+      <w:r>
+        <w:t>Now that you have a </w:t>
+      </w:r>
+      <w:proofErr w:type="spellStart"/>
+      <w:r>
+        <w:t>CurrentUser</w:t>
+      </w:r>
+      <w:proofErr w:type="spellEnd"/>
+      <w:r>
+        <w:t>, you must enforce it.</w:t>
+      </w:r>
+    </w:p>
+    <w:p>
+      <w:pPr>
+        <w:numPr>
+          <w:ilvl w:val="0"/>
+          <w:numId w:val="6"/>
+        </w:numPr>
+      </w:pPr>
+      <w:r>
+        <w:rPr>
+          <w:b/>
+          <w:bCs/>
+        </w:rPr>
+        <w:t>What's missing:</w:t>
+      </w:r>
+      <w:r>
+        <w:t> In your </w:t>
+      </w:r>
+      <w:proofErr w:type="spellStart"/>
+      <w:r>
+        <w:t>MainMenu</w:t>
+      </w:r>
+      <w:proofErr w:type="spellEnd"/>
+      <w:r>
+        <w:t>, </w:t>
+      </w:r>
+      <w:proofErr w:type="spellStart"/>
+      <w:r>
+        <w:t>BookMenu</w:t>
+      </w:r>
+      <w:proofErr w:type="spellEnd"/>
+      <w:r>
+        <w:t>, and </w:t>
+      </w:r>
+      <w:proofErr w:type="spellStart"/>
+      <w:r>
+        <w:t>UserMenu</w:t>
+      </w:r>
+      <w:proofErr w:type="spellEnd"/>
+      <w:r>
+        <w:t>, you are showing </w:t>
+      </w:r>
+      <w:r>
+        <w:rPr>
+          <w:i/>
+          <w:iCs/>
+        </w:rPr>
+        <w:t>all</w:t>
+      </w:r>
+      <w:r>
+        <w:t> options to everyone.</w:t>
+      </w:r>
+    </w:p>
+    <w:p>
+      <w:pPr>
+        <w:numPr>
+          <w:ilvl w:val="0"/>
+          <w:numId w:val="6"/>
+        </w:numPr>
+      </w:pPr>
+      <w:r>
+        <w:rPr>
+          <w:b/>
+          <w:bCs/>
+        </w:rPr>
+        <w:t>What to add:</w:t>
+      </w:r>
+    </w:p>
+    <w:p>
+      <w:pPr>
+        <w:numPr>
+          <w:ilvl w:val="1"/>
+          <w:numId w:val="6"/>
+        </w:numPr>
+      </w:pPr>
+      <w:r>
+        <w:t>if (</w:t>
+      </w:r>
+      <w:proofErr w:type="spellStart"/>
+      <w:proofErr w:type="gramStart"/>
+      <w:r>
+        <w:t>CurrentUser.Role</w:t>
+      </w:r>
+      <w:proofErr w:type="spellEnd"/>
+      <w:r>
+        <w:t xml:space="preserve"> !</w:t>
+      </w:r>
+      <w:proofErr w:type="gramEnd"/>
+      <w:r>
+        <w:t xml:space="preserve">= </w:t>
+      </w:r>
+      <w:proofErr w:type="spellStart"/>
+      <w:r>
+        <w:t>Role.Admin</w:t>
+      </w:r>
+      <w:proofErr w:type="spellEnd"/>
+      <w:r>
+        <w:t xml:space="preserve">) </w:t>
+      </w:r>
+      <w:proofErr w:type="gramStart"/>
+      <w:r>
+        <w:t>{ Hide</w:t>
+      </w:r>
+      <w:proofErr w:type="gramEnd"/>
+      <w:r>
+        <w:t>/Disable "Manage Users" or "Remove Book</w:t>
+      </w:r>
+      <w:proofErr w:type="gramStart"/>
+      <w:r>
+        <w:t>" }</w:t>
+      </w:r>
+      <w:proofErr w:type="gramEnd"/>
+      <w:r>
+        <w:t>.</w:t>
+      </w:r>
+    </w:p>
+    <w:p>
+      <w:pPr>
+        <w:numPr>
+          <w:ilvl w:val="1"/>
+          <w:numId w:val="6"/>
+        </w:numPr>
+      </w:pPr>
+      <w:r>
+        <w:t>A method like </w:t>
+      </w:r>
+      <w:proofErr w:type="spellStart"/>
+      <w:r>
+        <w:t>User.HasPermission</w:t>
+      </w:r>
+      <w:proofErr w:type="spellEnd"/>
+      <w:r>
+        <w:t>(</w:t>
+      </w:r>
+      <w:proofErr w:type="spellStart"/>
+      <w:r>
+        <w:t>Permission.ManageUsers</w:t>
+      </w:r>
+      <w:proofErr w:type="spellEnd"/>
+      <w:r>
+        <w:t>).</w:t>
+      </w:r>
+    </w:p>
+    <w:p>
+      <w:pPr>
+        <w:rPr>
+          <w:b/>
+          <w:bCs/>
+        </w:rPr>
+      </w:pPr>
+      <w:r>
+        <w:rPr>
+          <w:b/>
+          <w:bCs/>
+        </w:rPr>
+        <w:t>7. Data Persistence (Saving to File)</w:t>
+      </w:r>
+    </w:p>
+    <w:p>
+      <w:pPr>
+        <w:numPr>
+          <w:ilvl w:val="0"/>
+          <w:numId w:val="7"/>
+        </w:numPr>
+      </w:pPr>
+      <w:r>
+        <w:t>Right now, everything runs in memory. When you close the console, all Books, Authors, and Users are </w:t>
+      </w:r>
+      <w:r>
+        <w:rPr>
+          <w:b/>
+          <w:bCs/>
+        </w:rPr>
+        <w:t>lost</w:t>
+      </w:r>
+      <w:r>
+        <w:t>.</w:t>
+      </w:r>
+    </w:p>
+    <w:p>
+      <w:pPr>
+        <w:numPr>
+          <w:ilvl w:val="0"/>
+          <w:numId w:val="7"/>
+        </w:numPr>
+      </w:pPr>
+      <w:r>
+        <w:rPr>
+          <w:b/>
+          <w:bCs/>
+        </w:rPr>
+        <w:t>What's missing:</w:t>
+      </w:r>
+      <w:r>
+        <w:t> Saving/Loading data between runs.</w:t>
+      </w:r>
+    </w:p>
+    <w:p>
+      <w:pPr>
+        <w:numPr>
+          <w:ilvl w:val="0"/>
+          <w:numId w:val="7"/>
+        </w:numPr>
+      </w:pPr>
+      <w:r>
+        <w:rPr>
+          <w:b/>
+          <w:bCs/>
+        </w:rPr>
+        <w:lastRenderedPageBreak/>
+        <w:t>What to add:</w:t>
+      </w:r>
+      <w:r>
+        <w:t> A </w:t>
+      </w:r>
+      <w:proofErr w:type="spellStart"/>
+      <w:r>
+        <w:t>JsonPersistenceService</w:t>
+      </w:r>
+      <w:proofErr w:type="spellEnd"/>
+      <w:r>
+        <w:t> or </w:t>
+      </w:r>
+      <w:proofErr w:type="spellStart"/>
+      <w:r>
+        <w:t>FileStorageService</w:t>
+      </w:r>
+      <w:proofErr w:type="spellEnd"/>
+      <w:r>
+        <w:t> that serializes your </w:t>
+      </w:r>
+      <w:proofErr w:type="spellStart"/>
+      <w:r>
+        <w:t>InMemory</w:t>
+      </w:r>
+      <w:proofErr w:type="spellEnd"/>
+      <w:r>
+        <w:t> repositories (Books, Authors, Users, Loans) to a .</w:t>
+      </w:r>
+      <w:proofErr w:type="spellStart"/>
+      <w:r>
+        <w:t>json</w:t>
+      </w:r>
+      <w:proofErr w:type="spellEnd"/>
+      <w:r>
+        <w:t> file upon exit, and loads them at startup.</w:t>
+      </w:r>
+    </w:p>
+    <w:p>
+      <w:pPr>
+        <w:numPr>
+          <w:ilvl w:val="0"/>
+          <w:numId w:val="7"/>
+        </w:numPr>
+      </w:pPr>
+      <w:r>
+        <w:rPr>
+          <w:i/>
+          <w:iCs/>
+        </w:rPr>
+        <w:t>This is the single most critical practice before moving to SQL, as it bridges the gap between "prototype" and "usable application".</w:t>
+      </w:r>
+    </w:p>
+    <w:p>
+      <w:r>
+        <w:pict w14:anchorId="1CACB02E">
+          <v:rect id="_x0000_i1044" style="width:0;height:.75pt" o:hralign="center" o:hrstd="t" o:hr="t" fillcolor="#a0a0a0" stroked="f"/>
+        </w:pict>
+      </w:r>
+    </w:p>
+    <w:p>
+      <w:pPr>
+        <w:rPr>
+          <w:b/>
+          <w:bCs/>
+        </w:rPr>
+      </w:pPr>
+      <w:r>
+        <w:rPr>
+          <w:b/>
+          <w:bCs/>
+        </w:rPr>
+        <w:t>Category 3: Reports &amp; Views (Information)</w:t>
+      </w:r>
+    </w:p>
+    <w:p>
+      <w:pPr>
+        <w:rPr>
+          <w:b/>
+          <w:bCs/>
+        </w:rPr>
+      </w:pPr>
+      <w:r>
+        <w:rPr>
+          <w:b/>
+          <w:bCs/>
+        </w:rPr>
+        <w:t>8. Overdue Books Report</w:t>
+      </w:r>
+    </w:p>
+    <w:p>
+      <w:pPr>
+        <w:numPr>
+          <w:ilvl w:val="0"/>
+          <w:numId w:val="8"/>
+        </w:numPr>
+      </w:pPr>
+      <w:r>
+        <w:t>You need a report that shows all currently active loans where </w:t>
+      </w:r>
+      <w:proofErr w:type="spellStart"/>
+      <w:r>
+        <w:t>DueDate</w:t>
+      </w:r>
+      <w:proofErr w:type="spellEnd"/>
+      <w:r>
+        <w:t xml:space="preserve"> &lt; </w:t>
+      </w:r>
+      <w:proofErr w:type="spellStart"/>
+      <w:r>
+        <w:t>DateTime.Today</w:t>
+      </w:r>
+      <w:proofErr w:type="spellEnd"/>
+      <w:r>
+        <w:t>.</w:t>
+      </w:r>
+    </w:p>
+    <w:p>
+      <w:pPr>
+        <w:numPr>
+          <w:ilvl w:val="0"/>
+          <w:numId w:val="8"/>
+        </w:numPr>
+      </w:pPr>
+      <w:r>
+        <w:rPr>
+          <w:b/>
+          <w:bCs/>
+        </w:rPr>
+        <w:t>Method:</w:t>
+      </w:r>
+      <w:r>
+        <w:t> </w:t>
+      </w:r>
+      <w:proofErr w:type="spellStart"/>
+      <w:proofErr w:type="gramStart"/>
+      <w:r>
+        <w:t>GetOverdueLoans</w:t>
+      </w:r>
+      <w:proofErr w:type="spellEnd"/>
+      <w:r>
+        <w:t>(</w:t>
+      </w:r>
+      <w:proofErr w:type="gramEnd"/>
+      <w:r>
+        <w:t>) in </w:t>
+      </w:r>
+      <w:proofErr w:type="spellStart"/>
+      <w:r>
+        <w:t>LoanService</w:t>
+      </w:r>
+      <w:proofErr w:type="spellEnd"/>
+      <w:r>
+        <w:t>. Display it as "Overdue Report" in the main menu.</w:t>
+      </w:r>
+    </w:p>
+    <w:p>
+      <w:pPr>
+        <w:rPr>
+          <w:b/>
+          <w:bCs/>
+        </w:rPr>
+      </w:pPr>
+      <w:r>
+        <w:rPr>
+          <w:b/>
+          <w:bCs/>
+        </w:rPr>
+        <w:t>9. Member Borrowing History</w:t>
+      </w:r>
+    </w:p>
+    <w:p>
+      <w:pPr>
+        <w:numPr>
+          <w:ilvl w:val="0"/>
+          <w:numId w:val="9"/>
+        </w:numPr>
+      </w:pPr>
+      <w:r>
+        <w:t xml:space="preserve">You can view Author details and Book details, but can you view a </w:t>
+      </w:r>
+      <w:proofErr w:type="gramStart"/>
+      <w:r>
+        <w:t>Member's</w:t>
+      </w:r>
+      <w:proofErr w:type="gramEnd"/>
+      <w:r>
+        <w:t xml:space="preserve"> history?</w:t>
+      </w:r>
+    </w:p>
+    <w:p>
+      <w:pPr>
+        <w:numPr>
+          <w:ilvl w:val="0"/>
+          <w:numId w:val="9"/>
+        </w:numPr>
+      </w:pPr>
+      <w:r>
+        <w:rPr>
+          <w:b/>
+          <w:bCs/>
+        </w:rPr>
+        <w:t>What to add:</w:t>
+      </w:r>
+      <w:r>
+        <w:t> In the Member Menu, add an option "View Borrowing History" that lists all loans (past and active) for a selected member.</w:t>
+      </w:r>
+    </w:p>
+    <w:p>
+      <w:pPr>
+        <w:rPr>
+          <w:b/>
+          <w:bCs/>
+        </w:rPr>
+      </w:pPr>
+      <w:r>
+        <w:rPr>
+          <w:b/>
+          <w:bCs/>
+        </w:rPr>
+        <w:t>10. Audit Log (Who Did What?)</w:t>
+      </w:r>
+    </w:p>
+    <w:p>
+      <w:pPr>
+        <w:numPr>
+          <w:ilvl w:val="0"/>
+          <w:numId w:val="10"/>
+        </w:numPr>
+      </w:pPr>
+      <w:r>
+        <w:t>In a real library, you need to know </w:t>
+      </w:r>
+      <w:r>
+        <w:rPr>
+          <w:i/>
+          <w:iCs/>
+        </w:rPr>
+        <w:t>who</w:t>
+      </w:r>
+      <w:r>
+        <w:t> added a book or deleted a member.</w:t>
+      </w:r>
+    </w:p>
+    <w:p>
+      <w:pPr>
+        <w:numPr>
+          <w:ilvl w:val="0"/>
+          <w:numId w:val="10"/>
+        </w:numPr>
+      </w:pPr>
+      <w:r>
+        <w:rPr>
+          <w:b/>
+          <w:bCs/>
+        </w:rPr>
+        <w:t>What to add:</w:t>
+      </w:r>
+      <w:r>
+        <w:t> A simple </w:t>
+      </w:r>
+      <w:proofErr w:type="spellStart"/>
+      <w:r>
+        <w:t>AuditLog</w:t>
+      </w:r>
+      <w:proofErr w:type="spellEnd"/>
+      <w:r>
+        <w:t xml:space="preserve"> class (Id, Timestamp, </w:t>
+      </w:r>
+      <w:proofErr w:type="spellStart"/>
+      <w:r>
+        <w:t>PerformedBy</w:t>
+      </w:r>
+      <w:proofErr w:type="spellEnd"/>
+      <w:r>
+        <w:t>, Action, Details). Log every "Add", "Update", "Remove", and "Borrow/Return" action with the </w:t>
+      </w:r>
+      <w:proofErr w:type="spellStart"/>
+      <w:r>
+        <w:t>CurrentUser</w:t>
+      </w:r>
+      <w:proofErr w:type="spellEnd"/>
+      <w:r>
+        <w:t>. (Optional but highly professional).</w:t>
+      </w:r>
+    </w:p>
+    <w:p>
+      <w:r>
+        <w:pict w14:anchorId="27EF90CE">
+          <v:rect id="_x0000_i1045" style="width:0;height:.75pt" o:hralign="center" o:hrstd="t" o:hr="t" fillcolor="#a0a0a0" stroked="f"/>
+        </w:pict>
+      </w:r>
+    </w:p>
+    <w:p>
+      <w:pPr>
+        <w:rPr>
+          <w:b/>
+          <w:bCs/>
+        </w:rPr>
+      </w:pPr>
+      <w:r>
+        <w:rPr>
+          <w:b/>
+          <w:bCs/>
+        </w:rPr>
+        <w:t>Category 4: Configuration &amp; Infrastructure</w:t>
+      </w:r>
+    </w:p>
+    <w:p>
+      <w:pPr>
+        <w:rPr>
+          <w:b/>
+          <w:bCs/>
+        </w:rPr>
+      </w:pPr>
+      <w:r>
+        <w:rPr>
+          <w:b/>
+          <w:bCs/>
+        </w:rPr>
+        <w:t>11. Business Rule Configuration</w:t>
+      </w:r>
+    </w:p>
+    <w:p>
+      <w:pPr>
+        <w:numPr>
+          <w:ilvl w:val="0"/>
+          <w:numId w:val="11"/>
+        </w:numPr>
+      </w:pPr>
+      <w:r>
+        <w:t>You currently hardcode "Max books = 5", "Loan Duration = 14 days", "Fine = $1/day".</w:t>
+      </w:r>
+    </w:p>
+    <w:p>
+      <w:pPr>
+        <w:numPr>
+          <w:ilvl w:val="0"/>
+          <w:numId w:val="11"/>
+        </w:numPr>
+      </w:pPr>
+      <w:r>
+        <w:rPr>
+          <w:b/>
+          <w:bCs/>
+        </w:rPr>
+        <w:t>What to add:</w:t>
+      </w:r>
+      <w:r>
+        <w:t> A </w:t>
+      </w:r>
+      <w:proofErr w:type="spellStart"/>
+      <w:r>
+        <w:t>LibrarySettings</w:t>
+      </w:r>
+      <w:proofErr w:type="spellEnd"/>
+      <w:r>
+        <w:t xml:space="preserve"> static class or </w:t>
+      </w:r>
+      <w:proofErr w:type="gramStart"/>
+      <w:r>
+        <w:t>a</w:t>
+      </w:r>
+      <w:proofErr w:type="gramEnd"/>
+      <w:r>
+        <w:t> </w:t>
+      </w:r>
+      <w:proofErr w:type="spellStart"/>
+      <w:proofErr w:type="gramStart"/>
+      <w:r>
+        <w:t>appsettings.json</w:t>
+      </w:r>
+      <w:proofErr w:type="spellEnd"/>
+      <w:proofErr w:type="gramEnd"/>
+      <w:r>
+        <w:t> (if you integrate it early) to read these values. This makes the system flexible.</w:t>
+      </w:r>
+    </w:p>
+    <w:p>
+      <w:pPr>
+        <w:rPr>
+          <w:b/>
+          <w:bCs/>
+        </w:rPr>
+      </w:pPr>
+      <w:r>
+        <w:rPr>
+          <w:b/>
+          <w:bCs/>
+        </w:rPr>
+        <w:t>12. Exception Handling &amp; User Feedback</w:t>
+      </w:r>
+    </w:p>
+    <w:p>
+      <w:pPr>
+        <w:numPr>
+          <w:ilvl w:val="0"/>
+          <w:numId w:val="12"/>
+        </w:numPr>
+      </w:pPr>
+      <w:r>
+        <w:t>You use </w:t>
+      </w:r>
+      <w:proofErr w:type="spellStart"/>
+      <w:r>
+        <w:t>ServiceResult</w:t>
+      </w:r>
+      <w:proofErr w:type="spellEnd"/>
+      <w:r>
+        <w:t> for business errors, but what about unexpected </w:t>
+      </w:r>
+      <w:proofErr w:type="spellStart"/>
+      <w:r>
+        <w:t>NullReferenceException</w:t>
+      </w:r>
+      <w:proofErr w:type="spellEnd"/>
+      <w:r>
+        <w:t> or </w:t>
+      </w:r>
+      <w:proofErr w:type="spellStart"/>
+      <w:r>
+        <w:t>ArgumentNullException</w:t>
+      </w:r>
+      <w:proofErr w:type="spellEnd"/>
+      <w:r>
+        <w:t>?</w:t>
+      </w:r>
+    </w:p>
+    <w:p>
+      <w:pPr>
+        <w:numPr>
+          <w:ilvl w:val="0"/>
+          <w:numId w:val="12"/>
+        </w:numPr>
+      </w:pPr>
+      <w:r>
+        <w:rPr>
+          <w:b/>
+          <w:bCs/>
+        </w:rPr>
+        <w:t>What to add:</w:t>
+      </w:r>
+      <w:r>
+        <w:t> A global try-catch in the </w:t>
+      </w:r>
+      <w:proofErr w:type="spellStart"/>
+      <w:r>
+        <w:t>Program.Main</w:t>
+      </w:r>
+      <w:proofErr w:type="spellEnd"/>
+      <w:r>
+        <w:t> loop that catches unhandled exceptions, logs them, and shows a generic "Something went wrong" message to the user, preventing the app from crashing.</w:t>
+      </w:r>
+    </w:p>
+    <w:p>
+      <w:pPr>
+        <w:pBdr>
+          <w:bottom w:val="double" w:sz="6" w:space="1" w:color="auto"/>
+        </w:pBdr>
+      </w:pPr>
+    </w:p>
     <w:p/>
     <w:sectPr>
       <w:pgSz w:w="12240" w:h="15840"/>
-      <w:pgMar w:top="1440" w:right="1440" w:bottom="1440" w:left="1440" w:header="720" w:footer="720" w:gutter="0"/>
+      <w:pgMar w:top="90" w:right="1440" w:bottom="360" w:left="1440" w:header="720" w:footer="720" w:gutter="0"/>
       <w:cols w:space="720"/>
       <w:docGrid w:linePitch="360"/>
     </w:sectPr>
   </w:body>
 </w:document>
+</file>
+
+<file path=word/endnotes.xml><?xml version="1.0" encoding="utf-8"?>
+<w:endnotes xmlns:wpc="http://schemas.microsoft.com/office/word/2010/wordprocessingCanvas" xmlns:cx="http://schemas.microsoft.com/office/drawing/2014/chartex" xmlns:cx1="http://schemas.microsoft.com/office/drawing/2015/9/8/chartex" xmlns:cx2="http://schemas.microsoft.com/office/drawing/2015/10/21/chartex" xmlns:cx3="http://schemas.microsoft.com/office/drawing/2016/5/9/chartex" xmlns:cx4="http://schemas.microsoft.com/office/drawing/2016/5/10/chartex" xmlns:cx5="http://schemas.microsoft.com/office/drawing/2016/5/11/chartex" xmlns:cx6="http://schemas.microsoft.com/office/drawing/2016/5/12/chartex" xmlns:cx7="http://schemas.microsoft.com/office/drawing/2016/5/13/chartex" xmlns:cx8="http://schemas.microsoft.com/office/drawing/2016/5/14/chartex" xmlns:mc="http://schemas.openxmlformats.org/markup-compatibility/2006" xmlns:aink="http://schemas.microsoft.com/office/drawing/2016/ink" xmlns:am3d="http://schemas.microsoft.com/office/drawing/2017/model3d" xmlns:o="urn:schemas-microsoft-com:office:office" xmlns:oel="http://schemas.microsoft.com/office/2019/extlst" xmlns:r="http://schemas.openxmlformats.org/officeDocument/2006/relationships" xmlns:m="http://schemas.openxmlformats.org/officeDocument/2006/math" xmlns:v="urn:schemas-microsoft-com:vml" xmlns:wp14="http://schemas.microsoft.com/office/word/2010/wordprocessingDrawing" xmlns:wp="http://schemas.openxmlformats.org/drawingml/2006/wordprocessingDrawing" xmlns:w10="urn:schemas-microsoft-com:office:word" xmlns:w="http://schemas.openxmlformats.org/wordprocessingml/2006/main" xmlns:w14="http://schemas.microsoft.com/office/word/2010/wordml" xmlns:w15="http://schemas.microsoft.com/office/word/2012/wordml" xmlns:w16cex="http://schemas.microsoft.com/office/word/2018/wordml/cex" xmlns:w16cid="http://schemas.microsoft.com/office/word/2016/wordml/cid" xmlns:w16="http://schemas.microsoft.com/office/word/2018/wordml" xmlns:w16du="http://schemas.microsoft.com/office/word/2023/wordml/word16du" xmlns:w16sdtdh="http://schemas.microsoft.com/office/word/2020/wordml/sdtdatahash" xmlns:w16sdtfl="http://schemas.microsoft.com/office/word/2024/wordml/sdtformatlock" xmlns:w16se="http://schemas.microsoft.com/office/word/2015/wordml/symex" xmlns:wpg="http://schemas.microsoft.com/office/word/2010/wordprocessingGroup" xmlns:wpi="http://schemas.microsoft.com/office/word/2010/wordprocessingInk" xmlns:wne="http://schemas.microsoft.com/office/word/2006/wordml" xmlns:wps="http://schemas.microsoft.com/office/word/2010/wordprocessingShape" mc:Ignorable="w14 w15 w16se w16cid w16 w16cex w16sdtdh w16sdtfl w16du wp14">
+  <w:endnote w:type="separator" w:id="-1">
+    <w:p>
+      <w:pPr>
+        <w:spacing w:after="0" w:line="240" w:lineRule="auto"/>
+      </w:pPr>
+      <w:r>
+        <w:separator/>
+      </w:r>
+    </w:p>
+  </w:endnote>
+  <w:endnote w:type="continuationSeparator" w:id="0">
+    <w:p>
+      <w:pPr>
+        <w:spacing w:after="0" w:line="240" w:lineRule="auto"/>
+      </w:pPr>
+      <w:r>
+        <w:continuationSeparator/>
+      </w:r>
+    </w:p>
+  </w:endnote>
+</w:endnotes>
+</file>
+
+<file path=word/footnotes.xml><?xml version="1.0" encoding="utf-8"?>
+<w:footnotes xmlns:wpc="http://schemas.microsoft.com/office/word/2010/wordprocessingCanvas" xmlns:cx="http://schemas.microsoft.com/office/drawing/2014/chartex" xmlns:cx1="http://schemas.microsoft.com/office/drawing/2015/9/8/chartex" xmlns:cx2="http://schemas.microsoft.com/office/drawing/2015/10/21/chartex" xmlns:cx3="http://schemas.microsoft.com/office/drawing/2016/5/9/chartex" xmlns:cx4="http://schemas.microsoft.com/office/drawing/2016/5/10/chartex" xmlns:cx5="http://schemas.microsoft.com/office/drawing/2016/5/11/chartex" xmlns:cx6="http://schemas.microsoft.com/office/drawing/2016/5/12/chartex" xmlns:cx7="http://schemas.microsoft.com/office/drawing/2016/5/13/chartex" xmlns:cx8="http://schemas.microsoft.com/office/drawing/2016/5/14/chartex" xmlns:mc="http://schemas.openxmlformats.org/markup-compatibility/2006" xmlns:aink="http://schemas.microsoft.com/office/drawing/2016/ink" xmlns:am3d="http://schemas.microsoft.com/office/drawing/2017/model3d" xmlns:o="urn:schemas-microsoft-com:office:office" xmlns:oel="http://schemas.microsoft.com/office/2019/extlst" xmlns:r="http://schemas.openxmlformats.org/officeDocument/2006/relationships" xmlns:m="http://schemas.openxmlformats.org/officeDocument/2006/math" xmlns:v="urn:schemas-microsoft-com:vml" xmlns:wp14="http://schemas.microsoft.com/office/word/2010/wordprocessingDrawing" xmlns:wp="http://schemas.openxmlformats.org/drawingml/2006/wordprocessingDrawing" xmlns:w10="urn:schemas-microsoft-com:office:word" xmlns:w="http://schemas.openxmlformats.org/wordprocessingml/2006/main" xmlns:w14="http://schemas.microsoft.com/office/word/2010/wordml" xmlns:w15="http://schemas.microsoft.com/office/word/2012/wordml" xmlns:w16cex="http://schemas.microsoft.com/office/word/2018/wordml/cex" xmlns:w16cid="http://schemas.microsoft.com/office/word/2016/wordml/cid" xmlns:w16="http://schemas.microsoft.com/office/word/2018/wordml" xmlns:w16du="http://schemas.microsoft.com/office/word/2023/wordml/word16du" xmlns:w16sdtdh="http://schemas.microsoft.com/office/word/2020/wordml/sdtdatahash" xmlns:w16sdtfl="http://schemas.microsoft.com/office/word/2024/wordml/sdtformatlock" xmlns:w16se="http://schemas.microsoft.com/office/word/2015/wordml/symex" xmlns:wpg="http://schemas.microsoft.com/office/word/2010/wordprocessingGroup" xmlns:wpi="http://schemas.microsoft.com/office/word/2010/wordprocessingInk" xmlns:wne="http://schemas.microsoft.com/office/word/2006/wordml" xmlns:wps="http://schemas.microsoft.com/office/word/2010/wordprocessingShape" mc:Ignorable="w14 w15 w16se w16cid w16 w16cex w16sdtdh w16sdtfl w16du wp14">
+  <w:footnote w:type="separator" w:id="-1">
+    <w:p>
+      <w:pPr>
+        <w:spacing w:after="0" w:line="240" w:lineRule="auto"/>
+      </w:pPr>
+      <w:r>
+        <w:separator/>
+      </w:r>
+    </w:p>
+  </w:footnote>
+  <w:footnote w:type="continuationSeparator" w:id="0">
+    <w:p>
+      <w:pPr>
+        <w:spacing w:after="0" w:line="240" w:lineRule="auto"/>
+      </w:pPr>
+      <w:r>
+        <w:continuationSeparator/>
+      </w:r>
+    </w:p>
+  </w:footnote>
+</w:footnotes>
+</file>
+
+<file path=word/numbering.xml><?xml version="1.0" encoding="utf-8"?>
+<w:numbering xmlns:wpc="http://schemas.microsoft.com/office/word/2010/wordprocessingCanvas" xmlns:cx="http://schemas.microsoft.com/office/drawing/2014/chartex" xmlns:cx1="http://schemas.microsoft.com/office/drawing/2015/9/8/chartex" xmlns:cx2="http://schemas.microsoft.com/office/drawing/2015/10/21/chartex" xmlns:cx3="http://schemas.microsoft.com/office/drawing/2016/5/9/chartex" xmlns:cx4="http://schemas.microsoft.com/office/drawing/2016/5/10/chartex" xmlns:cx5="http://schemas.microsoft.com/office/drawing/2016/5/11/chartex" xmlns:cx6="http://schemas.microsoft.com/office/drawing/2016/5/12/chartex" xmlns:cx7="http://schemas.microsoft.com/office/drawing/2016/5/13/chartex" xmlns:cx8="http://schemas.microsoft.com/office/drawing/2016/5/14/chartex" xmlns:mc="http://schemas.openxmlformats.org/markup-compatibility/2006" xmlns:aink="http://schemas.microsoft.com/office/drawing/2016/ink" xmlns:am3d="http://schemas.microsoft.com/office/drawing/2017/model3d" xmlns:o="urn:schemas-microsoft-com:office:office" xmlns:oel="http://schemas.microsoft.com/office/2019/extlst" xmlns:r="http://schemas.openxmlformats.org/officeDocument/2006/relationships" xmlns:m="http://schemas.openxmlformats.org/officeDocument/2006/math" xmlns:v="urn:schemas-microsoft-com:vml" xmlns:wp14="http://schemas.microsoft.com/office/word/2010/wordprocessingDrawing" xmlns:wp="http://schemas.openxmlformats.org/drawingml/2006/wordprocessingDrawing" xmlns:w10="urn:schemas-microsoft-com:office:word" xmlns:w="http://schemas.openxmlformats.org/wordprocessingml/2006/main" xmlns:w14="http://schemas.microsoft.com/office/word/2010/wordml" xmlns:w15="http://schemas.microsoft.com/office/word/2012/wordml" xmlns:w16cex="http://schemas.microsoft.com/office/word/2018/wordml/cex" xmlns:w16cid="http://schemas.microsoft.com/office/word/2016/wordml/cid" xmlns:w16="http://schemas.microsoft.com/office/word/2018/wordml" xmlns:w16du="http://schemas.microsoft.com/office/word/2023/wordml/word16du" xmlns:w16sdtdh="http://schemas.microsoft.com/office/word/2020/wordml/sdtdatahash" xmlns:w16sdtfl="http://schemas.microsoft.com/office/word/2024/wordml/sdtformatlock" xmlns:w16se="http://schemas.microsoft.com/office/word/2015/wordml/symex" xmlns:wpg="http://schemas.microsoft.com/office/word/2010/wordprocessingGroup" xmlns:wpi="http://schemas.microsoft.com/office/word/2010/wordprocessingInk" xmlns:wne="http://schemas.microsoft.com/office/word/2006/wordml" xmlns:wps="http://schemas.microsoft.com/office/word/2010/wordprocessingShape" mc:Ignorable="w14 w15 w16se w16cid w16 w16cex w16sdtdh w16sdtfl w16du wp14">
+  <w:abstractNum w:abstractNumId="0" w15:restartNumberingAfterBreak="0">
+    <w:nsid w:val="0C972420"/>
+    <w:multiLevelType w:val="multilevel"/>
+    <w:tmpl w:val="2C565F30"/>
+    <w:lvl w:ilvl="0">
+      <w:start w:val="1"/>
+      <w:numFmt w:val="bullet"/>
+      <w:lvlText w:val=""/>
+      <w:lvlJc w:val="left"/>
+      <w:pPr>
+        <w:tabs>
+          <w:tab w:val="num" w:pos="720"/>
+        </w:tabs>
+        <w:ind w:left="720" w:hanging="360"/>
+      </w:pPr>
+      <w:rPr>
+        <w:rFonts w:ascii="Symbol" w:hAnsi="Symbol" w:hint="default"/>
+        <w:sz w:val="20"/>
+      </w:rPr>
+    </w:lvl>
+    <w:lvl w:ilvl="1" w:tentative="1">
+      <w:start w:val="1"/>
+      <w:numFmt w:val="bullet"/>
+      <w:lvlText w:val="o"/>
+      <w:lvlJc w:val="left"/>
+      <w:pPr>
+        <w:tabs>
+          <w:tab w:val="num" w:pos="1440"/>
+        </w:tabs>
+        <w:ind w:left="1440" w:hanging="360"/>
+      </w:pPr>
+      <w:rPr>
+        <w:rFonts w:ascii="Courier New" w:hAnsi="Courier New" w:hint="default"/>
+        <w:sz w:val="20"/>
+      </w:rPr>
+    </w:lvl>
+    <w:lvl w:ilvl="2" w:tentative="1">
+      <w:start w:val="1"/>
+      <w:numFmt w:val="bullet"/>
+      <w:lvlText w:val=""/>
+      <w:lvlJc w:val="left"/>
+      <w:pPr>
+        <w:tabs>
+          <w:tab w:val="num" w:pos="2160"/>
+        </w:tabs>
+        <w:ind w:left="2160" w:hanging="360"/>
+      </w:pPr>
+      <w:rPr>
+        <w:rFonts w:ascii="Wingdings" w:hAnsi="Wingdings" w:hint="default"/>
+        <w:sz w:val="20"/>
+      </w:rPr>
+    </w:lvl>
+    <w:lvl w:ilvl="3" w:tentative="1">
+      <w:start w:val="1"/>
+      <w:numFmt w:val="bullet"/>
+      <w:lvlText w:val=""/>
+      <w:lvlJc w:val="left"/>
+      <w:pPr>
+        <w:tabs>
+          <w:tab w:val="num" w:pos="2880"/>
+        </w:tabs>
+        <w:ind w:left="2880" w:hanging="360"/>
+      </w:pPr>
+      <w:rPr>
+        <w:rFonts w:ascii="Wingdings" w:hAnsi="Wingdings" w:hint="default"/>
+        <w:sz w:val="20"/>
+      </w:rPr>
+    </w:lvl>
+    <w:lvl w:ilvl="4" w:tentative="1">
+      <w:start w:val="1"/>
+      <w:numFmt w:val="bullet"/>
+      <w:lvlText w:val=""/>
+      <w:lvlJc w:val="left"/>
+      <w:pPr>
+        <w:tabs>
+          <w:tab w:val="num" w:pos="3600"/>
+        </w:tabs>
+        <w:ind w:left="3600" w:hanging="360"/>
+      </w:pPr>
+      <w:rPr>
+        <w:rFonts w:ascii="Wingdings" w:hAnsi="Wingdings" w:hint="default"/>
+        <w:sz w:val="20"/>
+      </w:rPr>
+    </w:lvl>
+    <w:lvl w:ilvl="5" w:tentative="1">
+      <w:start w:val="1"/>
+      <w:numFmt w:val="bullet"/>
+      <w:lvlText w:val=""/>
+      <w:lvlJc w:val="left"/>
+      <w:pPr>
+        <w:tabs>
+          <w:tab w:val="num" w:pos="4320"/>
+        </w:tabs>
+        <w:ind w:left="4320" w:hanging="360"/>
+      </w:pPr>
+      <w:rPr>
+        <w:rFonts w:ascii="Wingdings" w:hAnsi="Wingdings" w:hint="default"/>
+        <w:sz w:val="20"/>
+      </w:rPr>
+    </w:lvl>
+    <w:lvl w:ilvl="6" w:tentative="1">
+      <w:start w:val="1"/>
+      <w:numFmt w:val="bullet"/>
+      <w:lvlText w:val=""/>
+      <w:lvlJc w:val="left"/>
+      <w:pPr>
+        <w:tabs>
+          <w:tab w:val="num" w:pos="5040"/>
+        </w:tabs>
+        <w:ind w:left="5040" w:hanging="360"/>
+      </w:pPr>
+      <w:rPr>
+        <w:rFonts w:ascii="Wingdings" w:hAnsi="Wingdings" w:hint="default"/>
+        <w:sz w:val="20"/>
+      </w:rPr>
+    </w:lvl>
+    <w:lvl w:ilvl="7" w:tentative="1">
+      <w:start w:val="1"/>
+      <w:numFmt w:val="bullet"/>
+      <w:lvlText w:val=""/>
+      <w:lvlJc w:val="left"/>
+      <w:pPr>
+        <w:tabs>
+          <w:tab w:val="num" w:pos="5760"/>
+        </w:tabs>
+        <w:ind w:left="5760" w:hanging="360"/>
+      </w:pPr>
+      <w:rPr>
+        <w:rFonts w:ascii="Wingdings" w:hAnsi="Wingdings" w:hint="default"/>
+        <w:sz w:val="20"/>
+      </w:rPr>
+    </w:lvl>
+    <w:lvl w:ilvl="8" w:tentative="1">
+      <w:start w:val="1"/>
+      <w:numFmt w:val="bullet"/>
+      <w:lvlText w:val=""/>
+      <w:lvlJc w:val="left"/>
+      <w:pPr>
+        <w:tabs>
+          <w:tab w:val="num" w:pos="6480"/>
+        </w:tabs>
+        <w:ind w:left="6480" w:hanging="360"/>
+      </w:pPr>
+      <w:rPr>
+        <w:rFonts w:ascii="Wingdings" w:hAnsi="Wingdings" w:hint="default"/>
+        <w:sz w:val="20"/>
+      </w:rPr>
+    </w:lvl>
+  </w:abstractNum>
+  <w:abstractNum w:abstractNumId="1" w15:restartNumberingAfterBreak="0">
+    <w:nsid w:val="2E1479C4"/>
+    <w:multiLevelType w:val="multilevel"/>
+    <w:tmpl w:val="6B3AF8E0"/>
+    <w:lvl w:ilvl="0">
+      <w:start w:val="1"/>
+      <w:numFmt w:val="bullet"/>
+      <w:lvlText w:val=""/>
+      <w:lvlJc w:val="left"/>
+      <w:pPr>
+        <w:tabs>
+          <w:tab w:val="num" w:pos="720"/>
+        </w:tabs>
+        <w:ind w:left="720" w:hanging="360"/>
+      </w:pPr>
+      <w:rPr>
+        <w:rFonts w:ascii="Symbol" w:hAnsi="Symbol" w:hint="default"/>
+        <w:sz w:val="20"/>
+      </w:rPr>
+    </w:lvl>
+    <w:lvl w:ilvl="1" w:tentative="1">
+      <w:start w:val="1"/>
+      <w:numFmt w:val="bullet"/>
+      <w:lvlText w:val="o"/>
+      <w:lvlJc w:val="left"/>
+      <w:pPr>
+        <w:tabs>
+          <w:tab w:val="num" w:pos="1440"/>
+        </w:tabs>
+        <w:ind w:left="1440" w:hanging="360"/>
+      </w:pPr>
+      <w:rPr>
+        <w:rFonts w:ascii="Courier New" w:hAnsi="Courier New" w:hint="default"/>
+        <w:sz w:val="20"/>
+      </w:rPr>
+    </w:lvl>
+    <w:lvl w:ilvl="2" w:tentative="1">
+      <w:start w:val="1"/>
+      <w:numFmt w:val="bullet"/>
+      <w:lvlText w:val=""/>
+      <w:lvlJc w:val="left"/>
+      <w:pPr>
+        <w:tabs>
+          <w:tab w:val="num" w:pos="2160"/>
+        </w:tabs>
+        <w:ind w:left="2160" w:hanging="360"/>
+      </w:pPr>
+      <w:rPr>
+        <w:rFonts w:ascii="Wingdings" w:hAnsi="Wingdings" w:hint="default"/>
+        <w:sz w:val="20"/>
+      </w:rPr>
+    </w:lvl>
+    <w:lvl w:ilvl="3" w:tentative="1">
+      <w:start w:val="1"/>
+      <w:numFmt w:val="bullet"/>
+      <w:lvlText w:val=""/>
+      <w:lvlJc w:val="left"/>
+      <w:pPr>
+        <w:tabs>
+          <w:tab w:val="num" w:pos="2880"/>
+        </w:tabs>
+        <w:ind w:left="2880" w:hanging="360"/>
+      </w:pPr>
+      <w:rPr>
+        <w:rFonts w:ascii="Wingdings" w:hAnsi="Wingdings" w:hint="default"/>
+        <w:sz w:val="20"/>
+      </w:rPr>
+    </w:lvl>
+    <w:lvl w:ilvl="4" w:tentative="1">
+      <w:start w:val="1"/>
+      <w:numFmt w:val="bullet"/>
+      <w:lvlText w:val=""/>
+      <w:lvlJc w:val="left"/>
+      <w:pPr>
+        <w:tabs>
+          <w:tab w:val="num" w:pos="3600"/>
+        </w:tabs>
+        <w:ind w:left="3600" w:hanging="360"/>
+      </w:pPr>
+      <w:rPr>
+        <w:rFonts w:ascii="Wingdings" w:hAnsi="Wingdings" w:hint="default"/>
+        <w:sz w:val="20"/>
+      </w:rPr>
+    </w:lvl>
+    <w:lvl w:ilvl="5" w:tentative="1">
+      <w:start w:val="1"/>
+      <w:numFmt w:val="bullet"/>
+      <w:lvlText w:val=""/>
+      <w:lvlJc w:val="left"/>
+      <w:pPr>
+        <w:tabs>
+          <w:tab w:val="num" w:pos="4320"/>
+        </w:tabs>
+        <w:ind w:left="4320" w:hanging="360"/>
+      </w:pPr>
+      <w:rPr>
+        <w:rFonts w:ascii="Wingdings" w:hAnsi="Wingdings" w:hint="default"/>
+        <w:sz w:val="20"/>
+      </w:rPr>
+    </w:lvl>
+    <w:lvl w:ilvl="6" w:tentative="1">
+      <w:start w:val="1"/>
+      <w:numFmt w:val="bullet"/>
+      <w:lvlText w:val=""/>
+      <w:lvlJc w:val="left"/>
+      <w:pPr>
+        <w:tabs>
+          <w:tab w:val="num" w:pos="5040"/>
+        </w:tabs>
+        <w:ind w:left="5040" w:hanging="360"/>
+      </w:pPr>
+      <w:rPr>
+        <w:rFonts w:ascii="Wingdings" w:hAnsi="Wingdings" w:hint="default"/>
+        <w:sz w:val="20"/>
+      </w:rPr>
+    </w:lvl>
+    <w:lvl w:ilvl="7" w:tentative="1">
+      <w:start w:val="1"/>
+      <w:numFmt w:val="bullet"/>
+      <w:lvlText w:val=""/>
+      <w:lvlJc w:val="left"/>
+      <w:pPr>
+        <w:tabs>
+          <w:tab w:val="num" w:pos="5760"/>
+        </w:tabs>
+        <w:ind w:left="5760" w:hanging="360"/>
+      </w:pPr>
+      <w:rPr>
+        <w:rFonts w:ascii="Wingdings" w:hAnsi="Wingdings" w:hint="default"/>
+        <w:sz w:val="20"/>
+      </w:rPr>
+    </w:lvl>
+    <w:lvl w:ilvl="8" w:tentative="1">
+      <w:start w:val="1"/>
+      <w:numFmt w:val="bullet"/>
+      <w:lvlText w:val=""/>
+      <w:lvlJc w:val="left"/>
+      <w:pPr>
+        <w:tabs>
+          <w:tab w:val="num" w:pos="6480"/>
+        </w:tabs>
+        <w:ind w:left="6480" w:hanging="360"/>
+      </w:pPr>
+      <w:rPr>
+        <w:rFonts w:ascii="Wingdings" w:hAnsi="Wingdings" w:hint="default"/>
+        <w:sz w:val="20"/>
+      </w:rPr>
+    </w:lvl>
+  </w:abstractNum>
+  <w:abstractNum w:abstractNumId="2" w15:restartNumberingAfterBreak="0">
+    <w:nsid w:val="41B61230"/>
+    <w:multiLevelType w:val="multilevel"/>
+    <w:tmpl w:val="D9A29F38"/>
+    <w:lvl w:ilvl="0">
+      <w:start w:val="1"/>
+      <w:numFmt w:val="bullet"/>
+      <w:lvlText w:val=""/>
+      <w:lvlJc w:val="left"/>
+      <w:pPr>
+        <w:tabs>
+          <w:tab w:val="num" w:pos="720"/>
+        </w:tabs>
+        <w:ind w:left="720" w:hanging="360"/>
+      </w:pPr>
+      <w:rPr>
+        <w:rFonts w:ascii="Symbol" w:hAnsi="Symbol" w:hint="default"/>
+        <w:sz w:val="20"/>
+      </w:rPr>
+    </w:lvl>
+    <w:lvl w:ilvl="1">
+      <w:start w:val="1"/>
+      <w:numFmt w:val="bullet"/>
+      <w:lvlText w:val="o"/>
+      <w:lvlJc w:val="left"/>
+      <w:pPr>
+        <w:tabs>
+          <w:tab w:val="num" w:pos="1440"/>
+        </w:tabs>
+        <w:ind w:left="1440" w:hanging="360"/>
+      </w:pPr>
+      <w:rPr>
+        <w:rFonts w:ascii="Courier New" w:hAnsi="Courier New" w:hint="default"/>
+        <w:sz w:val="20"/>
+      </w:rPr>
+    </w:lvl>
+    <w:lvl w:ilvl="2" w:tentative="1">
+      <w:start w:val="1"/>
+      <w:numFmt w:val="bullet"/>
+      <w:lvlText w:val=""/>
+      <w:lvlJc w:val="left"/>
+      <w:pPr>
+        <w:tabs>
+          <w:tab w:val="num" w:pos="2160"/>
+        </w:tabs>
+        <w:ind w:left="2160" w:hanging="360"/>
+      </w:pPr>
+      <w:rPr>
+        <w:rFonts w:ascii="Wingdings" w:hAnsi="Wingdings" w:hint="default"/>
+        <w:sz w:val="20"/>
+      </w:rPr>
+    </w:lvl>
+    <w:lvl w:ilvl="3" w:tentative="1">
+      <w:start w:val="1"/>
+      <w:numFmt w:val="bullet"/>
+      <w:lvlText w:val=""/>
+      <w:lvlJc w:val="left"/>
+      <w:pPr>
+        <w:tabs>
+          <w:tab w:val="num" w:pos="2880"/>
+        </w:tabs>
+        <w:ind w:left="2880" w:hanging="360"/>
+      </w:pPr>
+      <w:rPr>
+        <w:rFonts w:ascii="Wingdings" w:hAnsi="Wingdings" w:hint="default"/>
+        <w:sz w:val="20"/>
+      </w:rPr>
+    </w:lvl>
+    <w:lvl w:ilvl="4" w:tentative="1">
+      <w:start w:val="1"/>
+      <w:numFmt w:val="bullet"/>
+      <w:lvlText w:val=""/>
+      <w:lvlJc w:val="left"/>
+      <w:pPr>
+        <w:tabs>
+          <w:tab w:val="num" w:pos="3600"/>
+        </w:tabs>
+        <w:ind w:left="3600" w:hanging="360"/>
+      </w:pPr>
+      <w:rPr>
+        <w:rFonts w:ascii="Wingdings" w:hAnsi="Wingdings" w:hint="default"/>
+        <w:sz w:val="20"/>
+      </w:rPr>
+    </w:lvl>
+    <w:lvl w:ilvl="5" w:tentative="1">
+      <w:start w:val="1"/>
+      <w:numFmt w:val="bullet"/>
+      <w:lvlText w:val=""/>
+      <w:lvlJc w:val="left"/>
+      <w:pPr>
+        <w:tabs>
+          <w:tab w:val="num" w:pos="4320"/>
+        </w:tabs>
+        <w:ind w:left="4320" w:hanging="360"/>
+      </w:pPr>
+      <w:rPr>
+        <w:rFonts w:ascii="Wingdings" w:hAnsi="Wingdings" w:hint="default"/>
+        <w:sz w:val="20"/>
+      </w:rPr>
+    </w:lvl>
+    <w:lvl w:ilvl="6" w:tentative="1">
+      <w:start w:val="1"/>
+      <w:numFmt w:val="bullet"/>
+      <w:lvlText w:val=""/>
+      <w:lvlJc w:val="left"/>
+      <w:pPr>
+        <w:tabs>
+          <w:tab w:val="num" w:pos="5040"/>
+        </w:tabs>
+        <w:ind w:left="5040" w:hanging="360"/>
+      </w:pPr>
+      <w:rPr>
+        <w:rFonts w:ascii="Wingdings" w:hAnsi="Wingdings" w:hint="default"/>
+        <w:sz w:val="20"/>
+      </w:rPr>
+    </w:lvl>
+    <w:lvl w:ilvl="7" w:tentative="1">
+      <w:start w:val="1"/>
+      <w:numFmt w:val="bullet"/>
+      <w:lvlText w:val=""/>
+      <w:lvlJc w:val="left"/>
+      <w:pPr>
+        <w:tabs>
+          <w:tab w:val="num" w:pos="5760"/>
+        </w:tabs>
+        <w:ind w:left="5760" w:hanging="360"/>
+      </w:pPr>
+      <w:rPr>
+        <w:rFonts w:ascii="Wingdings" w:hAnsi="Wingdings" w:hint="default"/>
+        <w:sz w:val="20"/>
+      </w:rPr>
+    </w:lvl>
+    <w:lvl w:ilvl="8" w:tentative="1">
+      <w:start w:val="1"/>
+      <w:numFmt w:val="bullet"/>
+      <w:lvlText w:val=""/>
+      <w:lvlJc w:val="left"/>
+      <w:pPr>
+        <w:tabs>
+          <w:tab w:val="num" w:pos="6480"/>
+        </w:tabs>
+        <w:ind w:left="6480" w:hanging="360"/>
+      </w:pPr>
+      <w:rPr>
+        <w:rFonts w:ascii="Wingdings" w:hAnsi="Wingdings" w:hint="default"/>
+        <w:sz w:val="20"/>
+      </w:rPr>
+    </w:lvl>
+  </w:abstractNum>
+  <w:abstractNum w:abstractNumId="3" w15:restartNumberingAfterBreak="0">
+    <w:nsid w:val="44B50E49"/>
+    <w:multiLevelType w:val="multilevel"/>
+    <w:tmpl w:val="8308603A"/>
+    <w:lvl w:ilvl="0">
+      <w:start w:val="1"/>
+      <w:numFmt w:val="bullet"/>
+      <w:lvlText w:val=""/>
+      <w:lvlJc w:val="left"/>
+      <w:pPr>
+        <w:tabs>
+          <w:tab w:val="num" w:pos="720"/>
+        </w:tabs>
+        <w:ind w:left="720" w:hanging="360"/>
+      </w:pPr>
+      <w:rPr>
+        <w:rFonts w:ascii="Symbol" w:hAnsi="Symbol" w:hint="default"/>
+        <w:sz w:val="20"/>
+      </w:rPr>
+    </w:lvl>
+    <w:lvl w:ilvl="1">
+      <w:start w:val="1"/>
+      <w:numFmt w:val="bullet"/>
+      <w:lvlText w:val="o"/>
+      <w:lvlJc w:val="left"/>
+      <w:pPr>
+        <w:tabs>
+          <w:tab w:val="num" w:pos="1440"/>
+        </w:tabs>
+        <w:ind w:left="1440" w:hanging="360"/>
+      </w:pPr>
+      <w:rPr>
+        <w:rFonts w:ascii="Courier New" w:hAnsi="Courier New" w:hint="default"/>
+        <w:sz w:val="20"/>
+      </w:rPr>
+    </w:lvl>
+    <w:lvl w:ilvl="2" w:tentative="1">
+      <w:start w:val="1"/>
+      <w:numFmt w:val="bullet"/>
+      <w:lvlText w:val=""/>
+      <w:lvlJc w:val="left"/>
+      <w:pPr>
+        <w:tabs>
+          <w:tab w:val="num" w:pos="2160"/>
+        </w:tabs>
+        <w:ind w:left="2160" w:hanging="360"/>
+      </w:pPr>
+      <w:rPr>
+        <w:rFonts w:ascii="Wingdings" w:hAnsi="Wingdings" w:hint="default"/>
+        <w:sz w:val="20"/>
+      </w:rPr>
+    </w:lvl>
+    <w:lvl w:ilvl="3" w:tentative="1">
+      <w:start w:val="1"/>
+      <w:numFmt w:val="bullet"/>
+      <w:lvlText w:val=""/>
+      <w:lvlJc w:val="left"/>
+      <w:pPr>
+        <w:tabs>
+          <w:tab w:val="num" w:pos="2880"/>
+        </w:tabs>
+        <w:ind w:left="2880" w:hanging="360"/>
+      </w:pPr>
+      <w:rPr>
+        <w:rFonts w:ascii="Wingdings" w:hAnsi="Wingdings" w:hint="default"/>
+        <w:sz w:val="20"/>
+      </w:rPr>
+    </w:lvl>
+    <w:lvl w:ilvl="4" w:tentative="1">
+      <w:start w:val="1"/>
+      <w:numFmt w:val="bullet"/>
+      <w:lvlText w:val=""/>
+      <w:lvlJc w:val="left"/>
+      <w:pPr>
+        <w:tabs>
+          <w:tab w:val="num" w:pos="3600"/>
+        </w:tabs>
+        <w:ind w:left="3600" w:hanging="360"/>
+      </w:pPr>
+      <w:rPr>
+        <w:rFonts w:ascii="Wingdings" w:hAnsi="Wingdings" w:hint="default"/>
+        <w:sz w:val="20"/>
+      </w:rPr>
+    </w:lvl>
+    <w:lvl w:ilvl="5" w:tentative="1">
+      <w:start w:val="1"/>
+      <w:numFmt w:val="bullet"/>
+      <w:lvlText w:val=""/>
+      <w:lvlJc w:val="left"/>
+      <w:pPr>
+        <w:tabs>
+          <w:tab w:val="num" w:pos="4320"/>
+        </w:tabs>
+        <w:ind w:left="4320" w:hanging="360"/>
+      </w:pPr>
+      <w:rPr>
+        <w:rFonts w:ascii="Wingdings" w:hAnsi="Wingdings" w:hint="default"/>
+        <w:sz w:val="20"/>
+      </w:rPr>
+    </w:lvl>
+    <w:lvl w:ilvl="6" w:tentative="1">
+      <w:start w:val="1"/>
+      <w:numFmt w:val="bullet"/>
+      <w:lvlText w:val=""/>
+      <w:lvlJc w:val="left"/>
+      <w:pPr>
+        <w:tabs>
+          <w:tab w:val="num" w:pos="5040"/>
+        </w:tabs>
+        <w:ind w:left="5040" w:hanging="360"/>
+      </w:pPr>
+      <w:rPr>
+        <w:rFonts w:ascii="Wingdings" w:hAnsi="Wingdings" w:hint="default"/>
+        <w:sz w:val="20"/>
+      </w:rPr>
+    </w:lvl>
+    <w:lvl w:ilvl="7" w:tentative="1">
+      <w:start w:val="1"/>
+      <w:numFmt w:val="bullet"/>
+      <w:lvlText w:val=""/>
+      <w:lvlJc w:val="left"/>
+      <w:pPr>
+        <w:tabs>
+          <w:tab w:val="num" w:pos="5760"/>
+        </w:tabs>
+        <w:ind w:left="5760" w:hanging="360"/>
+      </w:pPr>
+      <w:rPr>
+        <w:rFonts w:ascii="Wingdings" w:hAnsi="Wingdings" w:hint="default"/>
+        <w:sz w:val="20"/>
+      </w:rPr>
+    </w:lvl>
+    <w:lvl w:ilvl="8" w:tentative="1">
+      <w:start w:val="1"/>
+      <w:numFmt w:val="bullet"/>
+      <w:lvlText w:val=""/>
+      <w:lvlJc w:val="left"/>
+      <w:pPr>
+        <w:tabs>
+          <w:tab w:val="num" w:pos="6480"/>
+        </w:tabs>
+        <w:ind w:left="6480" w:hanging="360"/>
+      </w:pPr>
+      <w:rPr>
+        <w:rFonts w:ascii="Wingdings" w:hAnsi="Wingdings" w:hint="default"/>
+        <w:sz w:val="20"/>
+      </w:rPr>
+    </w:lvl>
+  </w:abstractNum>
+  <w:abstractNum w:abstractNumId="4" w15:restartNumberingAfterBreak="0">
+    <w:nsid w:val="4D0C09AA"/>
+    <w:multiLevelType w:val="multilevel"/>
+    <w:tmpl w:val="BED22768"/>
+    <w:lvl w:ilvl="0">
+      <w:start w:val="1"/>
+      <w:numFmt w:val="bullet"/>
+      <w:lvlText w:val=""/>
+      <w:lvlJc w:val="left"/>
+      <w:pPr>
+        <w:tabs>
+          <w:tab w:val="num" w:pos="720"/>
+        </w:tabs>
+        <w:ind w:left="720" w:hanging="360"/>
+      </w:pPr>
+      <w:rPr>
+        <w:rFonts w:ascii="Symbol" w:hAnsi="Symbol" w:hint="default"/>
+        <w:sz w:val="20"/>
+      </w:rPr>
+    </w:lvl>
+    <w:lvl w:ilvl="1" w:tentative="1">
+      <w:start w:val="1"/>
+      <w:numFmt w:val="bullet"/>
+      <w:lvlText w:val="o"/>
+      <w:lvlJc w:val="left"/>
+      <w:pPr>
+        <w:tabs>
+          <w:tab w:val="num" w:pos="1440"/>
+        </w:tabs>
+        <w:ind w:left="1440" w:hanging="360"/>
+      </w:pPr>
+      <w:rPr>
+        <w:rFonts w:ascii="Courier New" w:hAnsi="Courier New" w:hint="default"/>
+        <w:sz w:val="20"/>
+      </w:rPr>
+    </w:lvl>
+    <w:lvl w:ilvl="2" w:tentative="1">
+      <w:start w:val="1"/>
+      <w:numFmt w:val="bullet"/>
+      <w:lvlText w:val=""/>
+      <w:lvlJc w:val="left"/>
+      <w:pPr>
+        <w:tabs>
+          <w:tab w:val="num" w:pos="2160"/>
+        </w:tabs>
+        <w:ind w:left="2160" w:hanging="360"/>
+      </w:pPr>
+      <w:rPr>
+        <w:rFonts w:ascii="Wingdings" w:hAnsi="Wingdings" w:hint="default"/>
+        <w:sz w:val="20"/>
+      </w:rPr>
+    </w:lvl>
+    <w:lvl w:ilvl="3" w:tentative="1">
+      <w:start w:val="1"/>
+      <w:numFmt w:val="bullet"/>
+      <w:lvlText w:val=""/>
+      <w:lvlJc w:val="left"/>
+      <w:pPr>
+        <w:tabs>
+          <w:tab w:val="num" w:pos="2880"/>
+        </w:tabs>
+        <w:ind w:left="2880" w:hanging="360"/>
+      </w:pPr>
+      <w:rPr>
+        <w:rFonts w:ascii="Wingdings" w:hAnsi="Wingdings" w:hint="default"/>
+        <w:sz w:val="20"/>
+      </w:rPr>
+    </w:lvl>
+    <w:lvl w:ilvl="4" w:tentative="1">
+      <w:start w:val="1"/>
+      <w:numFmt w:val="bullet"/>
+      <w:lvlText w:val=""/>
+      <w:lvlJc w:val="left"/>
+      <w:pPr>
+        <w:tabs>
+          <w:tab w:val="num" w:pos="3600"/>
+        </w:tabs>
+        <w:ind w:left="3600" w:hanging="360"/>
+      </w:pPr>
+      <w:rPr>
+        <w:rFonts w:ascii="Wingdings" w:hAnsi="Wingdings" w:hint="default"/>
+        <w:sz w:val="20"/>
+      </w:rPr>
+    </w:lvl>
+    <w:lvl w:ilvl="5" w:tentative="1">
+      <w:start w:val="1"/>
+      <w:numFmt w:val="bullet"/>
+      <w:lvlText w:val=""/>
+      <w:lvlJc w:val="left"/>
+      <w:pPr>
+        <w:tabs>
+          <w:tab w:val="num" w:pos="4320"/>
+        </w:tabs>
+        <w:ind w:left="4320" w:hanging="360"/>
+      </w:pPr>
+      <w:rPr>
+        <w:rFonts w:ascii="Wingdings" w:hAnsi="Wingdings" w:hint="default"/>
+        <w:sz w:val="20"/>
+      </w:rPr>
+    </w:lvl>
+    <w:lvl w:ilvl="6" w:tentative="1">
+      <w:start w:val="1"/>
+      <w:numFmt w:val="bullet"/>
+      <w:lvlText w:val=""/>
+      <w:lvlJc w:val="left"/>
+      <w:pPr>
+        <w:tabs>
+          <w:tab w:val="num" w:pos="5040"/>
+        </w:tabs>
+        <w:ind w:left="5040" w:hanging="360"/>
+      </w:pPr>
+      <w:rPr>
+        <w:rFonts w:ascii="Wingdings" w:hAnsi="Wingdings" w:hint="default"/>
+        <w:sz w:val="20"/>
+      </w:rPr>
+    </w:lvl>
+    <w:lvl w:ilvl="7" w:tentative="1">
+      <w:start w:val="1"/>
+      <w:numFmt w:val="bullet"/>
+      <w:lvlText w:val=""/>
+      <w:lvlJc w:val="left"/>
+      <w:pPr>
+        <w:tabs>
+          <w:tab w:val="num" w:pos="5760"/>
+        </w:tabs>
+        <w:ind w:left="5760" w:hanging="360"/>
+      </w:pPr>
+      <w:rPr>
+        <w:rFonts w:ascii="Wingdings" w:hAnsi="Wingdings" w:hint="default"/>
+        <w:sz w:val="20"/>
+      </w:rPr>
+    </w:lvl>
+    <w:lvl w:ilvl="8" w:tentative="1">
+      <w:start w:val="1"/>
+      <w:numFmt w:val="bullet"/>
+      <w:lvlText w:val=""/>
+      <w:lvlJc w:val="left"/>
+      <w:pPr>
+        <w:tabs>
+          <w:tab w:val="num" w:pos="6480"/>
+        </w:tabs>
+        <w:ind w:left="6480" w:hanging="360"/>
+      </w:pPr>
+      <w:rPr>
+        <w:rFonts w:ascii="Wingdings" w:hAnsi="Wingdings" w:hint="default"/>
+        <w:sz w:val="20"/>
+      </w:rPr>
+    </w:lvl>
+  </w:abstractNum>
+  <w:abstractNum w:abstractNumId="5" w15:restartNumberingAfterBreak="0">
+    <w:nsid w:val="59F43A7D"/>
+    <w:multiLevelType w:val="multilevel"/>
+    <w:tmpl w:val="171279F6"/>
+    <w:lvl w:ilvl="0">
+      <w:start w:val="1"/>
+      <w:numFmt w:val="bullet"/>
+      <w:lvlText w:val=""/>
+      <w:lvlJc w:val="left"/>
+      <w:pPr>
+        <w:tabs>
+          <w:tab w:val="num" w:pos="720"/>
+        </w:tabs>
+        <w:ind w:left="720" w:hanging="360"/>
+      </w:pPr>
+      <w:rPr>
+        <w:rFonts w:ascii="Symbol" w:hAnsi="Symbol" w:hint="default"/>
+        <w:sz w:val="20"/>
+      </w:rPr>
+    </w:lvl>
+    <w:lvl w:ilvl="1" w:tentative="1">
+      <w:start w:val="1"/>
+      <w:numFmt w:val="bullet"/>
+      <w:lvlText w:val="o"/>
+      <w:lvlJc w:val="left"/>
+      <w:pPr>
+        <w:tabs>
+          <w:tab w:val="num" w:pos="1440"/>
+        </w:tabs>
+        <w:ind w:left="1440" w:hanging="360"/>
+      </w:pPr>
+      <w:rPr>
+        <w:rFonts w:ascii="Courier New" w:hAnsi="Courier New" w:hint="default"/>
+        <w:sz w:val="20"/>
+      </w:rPr>
+    </w:lvl>
+    <w:lvl w:ilvl="2" w:tentative="1">
+      <w:start w:val="1"/>
+      <w:numFmt w:val="bullet"/>
+      <w:lvlText w:val=""/>
+      <w:lvlJc w:val="left"/>
+      <w:pPr>
+        <w:tabs>
+          <w:tab w:val="num" w:pos="2160"/>
+        </w:tabs>
+        <w:ind w:left="2160" w:hanging="360"/>
+      </w:pPr>
+      <w:rPr>
+        <w:rFonts w:ascii="Wingdings" w:hAnsi="Wingdings" w:hint="default"/>
+        <w:sz w:val="20"/>
+      </w:rPr>
+    </w:lvl>
+    <w:lvl w:ilvl="3" w:tentative="1">
+      <w:start w:val="1"/>
+      <w:numFmt w:val="bullet"/>
+      <w:lvlText w:val=""/>
+      <w:lvlJc w:val="left"/>
+      <w:pPr>
+        <w:tabs>
+          <w:tab w:val="num" w:pos="2880"/>
+        </w:tabs>
+        <w:ind w:left="2880" w:hanging="360"/>
+      </w:pPr>
+      <w:rPr>
+        <w:rFonts w:ascii="Wingdings" w:hAnsi="Wingdings" w:hint="default"/>
+        <w:sz w:val="20"/>
+      </w:rPr>
+    </w:lvl>
+    <w:lvl w:ilvl="4" w:tentative="1">
+      <w:start w:val="1"/>
+      <w:numFmt w:val="bullet"/>
+      <w:lvlText w:val=""/>
+      <w:lvlJc w:val="left"/>
+      <w:pPr>
+        <w:tabs>
+          <w:tab w:val="num" w:pos="3600"/>
+        </w:tabs>
+        <w:ind w:left="3600" w:hanging="360"/>
+      </w:pPr>
+      <w:rPr>
+        <w:rFonts w:ascii="Wingdings" w:hAnsi="Wingdings" w:hint="default"/>
+        <w:sz w:val="20"/>
+      </w:rPr>
+    </w:lvl>
+    <w:lvl w:ilvl="5" w:tentative="1">
+      <w:start w:val="1"/>
+      <w:numFmt w:val="bullet"/>
+      <w:lvlText w:val=""/>
+      <w:lvlJc w:val="left"/>
+      <w:pPr>
+        <w:tabs>
+          <w:tab w:val="num" w:pos="4320"/>
+        </w:tabs>
+        <w:ind w:left="4320" w:hanging="360"/>
+      </w:pPr>
+      <w:rPr>
+        <w:rFonts w:ascii="Wingdings" w:hAnsi="Wingdings" w:hint="default"/>
+        <w:sz w:val="20"/>
+      </w:rPr>
+    </w:lvl>
+    <w:lvl w:ilvl="6" w:tentative="1">
+      <w:start w:val="1"/>
+      <w:numFmt w:val="bullet"/>
+      <w:lvlText w:val=""/>
+      <w:lvlJc w:val="left"/>
+      <w:pPr>
+        <w:tabs>
+          <w:tab w:val="num" w:pos="5040"/>
+        </w:tabs>
+        <w:ind w:left="5040" w:hanging="360"/>
+      </w:pPr>
+      <w:rPr>
+        <w:rFonts w:ascii="Wingdings" w:hAnsi="Wingdings" w:hint="default"/>
+        <w:sz w:val="20"/>
+      </w:rPr>
+    </w:lvl>
+    <w:lvl w:ilvl="7" w:tentative="1">
+      <w:start w:val="1"/>
+      <w:numFmt w:val="bullet"/>
+      <w:lvlText w:val=""/>
+      <w:lvlJc w:val="left"/>
+      <w:pPr>
+        <w:tabs>
+          <w:tab w:val="num" w:pos="5760"/>
+        </w:tabs>
+        <w:ind w:left="5760" w:hanging="360"/>
+      </w:pPr>
+      <w:rPr>
+        <w:rFonts w:ascii="Wingdings" w:hAnsi="Wingdings" w:hint="default"/>
+        <w:sz w:val="20"/>
+      </w:rPr>
+    </w:lvl>
+    <w:lvl w:ilvl="8" w:tentative="1">
+      <w:start w:val="1"/>
+      <w:numFmt w:val="bullet"/>
+      <w:lvlText w:val=""/>
+      <w:lvlJc w:val="left"/>
+      <w:pPr>
+        <w:tabs>
+          <w:tab w:val="num" w:pos="6480"/>
+        </w:tabs>
+        <w:ind w:left="6480" w:hanging="360"/>
+      </w:pPr>
+      <w:rPr>
+        <w:rFonts w:ascii="Wingdings" w:hAnsi="Wingdings" w:hint="default"/>
+        <w:sz w:val="20"/>
+      </w:rPr>
+    </w:lvl>
+  </w:abstractNum>
+  <w:abstractNum w:abstractNumId="6" w15:restartNumberingAfterBreak="0">
+    <w:nsid w:val="5B855244"/>
+    <w:multiLevelType w:val="multilevel"/>
+    <w:tmpl w:val="987E8FD2"/>
+    <w:lvl w:ilvl="0">
+      <w:start w:val="1"/>
+      <w:numFmt w:val="bullet"/>
+      <w:lvlText w:val=""/>
+      <w:lvlJc w:val="left"/>
+      <w:pPr>
+        <w:tabs>
+          <w:tab w:val="num" w:pos="720"/>
+        </w:tabs>
+        <w:ind w:left="720" w:hanging="360"/>
+      </w:pPr>
+      <w:rPr>
+        <w:rFonts w:ascii="Symbol" w:hAnsi="Symbol" w:hint="default"/>
+        <w:sz w:val="20"/>
+      </w:rPr>
+    </w:lvl>
+    <w:lvl w:ilvl="1" w:tentative="1">
+      <w:start w:val="1"/>
+      <w:numFmt w:val="bullet"/>
+      <w:lvlText w:val="o"/>
+      <w:lvlJc w:val="left"/>
+      <w:pPr>
+        <w:tabs>
+          <w:tab w:val="num" w:pos="1440"/>
+        </w:tabs>
+        <w:ind w:left="1440" w:hanging="360"/>
+      </w:pPr>
+      <w:rPr>
+        <w:rFonts w:ascii="Courier New" w:hAnsi="Courier New" w:hint="default"/>
+        <w:sz w:val="20"/>
+      </w:rPr>
+    </w:lvl>
+    <w:lvl w:ilvl="2" w:tentative="1">
+      <w:start w:val="1"/>
+      <w:numFmt w:val="bullet"/>
+      <w:lvlText w:val=""/>
+      <w:lvlJc w:val="left"/>
+      <w:pPr>
+        <w:tabs>
+          <w:tab w:val="num" w:pos="2160"/>
+        </w:tabs>
+        <w:ind w:left="2160" w:hanging="360"/>
+      </w:pPr>
+      <w:rPr>
+        <w:rFonts w:ascii="Wingdings" w:hAnsi="Wingdings" w:hint="default"/>
+        <w:sz w:val="20"/>
+      </w:rPr>
+    </w:lvl>
+    <w:lvl w:ilvl="3" w:tentative="1">
+      <w:start w:val="1"/>
+      <w:numFmt w:val="bullet"/>
+      <w:lvlText w:val=""/>
+      <w:lvlJc w:val="left"/>
+      <w:pPr>
+        <w:tabs>
+          <w:tab w:val="num" w:pos="2880"/>
+        </w:tabs>
+        <w:ind w:left="2880" w:hanging="360"/>
+      </w:pPr>
+      <w:rPr>
+        <w:rFonts w:ascii="Wingdings" w:hAnsi="Wingdings" w:hint="default"/>
+        <w:sz w:val="20"/>
+      </w:rPr>
+    </w:lvl>
+    <w:lvl w:ilvl="4" w:tentative="1">
+      <w:start w:val="1"/>
+      <w:numFmt w:val="bullet"/>
+      <w:lvlText w:val=""/>
+      <w:lvlJc w:val="left"/>
+      <w:pPr>
+        <w:tabs>
+          <w:tab w:val="num" w:pos="3600"/>
+        </w:tabs>
+        <w:ind w:left="3600" w:hanging="360"/>
+      </w:pPr>
+      <w:rPr>
+        <w:rFonts w:ascii="Wingdings" w:hAnsi="Wingdings" w:hint="default"/>
+        <w:sz w:val="20"/>
+      </w:rPr>
+    </w:lvl>
+    <w:lvl w:ilvl="5" w:tentative="1">
+      <w:start w:val="1"/>
+      <w:numFmt w:val="bullet"/>
+      <w:lvlText w:val=""/>
+      <w:lvlJc w:val="left"/>
+      <w:pPr>
+        <w:tabs>
+          <w:tab w:val="num" w:pos="4320"/>
+        </w:tabs>
+        <w:ind w:left="4320" w:hanging="360"/>
+      </w:pPr>
+      <w:rPr>
+        <w:rFonts w:ascii="Wingdings" w:hAnsi="Wingdings" w:hint="default"/>
+        <w:sz w:val="20"/>
+      </w:rPr>
+    </w:lvl>
+    <w:lvl w:ilvl="6" w:tentative="1">
+      <w:start w:val="1"/>
+      <w:numFmt w:val="bullet"/>
+      <w:lvlText w:val=""/>
+      <w:lvlJc w:val="left"/>
+      <w:pPr>
+        <w:tabs>
+          <w:tab w:val="num" w:pos="5040"/>
+        </w:tabs>
+        <w:ind w:left="5040" w:hanging="360"/>
+      </w:pPr>
+      <w:rPr>
+        <w:rFonts w:ascii="Wingdings" w:hAnsi="Wingdings" w:hint="default"/>
+        <w:sz w:val="20"/>
+      </w:rPr>
+    </w:lvl>
+    <w:lvl w:ilvl="7" w:tentative="1">
+      <w:start w:val="1"/>
+      <w:numFmt w:val="bullet"/>
+      <w:lvlText w:val=""/>
+      <w:lvlJc w:val="left"/>
+      <w:pPr>
+        <w:tabs>
+          <w:tab w:val="num" w:pos="5760"/>
+        </w:tabs>
+        <w:ind w:left="5760" w:hanging="360"/>
+      </w:pPr>
+      <w:rPr>
+        <w:rFonts w:ascii="Wingdings" w:hAnsi="Wingdings" w:hint="default"/>
+        <w:sz w:val="20"/>
+      </w:rPr>
+    </w:lvl>
+    <w:lvl w:ilvl="8" w:tentative="1">
+      <w:start w:val="1"/>
+      <w:numFmt w:val="bullet"/>
+      <w:lvlText w:val=""/>
+      <w:lvlJc w:val="left"/>
+      <w:pPr>
+        <w:tabs>
+          <w:tab w:val="num" w:pos="6480"/>
+        </w:tabs>
+        <w:ind w:left="6480" w:hanging="360"/>
+      </w:pPr>
+      <w:rPr>
+        <w:rFonts w:ascii="Wingdings" w:hAnsi="Wingdings" w:hint="default"/>
+        <w:sz w:val="20"/>
+      </w:rPr>
+    </w:lvl>
+  </w:abstractNum>
+  <w:abstractNum w:abstractNumId="7" w15:restartNumberingAfterBreak="0">
+    <w:nsid w:val="658A3980"/>
+    <w:multiLevelType w:val="multilevel"/>
+    <w:tmpl w:val="223CAA3C"/>
+    <w:lvl w:ilvl="0">
+      <w:start w:val="1"/>
+      <w:numFmt w:val="bullet"/>
+      <w:lvlText w:val=""/>
+      <w:lvlJc w:val="left"/>
+      <w:pPr>
+        <w:tabs>
+          <w:tab w:val="num" w:pos="720"/>
+        </w:tabs>
+        <w:ind w:left="720" w:hanging="360"/>
+      </w:pPr>
+      <w:rPr>
+        <w:rFonts w:ascii="Symbol" w:hAnsi="Symbol" w:hint="default"/>
+        <w:sz w:val="20"/>
+      </w:rPr>
+    </w:lvl>
+    <w:lvl w:ilvl="1" w:tentative="1">
+      <w:start w:val="1"/>
+      <w:numFmt w:val="bullet"/>
+      <w:lvlText w:val="o"/>
+      <w:lvlJc w:val="left"/>
+      <w:pPr>
+        <w:tabs>
+          <w:tab w:val="num" w:pos="1440"/>
+        </w:tabs>
+        <w:ind w:left="1440" w:hanging="360"/>
+      </w:pPr>
+      <w:rPr>
+        <w:rFonts w:ascii="Courier New" w:hAnsi="Courier New" w:hint="default"/>
+        <w:sz w:val="20"/>
+      </w:rPr>
+    </w:lvl>
+    <w:lvl w:ilvl="2" w:tentative="1">
+      <w:start w:val="1"/>
+      <w:numFmt w:val="bullet"/>
+      <w:lvlText w:val=""/>
+      <w:lvlJc w:val="left"/>
+      <w:pPr>
+        <w:tabs>
+          <w:tab w:val="num" w:pos="2160"/>
+        </w:tabs>
+        <w:ind w:left="2160" w:hanging="360"/>
+      </w:pPr>
+      <w:rPr>
+        <w:rFonts w:ascii="Wingdings" w:hAnsi="Wingdings" w:hint="default"/>
+        <w:sz w:val="20"/>
+      </w:rPr>
+    </w:lvl>
+    <w:lvl w:ilvl="3" w:tentative="1">
+      <w:start w:val="1"/>
+      <w:numFmt w:val="bullet"/>
+      <w:lvlText w:val=""/>
+      <w:lvlJc w:val="left"/>
+      <w:pPr>
+        <w:tabs>
+          <w:tab w:val="num" w:pos="2880"/>
+        </w:tabs>
+        <w:ind w:left="2880" w:hanging="360"/>
+      </w:pPr>
+      <w:rPr>
+        <w:rFonts w:ascii="Wingdings" w:hAnsi="Wingdings" w:hint="default"/>
+        <w:sz w:val="20"/>
+      </w:rPr>
+    </w:lvl>
+    <w:lvl w:ilvl="4" w:tentative="1">
+      <w:start w:val="1"/>
+      <w:numFmt w:val="bullet"/>
+      <w:lvlText w:val=""/>
+      <w:lvlJc w:val="left"/>
+      <w:pPr>
+        <w:tabs>
+          <w:tab w:val="num" w:pos="3600"/>
+        </w:tabs>
+        <w:ind w:left="3600" w:hanging="360"/>
+      </w:pPr>
+      <w:rPr>
+        <w:rFonts w:ascii="Wingdings" w:hAnsi="Wingdings" w:hint="default"/>
+        <w:sz w:val="20"/>
+      </w:rPr>
+    </w:lvl>
+    <w:lvl w:ilvl="5" w:tentative="1">
+      <w:start w:val="1"/>
+      <w:numFmt w:val="bullet"/>
+      <w:lvlText w:val=""/>
+      <w:lvlJc w:val="left"/>
+      <w:pPr>
+        <w:tabs>
+          <w:tab w:val="num" w:pos="4320"/>
+        </w:tabs>
+        <w:ind w:left="4320" w:hanging="360"/>
+      </w:pPr>
+      <w:rPr>
+        <w:rFonts w:ascii="Wingdings" w:hAnsi="Wingdings" w:hint="default"/>
+        <w:sz w:val="20"/>
+      </w:rPr>
+    </w:lvl>
+    <w:lvl w:ilvl="6" w:tentative="1">
+      <w:start w:val="1"/>
+      <w:numFmt w:val="bullet"/>
+      <w:lvlText w:val=""/>
+      <w:lvlJc w:val="left"/>
+      <w:pPr>
+        <w:tabs>
+          <w:tab w:val="num" w:pos="5040"/>
+        </w:tabs>
+        <w:ind w:left="5040" w:hanging="360"/>
+      </w:pPr>
+      <w:rPr>
+        <w:rFonts w:ascii="Wingdings" w:hAnsi="Wingdings" w:hint="default"/>
+        <w:sz w:val="20"/>
+      </w:rPr>
+    </w:lvl>
+    <w:lvl w:ilvl="7" w:tentative="1">
+      <w:start w:val="1"/>
+      <w:numFmt w:val="bullet"/>
+      <w:lvlText w:val=""/>
+      <w:lvlJc w:val="left"/>
+      <w:pPr>
+        <w:tabs>
+          <w:tab w:val="num" w:pos="5760"/>
+        </w:tabs>
+        <w:ind w:left="5760" w:hanging="360"/>
+      </w:pPr>
+      <w:rPr>
+        <w:rFonts w:ascii="Wingdings" w:hAnsi="Wingdings" w:hint="default"/>
+        <w:sz w:val="20"/>
+      </w:rPr>
+    </w:lvl>
+    <w:lvl w:ilvl="8" w:tentative="1">
+      <w:start w:val="1"/>
+      <w:numFmt w:val="bullet"/>
+      <w:lvlText w:val=""/>
+      <w:lvlJc w:val="left"/>
+      <w:pPr>
+        <w:tabs>
+          <w:tab w:val="num" w:pos="6480"/>
+        </w:tabs>
+        <w:ind w:left="6480" w:hanging="360"/>
+      </w:pPr>
+      <w:rPr>
+        <w:rFonts w:ascii="Wingdings" w:hAnsi="Wingdings" w:hint="default"/>
+        <w:sz w:val="20"/>
+      </w:rPr>
+    </w:lvl>
+  </w:abstractNum>
+  <w:abstractNum w:abstractNumId="8" w15:restartNumberingAfterBreak="0">
+    <w:nsid w:val="689E3E83"/>
+    <w:multiLevelType w:val="multilevel"/>
+    <w:tmpl w:val="B6CC4AE0"/>
+    <w:lvl w:ilvl="0">
+      <w:start w:val="1"/>
+      <w:numFmt w:val="bullet"/>
+      <w:lvlText w:val=""/>
+      <w:lvlJc w:val="left"/>
+      <w:pPr>
+        <w:tabs>
+          <w:tab w:val="num" w:pos="720"/>
+        </w:tabs>
+        <w:ind w:left="720" w:hanging="360"/>
+      </w:pPr>
+      <w:rPr>
+        <w:rFonts w:ascii="Symbol" w:hAnsi="Symbol" w:hint="default"/>
+        <w:sz w:val="20"/>
+      </w:rPr>
+    </w:lvl>
+    <w:lvl w:ilvl="1" w:tentative="1">
+      <w:start w:val="1"/>
+      <w:numFmt w:val="bullet"/>
+      <w:lvlText w:val="o"/>
+      <w:lvlJc w:val="left"/>
+      <w:pPr>
+        <w:tabs>
+          <w:tab w:val="num" w:pos="1440"/>
+        </w:tabs>
+        <w:ind w:left="1440" w:hanging="360"/>
+      </w:pPr>
+      <w:rPr>
+        <w:rFonts w:ascii="Courier New" w:hAnsi="Courier New" w:hint="default"/>
+        <w:sz w:val="20"/>
+      </w:rPr>
+    </w:lvl>
+    <w:lvl w:ilvl="2" w:tentative="1">
+      <w:start w:val="1"/>
+      <w:numFmt w:val="bullet"/>
+      <w:lvlText w:val=""/>
+      <w:lvlJc w:val="left"/>
+      <w:pPr>
+        <w:tabs>
+          <w:tab w:val="num" w:pos="2160"/>
+        </w:tabs>
+        <w:ind w:left="2160" w:hanging="360"/>
+      </w:pPr>
+      <w:rPr>
+        <w:rFonts w:ascii="Wingdings" w:hAnsi="Wingdings" w:hint="default"/>
+        <w:sz w:val="20"/>
+      </w:rPr>
+    </w:lvl>
+    <w:lvl w:ilvl="3" w:tentative="1">
+      <w:start w:val="1"/>
+      <w:numFmt w:val="bullet"/>
+      <w:lvlText w:val=""/>
+      <w:lvlJc w:val="left"/>
+      <w:pPr>
+        <w:tabs>
+          <w:tab w:val="num" w:pos="2880"/>
+        </w:tabs>
+        <w:ind w:left="2880" w:hanging="360"/>
+      </w:pPr>
+      <w:rPr>
+        <w:rFonts w:ascii="Wingdings" w:hAnsi="Wingdings" w:hint="default"/>
+        <w:sz w:val="20"/>
+      </w:rPr>
+    </w:lvl>
+    <w:lvl w:ilvl="4" w:tentative="1">
+      <w:start w:val="1"/>
+      <w:numFmt w:val="bullet"/>
+      <w:lvlText w:val=""/>
+      <w:lvlJc w:val="left"/>
+      <w:pPr>
+        <w:tabs>
+          <w:tab w:val="num" w:pos="3600"/>
+        </w:tabs>
+        <w:ind w:left="3600" w:hanging="360"/>
+      </w:pPr>
+      <w:rPr>
+        <w:rFonts w:ascii="Wingdings" w:hAnsi="Wingdings" w:hint="default"/>
+        <w:sz w:val="20"/>
+      </w:rPr>
+    </w:lvl>
+    <w:lvl w:ilvl="5" w:tentative="1">
+      <w:start w:val="1"/>
+      <w:numFmt w:val="bullet"/>
+      <w:lvlText w:val=""/>
+      <w:lvlJc w:val="left"/>
+      <w:pPr>
+        <w:tabs>
+          <w:tab w:val="num" w:pos="4320"/>
+        </w:tabs>
+        <w:ind w:left="4320" w:hanging="360"/>
+      </w:pPr>
+      <w:rPr>
+        <w:rFonts w:ascii="Wingdings" w:hAnsi="Wingdings" w:hint="default"/>
+        <w:sz w:val="20"/>
+      </w:rPr>
+    </w:lvl>
+    <w:lvl w:ilvl="6" w:tentative="1">
+      <w:start w:val="1"/>
+      <w:numFmt w:val="bullet"/>
+      <w:lvlText w:val=""/>
+      <w:lvlJc w:val="left"/>
+      <w:pPr>
+        <w:tabs>
+          <w:tab w:val="num" w:pos="5040"/>
+        </w:tabs>
+        <w:ind w:left="5040" w:hanging="360"/>
+      </w:pPr>
+      <w:rPr>
+        <w:rFonts w:ascii="Wingdings" w:hAnsi="Wingdings" w:hint="default"/>
+        <w:sz w:val="20"/>
+      </w:rPr>
+    </w:lvl>
+    <w:lvl w:ilvl="7" w:tentative="1">
+      <w:start w:val="1"/>
+      <w:numFmt w:val="bullet"/>
+      <w:lvlText w:val=""/>
+      <w:lvlJc w:val="left"/>
+      <w:pPr>
+        <w:tabs>
+          <w:tab w:val="num" w:pos="5760"/>
+        </w:tabs>
+        <w:ind w:left="5760" w:hanging="360"/>
+      </w:pPr>
+      <w:rPr>
+        <w:rFonts w:ascii="Wingdings" w:hAnsi="Wingdings" w:hint="default"/>
+        <w:sz w:val="20"/>
+      </w:rPr>
+    </w:lvl>
+    <w:lvl w:ilvl="8" w:tentative="1">
+      <w:start w:val="1"/>
+      <w:numFmt w:val="bullet"/>
+      <w:lvlText w:val=""/>
+      <w:lvlJc w:val="left"/>
+      <w:pPr>
+        <w:tabs>
+          <w:tab w:val="num" w:pos="6480"/>
+        </w:tabs>
+        <w:ind w:left="6480" w:hanging="360"/>
+      </w:pPr>
+      <w:rPr>
+        <w:rFonts w:ascii="Wingdings" w:hAnsi="Wingdings" w:hint="default"/>
+        <w:sz w:val="20"/>
+      </w:rPr>
+    </w:lvl>
+  </w:abstractNum>
+  <w:abstractNum w:abstractNumId="9" w15:restartNumberingAfterBreak="0">
+    <w:nsid w:val="68FE2EDA"/>
+    <w:multiLevelType w:val="multilevel"/>
+    <w:tmpl w:val="34E0CCFC"/>
+    <w:lvl w:ilvl="0">
+      <w:start w:val="1"/>
+      <w:numFmt w:val="bullet"/>
+      <w:lvlText w:val=""/>
+      <w:lvlJc w:val="left"/>
+      <w:pPr>
+        <w:tabs>
+          <w:tab w:val="num" w:pos="720"/>
+        </w:tabs>
+        <w:ind w:left="720" w:hanging="360"/>
+      </w:pPr>
+      <w:rPr>
+        <w:rFonts w:ascii="Symbol" w:hAnsi="Symbol" w:hint="default"/>
+        <w:sz w:val="20"/>
+      </w:rPr>
+    </w:lvl>
+    <w:lvl w:ilvl="1" w:tentative="1">
+      <w:start w:val="1"/>
+      <w:numFmt w:val="bullet"/>
+      <w:lvlText w:val="o"/>
+      <w:lvlJc w:val="left"/>
+      <w:pPr>
+        <w:tabs>
+          <w:tab w:val="num" w:pos="1440"/>
+        </w:tabs>
+        <w:ind w:left="1440" w:hanging="360"/>
+      </w:pPr>
+      <w:rPr>
+        <w:rFonts w:ascii="Courier New" w:hAnsi="Courier New" w:hint="default"/>
+        <w:sz w:val="20"/>
+      </w:rPr>
+    </w:lvl>
+    <w:lvl w:ilvl="2" w:tentative="1">
+      <w:start w:val="1"/>
+      <w:numFmt w:val="bullet"/>
+      <w:lvlText w:val=""/>
+      <w:lvlJc w:val="left"/>
+      <w:pPr>
+        <w:tabs>
+          <w:tab w:val="num" w:pos="2160"/>
+        </w:tabs>
+        <w:ind w:left="2160" w:hanging="360"/>
+      </w:pPr>
+      <w:rPr>
+        <w:rFonts w:ascii="Wingdings" w:hAnsi="Wingdings" w:hint="default"/>
+        <w:sz w:val="20"/>
+      </w:rPr>
+    </w:lvl>
+    <w:lvl w:ilvl="3" w:tentative="1">
+      <w:start w:val="1"/>
+      <w:numFmt w:val="bullet"/>
+      <w:lvlText w:val=""/>
+      <w:lvlJc w:val="left"/>
+      <w:pPr>
+        <w:tabs>
+          <w:tab w:val="num" w:pos="2880"/>
+        </w:tabs>
+        <w:ind w:left="2880" w:hanging="360"/>
+      </w:pPr>
+      <w:rPr>
+        <w:rFonts w:ascii="Wingdings" w:hAnsi="Wingdings" w:hint="default"/>
+        <w:sz w:val="20"/>
+      </w:rPr>
+    </w:lvl>
+    <w:lvl w:ilvl="4" w:tentative="1">
+      <w:start w:val="1"/>
+      <w:numFmt w:val="bullet"/>
+      <w:lvlText w:val=""/>
+      <w:lvlJc w:val="left"/>
+      <w:pPr>
+        <w:tabs>
+          <w:tab w:val="num" w:pos="3600"/>
+        </w:tabs>
+        <w:ind w:left="3600" w:hanging="360"/>
+      </w:pPr>
+      <w:rPr>
+        <w:rFonts w:ascii="Wingdings" w:hAnsi="Wingdings" w:hint="default"/>
+        <w:sz w:val="20"/>
+      </w:rPr>
+    </w:lvl>
+    <w:lvl w:ilvl="5" w:tentative="1">
+      <w:start w:val="1"/>
+      <w:numFmt w:val="bullet"/>
+      <w:lvlText w:val=""/>
+      <w:lvlJc w:val="left"/>
+      <w:pPr>
+        <w:tabs>
+          <w:tab w:val="num" w:pos="4320"/>
+        </w:tabs>
+        <w:ind w:left="4320" w:hanging="360"/>
+      </w:pPr>
+      <w:rPr>
+        <w:rFonts w:ascii="Wingdings" w:hAnsi="Wingdings" w:hint="default"/>
+        <w:sz w:val="20"/>
+      </w:rPr>
+    </w:lvl>
+    <w:lvl w:ilvl="6" w:tentative="1">
+      <w:start w:val="1"/>
+      <w:numFmt w:val="bullet"/>
+      <w:lvlText w:val=""/>
+      <w:lvlJc w:val="left"/>
+      <w:pPr>
+        <w:tabs>
+          <w:tab w:val="num" w:pos="5040"/>
+        </w:tabs>
+        <w:ind w:left="5040" w:hanging="360"/>
+      </w:pPr>
+      <w:rPr>
+        <w:rFonts w:ascii="Wingdings" w:hAnsi="Wingdings" w:hint="default"/>
+        <w:sz w:val="20"/>
+      </w:rPr>
+    </w:lvl>
+    <w:lvl w:ilvl="7" w:tentative="1">
+      <w:start w:val="1"/>
+      <w:numFmt w:val="bullet"/>
+      <w:lvlText w:val=""/>
+      <w:lvlJc w:val="left"/>
+      <w:pPr>
+        <w:tabs>
+          <w:tab w:val="num" w:pos="5760"/>
+        </w:tabs>
+        <w:ind w:left="5760" w:hanging="360"/>
+      </w:pPr>
+      <w:rPr>
+        <w:rFonts w:ascii="Wingdings" w:hAnsi="Wingdings" w:hint="default"/>
+        <w:sz w:val="20"/>
+      </w:rPr>
+    </w:lvl>
+    <w:lvl w:ilvl="8" w:tentative="1">
+      <w:start w:val="1"/>
+      <w:numFmt w:val="bullet"/>
+      <w:lvlText w:val=""/>
+      <w:lvlJc w:val="left"/>
+      <w:pPr>
+        <w:tabs>
+          <w:tab w:val="num" w:pos="6480"/>
+        </w:tabs>
+        <w:ind w:left="6480" w:hanging="360"/>
+      </w:pPr>
+      <w:rPr>
+        <w:rFonts w:ascii="Wingdings" w:hAnsi="Wingdings" w:hint="default"/>
+        <w:sz w:val="20"/>
+      </w:rPr>
+    </w:lvl>
+  </w:abstractNum>
+  <w:abstractNum w:abstractNumId="10" w15:restartNumberingAfterBreak="0">
+    <w:nsid w:val="6EDB2630"/>
+    <w:multiLevelType w:val="multilevel"/>
+    <w:tmpl w:val="82DEE5FE"/>
+    <w:lvl w:ilvl="0">
+      <w:start w:val="1"/>
+      <w:numFmt w:val="bullet"/>
+      <w:lvlText w:val=""/>
+      <w:lvlJc w:val="left"/>
+      <w:pPr>
+        <w:tabs>
+          <w:tab w:val="num" w:pos="720"/>
+        </w:tabs>
+        <w:ind w:left="720" w:hanging="360"/>
+      </w:pPr>
+      <w:rPr>
+        <w:rFonts w:ascii="Symbol" w:hAnsi="Symbol" w:hint="default"/>
+        <w:sz w:val="20"/>
+      </w:rPr>
+    </w:lvl>
+    <w:lvl w:ilvl="1" w:tentative="1">
+      <w:start w:val="1"/>
+      <w:numFmt w:val="bullet"/>
+      <w:lvlText w:val="o"/>
+      <w:lvlJc w:val="left"/>
+      <w:pPr>
+        <w:tabs>
+          <w:tab w:val="num" w:pos="1440"/>
+        </w:tabs>
+        <w:ind w:left="1440" w:hanging="360"/>
+      </w:pPr>
+      <w:rPr>
+        <w:rFonts w:ascii="Courier New" w:hAnsi="Courier New" w:hint="default"/>
+        <w:sz w:val="20"/>
+      </w:rPr>
+    </w:lvl>
+    <w:lvl w:ilvl="2" w:tentative="1">
+      <w:start w:val="1"/>
+      <w:numFmt w:val="bullet"/>
+      <w:lvlText w:val=""/>
+      <w:lvlJc w:val="left"/>
+      <w:pPr>
+        <w:tabs>
+          <w:tab w:val="num" w:pos="2160"/>
+        </w:tabs>
+        <w:ind w:left="2160" w:hanging="360"/>
+      </w:pPr>
+      <w:rPr>
+        <w:rFonts w:ascii="Wingdings" w:hAnsi="Wingdings" w:hint="default"/>
+        <w:sz w:val="20"/>
+      </w:rPr>
+    </w:lvl>
+    <w:lvl w:ilvl="3" w:tentative="1">
+      <w:start w:val="1"/>
+      <w:numFmt w:val="bullet"/>
+      <w:lvlText w:val=""/>
+      <w:lvlJc w:val="left"/>
+      <w:pPr>
+        <w:tabs>
+          <w:tab w:val="num" w:pos="2880"/>
+        </w:tabs>
+        <w:ind w:left="2880" w:hanging="360"/>
+      </w:pPr>
+      <w:rPr>
+        <w:rFonts w:ascii="Wingdings" w:hAnsi="Wingdings" w:hint="default"/>
+        <w:sz w:val="20"/>
+      </w:rPr>
+    </w:lvl>
+    <w:lvl w:ilvl="4" w:tentative="1">
+      <w:start w:val="1"/>
+      <w:numFmt w:val="bullet"/>
+      <w:lvlText w:val=""/>
+      <w:lvlJc w:val="left"/>
+      <w:pPr>
+        <w:tabs>
+          <w:tab w:val="num" w:pos="3600"/>
+        </w:tabs>
+        <w:ind w:left="3600" w:hanging="360"/>
+      </w:pPr>
+      <w:rPr>
+        <w:rFonts w:ascii="Wingdings" w:hAnsi="Wingdings" w:hint="default"/>
+        <w:sz w:val="20"/>
+      </w:rPr>
+    </w:lvl>
+    <w:lvl w:ilvl="5" w:tentative="1">
+      <w:start w:val="1"/>
+      <w:numFmt w:val="bullet"/>
+      <w:lvlText w:val=""/>
+      <w:lvlJc w:val="left"/>
+      <w:pPr>
+        <w:tabs>
+          <w:tab w:val="num" w:pos="4320"/>
+        </w:tabs>
+        <w:ind w:left="4320" w:hanging="360"/>
+      </w:pPr>
+      <w:rPr>
+        <w:rFonts w:ascii="Wingdings" w:hAnsi="Wingdings" w:hint="default"/>
+        <w:sz w:val="20"/>
+      </w:rPr>
+    </w:lvl>
+    <w:lvl w:ilvl="6" w:tentative="1">
+      <w:start w:val="1"/>
+      <w:numFmt w:val="bullet"/>
+      <w:lvlText w:val=""/>
+      <w:lvlJc w:val="left"/>
+      <w:pPr>
+        <w:tabs>
+          <w:tab w:val="num" w:pos="5040"/>
+        </w:tabs>
+        <w:ind w:left="5040" w:hanging="360"/>
+      </w:pPr>
+      <w:rPr>
+        <w:rFonts w:ascii="Wingdings" w:hAnsi="Wingdings" w:hint="default"/>
+        <w:sz w:val="20"/>
+      </w:rPr>
+    </w:lvl>
+    <w:lvl w:ilvl="7" w:tentative="1">
+      <w:start w:val="1"/>
+      <w:numFmt w:val="bullet"/>
+      <w:lvlText w:val=""/>
+      <w:lvlJc w:val="left"/>
+      <w:pPr>
+        <w:tabs>
+          <w:tab w:val="num" w:pos="5760"/>
+        </w:tabs>
+        <w:ind w:left="5760" w:hanging="360"/>
+      </w:pPr>
+      <w:rPr>
+        <w:rFonts w:ascii="Wingdings" w:hAnsi="Wingdings" w:hint="default"/>
+        <w:sz w:val="20"/>
+      </w:rPr>
+    </w:lvl>
+    <w:lvl w:ilvl="8" w:tentative="1">
+      <w:start w:val="1"/>
+      <w:numFmt w:val="bullet"/>
+      <w:lvlText w:val=""/>
+      <w:lvlJc w:val="left"/>
+      <w:pPr>
+        <w:tabs>
+          <w:tab w:val="num" w:pos="6480"/>
+        </w:tabs>
+        <w:ind w:left="6480" w:hanging="360"/>
+      </w:pPr>
+      <w:rPr>
+        <w:rFonts w:ascii="Wingdings" w:hAnsi="Wingdings" w:hint="default"/>
+        <w:sz w:val="20"/>
+      </w:rPr>
+    </w:lvl>
+  </w:abstractNum>
+  <w:abstractNum w:abstractNumId="11" w15:restartNumberingAfterBreak="0">
+    <w:nsid w:val="77210603"/>
+    <w:multiLevelType w:val="multilevel"/>
+    <w:tmpl w:val="C7B4F054"/>
+    <w:lvl w:ilvl="0">
+      <w:start w:val="1"/>
+      <w:numFmt w:val="bullet"/>
+      <w:lvlText w:val=""/>
+      <w:lvlJc w:val="left"/>
+      <w:pPr>
+        <w:tabs>
+          <w:tab w:val="num" w:pos="720"/>
+        </w:tabs>
+        <w:ind w:left="720" w:hanging="360"/>
+      </w:pPr>
+      <w:rPr>
+        <w:rFonts w:ascii="Symbol" w:hAnsi="Symbol" w:hint="default"/>
+        <w:sz w:val="20"/>
+      </w:rPr>
+    </w:lvl>
+    <w:lvl w:ilvl="1" w:tentative="1">
+      <w:start w:val="1"/>
+      <w:numFmt w:val="bullet"/>
+      <w:lvlText w:val="o"/>
+      <w:lvlJc w:val="left"/>
+      <w:pPr>
+        <w:tabs>
+          <w:tab w:val="num" w:pos="1440"/>
+        </w:tabs>
+        <w:ind w:left="1440" w:hanging="360"/>
+      </w:pPr>
+      <w:rPr>
+        <w:rFonts w:ascii="Courier New" w:hAnsi="Courier New" w:hint="default"/>
+        <w:sz w:val="20"/>
+      </w:rPr>
+    </w:lvl>
+    <w:lvl w:ilvl="2" w:tentative="1">
+      <w:start w:val="1"/>
+      <w:numFmt w:val="bullet"/>
+      <w:lvlText w:val=""/>
+      <w:lvlJc w:val="left"/>
+      <w:pPr>
+        <w:tabs>
+          <w:tab w:val="num" w:pos="2160"/>
+        </w:tabs>
+        <w:ind w:left="2160" w:hanging="360"/>
+      </w:pPr>
+      <w:rPr>
+        <w:rFonts w:ascii="Wingdings" w:hAnsi="Wingdings" w:hint="default"/>
+        <w:sz w:val="20"/>
+      </w:rPr>
+    </w:lvl>
+    <w:lvl w:ilvl="3" w:tentative="1">
+      <w:start w:val="1"/>
+      <w:numFmt w:val="bullet"/>
+      <w:lvlText w:val=""/>
+      <w:lvlJc w:val="left"/>
+      <w:pPr>
+        <w:tabs>
+          <w:tab w:val="num" w:pos="2880"/>
+        </w:tabs>
+        <w:ind w:left="2880" w:hanging="360"/>
+      </w:pPr>
+      <w:rPr>
+        <w:rFonts w:ascii="Wingdings" w:hAnsi="Wingdings" w:hint="default"/>
+        <w:sz w:val="20"/>
+      </w:rPr>
+    </w:lvl>
+    <w:lvl w:ilvl="4" w:tentative="1">
+      <w:start w:val="1"/>
+      <w:numFmt w:val="bullet"/>
+      <w:lvlText w:val=""/>
+      <w:lvlJc w:val="left"/>
+      <w:pPr>
+        <w:tabs>
+          <w:tab w:val="num" w:pos="3600"/>
+        </w:tabs>
+        <w:ind w:left="3600" w:hanging="360"/>
+      </w:pPr>
+      <w:rPr>
+        <w:rFonts w:ascii="Wingdings" w:hAnsi="Wingdings" w:hint="default"/>
+        <w:sz w:val="20"/>
+      </w:rPr>
+    </w:lvl>
+    <w:lvl w:ilvl="5" w:tentative="1">
+      <w:start w:val="1"/>
+      <w:numFmt w:val="bullet"/>
+      <w:lvlText w:val=""/>
+      <w:lvlJc w:val="left"/>
+      <w:pPr>
+        <w:tabs>
+          <w:tab w:val="num" w:pos="4320"/>
+        </w:tabs>
+        <w:ind w:left="4320" w:hanging="360"/>
+      </w:pPr>
+      <w:rPr>
+        <w:rFonts w:ascii="Wingdings" w:hAnsi="Wingdings" w:hint="default"/>
+        <w:sz w:val="20"/>
+      </w:rPr>
+    </w:lvl>
+    <w:lvl w:ilvl="6" w:tentative="1">
+      <w:start w:val="1"/>
+      <w:numFmt w:val="bullet"/>
+      <w:lvlText w:val=""/>
+      <w:lvlJc w:val="left"/>
+      <w:pPr>
+        <w:tabs>
+          <w:tab w:val="num" w:pos="5040"/>
+        </w:tabs>
+        <w:ind w:left="5040" w:hanging="360"/>
+      </w:pPr>
+      <w:rPr>
+        <w:rFonts w:ascii="Wingdings" w:hAnsi="Wingdings" w:hint="default"/>
+        <w:sz w:val="20"/>
+      </w:rPr>
+    </w:lvl>
+    <w:lvl w:ilvl="7" w:tentative="1">
+      <w:start w:val="1"/>
+      <w:numFmt w:val="bullet"/>
+      <w:lvlText w:val=""/>
+      <w:lvlJc w:val="left"/>
+      <w:pPr>
+        <w:tabs>
+          <w:tab w:val="num" w:pos="5760"/>
+        </w:tabs>
+        <w:ind w:left="5760" w:hanging="360"/>
+      </w:pPr>
+      <w:rPr>
+        <w:rFonts w:ascii="Wingdings" w:hAnsi="Wingdings" w:hint="default"/>
+        <w:sz w:val="20"/>
+      </w:rPr>
+    </w:lvl>
+    <w:lvl w:ilvl="8" w:tentative="1">
+      <w:start w:val="1"/>
+      <w:numFmt w:val="bullet"/>
+      <w:lvlText w:val=""/>
+      <w:lvlJc w:val="left"/>
+      <w:pPr>
+        <w:tabs>
+          <w:tab w:val="num" w:pos="6480"/>
+        </w:tabs>
+        <w:ind w:left="6480" w:hanging="360"/>
+      </w:pPr>
+      <w:rPr>
+        <w:rFonts w:ascii="Wingdings" w:hAnsi="Wingdings" w:hint="default"/>
+        <w:sz w:val="20"/>
+      </w:rPr>
+    </w:lvl>
+  </w:abstractNum>
+  <w:num w:numId="1" w16cid:durableId="684088582">
+    <w:abstractNumId w:val="7"/>
+  </w:num>
+  <w:num w:numId="2" w16cid:durableId="1858419874">
+    <w:abstractNumId w:val="10"/>
+  </w:num>
+  <w:num w:numId="3" w16cid:durableId="211967728">
+    <w:abstractNumId w:val="4"/>
+  </w:num>
+  <w:num w:numId="4" w16cid:durableId="1076898536">
+    <w:abstractNumId w:val="9"/>
+  </w:num>
+  <w:num w:numId="5" w16cid:durableId="333265785">
+    <w:abstractNumId w:val="3"/>
+  </w:num>
+  <w:num w:numId="6" w16cid:durableId="1643267522">
+    <w:abstractNumId w:val="2"/>
+  </w:num>
+  <w:num w:numId="7" w16cid:durableId="2022855738">
+    <w:abstractNumId w:val="6"/>
+  </w:num>
+  <w:num w:numId="8" w16cid:durableId="611090006">
+    <w:abstractNumId w:val="11"/>
+  </w:num>
+  <w:num w:numId="9" w16cid:durableId="155657379">
+    <w:abstractNumId w:val="0"/>
+  </w:num>
+  <w:num w:numId="10" w16cid:durableId="512064208">
+    <w:abstractNumId w:val="1"/>
+  </w:num>
+  <w:num w:numId="11" w16cid:durableId="588389570">
+    <w:abstractNumId w:val="5"/>
+  </w:num>
+  <w:num w:numId="12" w16cid:durableId="1656565592">
+    <w:abstractNumId w:val="8"/>
+  </w:num>
+</w:numbering>
 </file>
 
 <file path=word/styles.xml><?xml version="1.0" encoding="utf-8"?>
@@ -15702,6 +18930,50 @@
       <w14:ligatures w14:val="none"/>
     </w:rPr>
   </w:style>
+  <w:style w:type="paragraph" w:styleId="Header">
+    <w:name w:val="header"/>
+    <w:basedOn w:val="Normal"/>
+    <w:link w:val="HeaderChar"/>
+    <w:uiPriority w:val="99"/>
+    <w:unhideWhenUsed/>
+    <w:rsid w:val="000B75BF"/>
+    <w:pPr>
+      <w:tabs>
+        <w:tab w:val="center" w:pos="4680"/>
+        <w:tab w:val="right" w:pos="9360"/>
+      </w:tabs>
+      <w:spacing w:after="0" w:line="240" w:lineRule="auto"/>
+    </w:pPr>
+  </w:style>
+  <w:style w:type="character" w:customStyle="1" w:styleId="HeaderChar">
+    <w:name w:val="Header Char"/>
+    <w:basedOn w:val="DefaultParagraphFont"/>
+    <w:link w:val="Header"/>
+    <w:uiPriority w:val="99"/>
+    <w:rsid w:val="000B75BF"/>
+  </w:style>
+  <w:style w:type="paragraph" w:styleId="Footer">
+    <w:name w:val="footer"/>
+    <w:basedOn w:val="Normal"/>
+    <w:link w:val="FooterChar"/>
+    <w:uiPriority w:val="99"/>
+    <w:unhideWhenUsed/>
+    <w:rsid w:val="000B75BF"/>
+    <w:pPr>
+      <w:tabs>
+        <w:tab w:val="center" w:pos="4680"/>
+        <w:tab w:val="right" w:pos="9360"/>
+      </w:tabs>
+      <w:spacing w:after="0" w:line="240" w:lineRule="auto"/>
+    </w:pPr>
+  </w:style>
+  <w:style w:type="character" w:customStyle="1" w:styleId="FooterChar">
+    <w:name w:val="Footer Char"/>
+    <w:basedOn w:val="DefaultParagraphFont"/>
+    <w:link w:val="Footer"/>
+    <w:uiPriority w:val="99"/>
+    <w:rsid w:val="000B75BF"/>
+  </w:style>
 </w:styles>
 </file>
 

</xml_diff>

<commit_message>
Solve some of TODOs
</commit_message>
<xml_diff>
--- a/Optimization.docx
+++ b/Optimization.docx
@@ -20701,12 +20701,7 @@
       </w:ins>
     </w:p>
     <w:p>
-      <w:pPr>
-        <w:rPr>
-          <w:ins w:id="145" w:author="Erfan Mohammadzadeh" w:date="2026-07-26T17:05:00Z" w16du:dateUtc="2026-07-26T13:35:00Z"/>
-        </w:rPr>
-      </w:pPr>
-      <w:ins w:id="146" w:author="Erfan Mohammadzadeh" w:date="2026-07-26T17:05:00Z" w16du:dateUtc="2026-07-26T13:35:00Z">
+      <w:ins w:id="145" w:author="Erfan Mohammadzadeh" w:date="2026-07-26T17:05:00Z" w16du:dateUtc="2026-07-26T13:35:00Z">
         <w:r>
           <w:t xml:space="preserve">This will teach you an important professional skill: </w:t>
         </w:r>
@@ -20719,9 +20714,6 @@
         </w:r>
       </w:ins>
     </w:p>
-    <w:p/>
-    <w:p/>
-    <w:p/>
     <w:sectPr>
       <w:headerReference w:type="default" r:id="rId8"/>
       <w:footerReference w:type="default" r:id="rId9"/>

</xml_diff>

<commit_message>
Fix Renewal rules based on fine rules
</commit_message>
<xml_diff>
--- a/Optimization.docx
+++ b/Optimization.docx
@@ -1,6 +1,6 @@
 
 <file path=word/document.xml><?xml version="1.0" encoding="utf-8"?>
-<w:document xmlns:wpc="http://schemas.microsoft.com/office/word/2010/wordprocessingCanvas" xmlns:cx="http://schemas.microsoft.com/office/drawing/2014/chartex" xmlns:cx1="http://schemas.microsoft.com/office/drawing/2015/9/8/chartex" xmlns:cx2="http://schemas.microsoft.com/office/drawing/2015/10/21/chartex" xmlns:cx3="http://schemas.microsoft.com/office/drawing/2016/5/9/chartex" xmlns:cx4="http://schemas.microsoft.com/office/drawing/2016/5/10/chartex" xmlns:cx5="http://schemas.microsoft.com/office/drawing/2016/5/11/chartex" xmlns:cx6="http://schemas.microsoft.com/office/drawing/2016/5/12/chartex" xmlns:cx7="http://schemas.microsoft.com/office/drawing/2016/5/13/chartex" xmlns:cx8="http://schemas.microsoft.com/office/drawing/2016/5/14/chartex" xmlns:mc="http://schemas.openxmlformats.org/markup-compatibility/2006" xmlns:aink="http://schemas.microsoft.com/office/drawing/2016/ink" xmlns:am3d="http://schemas.microsoft.com/office/drawing/2017/model3d" xmlns:o="urn:schemas-microsoft-com:office:office" xmlns:oel="http://schemas.microsoft.com/office/2019/extlst" xmlns:r="http://schemas.openxmlformats.org/officeDocument/2006/relationships" xmlns:m="http://schemas.openxmlformats.org/officeDocument/2006/math" xmlns:v="urn:schemas-microsoft-com:vml" xmlns:wp14="http://schemas.microsoft.com/office/word/2010/wordprocessingDrawing" xmlns:wp="http://schemas.openxmlformats.org/drawingml/2006/wordprocessingDrawing" xmlns:w10="urn:schemas-microsoft-com:office:word" xmlns:w="http://schemas.openxmlformats.org/wordprocessingml/2006/main" xmlns:w14="http://schemas.microsoft.com/office/word/2010/wordml" xmlns:w15="http://schemas.microsoft.com/office/word/2012/wordml" xmlns:w16cex="http://schemas.microsoft.com/office/word/2018/wordml/cex" xmlns:w16cid="http://schemas.microsoft.com/office/word/2016/wordml/cid" xmlns:w16="http://schemas.microsoft.com/office/word/2018/wordml" xmlns:w16du="http://schemas.microsoft.com/office/word/2023/wordml/word16du" xmlns:w16sdtdh="http://schemas.microsoft.com/office/word/2020/wordml/sdtdatahash" xmlns:w16sdtfl="http://schemas.microsoft.com/office/word/2024/wordml/sdtformatlock" xmlns:w16se="http://schemas.microsoft.com/office/word/2015/wordml/symex" xmlns:wpg="http://schemas.microsoft.com/office/word/2010/wordprocessingGroup" xmlns:wpi="http://schemas.microsoft.com/office/word/2010/wordprocessingInk" xmlns:wne="http://schemas.microsoft.com/office/word/2006/wordml" xmlns:wps="http://schemas.microsoft.com/office/word/2010/wordprocessingShape" mc:Ignorable="w14 w15 w16se w16cid w16 w16cex w16sdtdh w16sdtfl w16du wp14">
+<w:document xmlns:wpc="http://schemas.microsoft.com/office/word/2010/wordprocessingCanvas" xmlns:cx="http://schemas.microsoft.com/office/drawing/2014/chartex" xmlns:cx1="http://schemas.microsoft.com/office/drawing/2015/9/8/chartex" xmlns:cx2="http://schemas.microsoft.com/office/drawing/2015/10/21/chartex" xmlns:cx3="http://schemas.microsoft.com/office/drawing/2016/5/9/chartex" xmlns:cx4="http://schemas.microsoft.com/office/drawing/2016/5/10/chartex" xmlns:cx5="http://schemas.microsoft.com/office/drawing/2016/5/11/chartex" xmlns:cx6="http://schemas.microsoft.com/office/drawing/2016/5/12/chartex" xmlns:cx7="http://schemas.microsoft.com/office/drawing/2016/5/13/chartex" xmlns:cx8="http://schemas.microsoft.com/office/drawing/2016/5/14/chartex" xmlns:mc="http://schemas.openxmlformats.org/markup-compatibility/2006" xmlns:aink="http://schemas.microsoft.com/office/drawing/2016/ink" xmlns:am3d="http://schemas.microsoft.com/office/drawing/2017/model3d" xmlns:o="urn:schemas-microsoft-com:office:office" xmlns:oel="http://schemas.microsoft.com/office/2019/extlst" xmlns:r="http://schemas.openxmlformats.org/officeDocument/2006/relationships" xmlns:m="http://schemas.openxmlformats.org/officeDocument/2006/math" xmlns:v="urn:schemas-microsoft-com:vml" xmlns:wp14="http://schemas.microsoft.com/office/word/2010/wordprocessingDrawing" xmlns:wp="http://schemas.openxmlformats.org/drawingml/2006/wordprocessingDrawing" xmlns:w10="urn:schemas-microsoft-com:office:word" xmlns:w="http://schemas.openxmlformats.org/wordprocessingml/2006/main" xmlns:w14="http://schemas.microsoft.com/office/word/2010/wordml" xmlns:w15="http://schemas.microsoft.com/office/word/2012/wordml" xmlns:w16cei="http://schemas.microsoft.com/office/word/2026/wordml/cei" xmlns:w16cex="http://schemas.microsoft.com/office/word/2018/wordml/cex" xmlns:w16cid="http://schemas.microsoft.com/office/word/2016/wordml/cid" xmlns:w16="http://schemas.microsoft.com/office/word/2018/wordml" xmlns:w16du="http://schemas.microsoft.com/office/word/2023/wordml/word16du" xmlns:w16sdtdh="http://schemas.microsoft.com/office/word/2020/wordml/sdtdatahash" xmlns:w16sdtfl="http://schemas.microsoft.com/office/word/2024/wordml/sdtformatlock" xmlns:w16se="http://schemas.microsoft.com/office/word/2015/wordml/symex" xmlns:wpg="http://schemas.microsoft.com/office/word/2010/wordprocessingGroup" xmlns:wpi="http://schemas.microsoft.com/office/word/2010/wordprocessingInk" xmlns:wne="http://schemas.microsoft.com/office/word/2006/wordml" xmlns:wps="http://schemas.microsoft.com/office/word/2010/wordprocessingShape" mc:Ignorable="w14 w15 w16se w16cid w16 w16cex w16sdtdh w16sdtfl w16du wp14">
   <w:body>
     <w:p>
       <w:pPr>
@@ -18999,103 +18999,95 @@
     <w:p>
       <w:ins w:id="0" w:author="Erfan Mohammadzadeh" w:date="2026-07-26T17:05:00Z" w16du:dateUtc="2026-07-26T13:35:00Z">
         <w:r>
+          <w:rPr>
+            <w:strike/>
+          </w:rPr>
           <w:t>I'm going to complete</w:t>
         </w:r>
         <w:r>
+          <w:rPr>
+            <w:strike/>
+          </w:rPr>
           <w:t xml:space="preserve"> step 1: TODO, add Fine to loans that member didn’t return on time.</w:t>
         </w:r>
         <w:r>
+          <w:rPr>
+            <w:strike/>
+          </w:rPr>
           <w:br/>
           <w:t xml:space="preserve">about step 1, what is idea about these items: </w:t>
         </w:r>
         <w:proofErr w:type="gramStart"/>
         <w:r>
-          <w:t xml:space="preserve">- </w:t>
-        </w:r>
-        <w:r>
-          <w:t xml:space="preserve"> </w:t>
+          <w:rPr>
+            <w:strike/>
+          </w:rPr>
+          <w:t xml:space="preserve">-  </w:t>
         </w:r>
         <w:proofErr w:type="spellStart"/>
         <w:r>
+          <w:rPr>
+            <w:strike/>
+          </w:rPr>
           <w:t>NotImplementedException</w:t>
         </w:r>
         <w:proofErr w:type="spellEnd"/>
         <w:proofErr w:type="gramEnd"/>
         <w:r>
+          <w:rPr>
+            <w:strike/>
+          </w:rPr>
+          <w:t xml:space="preserve">  </w:t>
+        </w:r>
+        <w:proofErr w:type="gramStart"/>
+        <w:r>
+          <w:rPr>
+            <w:strike/>
+          </w:rPr>
+          <w:t>-  temporary</w:t>
+        </w:r>
+        <w:proofErr w:type="gramEnd"/>
+        <w:r>
+          <w:rPr>
+            <w:strike/>
+          </w:rPr>
           <w:t xml:space="preserve"> </w:t>
         </w:r>
         <w:r>
-          <w:t xml:space="preserve"> </w:t>
-        </w:r>
-        <w:proofErr w:type="gramStart"/>
-        <w:r>
-          <w:t>-</w:t>
-        </w:r>
-        <w:r>
-          <w:t xml:space="preserve">  temporary</w:t>
-        </w:r>
-        <w:proofErr w:type="gramEnd"/>
-        <w:r>
-          <w:t xml:space="preserve"> </w:t>
-        </w:r>
-        <w:r>
+          <w:rPr>
+            <w:strike/>
+          </w:rPr>
           <w:lastRenderedPageBreak/>
           <w:t xml:space="preserve">method </w:t>
         </w:r>
         <w:proofErr w:type="gramStart"/>
         <w:r>
-          <w:t>-</w:t>
-        </w:r>
-        <w:r>
-          <w:t xml:space="preserve">  placeholder</w:t>
+          <w:rPr>
+            <w:strike/>
+          </w:rPr>
+          <w:t>-  placeholder</w:t>
         </w:r>
         <w:proofErr w:type="gramEnd"/>
         <w:r>
-          <w:t xml:space="preserve"> </w:t>
-        </w:r>
-        <w:r>
-          <w:t>-</w:t>
-        </w:r>
-        <w:r>
-          <w:t xml:space="preserve"> incomplete menu option </w:t>
-        </w:r>
-        <w:r>
-          <w:t>-</w:t>
-        </w:r>
-        <w:r>
-          <w:t xml:space="preserve"> unused repository method </w:t>
-        </w:r>
-        <w:r>
-          <w:t>-</w:t>
-        </w:r>
-        <w:r>
-          <w:t xml:space="preserve"> unused service method</w:t>
-        </w:r>
-        <w:r>
-          <w:t>. Which one needs to work now?</w:t>
+          <w:rPr>
+            <w:strike/>
+          </w:rPr>
+          <w:t xml:space="preserve"> - incomplete menu option - unused repository method - unused service method. Which one needs to work now?</w:t>
         </w:r>
         <w:r>
           <w:br/>
           <w:t xml:space="preserve">about step 2, what is your idea </w:t>
         </w:r>
-        <w:proofErr w:type="spellStart"/>
+      </w:ins>
+      <w:r>
+        <w:t>about</w:t>
+      </w:r>
+      <w:ins w:id="1" w:author="Erfan Mohammadzadeh" w:date="2026-07-26T17:05:00Z" w16du:dateUtc="2026-07-26T13:35:00Z">
         <w:r>
-          <w:t>bout</w:t>
-        </w:r>
-        <w:proofErr w:type="spellEnd"/>
-        <w:r>
-          <w:t xml:space="preserve"> these items: </w:t>
-        </w:r>
-        <w:proofErr w:type="gramStart"/>
-        <w:r>
-          <w:t xml:space="preserve">- </w:t>
+          <w:t xml:space="preserve"> these items: - </w:t>
         </w:r>
         <w:r>
-          <w:t xml:space="preserve"> Books</w:t>
-        </w:r>
-        <w:proofErr w:type="gramEnd"/>
-        <w:r>
-          <w:t xml:space="preserve"> </w:t>
+          <w:t xml:space="preserve">Books </w:t>
         </w:r>
         <w:r>
           <w:t xml:space="preserve">- </w:t>
@@ -19235,7 +19227,7 @@
           <w:t xml:space="preserve"> (Login in Authentication) and (Roles/Permissions in Authorization).</w:t>
         </w:r>
       </w:ins>
-      <w:del w:id="1" w:author="Erfan Mohammadzadeh" w:date="2026-07-26T17:05:00Z" w16du:dateUtc="2026-07-26T13:35:00Z">
+      <w:del w:id="2" w:author="Erfan Mohammadzadeh" w:date="2026-07-26T17:05:00Z" w16du:dateUtc="2026-07-26T13:35:00Z">
         <w:r>
           <w:delText>Now I'm going to complete (Login in Authentication) and (Roles/Permissions in Authorization).</w:delText>
         </w:r>
@@ -19243,26 +19235,6 @@
     </w:p>
     <w:p>
       <w:r>
-        <w:t>In the previous text, you suggested some orders like: User -&gt; Authentication -&gt; Authorization -&gt; Role/Permission -&gt; Menu Access</w:t>
-      </w:r>
-    </w:p>
-    <w:p>
-      <w:r>
-        <w:t>1. Because I'm new to this major, I know nothing about Authentication and Authorization. Are there other orders? Which order is good? What is the standard order?</w:t>
-      </w:r>
-    </w:p>
-    <w:p>
-      <w:r>
-        <w:t>2. What should I do in each section (Authentication - Authorization)?</w:t>
-      </w:r>
-    </w:p>
-    <w:p>
-      <w:r>
-        <w:t xml:space="preserve">3. My project's Roles are "Admin, Librarian, Member". We can use them in Authorization, right? how? </w:t>
-      </w:r>
-    </w:p>
-    <w:p>
-      <w:r>
         <w:t xml:space="preserve">4. About the concept of a user. There are two other concepts in my project (Author &amp; Translator). These two are two separate persons that each book may need. This library should have an author, and </w:t>
       </w:r>
       <w:proofErr w:type="spellStart"/>
@@ -19329,6 +19301,93 @@
       <w:r>
         <w:t xml:space="preserve"> Username: john</w:t>
       </w:r>
+    </w:p>
+    <w:p>
+      <w:r>
+        <w:rPr>
+          <w:rFonts w:ascii="MS Gothic" w:eastAsia="MS Gothic" w:hAnsi="MS Gothic" w:cs="MS Gothic" w:hint="eastAsia"/>
+        </w:rPr>
+        <w:t>├</w:t>
+      </w:r>
+      <w:r>
+        <w:rPr>
+          <w:rFonts w:ascii="Aptos" w:hAnsi="Aptos" w:cs="Aptos"/>
+        </w:rPr>
+        <w:t>──</w:t>
+      </w:r>
+      <w:r>
+        <w:t xml:space="preserve"> </w:t>
+      </w:r>
+      <w:proofErr w:type="spellStart"/>
+      <w:r>
+        <w:t>PasswordHash</w:t>
+      </w:r>
+      <w:proofErr w:type="spellEnd"/>
+      <w:r>
+        <w:t>: ...</w:t>
+      </w:r>
+    </w:p>
+    <w:p>
+      <w:r>
+        <w:rPr>
+          <w:rFonts w:ascii="MS Gothic" w:eastAsia="MS Gothic" w:hAnsi="MS Gothic" w:cs="MS Gothic" w:hint="eastAsia"/>
+        </w:rPr>
+        <w:t>├</w:t>
+      </w:r>
+      <w:r>
+        <w:rPr>
+          <w:rFonts w:ascii="Aptos" w:hAnsi="Aptos" w:cs="Aptos"/>
+        </w:rPr>
+        <w:t>──</w:t>
+      </w:r>
+      <w:r>
+        <w:t xml:space="preserve"> Role: Librarian</w:t>
+      </w:r>
+    </w:p>
+    <w:p>
+      <w:r>
+        <w:t xml:space="preserve">└── </w:t>
+      </w:r>
+      <w:proofErr w:type="spellStart"/>
+      <w:r>
+        <w:t>IsActive</w:t>
+      </w:r>
+      <w:proofErr w:type="spellEnd"/>
+      <w:r>
+        <w:t>: true</w:t>
+      </w:r>
+    </w:p>
+    <w:p>
+      <w:r>
+        <w:t>while another user might be:</w:t>
+      </w:r>
+    </w:p>
+    <w:p>
+      <w:r>
+        <w:t>User</w:t>
+      </w:r>
+    </w:p>
+    <w:p>
+      <w:r>
+        <w:rPr>
+          <w:rFonts w:ascii="MS Gothic" w:eastAsia="MS Gothic" w:hAnsi="MS Gothic" w:cs="MS Gothic" w:hint="eastAsia"/>
+        </w:rPr>
+        <w:t>├</w:t>
+      </w:r>
+      <w:r>
+        <w:rPr>
+          <w:rFonts w:ascii="Aptos" w:hAnsi="Aptos" w:cs="Aptos"/>
+        </w:rPr>
+        <w:t>──</w:t>
+      </w:r>
+      <w:r>
+        <w:t xml:space="preserve"> Username: </w:t>
+      </w:r>
+      <w:proofErr w:type="spellStart"/>
+      <w:r>
+        <w:t>mary</w:t>
+      </w:r>
+      <w:proofErr w:type="spellEnd"/>
     </w:p>
     <w:p>
       <w:r>
@@ -19370,7 +19429,7 @@
         <w:t>──</w:t>
       </w:r>
       <w:r>
-        <w:t xml:space="preserve"> Role: Librarian</w:t>
+        <w:t xml:space="preserve"> Role: Member</w:t>
       </w:r>
     </w:p>
     <w:p>
@@ -19387,108 +19446,21 @@
       </w:r>
     </w:p>
     <w:p>
-      <w:r>
-        <w:t>while another user might be:</w:t>
-      </w:r>
-    </w:p>
-    <w:p>
-      <w:r>
-        <w:t>User</w:t>
-      </w:r>
-    </w:p>
-    <w:p>
-      <w:r>
-        <w:rPr>
-          <w:rFonts w:ascii="MS Gothic" w:eastAsia="MS Gothic" w:hAnsi="MS Gothic" w:cs="MS Gothic" w:hint="eastAsia"/>
-        </w:rPr>
-        <w:t>├</w:t>
-      </w:r>
-      <w:r>
-        <w:rPr>
-          <w:rFonts w:ascii="Aptos" w:hAnsi="Aptos" w:cs="Aptos"/>
-        </w:rPr>
-        <w:t>──</w:t>
-      </w:r>
-      <w:r>
-        <w:t xml:space="preserve"> Username: </w:t>
-      </w:r>
-      <w:proofErr w:type="spellStart"/>
-      <w:r>
-        <w:t>mary</w:t>
-      </w:r>
-      <w:proofErr w:type="spellEnd"/>
-    </w:p>
-    <w:p>
-      <w:r>
-        <w:rPr>
-          <w:rFonts w:ascii="MS Gothic" w:eastAsia="MS Gothic" w:hAnsi="MS Gothic" w:cs="MS Gothic" w:hint="eastAsia"/>
-        </w:rPr>
-        <w:t>├</w:t>
-      </w:r>
-      <w:r>
-        <w:rPr>
-          <w:rFonts w:ascii="Aptos" w:hAnsi="Aptos" w:cs="Aptos"/>
-        </w:rPr>
-        <w:t>──</w:t>
-      </w:r>
-      <w:r>
-        <w:t xml:space="preserve"> </w:t>
-      </w:r>
-      <w:proofErr w:type="spellStart"/>
-      <w:r>
-        <w:t>PasswordHash</w:t>
-      </w:r>
-      <w:proofErr w:type="spellEnd"/>
-      <w:r>
-        <w:t>: ...</w:t>
-      </w:r>
-    </w:p>
-    <w:p>
-      <w:r>
-        <w:rPr>
-          <w:rFonts w:ascii="MS Gothic" w:eastAsia="MS Gothic" w:hAnsi="MS Gothic" w:cs="MS Gothic" w:hint="eastAsia"/>
-        </w:rPr>
-        <w:t>├</w:t>
-      </w:r>
-      <w:r>
-        <w:rPr>
-          <w:rFonts w:ascii="Aptos" w:hAnsi="Aptos" w:cs="Aptos"/>
-        </w:rPr>
-        <w:t>──</w:t>
-      </w:r>
-      <w:r>
-        <w:t xml:space="preserve"> Role: Member</w:t>
-      </w:r>
-    </w:p>
-    <w:p>
-      <w:r>
-        <w:t xml:space="preserve">└── </w:t>
-      </w:r>
-      <w:proofErr w:type="spellStart"/>
-      <w:r>
-        <w:t>IsActive</w:t>
-      </w:r>
-      <w:proofErr w:type="spellEnd"/>
-      <w:r>
-        <w:t>: true</w:t>
-      </w:r>
-    </w:p>
-    <w:p>
-      <w:pPr>
-        <w:rPr>
-          <w:ins w:id="2" w:author="Erfan Mohammadzadeh" w:date="2026-07-26T17:05:00Z" w16du:dateUtc="2026-07-26T13:35:00Z"/>
-        </w:rPr>
-      </w:pPr>
-    </w:p>
-    <w:p>
       <w:pPr>
         <w:rPr>
           <w:ins w:id="3" w:author="Erfan Mohammadzadeh" w:date="2026-07-26T17:05:00Z" w16du:dateUtc="2026-07-26T13:35:00Z"/>
+        </w:rPr>
+      </w:pPr>
+    </w:p>
+    <w:p>
+      <w:pPr>
+        <w:rPr>
+          <w:ins w:id="4" w:author="Erfan Mohammadzadeh" w:date="2026-07-26T17:05:00Z" w16du:dateUtc="2026-07-26T13:35:00Z"/>
           <w:b/>
           <w:bCs/>
         </w:rPr>
       </w:pPr>
-      <w:ins w:id="4" w:author="Erfan Mohammadzadeh" w:date="2026-07-26T17:05:00Z" w16du:dateUtc="2026-07-26T13:35:00Z">
+      <w:ins w:id="5" w:author="Erfan Mohammadzadeh" w:date="2026-07-26T17:05:00Z" w16du:dateUtc="2026-07-26T13:35:00Z">
         <w:r>
           <w:rPr>
             <w:b/>
@@ -19501,10 +19473,10 @@
     <w:p>
       <w:pPr>
         <w:rPr>
-          <w:ins w:id="5" w:author="Erfan Mohammadzadeh" w:date="2026-07-26T17:05:00Z" w16du:dateUtc="2026-07-26T13:35:00Z"/>
-        </w:rPr>
-      </w:pPr>
-      <w:ins w:id="6" w:author="Erfan Mohammadzadeh" w:date="2026-07-26T17:05:00Z" w16du:dateUtc="2026-07-26T13:35:00Z">
+          <w:ins w:id="6" w:author="Erfan Mohammadzadeh" w:date="2026-07-26T17:05:00Z" w16du:dateUtc="2026-07-26T13:35:00Z"/>
+        </w:rPr>
+      </w:pPr>
+      <w:ins w:id="7" w:author="Erfan Mohammadzadeh" w:date="2026-07-26T17:05:00Z" w16du:dateUtc="2026-07-26T13:35:00Z">
         <w:r>
           <w:t>Introduce:</w:t>
         </w:r>
@@ -19513,11 +19485,11 @@
     <w:p>
       <w:pPr>
         <w:rPr>
-          <w:ins w:id="7" w:author="Erfan Mohammadzadeh" w:date="2026-07-26T17:05:00Z" w16du:dateUtc="2026-07-26T13:35:00Z"/>
+          <w:ins w:id="8" w:author="Erfan Mohammadzadeh" w:date="2026-07-26T17:05:00Z" w16du:dateUtc="2026-07-26T13:35:00Z"/>
         </w:rPr>
       </w:pPr>
       <w:proofErr w:type="spellStart"/>
-      <w:ins w:id="8" w:author="Erfan Mohammadzadeh" w:date="2026-07-26T17:05:00Z" w16du:dateUtc="2026-07-26T13:35:00Z">
+      <w:ins w:id="9" w:author="Erfan Mohammadzadeh" w:date="2026-07-26T17:05:00Z" w16du:dateUtc="2026-07-26T13:35:00Z">
         <w:r>
           <w:t>AuthenticationService</w:t>
         </w:r>
@@ -19527,10 +19499,10 @@
     <w:p>
       <w:pPr>
         <w:rPr>
-          <w:ins w:id="9" w:author="Erfan Mohammadzadeh" w:date="2026-07-26T17:05:00Z" w16du:dateUtc="2026-07-26T13:35:00Z"/>
-        </w:rPr>
-      </w:pPr>
-      <w:ins w:id="10" w:author="Erfan Mohammadzadeh" w:date="2026-07-26T17:05:00Z" w16du:dateUtc="2026-07-26T13:35:00Z">
+          <w:ins w:id="10" w:author="Erfan Mohammadzadeh" w:date="2026-07-26T17:05:00Z" w16du:dateUtc="2026-07-26T13:35:00Z"/>
+        </w:rPr>
+      </w:pPr>
+      <w:ins w:id="11" w:author="Erfan Mohammadzadeh" w:date="2026-07-26T17:05:00Z" w16du:dateUtc="2026-07-26T13:35:00Z">
         <w:r>
           <w:t>User credentials</w:t>
         </w:r>
@@ -19539,10 +19511,10 @@
     <w:p>
       <w:pPr>
         <w:rPr>
-          <w:ins w:id="11" w:author="Erfan Mohammadzadeh" w:date="2026-07-26T17:05:00Z" w16du:dateUtc="2026-07-26T13:35:00Z"/>
-        </w:rPr>
-      </w:pPr>
-      <w:ins w:id="12" w:author="Erfan Mohammadzadeh" w:date="2026-07-26T17:05:00Z" w16du:dateUtc="2026-07-26T13:35:00Z">
+          <w:ins w:id="12" w:author="Erfan Mohammadzadeh" w:date="2026-07-26T17:05:00Z" w16du:dateUtc="2026-07-26T13:35:00Z"/>
+        </w:rPr>
+      </w:pPr>
+      <w:ins w:id="13" w:author="Erfan Mohammadzadeh" w:date="2026-07-26T17:05:00Z" w16du:dateUtc="2026-07-26T13:35:00Z">
         <w:r>
           <w:t>Password hashing</w:t>
         </w:r>
@@ -19551,10 +19523,10 @@
     <w:p>
       <w:pPr>
         <w:rPr>
-          <w:ins w:id="13" w:author="Erfan Mohammadzadeh" w:date="2026-07-26T17:05:00Z" w16du:dateUtc="2026-07-26T13:35:00Z"/>
-        </w:rPr>
-      </w:pPr>
-      <w:ins w:id="14" w:author="Erfan Mohammadzadeh" w:date="2026-07-26T17:05:00Z" w16du:dateUtc="2026-07-26T13:35:00Z">
+          <w:ins w:id="14" w:author="Erfan Mohammadzadeh" w:date="2026-07-26T17:05:00Z" w16du:dateUtc="2026-07-26T13:35:00Z"/>
+        </w:rPr>
+      </w:pPr>
+      <w:ins w:id="15" w:author="Erfan Mohammadzadeh" w:date="2026-07-26T17:05:00Z" w16du:dateUtc="2026-07-26T13:35:00Z">
         <w:r>
           <w:t>Login</w:t>
         </w:r>
@@ -19563,10 +19535,10 @@
     <w:p>
       <w:pPr>
         <w:rPr>
-          <w:ins w:id="15" w:author="Erfan Mohammadzadeh" w:date="2026-07-26T17:05:00Z" w16du:dateUtc="2026-07-26T13:35:00Z"/>
-        </w:rPr>
-      </w:pPr>
-      <w:ins w:id="16" w:author="Erfan Mohammadzadeh" w:date="2026-07-26T17:05:00Z" w16du:dateUtc="2026-07-26T13:35:00Z">
+          <w:ins w:id="16" w:author="Erfan Mohammadzadeh" w:date="2026-07-26T17:05:00Z" w16du:dateUtc="2026-07-26T13:35:00Z"/>
+        </w:rPr>
+      </w:pPr>
+      <w:ins w:id="17" w:author="Erfan Mohammadzadeh" w:date="2026-07-26T17:05:00Z" w16du:dateUtc="2026-07-26T13:35:00Z">
         <w:r>
           <w:t>Logout</w:t>
         </w:r>
@@ -19575,10 +19547,10 @@
     <w:p>
       <w:pPr>
         <w:rPr>
-          <w:ins w:id="17" w:author="Erfan Mohammadzadeh" w:date="2026-07-26T17:05:00Z" w16du:dateUtc="2026-07-26T13:35:00Z"/>
-        </w:rPr>
-      </w:pPr>
-      <w:ins w:id="18" w:author="Erfan Mohammadzadeh" w:date="2026-07-26T17:05:00Z" w16du:dateUtc="2026-07-26T13:35:00Z">
+          <w:ins w:id="18" w:author="Erfan Mohammadzadeh" w:date="2026-07-26T17:05:00Z" w16du:dateUtc="2026-07-26T13:35:00Z"/>
+        </w:rPr>
+      </w:pPr>
+      <w:ins w:id="19" w:author="Erfan Mohammadzadeh" w:date="2026-07-26T17:05:00Z" w16du:dateUtc="2026-07-26T13:35:00Z">
         <w:r>
           <w:t>Session</w:t>
         </w:r>
@@ -19587,10 +19559,10 @@
     <w:p>
       <w:pPr>
         <w:rPr>
-          <w:ins w:id="19" w:author="Erfan Mohammadzadeh" w:date="2026-07-26T17:05:00Z" w16du:dateUtc="2026-07-26T13:35:00Z"/>
-        </w:rPr>
-      </w:pPr>
-      <w:ins w:id="20" w:author="Erfan Mohammadzadeh" w:date="2026-07-26T17:05:00Z" w16du:dateUtc="2026-07-26T13:35:00Z">
+          <w:ins w:id="20" w:author="Erfan Mohammadzadeh" w:date="2026-07-26T17:05:00Z" w16du:dateUtc="2026-07-26T13:35:00Z"/>
+        </w:rPr>
+      </w:pPr>
+      <w:ins w:id="21" w:author="Erfan Mohammadzadeh" w:date="2026-07-26T17:05:00Z" w16du:dateUtc="2026-07-26T13:35:00Z">
         <w:r>
           <w:t xml:space="preserve">I would start with </w:t>
         </w:r>
@@ -19609,10 +19581,10 @@
     <w:p>
       <w:pPr>
         <w:rPr>
-          <w:ins w:id="21" w:author="Erfan Mohammadzadeh" w:date="2026-07-26T17:05:00Z" w16du:dateUtc="2026-07-26T13:35:00Z"/>
-        </w:rPr>
-      </w:pPr>
-      <w:ins w:id="22" w:author="Erfan Mohammadzadeh" w:date="2026-07-26T17:05:00Z" w16du:dateUtc="2026-07-26T13:35:00Z">
+          <w:ins w:id="22" w:author="Erfan Mohammadzadeh" w:date="2026-07-26T17:05:00Z" w16du:dateUtc="2026-07-26T13:35:00Z"/>
+        </w:rPr>
+      </w:pPr>
+      <w:ins w:id="23" w:author="Erfan Mohammadzadeh" w:date="2026-07-26T17:05:00Z" w16du:dateUtc="2026-07-26T13:35:00Z">
         <w:r>
           <w:pict w14:anchorId="42732E2D">
             <v:rect id="_x0000_i1028" style="width:0;height:1.5pt" o:hralign="center" o:hrstd="t" o:hr="t" fillcolor="#a0a0a0" stroked="f"/>
@@ -19623,12 +19595,12 @@
     <w:p>
       <w:pPr>
         <w:rPr>
-          <w:ins w:id="23" w:author="Erfan Mohammadzadeh" w:date="2026-07-26T17:05:00Z" w16du:dateUtc="2026-07-26T13:35:00Z"/>
+          <w:ins w:id="24" w:author="Erfan Mohammadzadeh" w:date="2026-07-26T17:05:00Z" w16du:dateUtc="2026-07-26T13:35:00Z"/>
           <w:b/>
           <w:bCs/>
         </w:rPr>
       </w:pPr>
-      <w:ins w:id="24" w:author="Erfan Mohammadzadeh" w:date="2026-07-26T17:05:00Z" w16du:dateUtc="2026-07-26T13:35:00Z">
+      <w:ins w:id="25" w:author="Erfan Mohammadzadeh" w:date="2026-07-26T17:05:00Z" w16du:dateUtc="2026-07-26T13:35:00Z">
         <w:r>
           <w:rPr>
             <w:b/>
@@ -19641,10 +19613,10 @@
     <w:p>
       <w:pPr>
         <w:rPr>
-          <w:ins w:id="25" w:author="Erfan Mohammadzadeh" w:date="2026-07-26T17:05:00Z" w16du:dateUtc="2026-07-26T13:35:00Z"/>
-        </w:rPr>
-      </w:pPr>
-      <w:ins w:id="26" w:author="Erfan Mohammadzadeh" w:date="2026-07-26T17:05:00Z" w16du:dateUtc="2026-07-26T13:35:00Z">
+          <w:ins w:id="26" w:author="Erfan Mohammadzadeh" w:date="2026-07-26T17:05:00Z" w16du:dateUtc="2026-07-26T13:35:00Z"/>
+        </w:rPr>
+      </w:pPr>
+      <w:ins w:id="27" w:author="Erfan Mohammadzadeh" w:date="2026-07-26T17:05:00Z" w16du:dateUtc="2026-07-26T13:35:00Z">
         <w:r>
           <w:t>Introduce:</w:t>
         </w:r>
@@ -19653,11 +19625,11 @@
     <w:p>
       <w:pPr>
         <w:rPr>
-          <w:ins w:id="27" w:author="Erfan Mohammadzadeh" w:date="2026-07-26T17:05:00Z" w16du:dateUtc="2026-07-26T13:35:00Z"/>
+          <w:ins w:id="28" w:author="Erfan Mohammadzadeh" w:date="2026-07-26T17:05:00Z" w16du:dateUtc="2026-07-26T13:35:00Z"/>
         </w:rPr>
       </w:pPr>
       <w:proofErr w:type="spellStart"/>
-      <w:ins w:id="28" w:author="Erfan Mohammadzadeh" w:date="2026-07-26T17:05:00Z" w16du:dateUtc="2026-07-26T13:35:00Z">
+      <w:ins w:id="29" w:author="Erfan Mohammadzadeh" w:date="2026-07-26T17:05:00Z" w16du:dateUtc="2026-07-26T13:35:00Z">
         <w:r>
           <w:t>AuthorizationService</w:t>
         </w:r>
@@ -19667,10 +19639,10 @@
     <w:p>
       <w:pPr>
         <w:rPr>
-          <w:ins w:id="29" w:author="Erfan Mohammadzadeh" w:date="2026-07-26T17:05:00Z" w16du:dateUtc="2026-07-26T13:35:00Z"/>
-        </w:rPr>
-      </w:pPr>
-      <w:ins w:id="30" w:author="Erfan Mohammadzadeh" w:date="2026-07-26T17:05:00Z" w16du:dateUtc="2026-07-26T13:35:00Z">
+          <w:ins w:id="30" w:author="Erfan Mohammadzadeh" w:date="2026-07-26T17:05:00Z" w16du:dateUtc="2026-07-26T13:35:00Z"/>
+        </w:rPr>
+      </w:pPr>
+      <w:ins w:id="31" w:author="Erfan Mohammadzadeh" w:date="2026-07-26T17:05:00Z" w16du:dateUtc="2026-07-26T13:35:00Z">
         <w:r>
           <w:t>Roles</w:t>
         </w:r>
@@ -19679,10 +19651,10 @@
     <w:p>
       <w:pPr>
         <w:rPr>
-          <w:ins w:id="31" w:author="Erfan Mohammadzadeh" w:date="2026-07-26T17:05:00Z" w16du:dateUtc="2026-07-26T13:35:00Z"/>
-        </w:rPr>
-      </w:pPr>
-      <w:ins w:id="32" w:author="Erfan Mohammadzadeh" w:date="2026-07-26T17:05:00Z" w16du:dateUtc="2026-07-26T13:35:00Z">
+          <w:ins w:id="32" w:author="Erfan Mohammadzadeh" w:date="2026-07-26T17:05:00Z" w16du:dateUtc="2026-07-26T13:35:00Z"/>
+        </w:rPr>
+      </w:pPr>
+      <w:ins w:id="33" w:author="Erfan Mohammadzadeh" w:date="2026-07-26T17:05:00Z" w16du:dateUtc="2026-07-26T13:35:00Z">
         <w:r>
           <w:t>Permissions</w:t>
         </w:r>
@@ -19691,10 +19663,10 @@
     <w:p>
       <w:pPr>
         <w:rPr>
-          <w:ins w:id="33" w:author="Erfan Mohammadzadeh" w:date="2026-07-26T17:05:00Z" w16du:dateUtc="2026-07-26T13:35:00Z"/>
-        </w:rPr>
-      </w:pPr>
-      <w:ins w:id="34" w:author="Erfan Mohammadzadeh" w:date="2026-07-26T17:05:00Z" w16du:dateUtc="2026-07-26T13:35:00Z">
+          <w:ins w:id="34" w:author="Erfan Mohammadzadeh" w:date="2026-07-26T17:05:00Z" w16du:dateUtc="2026-07-26T13:35:00Z"/>
+        </w:rPr>
+      </w:pPr>
+      <w:ins w:id="35" w:author="Erfan Mohammadzadeh" w:date="2026-07-26T17:05:00Z" w16du:dateUtc="2026-07-26T13:35:00Z">
         <w:r>
           <w:t>Role-Permission relationships</w:t>
         </w:r>
@@ -19703,10 +19675,10 @@
     <w:p>
       <w:pPr>
         <w:rPr>
-          <w:ins w:id="35" w:author="Erfan Mohammadzadeh" w:date="2026-07-26T17:05:00Z" w16du:dateUtc="2026-07-26T13:35:00Z"/>
-        </w:rPr>
-      </w:pPr>
-      <w:ins w:id="36" w:author="Erfan Mohammadzadeh" w:date="2026-07-26T17:05:00Z" w16du:dateUtc="2026-07-26T13:35:00Z">
+          <w:ins w:id="36" w:author="Erfan Mohammadzadeh" w:date="2026-07-26T17:05:00Z" w16du:dateUtc="2026-07-26T13:35:00Z"/>
+        </w:rPr>
+      </w:pPr>
+      <w:ins w:id="37" w:author="Erfan Mohammadzadeh" w:date="2026-07-26T17:05:00Z" w16du:dateUtc="2026-07-26T13:35:00Z">
         <w:r>
           <w:t>Then connect them to your menus.</w:t>
         </w:r>
@@ -19715,12 +19687,11 @@
     <w:p>
       <w:pPr>
         <w:rPr>
-          <w:ins w:id="37" w:author="Erfan Mohammadzadeh" w:date="2026-07-26T17:05:00Z" w16du:dateUtc="2026-07-26T13:35:00Z"/>
-        </w:rPr>
-      </w:pPr>
-      <w:ins w:id="38" w:author="Erfan Mohammadzadeh" w:date="2026-07-26T17:05:00Z" w16du:dateUtc="2026-07-26T13:35:00Z">
+          <w:ins w:id="38" w:author="Erfan Mohammadzadeh" w:date="2026-07-26T17:05:00Z" w16du:dateUtc="2026-07-26T13:35:00Z"/>
+        </w:rPr>
+      </w:pPr>
+      <w:ins w:id="39" w:author="Erfan Mohammadzadeh" w:date="2026-07-26T17:05:00Z" w16du:dateUtc="2026-07-26T13:35:00Z">
         <w:r>
-          <w:lastRenderedPageBreak/>
           <w:pict w14:anchorId="57BF4A84">
             <v:rect id="_x0000_i1029" style="width:0;height:1.5pt" o:hralign="center" o:hrstd="t" o:hr="t" fillcolor="#a0a0a0" stroked="f"/>
           </w:pict>
@@ -19730,12 +19701,12 @@
     <w:p>
       <w:pPr>
         <w:rPr>
-          <w:ins w:id="39" w:author="Erfan Mohammadzadeh" w:date="2026-07-26T17:05:00Z" w16du:dateUtc="2026-07-26T13:35:00Z"/>
+          <w:ins w:id="40" w:author="Erfan Mohammadzadeh" w:date="2026-07-26T17:05:00Z" w16du:dateUtc="2026-07-26T13:35:00Z"/>
           <w:b/>
           <w:bCs/>
         </w:rPr>
       </w:pPr>
-      <w:ins w:id="40" w:author="Erfan Mohammadzadeh" w:date="2026-07-26T17:05:00Z" w16du:dateUtc="2026-07-26T13:35:00Z">
+      <w:ins w:id="41" w:author="Erfan Mohammadzadeh" w:date="2026-07-26T17:05:00Z" w16du:dateUtc="2026-07-26T13:35:00Z">
         <w:r>
           <w:rPr>
             <w:b/>
@@ -19748,10 +19719,10 @@
     <w:p>
       <w:pPr>
         <w:rPr>
-          <w:ins w:id="41" w:author="Erfan Mohammadzadeh" w:date="2026-07-26T17:05:00Z" w16du:dateUtc="2026-07-26T13:35:00Z"/>
-        </w:rPr>
-      </w:pPr>
-      <w:ins w:id="42" w:author="Erfan Mohammadzadeh" w:date="2026-07-26T17:05:00Z" w16du:dateUtc="2026-07-26T13:35:00Z">
+          <w:ins w:id="42" w:author="Erfan Mohammadzadeh" w:date="2026-07-26T17:05:00Z" w16du:dateUtc="2026-07-26T13:35:00Z"/>
+        </w:rPr>
+      </w:pPr>
+      <w:ins w:id="43" w:author="Erfan Mohammadzadeh" w:date="2026-07-26T17:05:00Z" w16du:dateUtc="2026-07-26T13:35:00Z">
         <w:r>
           <w:t>The application becomes:</w:t>
         </w:r>
@@ -19760,10 +19731,10 @@
     <w:p>
       <w:pPr>
         <w:rPr>
-          <w:ins w:id="43" w:author="Erfan Mohammadzadeh" w:date="2026-07-26T17:05:00Z" w16du:dateUtc="2026-07-26T13:35:00Z"/>
-        </w:rPr>
-      </w:pPr>
-      <w:ins w:id="44" w:author="Erfan Mohammadzadeh" w:date="2026-07-26T17:05:00Z" w16du:dateUtc="2026-07-26T13:35:00Z">
+          <w:ins w:id="44" w:author="Erfan Mohammadzadeh" w:date="2026-07-26T17:05:00Z" w16du:dateUtc="2026-07-26T13:35:00Z"/>
+        </w:rPr>
+      </w:pPr>
+      <w:ins w:id="45" w:author="Erfan Mohammadzadeh" w:date="2026-07-26T17:05:00Z" w16du:dateUtc="2026-07-26T13:35:00Z">
         <w:r>
           <w:t>Application Start</w:t>
         </w:r>
@@ -19772,10 +19743,10 @@
     <w:p>
       <w:pPr>
         <w:rPr>
-          <w:ins w:id="45" w:author="Erfan Mohammadzadeh" w:date="2026-07-26T17:05:00Z" w16du:dateUtc="2026-07-26T13:35:00Z"/>
-        </w:rPr>
-      </w:pPr>
-      <w:ins w:id="46" w:author="Erfan Mohammadzadeh" w:date="2026-07-26T17:05:00Z" w16du:dateUtc="2026-07-26T13:35:00Z">
+          <w:ins w:id="46" w:author="Erfan Mohammadzadeh" w:date="2026-07-26T17:05:00Z" w16du:dateUtc="2026-07-26T13:35:00Z"/>
+        </w:rPr>
+      </w:pPr>
+      <w:ins w:id="47" w:author="Erfan Mohammadzadeh" w:date="2026-07-26T17:05:00Z" w16du:dateUtc="2026-07-26T13:35:00Z">
         <w:r>
           <w:t xml:space="preserve">       │</w:t>
         </w:r>
@@ -19784,10 +19755,10 @@
     <w:p>
       <w:pPr>
         <w:rPr>
-          <w:ins w:id="47" w:author="Erfan Mohammadzadeh" w:date="2026-07-26T17:05:00Z" w16du:dateUtc="2026-07-26T13:35:00Z"/>
-        </w:rPr>
-      </w:pPr>
-      <w:ins w:id="48" w:author="Erfan Mohammadzadeh" w:date="2026-07-26T17:05:00Z" w16du:dateUtc="2026-07-26T13:35:00Z">
+          <w:ins w:id="48" w:author="Erfan Mohammadzadeh" w:date="2026-07-26T17:05:00Z" w16du:dateUtc="2026-07-26T13:35:00Z"/>
+        </w:rPr>
+      </w:pPr>
+      <w:ins w:id="49" w:author="Erfan Mohammadzadeh" w:date="2026-07-26T17:05:00Z" w16du:dateUtc="2026-07-26T13:35:00Z">
         <w:r>
           <w:t xml:space="preserve">       </w:t>
         </w:r>
@@ -19802,10 +19773,10 @@
     <w:p>
       <w:pPr>
         <w:rPr>
-          <w:ins w:id="49" w:author="Erfan Mohammadzadeh" w:date="2026-07-26T17:05:00Z" w16du:dateUtc="2026-07-26T13:35:00Z"/>
-        </w:rPr>
-      </w:pPr>
-      <w:ins w:id="50" w:author="Erfan Mohammadzadeh" w:date="2026-07-26T17:05:00Z" w16du:dateUtc="2026-07-26T13:35:00Z">
+          <w:ins w:id="50" w:author="Erfan Mohammadzadeh" w:date="2026-07-26T17:05:00Z" w16du:dateUtc="2026-07-26T13:35:00Z"/>
+        </w:rPr>
+      </w:pPr>
+      <w:ins w:id="51" w:author="Erfan Mohammadzadeh" w:date="2026-07-26T17:05:00Z" w16du:dateUtc="2026-07-26T13:35:00Z">
         <w:r>
           <w:t xml:space="preserve">     Login</w:t>
         </w:r>
@@ -19814,11 +19785,12 @@
     <w:p>
       <w:pPr>
         <w:rPr>
-          <w:ins w:id="51" w:author="Erfan Mohammadzadeh" w:date="2026-07-26T17:05:00Z" w16du:dateUtc="2026-07-26T13:35:00Z"/>
-        </w:rPr>
-      </w:pPr>
-      <w:ins w:id="52" w:author="Erfan Mohammadzadeh" w:date="2026-07-26T17:05:00Z" w16du:dateUtc="2026-07-26T13:35:00Z">
+          <w:ins w:id="52" w:author="Erfan Mohammadzadeh" w:date="2026-07-26T17:05:00Z" w16du:dateUtc="2026-07-26T13:35:00Z"/>
+        </w:rPr>
+      </w:pPr>
+      <w:ins w:id="53" w:author="Erfan Mohammadzadeh" w:date="2026-07-26T17:05:00Z" w16du:dateUtc="2026-07-26T13:35:00Z">
         <w:r>
+          <w:lastRenderedPageBreak/>
           <w:t xml:space="preserve">       │</w:t>
         </w:r>
       </w:ins>
@@ -19826,10 +19798,10 @@
     <w:p>
       <w:pPr>
         <w:rPr>
-          <w:ins w:id="53" w:author="Erfan Mohammadzadeh" w:date="2026-07-26T17:05:00Z" w16du:dateUtc="2026-07-26T13:35:00Z"/>
-        </w:rPr>
-      </w:pPr>
-      <w:ins w:id="54" w:author="Erfan Mohammadzadeh" w:date="2026-07-26T17:05:00Z" w16du:dateUtc="2026-07-26T13:35:00Z">
+          <w:ins w:id="54" w:author="Erfan Mohammadzadeh" w:date="2026-07-26T17:05:00Z" w16du:dateUtc="2026-07-26T13:35:00Z"/>
+        </w:rPr>
+      </w:pPr>
+      <w:ins w:id="55" w:author="Erfan Mohammadzadeh" w:date="2026-07-26T17:05:00Z" w16du:dateUtc="2026-07-26T13:35:00Z">
         <w:r>
           <w:t xml:space="preserve">       </w:t>
         </w:r>
@@ -19844,10 +19816,10 @@
     <w:p>
       <w:pPr>
         <w:rPr>
-          <w:ins w:id="55" w:author="Erfan Mohammadzadeh" w:date="2026-07-26T17:05:00Z" w16du:dateUtc="2026-07-26T13:35:00Z"/>
-        </w:rPr>
-      </w:pPr>
-      <w:ins w:id="56" w:author="Erfan Mohammadzadeh" w:date="2026-07-26T17:05:00Z" w16du:dateUtc="2026-07-26T13:35:00Z">
+          <w:ins w:id="56" w:author="Erfan Mohammadzadeh" w:date="2026-07-26T17:05:00Z" w16du:dateUtc="2026-07-26T13:35:00Z"/>
+        </w:rPr>
+      </w:pPr>
+      <w:ins w:id="57" w:author="Erfan Mohammadzadeh" w:date="2026-07-26T17:05:00Z" w16du:dateUtc="2026-07-26T13:35:00Z">
         <w:r>
           <w:t>Authentication</w:t>
         </w:r>
@@ -19856,10 +19828,10 @@
     <w:p>
       <w:pPr>
         <w:rPr>
-          <w:ins w:id="57" w:author="Erfan Mohammadzadeh" w:date="2026-07-26T17:05:00Z" w16du:dateUtc="2026-07-26T13:35:00Z"/>
-        </w:rPr>
-      </w:pPr>
-      <w:ins w:id="58" w:author="Erfan Mohammadzadeh" w:date="2026-07-26T17:05:00Z" w16du:dateUtc="2026-07-26T13:35:00Z">
+          <w:ins w:id="58" w:author="Erfan Mohammadzadeh" w:date="2026-07-26T17:05:00Z" w16du:dateUtc="2026-07-26T13:35:00Z"/>
+        </w:rPr>
+      </w:pPr>
+      <w:ins w:id="59" w:author="Erfan Mohammadzadeh" w:date="2026-07-26T17:05:00Z" w16du:dateUtc="2026-07-26T13:35:00Z">
         <w:r>
           <w:t xml:space="preserve">       │</w:t>
         </w:r>
@@ -19868,10 +19840,10 @@
     <w:p>
       <w:pPr>
         <w:rPr>
-          <w:ins w:id="59" w:author="Erfan Mohammadzadeh" w:date="2026-07-26T17:05:00Z" w16du:dateUtc="2026-07-26T13:35:00Z"/>
-        </w:rPr>
-      </w:pPr>
-      <w:ins w:id="60" w:author="Erfan Mohammadzadeh" w:date="2026-07-26T17:05:00Z" w16du:dateUtc="2026-07-26T13:35:00Z">
+          <w:ins w:id="60" w:author="Erfan Mohammadzadeh" w:date="2026-07-26T17:05:00Z" w16du:dateUtc="2026-07-26T13:35:00Z"/>
+        </w:rPr>
+      </w:pPr>
+      <w:ins w:id="61" w:author="Erfan Mohammadzadeh" w:date="2026-07-26T17:05:00Z" w16du:dateUtc="2026-07-26T13:35:00Z">
         <w:r>
           <w:t xml:space="preserve">       </w:t>
         </w:r>
@@ -19886,10 +19858,10 @@
     <w:p>
       <w:pPr>
         <w:rPr>
-          <w:ins w:id="61" w:author="Erfan Mohammadzadeh" w:date="2026-07-26T17:05:00Z" w16du:dateUtc="2026-07-26T13:35:00Z"/>
-        </w:rPr>
-      </w:pPr>
-      <w:ins w:id="62" w:author="Erfan Mohammadzadeh" w:date="2026-07-26T17:05:00Z" w16du:dateUtc="2026-07-26T13:35:00Z">
+          <w:ins w:id="62" w:author="Erfan Mohammadzadeh" w:date="2026-07-26T17:05:00Z" w16du:dateUtc="2026-07-26T13:35:00Z"/>
+        </w:rPr>
+      </w:pPr>
+      <w:ins w:id="63" w:author="Erfan Mohammadzadeh" w:date="2026-07-26T17:05:00Z" w16du:dateUtc="2026-07-26T13:35:00Z">
         <w:r>
           <w:t xml:space="preserve">    Session</w:t>
         </w:r>
@@ -19898,10 +19870,10 @@
     <w:p>
       <w:pPr>
         <w:rPr>
-          <w:ins w:id="63" w:author="Erfan Mohammadzadeh" w:date="2026-07-26T17:05:00Z" w16du:dateUtc="2026-07-26T13:35:00Z"/>
-        </w:rPr>
-      </w:pPr>
-      <w:ins w:id="64" w:author="Erfan Mohammadzadeh" w:date="2026-07-26T17:05:00Z" w16du:dateUtc="2026-07-26T13:35:00Z">
+          <w:ins w:id="64" w:author="Erfan Mohammadzadeh" w:date="2026-07-26T17:05:00Z" w16du:dateUtc="2026-07-26T13:35:00Z"/>
+        </w:rPr>
+      </w:pPr>
+      <w:ins w:id="65" w:author="Erfan Mohammadzadeh" w:date="2026-07-26T17:05:00Z" w16du:dateUtc="2026-07-26T13:35:00Z">
         <w:r>
           <w:t xml:space="preserve">       │</w:t>
         </w:r>
@@ -19910,10 +19882,10 @@
     <w:p>
       <w:pPr>
         <w:rPr>
-          <w:ins w:id="65" w:author="Erfan Mohammadzadeh" w:date="2026-07-26T17:05:00Z" w16du:dateUtc="2026-07-26T13:35:00Z"/>
-        </w:rPr>
-      </w:pPr>
-      <w:ins w:id="66" w:author="Erfan Mohammadzadeh" w:date="2026-07-26T17:05:00Z" w16du:dateUtc="2026-07-26T13:35:00Z">
+          <w:ins w:id="66" w:author="Erfan Mohammadzadeh" w:date="2026-07-26T17:05:00Z" w16du:dateUtc="2026-07-26T13:35:00Z"/>
+        </w:rPr>
+      </w:pPr>
+      <w:ins w:id="67" w:author="Erfan Mohammadzadeh" w:date="2026-07-26T17:05:00Z" w16du:dateUtc="2026-07-26T13:35:00Z">
         <w:r>
           <w:t xml:space="preserve">       </w:t>
         </w:r>
@@ -19928,10 +19900,10 @@
     <w:p>
       <w:pPr>
         <w:rPr>
-          <w:ins w:id="67" w:author="Erfan Mohammadzadeh" w:date="2026-07-26T17:05:00Z" w16du:dateUtc="2026-07-26T13:35:00Z"/>
-        </w:rPr>
-      </w:pPr>
-      <w:ins w:id="68" w:author="Erfan Mohammadzadeh" w:date="2026-07-26T17:05:00Z" w16du:dateUtc="2026-07-26T13:35:00Z">
+          <w:ins w:id="68" w:author="Erfan Mohammadzadeh" w:date="2026-07-26T17:05:00Z" w16du:dateUtc="2026-07-26T13:35:00Z"/>
+        </w:rPr>
+      </w:pPr>
+      <w:ins w:id="69" w:author="Erfan Mohammadzadeh" w:date="2026-07-26T17:05:00Z" w16du:dateUtc="2026-07-26T13:35:00Z">
         <w:r>
           <w:t>Authorization</w:t>
         </w:r>
@@ -19940,10 +19912,10 @@
     <w:p>
       <w:pPr>
         <w:rPr>
-          <w:ins w:id="69" w:author="Erfan Mohammadzadeh" w:date="2026-07-26T17:05:00Z" w16du:dateUtc="2026-07-26T13:35:00Z"/>
-        </w:rPr>
-      </w:pPr>
-      <w:ins w:id="70" w:author="Erfan Mohammadzadeh" w:date="2026-07-26T17:05:00Z" w16du:dateUtc="2026-07-26T13:35:00Z">
+          <w:ins w:id="70" w:author="Erfan Mohammadzadeh" w:date="2026-07-26T17:05:00Z" w16du:dateUtc="2026-07-26T13:35:00Z"/>
+        </w:rPr>
+      </w:pPr>
+      <w:ins w:id="71" w:author="Erfan Mohammadzadeh" w:date="2026-07-26T17:05:00Z" w16du:dateUtc="2026-07-26T13:35:00Z">
         <w:r>
           <w:t xml:space="preserve">       │</w:t>
         </w:r>
@@ -19952,10 +19924,10 @@
     <w:p>
       <w:pPr>
         <w:rPr>
-          <w:ins w:id="71" w:author="Erfan Mohammadzadeh" w:date="2026-07-26T17:05:00Z" w16du:dateUtc="2026-07-26T13:35:00Z"/>
-        </w:rPr>
-      </w:pPr>
-      <w:ins w:id="72" w:author="Erfan Mohammadzadeh" w:date="2026-07-26T17:05:00Z" w16du:dateUtc="2026-07-26T13:35:00Z">
+          <w:ins w:id="72" w:author="Erfan Mohammadzadeh" w:date="2026-07-26T17:05:00Z" w16du:dateUtc="2026-07-26T13:35:00Z"/>
+        </w:rPr>
+      </w:pPr>
+      <w:ins w:id="73" w:author="Erfan Mohammadzadeh" w:date="2026-07-26T17:05:00Z" w16du:dateUtc="2026-07-26T13:35:00Z">
         <w:r>
           <w:t xml:space="preserve">       </w:t>
         </w:r>
@@ -19970,10 +19942,10 @@
     <w:p>
       <w:pPr>
         <w:rPr>
-          <w:ins w:id="73" w:author="Erfan Mohammadzadeh" w:date="2026-07-26T17:05:00Z" w16du:dateUtc="2026-07-26T13:35:00Z"/>
-        </w:rPr>
-      </w:pPr>
-      <w:ins w:id="74" w:author="Erfan Mohammadzadeh" w:date="2026-07-26T17:05:00Z" w16du:dateUtc="2026-07-26T13:35:00Z">
+          <w:ins w:id="74" w:author="Erfan Mohammadzadeh" w:date="2026-07-26T17:05:00Z" w16du:dateUtc="2026-07-26T13:35:00Z"/>
+        </w:rPr>
+      </w:pPr>
+      <w:ins w:id="75" w:author="Erfan Mohammadzadeh" w:date="2026-07-26T17:05:00Z" w16du:dateUtc="2026-07-26T13:35:00Z">
         <w:r>
           <w:t>Role-Based Main Menu</w:t>
         </w:r>
@@ -19982,10 +19954,10 @@
     <w:p>
       <w:pPr>
         <w:rPr>
-          <w:ins w:id="75" w:author="Erfan Mohammadzadeh" w:date="2026-07-26T17:05:00Z" w16du:dateUtc="2026-07-26T13:35:00Z"/>
-        </w:rPr>
-      </w:pPr>
-      <w:ins w:id="76" w:author="Erfan Mohammadzadeh" w:date="2026-07-26T17:05:00Z" w16du:dateUtc="2026-07-26T13:35:00Z">
+          <w:ins w:id="76" w:author="Erfan Mohammadzadeh" w:date="2026-07-26T17:05:00Z" w16du:dateUtc="2026-07-26T13:35:00Z"/>
+        </w:rPr>
+      </w:pPr>
+      <w:ins w:id="77" w:author="Erfan Mohammadzadeh" w:date="2026-07-26T17:05:00Z" w16du:dateUtc="2026-07-26T13:35:00Z">
         <w:r>
           <w:t xml:space="preserve">       │</w:t>
         </w:r>
@@ -19994,10 +19966,10 @@
     <w:p>
       <w:pPr>
         <w:rPr>
-          <w:ins w:id="77" w:author="Erfan Mohammadzadeh" w:date="2026-07-26T17:05:00Z" w16du:dateUtc="2026-07-26T13:35:00Z"/>
-        </w:rPr>
-      </w:pPr>
-      <w:ins w:id="78" w:author="Erfan Mohammadzadeh" w:date="2026-07-26T17:05:00Z" w16du:dateUtc="2026-07-26T13:35:00Z">
+          <w:ins w:id="78" w:author="Erfan Mohammadzadeh" w:date="2026-07-26T17:05:00Z" w16du:dateUtc="2026-07-26T13:35:00Z"/>
+        </w:rPr>
+      </w:pPr>
+      <w:ins w:id="79" w:author="Erfan Mohammadzadeh" w:date="2026-07-26T17:05:00Z" w16du:dateUtc="2026-07-26T13:35:00Z">
         <w:r>
           <w:t xml:space="preserve">       </w:t>
         </w:r>
@@ -20021,10 +19993,10 @@
     <w:p>
       <w:pPr>
         <w:rPr>
-          <w:ins w:id="79" w:author="Erfan Mohammadzadeh" w:date="2026-07-26T17:05:00Z" w16du:dateUtc="2026-07-26T13:35:00Z"/>
-        </w:rPr>
-      </w:pPr>
-      <w:ins w:id="80" w:author="Erfan Mohammadzadeh" w:date="2026-07-26T17:05:00Z" w16du:dateUtc="2026-07-26T13:35:00Z">
+          <w:ins w:id="80" w:author="Erfan Mohammadzadeh" w:date="2026-07-26T17:05:00Z" w16du:dateUtc="2026-07-26T13:35:00Z"/>
+        </w:rPr>
+      </w:pPr>
+      <w:ins w:id="81" w:author="Erfan Mohammadzadeh" w:date="2026-07-26T17:05:00Z" w16du:dateUtc="2026-07-26T13:35:00Z">
         <w:r>
           <w:t xml:space="preserve">       </w:t>
         </w:r>
@@ -20048,10 +20020,10 @@
     <w:p>
       <w:pPr>
         <w:rPr>
-          <w:ins w:id="81" w:author="Erfan Mohammadzadeh" w:date="2026-07-26T17:05:00Z" w16du:dateUtc="2026-07-26T13:35:00Z"/>
-        </w:rPr>
-      </w:pPr>
-      <w:ins w:id="82" w:author="Erfan Mohammadzadeh" w:date="2026-07-26T17:05:00Z" w16du:dateUtc="2026-07-26T13:35:00Z">
+          <w:ins w:id="82" w:author="Erfan Mohammadzadeh" w:date="2026-07-26T17:05:00Z" w16du:dateUtc="2026-07-26T13:35:00Z"/>
+        </w:rPr>
+      </w:pPr>
+      <w:ins w:id="83" w:author="Erfan Mohammadzadeh" w:date="2026-07-26T17:05:00Z" w16du:dateUtc="2026-07-26T13:35:00Z">
         <w:r>
           <w:t xml:space="preserve">       </w:t>
         </w:r>
@@ -20075,10 +20047,10 @@
     <w:p>
       <w:pPr>
         <w:rPr>
-          <w:ins w:id="83" w:author="Erfan Mohammadzadeh" w:date="2026-07-26T17:05:00Z" w16du:dateUtc="2026-07-26T13:35:00Z"/>
-        </w:rPr>
-      </w:pPr>
-      <w:ins w:id="84" w:author="Erfan Mohammadzadeh" w:date="2026-07-26T17:05:00Z" w16du:dateUtc="2026-07-26T13:35:00Z">
+          <w:ins w:id="84" w:author="Erfan Mohammadzadeh" w:date="2026-07-26T17:05:00Z" w16du:dateUtc="2026-07-26T13:35:00Z"/>
+        </w:rPr>
+      </w:pPr>
+      <w:ins w:id="85" w:author="Erfan Mohammadzadeh" w:date="2026-07-26T17:05:00Z" w16du:dateUtc="2026-07-26T13:35:00Z">
         <w:r>
           <w:t xml:space="preserve">       </w:t>
         </w:r>
@@ -20102,10 +20074,10 @@
     <w:p>
       <w:pPr>
         <w:rPr>
-          <w:ins w:id="85" w:author="Erfan Mohammadzadeh" w:date="2026-07-26T17:05:00Z" w16du:dateUtc="2026-07-26T13:35:00Z"/>
-        </w:rPr>
-      </w:pPr>
-      <w:ins w:id="86" w:author="Erfan Mohammadzadeh" w:date="2026-07-26T17:05:00Z" w16du:dateUtc="2026-07-26T13:35:00Z">
+          <w:ins w:id="86" w:author="Erfan Mohammadzadeh" w:date="2026-07-26T17:05:00Z" w16du:dateUtc="2026-07-26T13:35:00Z"/>
+        </w:rPr>
+      </w:pPr>
+      <w:ins w:id="87" w:author="Erfan Mohammadzadeh" w:date="2026-07-26T17:05:00Z" w16du:dateUtc="2026-07-26T13:35:00Z">
         <w:r>
           <w:t xml:space="preserve">       </w:t>
         </w:r>
@@ -20129,10 +20101,10 @@
     <w:p>
       <w:pPr>
         <w:rPr>
-          <w:ins w:id="87" w:author="Erfan Mohammadzadeh" w:date="2026-07-26T17:05:00Z" w16du:dateUtc="2026-07-26T13:35:00Z"/>
-        </w:rPr>
-      </w:pPr>
-      <w:ins w:id="88" w:author="Erfan Mohammadzadeh" w:date="2026-07-26T17:05:00Z" w16du:dateUtc="2026-07-26T13:35:00Z">
+          <w:ins w:id="88" w:author="Erfan Mohammadzadeh" w:date="2026-07-26T17:05:00Z" w16du:dateUtc="2026-07-26T13:35:00Z"/>
+        </w:rPr>
+      </w:pPr>
+      <w:ins w:id="89" w:author="Erfan Mohammadzadeh" w:date="2026-07-26T17:05:00Z" w16du:dateUtc="2026-07-26T13:35:00Z">
         <w:r>
           <w:t xml:space="preserve">       </w:t>
         </w:r>
@@ -20156,10 +20128,10 @@
     <w:p>
       <w:pPr>
         <w:rPr>
-          <w:ins w:id="89" w:author="Erfan Mohammadzadeh" w:date="2026-07-26T17:05:00Z" w16du:dateUtc="2026-07-26T13:35:00Z"/>
-        </w:rPr>
-      </w:pPr>
-      <w:ins w:id="90" w:author="Erfan Mohammadzadeh" w:date="2026-07-26T17:05:00Z" w16du:dateUtc="2026-07-26T13:35:00Z">
+          <w:ins w:id="90" w:author="Erfan Mohammadzadeh" w:date="2026-07-26T17:05:00Z" w16du:dateUtc="2026-07-26T13:35:00Z"/>
+        </w:rPr>
+      </w:pPr>
+      <w:ins w:id="91" w:author="Erfan Mohammadzadeh" w:date="2026-07-26T17:05:00Z" w16du:dateUtc="2026-07-26T13:35:00Z">
         <w:r>
           <w:t xml:space="preserve">       └── Logout</w:t>
         </w:r>
@@ -20168,10 +20140,10 @@
     <w:p>
       <w:pPr>
         <w:rPr>
-          <w:ins w:id="91" w:author="Erfan Mohammadzadeh" w:date="2026-07-26T17:05:00Z" w16du:dateUtc="2026-07-26T13:35:00Z"/>
-        </w:rPr>
-      </w:pPr>
-      <w:ins w:id="92" w:author="Erfan Mohammadzadeh" w:date="2026-07-26T17:05:00Z" w16du:dateUtc="2026-07-26T13:35:00Z">
+          <w:ins w:id="92" w:author="Erfan Mohammadzadeh" w:date="2026-07-26T17:05:00Z" w16du:dateUtc="2026-07-26T13:35:00Z"/>
+        </w:rPr>
+      </w:pPr>
+      <w:ins w:id="93" w:author="Erfan Mohammadzadeh" w:date="2026-07-26T17:05:00Z" w16du:dateUtc="2026-07-26T13:35:00Z">
         <w:r>
           <w:pict w14:anchorId="609A7F72">
             <v:rect id="_x0000_i1030" style="width:0;height:1.5pt" o:hralign="center" o:hrstd="t" o:hr="t" fillcolor="#a0a0a0" stroked="f"/>
@@ -20182,18 +20154,17 @@
     <w:p>
       <w:pPr>
         <w:rPr>
-          <w:ins w:id="93" w:author="Erfan Mohammadzadeh" w:date="2026-07-26T17:05:00Z" w16du:dateUtc="2026-07-26T13:35:00Z"/>
+          <w:ins w:id="94" w:author="Erfan Mohammadzadeh" w:date="2026-07-26T17:05:00Z" w16du:dateUtc="2026-07-26T13:35:00Z"/>
           <w:b/>
           <w:bCs/>
         </w:rPr>
       </w:pPr>
-      <w:ins w:id="94" w:author="Erfan Mohammadzadeh" w:date="2026-07-26T17:05:00Z" w16du:dateUtc="2026-07-26T13:35:00Z">
+      <w:ins w:id="95" w:author="Erfan Mohammadzadeh" w:date="2026-07-26T17:05:00Z" w16du:dateUtc="2026-07-26T13:35:00Z">
         <w:r>
           <w:rPr>
             <w:b/>
             <w:bCs/>
           </w:rPr>
-          <w:lastRenderedPageBreak/>
           <w:t>Step 7 — Add automated tests</w:t>
         </w:r>
       </w:ins>
@@ -20201,10 +20172,10 @@
     <w:p>
       <w:pPr>
         <w:rPr>
-          <w:ins w:id="95" w:author="Erfan Mohammadzadeh" w:date="2026-07-26T17:05:00Z" w16du:dateUtc="2026-07-26T13:35:00Z"/>
-        </w:rPr>
-      </w:pPr>
-      <w:ins w:id="96" w:author="Erfan Mohammadzadeh" w:date="2026-07-26T17:05:00Z" w16du:dateUtc="2026-07-26T13:35:00Z">
+          <w:ins w:id="96" w:author="Erfan Mohammadzadeh" w:date="2026-07-26T17:05:00Z" w16du:dateUtc="2026-07-26T13:35:00Z"/>
+        </w:rPr>
+      </w:pPr>
+      <w:ins w:id="97" w:author="Erfan Mohammadzadeh" w:date="2026-07-26T17:05:00Z" w16du:dateUtc="2026-07-26T13:35:00Z">
         <w:r>
           <w:t xml:space="preserve">This is the part I would </w:t>
         </w:r>
@@ -20223,10 +20194,10 @@
     <w:p>
       <w:pPr>
         <w:rPr>
-          <w:ins w:id="97" w:author="Erfan Mohammadzadeh" w:date="2026-07-26T17:05:00Z" w16du:dateUtc="2026-07-26T13:35:00Z"/>
-        </w:rPr>
-      </w:pPr>
-      <w:ins w:id="98" w:author="Erfan Mohammadzadeh" w:date="2026-07-26T17:05:00Z" w16du:dateUtc="2026-07-26T13:35:00Z">
+          <w:ins w:id="98" w:author="Erfan Mohammadzadeh" w:date="2026-07-26T17:05:00Z" w16du:dateUtc="2026-07-26T13:35:00Z"/>
+        </w:rPr>
+      </w:pPr>
+      <w:ins w:id="99" w:author="Erfan Mohammadzadeh" w:date="2026-07-26T17:05:00Z" w16du:dateUtc="2026-07-26T13:35:00Z">
         <w:r>
           <w:t>You have now reached a point where testing is valuable.</w:t>
         </w:r>
@@ -20235,10 +20206,10 @@
     <w:p>
       <w:pPr>
         <w:rPr>
-          <w:ins w:id="99" w:author="Erfan Mohammadzadeh" w:date="2026-07-26T17:05:00Z" w16du:dateUtc="2026-07-26T13:35:00Z"/>
-        </w:rPr>
-      </w:pPr>
-      <w:ins w:id="100" w:author="Erfan Mohammadzadeh" w:date="2026-07-26T17:05:00Z" w16du:dateUtc="2026-07-26T13:35:00Z">
+          <w:ins w:id="100" w:author="Erfan Mohammadzadeh" w:date="2026-07-26T17:05:00Z" w16du:dateUtc="2026-07-26T13:35:00Z"/>
+        </w:rPr>
+      </w:pPr>
+      <w:ins w:id="101" w:author="Erfan Mohammadzadeh" w:date="2026-07-26T17:05:00Z" w16du:dateUtc="2026-07-26T13:35:00Z">
         <w:r>
           <w:t>Start with unit tests for:</w:t>
         </w:r>
@@ -20247,10 +20218,10 @@
     <w:p>
       <w:pPr>
         <w:rPr>
-          <w:ins w:id="101" w:author="Erfan Mohammadzadeh" w:date="2026-07-26T17:05:00Z" w16du:dateUtc="2026-07-26T13:35:00Z"/>
-        </w:rPr>
-      </w:pPr>
-      <w:ins w:id="102" w:author="Erfan Mohammadzadeh" w:date="2026-07-26T17:05:00Z" w16du:dateUtc="2026-07-26T13:35:00Z">
+          <w:ins w:id="102" w:author="Erfan Mohammadzadeh" w:date="2026-07-26T17:05:00Z" w16du:dateUtc="2026-07-26T13:35:00Z"/>
+        </w:rPr>
+      </w:pPr>
+      <w:ins w:id="103" w:author="Erfan Mohammadzadeh" w:date="2026-07-26T17:05:00Z" w16du:dateUtc="2026-07-26T13:35:00Z">
         <w:r>
           <w:t>Book</w:t>
         </w:r>
@@ -20259,10 +20230,10 @@
     <w:p>
       <w:pPr>
         <w:rPr>
-          <w:ins w:id="103" w:author="Erfan Mohammadzadeh" w:date="2026-07-26T17:05:00Z" w16du:dateUtc="2026-07-26T13:35:00Z"/>
-        </w:rPr>
-      </w:pPr>
-      <w:ins w:id="104" w:author="Erfan Mohammadzadeh" w:date="2026-07-26T17:05:00Z" w16du:dateUtc="2026-07-26T13:35:00Z">
+          <w:ins w:id="104" w:author="Erfan Mohammadzadeh" w:date="2026-07-26T17:05:00Z" w16du:dateUtc="2026-07-26T13:35:00Z"/>
+        </w:rPr>
+      </w:pPr>
+      <w:ins w:id="105" w:author="Erfan Mohammadzadeh" w:date="2026-07-26T17:05:00Z" w16du:dateUtc="2026-07-26T13:35:00Z">
         <w:r>
           <w:t xml:space="preserve"> </w:t>
         </w:r>
@@ -20291,11 +20262,12 @@
     <w:p>
       <w:pPr>
         <w:rPr>
-          <w:ins w:id="105" w:author="Erfan Mohammadzadeh" w:date="2026-07-26T17:05:00Z" w16du:dateUtc="2026-07-26T13:35:00Z"/>
-        </w:rPr>
-      </w:pPr>
-      <w:ins w:id="106" w:author="Erfan Mohammadzadeh" w:date="2026-07-26T17:05:00Z" w16du:dateUtc="2026-07-26T13:35:00Z">
+          <w:ins w:id="106" w:author="Erfan Mohammadzadeh" w:date="2026-07-26T17:05:00Z" w16du:dateUtc="2026-07-26T13:35:00Z"/>
+        </w:rPr>
+      </w:pPr>
+      <w:ins w:id="107" w:author="Erfan Mohammadzadeh" w:date="2026-07-26T17:05:00Z" w16du:dateUtc="2026-07-26T13:35:00Z">
         <w:r>
+          <w:lastRenderedPageBreak/>
           <w:t xml:space="preserve"> </w:t>
         </w:r>
         <w:r>
@@ -20323,10 +20295,10 @@
     <w:p>
       <w:pPr>
         <w:rPr>
-          <w:ins w:id="107" w:author="Erfan Mohammadzadeh" w:date="2026-07-26T17:05:00Z" w16du:dateUtc="2026-07-26T13:35:00Z"/>
-        </w:rPr>
-      </w:pPr>
-      <w:ins w:id="108" w:author="Erfan Mohammadzadeh" w:date="2026-07-26T17:05:00Z" w16du:dateUtc="2026-07-26T13:35:00Z">
+          <w:ins w:id="108" w:author="Erfan Mohammadzadeh" w:date="2026-07-26T17:05:00Z" w16du:dateUtc="2026-07-26T13:35:00Z"/>
+        </w:rPr>
+      </w:pPr>
+      <w:ins w:id="109" w:author="Erfan Mohammadzadeh" w:date="2026-07-26T17:05:00Z" w16du:dateUtc="2026-07-26T13:35:00Z">
         <w:r>
           <w:t xml:space="preserve"> </w:t>
         </w:r>
@@ -20355,10 +20327,10 @@
     <w:p>
       <w:pPr>
         <w:rPr>
-          <w:ins w:id="109" w:author="Erfan Mohammadzadeh" w:date="2026-07-26T17:05:00Z" w16du:dateUtc="2026-07-26T13:35:00Z"/>
-        </w:rPr>
-      </w:pPr>
-      <w:ins w:id="110" w:author="Erfan Mohammadzadeh" w:date="2026-07-26T17:05:00Z" w16du:dateUtc="2026-07-26T13:35:00Z">
+          <w:ins w:id="110" w:author="Erfan Mohammadzadeh" w:date="2026-07-26T17:05:00Z" w16du:dateUtc="2026-07-26T13:35:00Z"/>
+        </w:rPr>
+      </w:pPr>
+      <w:ins w:id="111" w:author="Erfan Mohammadzadeh" w:date="2026-07-26T17:05:00Z" w16du:dateUtc="2026-07-26T13:35:00Z">
         <w:r>
           <w:t xml:space="preserve"> </w:t>
         </w:r>
@@ -20387,10 +20359,10 @@
     <w:p>
       <w:pPr>
         <w:rPr>
-          <w:ins w:id="111" w:author="Erfan Mohammadzadeh" w:date="2026-07-26T17:05:00Z" w16du:dateUtc="2026-07-26T13:35:00Z"/>
-        </w:rPr>
-      </w:pPr>
-      <w:ins w:id="112" w:author="Erfan Mohammadzadeh" w:date="2026-07-26T17:05:00Z" w16du:dateUtc="2026-07-26T13:35:00Z">
+          <w:ins w:id="112" w:author="Erfan Mohammadzadeh" w:date="2026-07-26T17:05:00Z" w16du:dateUtc="2026-07-26T13:35:00Z"/>
+        </w:rPr>
+      </w:pPr>
+      <w:ins w:id="113" w:author="Erfan Mohammadzadeh" w:date="2026-07-26T17:05:00Z" w16du:dateUtc="2026-07-26T13:35:00Z">
         <w:r>
           <w:t xml:space="preserve"> </w:t>
         </w:r>
@@ -20419,10 +20391,10 @@
     <w:p>
       <w:pPr>
         <w:rPr>
-          <w:ins w:id="113" w:author="Erfan Mohammadzadeh" w:date="2026-07-26T17:05:00Z" w16du:dateUtc="2026-07-26T13:35:00Z"/>
-        </w:rPr>
-      </w:pPr>
-      <w:ins w:id="114" w:author="Erfan Mohammadzadeh" w:date="2026-07-26T17:05:00Z" w16du:dateUtc="2026-07-26T13:35:00Z">
+          <w:ins w:id="114" w:author="Erfan Mohammadzadeh" w:date="2026-07-26T17:05:00Z" w16du:dateUtc="2026-07-26T13:35:00Z"/>
+        </w:rPr>
+      </w:pPr>
+      <w:ins w:id="115" w:author="Erfan Mohammadzadeh" w:date="2026-07-26T17:05:00Z" w16du:dateUtc="2026-07-26T13:35:00Z">
         <w:r>
           <w:t xml:space="preserve"> └── </w:t>
         </w:r>
@@ -20436,18 +20408,18 @@
     <w:p>
       <w:pPr>
         <w:rPr>
-          <w:ins w:id="115" w:author="Erfan Mohammadzadeh" w:date="2026-07-26T17:05:00Z" w16du:dateUtc="2026-07-26T13:35:00Z"/>
-        </w:rPr>
-      </w:pPr>
-    </w:p>
-    <w:p>
-      <w:pPr>
-        <w:rPr>
           <w:ins w:id="116" w:author="Erfan Mohammadzadeh" w:date="2026-07-26T17:05:00Z" w16du:dateUtc="2026-07-26T13:35:00Z"/>
         </w:rPr>
       </w:pPr>
+    </w:p>
+    <w:p>
+      <w:pPr>
+        <w:rPr>
+          <w:ins w:id="117" w:author="Erfan Mohammadzadeh" w:date="2026-07-26T17:05:00Z" w16du:dateUtc="2026-07-26T13:35:00Z"/>
+        </w:rPr>
+      </w:pPr>
       <w:proofErr w:type="spellStart"/>
-      <w:ins w:id="117" w:author="Erfan Mohammadzadeh" w:date="2026-07-26T17:05:00Z" w16du:dateUtc="2026-07-26T13:35:00Z">
+      <w:ins w:id="118" w:author="Erfan Mohammadzadeh" w:date="2026-07-26T17:05:00Z" w16du:dateUtc="2026-07-26T13:35:00Z">
         <w:r>
           <w:t>BookManagementService</w:t>
         </w:r>
@@ -20457,10 +20429,10 @@
     <w:p>
       <w:pPr>
         <w:rPr>
-          <w:ins w:id="118" w:author="Erfan Mohammadzadeh" w:date="2026-07-26T17:05:00Z" w16du:dateUtc="2026-07-26T13:35:00Z"/>
-        </w:rPr>
-      </w:pPr>
-      <w:ins w:id="119" w:author="Erfan Mohammadzadeh" w:date="2026-07-26T17:05:00Z" w16du:dateUtc="2026-07-26T13:35:00Z">
+          <w:ins w:id="119" w:author="Erfan Mohammadzadeh" w:date="2026-07-26T17:05:00Z" w16du:dateUtc="2026-07-26T13:35:00Z"/>
+        </w:rPr>
+      </w:pPr>
+      <w:ins w:id="120" w:author="Erfan Mohammadzadeh" w:date="2026-07-26T17:05:00Z" w16du:dateUtc="2026-07-26T13:35:00Z">
         <w:r>
           <w:t xml:space="preserve"> </w:t>
         </w:r>
@@ -20489,10 +20461,10 @@
     <w:p>
       <w:pPr>
         <w:rPr>
-          <w:ins w:id="120" w:author="Erfan Mohammadzadeh" w:date="2026-07-26T17:05:00Z" w16du:dateUtc="2026-07-26T13:35:00Z"/>
-        </w:rPr>
-      </w:pPr>
-      <w:ins w:id="121" w:author="Erfan Mohammadzadeh" w:date="2026-07-26T17:05:00Z" w16du:dateUtc="2026-07-26T13:35:00Z">
+          <w:ins w:id="121" w:author="Erfan Mohammadzadeh" w:date="2026-07-26T17:05:00Z" w16du:dateUtc="2026-07-26T13:35:00Z"/>
+        </w:rPr>
+      </w:pPr>
+      <w:ins w:id="122" w:author="Erfan Mohammadzadeh" w:date="2026-07-26T17:05:00Z" w16du:dateUtc="2026-07-26T13:35:00Z">
         <w:r>
           <w:t xml:space="preserve"> </w:t>
         </w:r>
@@ -20521,10 +20493,10 @@
     <w:p>
       <w:pPr>
         <w:rPr>
-          <w:ins w:id="122" w:author="Erfan Mohammadzadeh" w:date="2026-07-26T17:05:00Z" w16du:dateUtc="2026-07-26T13:35:00Z"/>
-        </w:rPr>
-      </w:pPr>
-      <w:ins w:id="123" w:author="Erfan Mohammadzadeh" w:date="2026-07-26T17:05:00Z" w16du:dateUtc="2026-07-26T13:35:00Z">
+          <w:ins w:id="123" w:author="Erfan Mohammadzadeh" w:date="2026-07-26T17:05:00Z" w16du:dateUtc="2026-07-26T13:35:00Z"/>
+        </w:rPr>
+      </w:pPr>
+      <w:ins w:id="124" w:author="Erfan Mohammadzadeh" w:date="2026-07-26T17:05:00Z" w16du:dateUtc="2026-07-26T13:35:00Z">
         <w:r>
           <w:t xml:space="preserve"> └── </w:t>
         </w:r>
@@ -20538,18 +20510,18 @@
     <w:p>
       <w:pPr>
         <w:rPr>
-          <w:ins w:id="124" w:author="Erfan Mohammadzadeh" w:date="2026-07-26T17:05:00Z" w16du:dateUtc="2026-07-26T13:35:00Z"/>
-        </w:rPr>
-      </w:pPr>
-    </w:p>
-    <w:p>
-      <w:pPr>
-        <w:rPr>
           <w:ins w:id="125" w:author="Erfan Mohammadzadeh" w:date="2026-07-26T17:05:00Z" w16du:dateUtc="2026-07-26T13:35:00Z"/>
         </w:rPr>
       </w:pPr>
+    </w:p>
+    <w:p>
+      <w:pPr>
+        <w:rPr>
+          <w:ins w:id="126" w:author="Erfan Mohammadzadeh" w:date="2026-07-26T17:05:00Z" w16du:dateUtc="2026-07-26T13:35:00Z"/>
+        </w:rPr>
+      </w:pPr>
       <w:proofErr w:type="spellStart"/>
-      <w:ins w:id="126" w:author="Erfan Mohammadzadeh" w:date="2026-07-26T17:05:00Z" w16du:dateUtc="2026-07-26T13:35:00Z">
+      <w:ins w:id="127" w:author="Erfan Mohammadzadeh" w:date="2026-07-26T17:05:00Z" w16du:dateUtc="2026-07-26T13:35:00Z">
         <w:r>
           <w:t>LoanManagementService</w:t>
         </w:r>
@@ -20559,10 +20531,10 @@
     <w:p>
       <w:pPr>
         <w:rPr>
-          <w:ins w:id="127" w:author="Erfan Mohammadzadeh" w:date="2026-07-26T17:05:00Z" w16du:dateUtc="2026-07-26T13:35:00Z"/>
-        </w:rPr>
-      </w:pPr>
-      <w:ins w:id="128" w:author="Erfan Mohammadzadeh" w:date="2026-07-26T17:05:00Z" w16du:dateUtc="2026-07-26T13:35:00Z">
+          <w:ins w:id="128" w:author="Erfan Mohammadzadeh" w:date="2026-07-26T17:05:00Z" w16du:dateUtc="2026-07-26T13:35:00Z"/>
+        </w:rPr>
+      </w:pPr>
+      <w:ins w:id="129" w:author="Erfan Mohammadzadeh" w:date="2026-07-26T17:05:00Z" w16du:dateUtc="2026-07-26T13:35:00Z">
         <w:r>
           <w:t xml:space="preserve"> </w:t>
         </w:r>
@@ -20591,10 +20563,10 @@
     <w:p>
       <w:pPr>
         <w:rPr>
-          <w:ins w:id="129" w:author="Erfan Mohammadzadeh" w:date="2026-07-26T17:05:00Z" w16du:dateUtc="2026-07-26T13:35:00Z"/>
-        </w:rPr>
-      </w:pPr>
-      <w:ins w:id="130" w:author="Erfan Mohammadzadeh" w:date="2026-07-26T17:05:00Z" w16du:dateUtc="2026-07-26T13:35:00Z">
+          <w:ins w:id="130" w:author="Erfan Mohammadzadeh" w:date="2026-07-26T17:05:00Z" w16du:dateUtc="2026-07-26T13:35:00Z"/>
+        </w:rPr>
+      </w:pPr>
+      <w:ins w:id="131" w:author="Erfan Mohammadzadeh" w:date="2026-07-26T17:05:00Z" w16du:dateUtc="2026-07-26T13:35:00Z">
         <w:r>
           <w:t xml:space="preserve"> </w:t>
         </w:r>
@@ -20623,10 +20595,10 @@
     <w:p>
       <w:pPr>
         <w:rPr>
-          <w:ins w:id="131" w:author="Erfan Mohammadzadeh" w:date="2026-07-26T17:05:00Z" w16du:dateUtc="2026-07-26T13:35:00Z"/>
-        </w:rPr>
-      </w:pPr>
-      <w:ins w:id="132" w:author="Erfan Mohammadzadeh" w:date="2026-07-26T17:05:00Z" w16du:dateUtc="2026-07-26T13:35:00Z">
+          <w:ins w:id="132" w:author="Erfan Mohammadzadeh" w:date="2026-07-26T17:05:00Z" w16du:dateUtc="2026-07-26T13:35:00Z"/>
+        </w:rPr>
+      </w:pPr>
+      <w:ins w:id="133" w:author="Erfan Mohammadzadeh" w:date="2026-07-26T17:05:00Z" w16du:dateUtc="2026-07-26T13:35:00Z">
         <w:r>
           <w:t xml:space="preserve"> └── </w:t>
         </w:r>
@@ -20640,18 +20612,18 @@
     <w:p>
       <w:pPr>
         <w:rPr>
-          <w:ins w:id="133" w:author="Erfan Mohammadzadeh" w:date="2026-07-26T17:05:00Z" w16du:dateUtc="2026-07-26T13:35:00Z"/>
-        </w:rPr>
-      </w:pPr>
-    </w:p>
-    <w:p>
-      <w:pPr>
-        <w:rPr>
           <w:ins w:id="134" w:author="Erfan Mohammadzadeh" w:date="2026-07-26T17:05:00Z" w16du:dateUtc="2026-07-26T13:35:00Z"/>
         </w:rPr>
       </w:pPr>
+    </w:p>
+    <w:p>
+      <w:pPr>
+        <w:rPr>
+          <w:ins w:id="135" w:author="Erfan Mohammadzadeh" w:date="2026-07-26T17:05:00Z" w16du:dateUtc="2026-07-26T13:35:00Z"/>
+        </w:rPr>
+      </w:pPr>
       <w:proofErr w:type="spellStart"/>
-      <w:ins w:id="135" w:author="Erfan Mohammadzadeh" w:date="2026-07-26T17:05:00Z" w16du:dateUtc="2026-07-26T13:35:00Z">
+      <w:ins w:id="136" w:author="Erfan Mohammadzadeh" w:date="2026-07-26T17:05:00Z" w16du:dateUtc="2026-07-26T13:35:00Z">
         <w:r>
           <w:t>AuthenticationService</w:t>
         </w:r>
@@ -20661,10 +20633,10 @@
     <w:p>
       <w:pPr>
         <w:rPr>
-          <w:ins w:id="136" w:author="Erfan Mohammadzadeh" w:date="2026-07-26T17:05:00Z" w16du:dateUtc="2026-07-26T13:35:00Z"/>
-        </w:rPr>
-      </w:pPr>
-      <w:ins w:id="137" w:author="Erfan Mohammadzadeh" w:date="2026-07-26T17:05:00Z" w16du:dateUtc="2026-07-26T13:35:00Z">
+          <w:ins w:id="137" w:author="Erfan Mohammadzadeh" w:date="2026-07-26T17:05:00Z" w16du:dateUtc="2026-07-26T13:35:00Z"/>
+        </w:rPr>
+      </w:pPr>
+      <w:ins w:id="138" w:author="Erfan Mohammadzadeh" w:date="2026-07-26T17:05:00Z" w16du:dateUtc="2026-07-26T13:35:00Z">
         <w:r>
           <w:t xml:space="preserve"> </w:t>
         </w:r>
@@ -20688,10 +20660,10 @@
     <w:p>
       <w:pPr>
         <w:rPr>
-          <w:ins w:id="138" w:author="Erfan Mohammadzadeh" w:date="2026-07-26T17:05:00Z" w16du:dateUtc="2026-07-26T13:35:00Z"/>
-        </w:rPr>
-      </w:pPr>
-      <w:ins w:id="139" w:author="Erfan Mohammadzadeh" w:date="2026-07-26T17:05:00Z" w16du:dateUtc="2026-07-26T13:35:00Z">
+          <w:ins w:id="139" w:author="Erfan Mohammadzadeh" w:date="2026-07-26T17:05:00Z" w16du:dateUtc="2026-07-26T13:35:00Z"/>
+        </w:rPr>
+      </w:pPr>
+      <w:ins w:id="140" w:author="Erfan Mohammadzadeh" w:date="2026-07-26T17:05:00Z" w16du:dateUtc="2026-07-26T13:35:00Z">
         <w:r>
           <w:t xml:space="preserve"> └── Logout</w:t>
         </w:r>
@@ -20700,18 +20672,18 @@
     <w:p>
       <w:pPr>
         <w:rPr>
-          <w:ins w:id="140" w:author="Erfan Mohammadzadeh" w:date="2026-07-26T17:05:00Z" w16du:dateUtc="2026-07-26T13:35:00Z"/>
-        </w:rPr>
-      </w:pPr>
-    </w:p>
-    <w:p>
-      <w:pPr>
-        <w:rPr>
           <w:ins w:id="141" w:author="Erfan Mohammadzadeh" w:date="2026-07-26T17:05:00Z" w16du:dateUtc="2026-07-26T13:35:00Z"/>
         </w:rPr>
       </w:pPr>
+    </w:p>
+    <w:p>
+      <w:pPr>
+        <w:rPr>
+          <w:ins w:id="142" w:author="Erfan Mohammadzadeh" w:date="2026-07-26T17:05:00Z" w16du:dateUtc="2026-07-26T13:35:00Z"/>
+        </w:rPr>
+      </w:pPr>
       <w:proofErr w:type="spellStart"/>
-      <w:ins w:id="142" w:author="Erfan Mohammadzadeh" w:date="2026-07-26T17:05:00Z" w16du:dateUtc="2026-07-26T13:35:00Z">
+      <w:ins w:id="143" w:author="Erfan Mohammadzadeh" w:date="2026-07-26T17:05:00Z" w16du:dateUtc="2026-07-26T13:35:00Z">
         <w:r>
           <w:t>AuthorizationService</w:t>
         </w:r>
@@ -20721,18 +20693,23 @@
     <w:p>
       <w:pPr>
         <w:rPr>
-          <w:ins w:id="143" w:author="Erfan Mohammadzadeh" w:date="2026-07-26T17:05:00Z" w16du:dateUtc="2026-07-26T13:35:00Z"/>
-        </w:rPr>
-      </w:pPr>
-      <w:ins w:id="144" w:author="Erfan Mohammadzadeh" w:date="2026-07-26T17:05:00Z" w16du:dateUtc="2026-07-26T13:35:00Z">
+          <w:ins w:id="144" w:author="Erfan Mohammadzadeh" w:date="2026-07-26T17:05:00Z" w16du:dateUtc="2026-07-26T13:35:00Z"/>
+        </w:rPr>
+      </w:pPr>
+      <w:ins w:id="145" w:author="Erfan Mohammadzadeh" w:date="2026-07-26T17:05:00Z" w16du:dateUtc="2026-07-26T13:35:00Z">
         <w:r>
-          <w:lastRenderedPageBreak/>
           <w:t xml:space="preserve"> └── Permission checks</w:t>
         </w:r>
       </w:ins>
     </w:p>
     <w:p>
-      <w:ins w:id="145" w:author="Erfan Mohammadzadeh" w:date="2026-07-26T17:05:00Z" w16du:dateUtc="2026-07-26T13:35:00Z">
+      <w:pPr>
+        <w:rPr>
+          <w:b/>
+          <w:bCs/>
+        </w:rPr>
+      </w:pPr>
+      <w:ins w:id="146" w:author="Erfan Mohammadzadeh" w:date="2026-07-26T17:05:00Z" w16du:dateUtc="2026-07-26T13:35:00Z">
         <w:r>
           <w:t xml:space="preserve">This will teach you an important professional skill: </w:t>
         </w:r>
@@ -20745,6 +20722,2105 @@
         </w:r>
       </w:ins>
     </w:p>
+    <w:p>
+      <w:pPr>
+        <w:rPr>
+          <w:b/>
+          <w:bCs/>
+        </w:rPr>
+      </w:pPr>
+    </w:p>
+    <w:p>
+      <w:pPr>
+        <w:rPr>
+          <w:b/>
+          <w:bCs/>
+        </w:rPr>
+      </w:pPr>
+    </w:p>
+    <w:p>
+      <w:pPr>
+        <w:rPr>
+          <w:b/>
+          <w:bCs/>
+        </w:rPr>
+      </w:pPr>
+    </w:p>
+    <w:tbl>
+      <w:tblPr>
+        <w:tblStyle w:val="TableGrid"/>
+        <w:tblW w:w="0" w:type="auto"/>
+        <w:tblLook w:val="04A0" w:firstRow="1" w:lastRow="0" w:firstColumn="1" w:lastColumn="0" w:noHBand="0" w:noVBand="1"/>
+      </w:tblPr>
+      <w:tblGrid>
+        <w:gridCol w:w="805"/>
+        <w:gridCol w:w="2935"/>
+        <w:gridCol w:w="1870"/>
+        <w:gridCol w:w="1870"/>
+        <w:gridCol w:w="1870"/>
+      </w:tblGrid>
+      <w:tr>
+        <w:trPr>
+          <w:trHeight w:val="576"/>
+        </w:trPr>
+        <w:tc>
+          <w:tcPr>
+            <w:tcW w:w="805" w:type="dxa"/>
+            <w:vAlign w:val="center"/>
+          </w:tcPr>
+          <w:p>
+            <w:pPr>
+              <w:jc w:val="center"/>
+              <w:rPr>
+                <w:b/>
+                <w:bCs/>
+                <w:sz w:val="28"/>
+                <w:szCs w:val="28"/>
+              </w:rPr>
+            </w:pPr>
+            <w:r>
+              <w:rPr>
+                <w:b/>
+                <w:bCs/>
+                <w:sz w:val="28"/>
+                <w:szCs w:val="28"/>
+              </w:rPr>
+              <w:lastRenderedPageBreak/>
+              <w:t>Item</w:t>
+            </w:r>
+          </w:p>
+        </w:tc>
+        <w:tc>
+          <w:tcPr>
+            <w:tcW w:w="2935" w:type="dxa"/>
+            <w:vAlign w:val="center"/>
+          </w:tcPr>
+          <w:p>
+            <w:pPr>
+              <w:rPr>
+                <w:sz w:val="28"/>
+                <w:szCs w:val="28"/>
+              </w:rPr>
+            </w:pPr>
+            <w:r>
+              <w:rPr>
+                <w:b/>
+                <w:bCs/>
+                <w:sz w:val="28"/>
+                <w:szCs w:val="28"/>
+              </w:rPr>
+              <w:t>Operation</w:t>
+            </w:r>
+          </w:p>
+        </w:tc>
+        <w:tc>
+          <w:tcPr>
+            <w:tcW w:w="1870" w:type="dxa"/>
+            <w:vAlign w:val="center"/>
+          </w:tcPr>
+          <w:p>
+            <w:pPr>
+              <w:jc w:val="center"/>
+              <w:rPr>
+                <w:sz w:val="28"/>
+                <w:szCs w:val="28"/>
+              </w:rPr>
+            </w:pPr>
+            <w:r>
+              <w:rPr>
+                <w:b/>
+                <w:bCs/>
+                <w:sz w:val="28"/>
+                <w:szCs w:val="28"/>
+              </w:rPr>
+              <w:t>Admin</w:t>
+            </w:r>
+          </w:p>
+        </w:tc>
+        <w:tc>
+          <w:tcPr>
+            <w:tcW w:w="1870" w:type="dxa"/>
+            <w:vAlign w:val="center"/>
+          </w:tcPr>
+          <w:p>
+            <w:pPr>
+              <w:jc w:val="center"/>
+              <w:rPr>
+                <w:sz w:val="28"/>
+                <w:szCs w:val="28"/>
+              </w:rPr>
+            </w:pPr>
+            <w:r>
+              <w:rPr>
+                <w:b/>
+                <w:bCs/>
+                <w:sz w:val="28"/>
+                <w:szCs w:val="28"/>
+              </w:rPr>
+              <w:t>Librarian</w:t>
+            </w:r>
+          </w:p>
+        </w:tc>
+        <w:tc>
+          <w:tcPr>
+            <w:tcW w:w="1870" w:type="dxa"/>
+            <w:vAlign w:val="center"/>
+          </w:tcPr>
+          <w:p>
+            <w:pPr>
+              <w:jc w:val="center"/>
+              <w:rPr>
+                <w:sz w:val="28"/>
+                <w:szCs w:val="28"/>
+              </w:rPr>
+            </w:pPr>
+            <w:r>
+              <w:rPr>
+                <w:b/>
+                <w:bCs/>
+                <w:sz w:val="28"/>
+                <w:szCs w:val="28"/>
+              </w:rPr>
+              <w:t>Member</w:t>
+            </w:r>
+          </w:p>
+        </w:tc>
+      </w:tr>
+      <w:tr>
+        <w:trPr>
+          <w:trHeight w:val="576"/>
+        </w:trPr>
+        <w:tc>
+          <w:tcPr>
+            <w:tcW w:w="805" w:type="dxa"/>
+            <w:vAlign w:val="center"/>
+          </w:tcPr>
+          <w:p>
+            <w:pPr>
+              <w:jc w:val="center"/>
+              <w:rPr>
+                <w:sz w:val="28"/>
+                <w:szCs w:val="28"/>
+              </w:rPr>
+            </w:pPr>
+            <w:r>
+              <w:rPr>
+                <w:sz w:val="28"/>
+                <w:szCs w:val="28"/>
+              </w:rPr>
+              <w:t>1</w:t>
+            </w:r>
+          </w:p>
+        </w:tc>
+        <w:tc>
+          <w:tcPr>
+            <w:tcW w:w="2935" w:type="dxa"/>
+            <w:vAlign w:val="center"/>
+          </w:tcPr>
+          <w:p>
+            <w:pPr>
+              <w:rPr>
+                <w:sz w:val="28"/>
+                <w:szCs w:val="28"/>
+              </w:rPr>
+            </w:pPr>
+            <w:r>
+              <w:rPr>
+                <w:sz w:val="28"/>
+                <w:szCs w:val="28"/>
+              </w:rPr>
+              <w:t>View available books</w:t>
+            </w:r>
+          </w:p>
+        </w:tc>
+        <w:tc>
+          <w:tcPr>
+            <w:tcW w:w="1870" w:type="dxa"/>
+            <w:vAlign w:val="center"/>
+          </w:tcPr>
+          <w:p>
+            <w:pPr>
+              <w:jc w:val="center"/>
+              <w:rPr>
+                <w:sz w:val="28"/>
+                <w:szCs w:val="28"/>
+              </w:rPr>
+            </w:pPr>
+            <w:r>
+              <w:rPr>
+                <w:rFonts w:ascii="Segoe UI Emoji" w:hAnsi="Segoe UI Emoji" w:cs="Segoe UI Emoji"/>
+                <w:sz w:val="28"/>
+                <w:szCs w:val="28"/>
+              </w:rPr>
+              <w:t>✅</w:t>
+            </w:r>
+          </w:p>
+        </w:tc>
+        <w:tc>
+          <w:tcPr>
+            <w:tcW w:w="1870" w:type="dxa"/>
+            <w:vAlign w:val="center"/>
+          </w:tcPr>
+          <w:p>
+            <w:pPr>
+              <w:jc w:val="center"/>
+              <w:rPr>
+                <w:sz w:val="28"/>
+                <w:szCs w:val="28"/>
+              </w:rPr>
+            </w:pPr>
+            <w:r>
+              <w:rPr>
+                <w:rFonts w:ascii="Segoe UI Emoji" w:hAnsi="Segoe UI Emoji" w:cs="Segoe UI Emoji"/>
+                <w:sz w:val="28"/>
+                <w:szCs w:val="28"/>
+              </w:rPr>
+              <w:t>✅</w:t>
+            </w:r>
+          </w:p>
+        </w:tc>
+        <w:tc>
+          <w:tcPr>
+            <w:tcW w:w="1870" w:type="dxa"/>
+            <w:vAlign w:val="center"/>
+          </w:tcPr>
+          <w:p>
+            <w:pPr>
+              <w:jc w:val="center"/>
+              <w:rPr>
+                <w:sz w:val="28"/>
+                <w:szCs w:val="28"/>
+              </w:rPr>
+            </w:pPr>
+            <w:r>
+              <w:rPr>
+                <w:rFonts w:ascii="Segoe UI Emoji" w:hAnsi="Segoe UI Emoji" w:cs="Segoe UI Emoji"/>
+                <w:sz w:val="28"/>
+                <w:szCs w:val="28"/>
+              </w:rPr>
+              <w:t>✅</w:t>
+            </w:r>
+          </w:p>
+        </w:tc>
+      </w:tr>
+      <w:tr>
+        <w:trPr>
+          <w:trHeight w:val="576"/>
+        </w:trPr>
+        <w:tc>
+          <w:tcPr>
+            <w:tcW w:w="805" w:type="dxa"/>
+            <w:vAlign w:val="center"/>
+          </w:tcPr>
+          <w:p>
+            <w:pPr>
+              <w:jc w:val="center"/>
+              <w:rPr>
+                <w:sz w:val="28"/>
+                <w:szCs w:val="28"/>
+              </w:rPr>
+            </w:pPr>
+            <w:r>
+              <w:rPr>
+                <w:sz w:val="28"/>
+                <w:szCs w:val="28"/>
+              </w:rPr>
+              <w:t>2</w:t>
+            </w:r>
+          </w:p>
+        </w:tc>
+        <w:tc>
+          <w:tcPr>
+            <w:tcW w:w="2935" w:type="dxa"/>
+            <w:vAlign w:val="center"/>
+          </w:tcPr>
+          <w:p>
+            <w:pPr>
+              <w:rPr>
+                <w:sz w:val="28"/>
+                <w:szCs w:val="28"/>
+              </w:rPr>
+            </w:pPr>
+            <w:r>
+              <w:rPr>
+                <w:sz w:val="28"/>
+                <w:szCs w:val="28"/>
+              </w:rPr>
+              <w:t>Add book</w:t>
+            </w:r>
+          </w:p>
+        </w:tc>
+        <w:tc>
+          <w:tcPr>
+            <w:tcW w:w="1870" w:type="dxa"/>
+            <w:vAlign w:val="center"/>
+          </w:tcPr>
+          <w:p>
+            <w:pPr>
+              <w:jc w:val="center"/>
+              <w:rPr>
+                <w:sz w:val="28"/>
+                <w:szCs w:val="28"/>
+              </w:rPr>
+            </w:pPr>
+            <w:r>
+              <w:rPr>
+                <w:rFonts w:ascii="Segoe UI Emoji" w:hAnsi="Segoe UI Emoji" w:cs="Segoe UI Emoji"/>
+                <w:sz w:val="28"/>
+                <w:szCs w:val="28"/>
+              </w:rPr>
+              <w:t>✅</w:t>
+            </w:r>
+          </w:p>
+        </w:tc>
+        <w:tc>
+          <w:tcPr>
+            <w:tcW w:w="1870" w:type="dxa"/>
+            <w:vAlign w:val="center"/>
+          </w:tcPr>
+          <w:p>
+            <w:pPr>
+              <w:jc w:val="center"/>
+              <w:rPr>
+                <w:sz w:val="28"/>
+                <w:szCs w:val="28"/>
+              </w:rPr>
+            </w:pPr>
+            <w:r>
+              <w:rPr>
+                <w:rFonts w:ascii="Segoe UI Emoji" w:hAnsi="Segoe UI Emoji" w:cs="Segoe UI Emoji"/>
+                <w:sz w:val="28"/>
+                <w:szCs w:val="28"/>
+              </w:rPr>
+              <w:t>✅</w:t>
+            </w:r>
+          </w:p>
+        </w:tc>
+        <w:tc>
+          <w:tcPr>
+            <w:tcW w:w="1870" w:type="dxa"/>
+            <w:vAlign w:val="center"/>
+          </w:tcPr>
+          <w:p>
+            <w:pPr>
+              <w:jc w:val="center"/>
+              <w:rPr>
+                <w:sz w:val="28"/>
+                <w:szCs w:val="28"/>
+              </w:rPr>
+            </w:pPr>
+            <w:r>
+              <w:rPr>
+                <w:rFonts w:ascii="Segoe UI Emoji" w:hAnsi="Segoe UI Emoji" w:cs="Segoe UI Emoji"/>
+                <w:sz w:val="28"/>
+                <w:szCs w:val="28"/>
+              </w:rPr>
+              <w:t>❌</w:t>
+            </w:r>
+          </w:p>
+        </w:tc>
+      </w:tr>
+      <w:tr>
+        <w:trPr>
+          <w:trHeight w:val="576"/>
+        </w:trPr>
+        <w:tc>
+          <w:tcPr>
+            <w:tcW w:w="805" w:type="dxa"/>
+            <w:vAlign w:val="center"/>
+          </w:tcPr>
+          <w:p>
+            <w:pPr>
+              <w:jc w:val="center"/>
+              <w:rPr>
+                <w:sz w:val="28"/>
+                <w:szCs w:val="28"/>
+              </w:rPr>
+            </w:pPr>
+            <w:r>
+              <w:rPr>
+                <w:sz w:val="28"/>
+                <w:szCs w:val="28"/>
+              </w:rPr>
+              <w:t>3</w:t>
+            </w:r>
+          </w:p>
+        </w:tc>
+        <w:tc>
+          <w:tcPr>
+            <w:tcW w:w="2935" w:type="dxa"/>
+            <w:vAlign w:val="center"/>
+          </w:tcPr>
+          <w:p>
+            <w:pPr>
+              <w:rPr>
+                <w:sz w:val="28"/>
+                <w:szCs w:val="28"/>
+              </w:rPr>
+            </w:pPr>
+            <w:r>
+              <w:rPr>
+                <w:sz w:val="28"/>
+                <w:szCs w:val="28"/>
+              </w:rPr>
+              <w:t>Edit book</w:t>
+            </w:r>
+          </w:p>
+        </w:tc>
+        <w:tc>
+          <w:tcPr>
+            <w:tcW w:w="1870" w:type="dxa"/>
+            <w:vAlign w:val="center"/>
+          </w:tcPr>
+          <w:p>
+            <w:pPr>
+              <w:jc w:val="center"/>
+              <w:rPr>
+                <w:sz w:val="28"/>
+                <w:szCs w:val="28"/>
+              </w:rPr>
+            </w:pPr>
+            <w:r>
+              <w:rPr>
+                <w:rFonts w:ascii="Segoe UI Emoji" w:hAnsi="Segoe UI Emoji" w:cs="Segoe UI Emoji"/>
+                <w:sz w:val="28"/>
+                <w:szCs w:val="28"/>
+              </w:rPr>
+              <w:t>✅</w:t>
+            </w:r>
+          </w:p>
+        </w:tc>
+        <w:tc>
+          <w:tcPr>
+            <w:tcW w:w="1870" w:type="dxa"/>
+            <w:vAlign w:val="center"/>
+          </w:tcPr>
+          <w:p>
+            <w:pPr>
+              <w:jc w:val="center"/>
+              <w:rPr>
+                <w:sz w:val="28"/>
+                <w:szCs w:val="28"/>
+              </w:rPr>
+            </w:pPr>
+            <w:r>
+              <w:rPr>
+                <w:rFonts w:ascii="Segoe UI Emoji" w:hAnsi="Segoe UI Emoji" w:cs="Segoe UI Emoji"/>
+                <w:sz w:val="28"/>
+                <w:szCs w:val="28"/>
+              </w:rPr>
+              <w:t>✅</w:t>
+            </w:r>
+          </w:p>
+        </w:tc>
+        <w:tc>
+          <w:tcPr>
+            <w:tcW w:w="1870" w:type="dxa"/>
+            <w:vAlign w:val="center"/>
+          </w:tcPr>
+          <w:p>
+            <w:pPr>
+              <w:jc w:val="center"/>
+              <w:rPr>
+                <w:sz w:val="28"/>
+                <w:szCs w:val="28"/>
+              </w:rPr>
+            </w:pPr>
+            <w:r>
+              <w:rPr>
+                <w:rFonts w:ascii="Segoe UI Emoji" w:hAnsi="Segoe UI Emoji" w:cs="Segoe UI Emoji"/>
+                <w:sz w:val="28"/>
+                <w:szCs w:val="28"/>
+              </w:rPr>
+              <w:t>❌</w:t>
+            </w:r>
+          </w:p>
+        </w:tc>
+      </w:tr>
+      <w:tr>
+        <w:trPr>
+          <w:trHeight w:val="576"/>
+        </w:trPr>
+        <w:tc>
+          <w:tcPr>
+            <w:tcW w:w="805" w:type="dxa"/>
+            <w:vAlign w:val="center"/>
+          </w:tcPr>
+          <w:p>
+            <w:pPr>
+              <w:jc w:val="center"/>
+              <w:rPr>
+                <w:sz w:val="28"/>
+                <w:szCs w:val="28"/>
+              </w:rPr>
+            </w:pPr>
+            <w:r>
+              <w:rPr>
+                <w:sz w:val="28"/>
+                <w:szCs w:val="28"/>
+              </w:rPr>
+              <w:t>4</w:t>
+            </w:r>
+          </w:p>
+        </w:tc>
+        <w:tc>
+          <w:tcPr>
+            <w:tcW w:w="2935" w:type="dxa"/>
+            <w:vAlign w:val="center"/>
+          </w:tcPr>
+          <w:p>
+            <w:pPr>
+              <w:rPr>
+                <w:sz w:val="28"/>
+                <w:szCs w:val="28"/>
+              </w:rPr>
+            </w:pPr>
+            <w:r>
+              <w:rPr>
+                <w:sz w:val="28"/>
+                <w:szCs w:val="28"/>
+              </w:rPr>
+              <w:t>Remove book</w:t>
+            </w:r>
+          </w:p>
+        </w:tc>
+        <w:tc>
+          <w:tcPr>
+            <w:tcW w:w="1870" w:type="dxa"/>
+            <w:vAlign w:val="center"/>
+          </w:tcPr>
+          <w:p>
+            <w:pPr>
+              <w:jc w:val="center"/>
+              <w:rPr>
+                <w:sz w:val="28"/>
+                <w:szCs w:val="28"/>
+              </w:rPr>
+            </w:pPr>
+            <w:r>
+              <w:rPr>
+                <w:rFonts w:ascii="Segoe UI Emoji" w:hAnsi="Segoe UI Emoji" w:cs="Segoe UI Emoji"/>
+                <w:sz w:val="28"/>
+                <w:szCs w:val="28"/>
+              </w:rPr>
+              <w:t>✅</w:t>
+            </w:r>
+          </w:p>
+        </w:tc>
+        <w:tc>
+          <w:tcPr>
+            <w:tcW w:w="1870" w:type="dxa"/>
+            <w:vAlign w:val="center"/>
+          </w:tcPr>
+          <w:p>
+            <w:pPr>
+              <w:jc w:val="center"/>
+              <w:rPr>
+                <w:sz w:val="28"/>
+                <w:szCs w:val="28"/>
+              </w:rPr>
+            </w:pPr>
+            <w:r>
+              <w:rPr>
+                <w:rFonts w:ascii="Segoe UI Emoji" w:hAnsi="Segoe UI Emoji" w:cs="Segoe UI Emoji"/>
+                <w:sz w:val="28"/>
+                <w:szCs w:val="28"/>
+              </w:rPr>
+              <w:t>✅</w:t>
+            </w:r>
+          </w:p>
+        </w:tc>
+        <w:tc>
+          <w:tcPr>
+            <w:tcW w:w="1870" w:type="dxa"/>
+            <w:vAlign w:val="center"/>
+          </w:tcPr>
+          <w:p>
+            <w:pPr>
+              <w:jc w:val="center"/>
+              <w:rPr>
+                <w:sz w:val="28"/>
+                <w:szCs w:val="28"/>
+              </w:rPr>
+            </w:pPr>
+            <w:r>
+              <w:rPr>
+                <w:rFonts w:ascii="Segoe UI Emoji" w:hAnsi="Segoe UI Emoji" w:cs="Segoe UI Emoji"/>
+                <w:sz w:val="28"/>
+                <w:szCs w:val="28"/>
+              </w:rPr>
+              <w:t>❌</w:t>
+            </w:r>
+          </w:p>
+        </w:tc>
+      </w:tr>
+      <w:tr>
+        <w:trPr>
+          <w:trHeight w:val="576"/>
+        </w:trPr>
+        <w:tc>
+          <w:tcPr>
+            <w:tcW w:w="805" w:type="dxa"/>
+            <w:vAlign w:val="center"/>
+          </w:tcPr>
+          <w:p>
+            <w:pPr>
+              <w:jc w:val="center"/>
+              <w:rPr>
+                <w:sz w:val="28"/>
+                <w:szCs w:val="28"/>
+              </w:rPr>
+            </w:pPr>
+            <w:r>
+              <w:rPr>
+                <w:sz w:val="28"/>
+                <w:szCs w:val="28"/>
+              </w:rPr>
+              <w:t>5</w:t>
+            </w:r>
+          </w:p>
+        </w:tc>
+        <w:tc>
+          <w:tcPr>
+            <w:tcW w:w="2935" w:type="dxa"/>
+            <w:vAlign w:val="center"/>
+          </w:tcPr>
+          <w:p>
+            <w:pPr>
+              <w:rPr>
+                <w:sz w:val="28"/>
+                <w:szCs w:val="28"/>
+              </w:rPr>
+            </w:pPr>
+            <w:r>
+              <w:rPr>
+                <w:sz w:val="28"/>
+                <w:szCs w:val="28"/>
+              </w:rPr>
+              <w:t>Add author</w:t>
+            </w:r>
+          </w:p>
+        </w:tc>
+        <w:tc>
+          <w:tcPr>
+            <w:tcW w:w="1870" w:type="dxa"/>
+            <w:vAlign w:val="center"/>
+          </w:tcPr>
+          <w:p>
+            <w:pPr>
+              <w:jc w:val="center"/>
+              <w:rPr>
+                <w:sz w:val="28"/>
+                <w:szCs w:val="28"/>
+              </w:rPr>
+            </w:pPr>
+            <w:r>
+              <w:rPr>
+                <w:rFonts w:ascii="Segoe UI Emoji" w:hAnsi="Segoe UI Emoji" w:cs="Segoe UI Emoji"/>
+                <w:sz w:val="28"/>
+                <w:szCs w:val="28"/>
+              </w:rPr>
+              <w:t>✅</w:t>
+            </w:r>
+          </w:p>
+        </w:tc>
+        <w:tc>
+          <w:tcPr>
+            <w:tcW w:w="1870" w:type="dxa"/>
+            <w:vAlign w:val="center"/>
+          </w:tcPr>
+          <w:p>
+            <w:pPr>
+              <w:jc w:val="center"/>
+              <w:rPr>
+                <w:sz w:val="28"/>
+                <w:szCs w:val="28"/>
+              </w:rPr>
+            </w:pPr>
+            <w:r>
+              <w:rPr>
+                <w:rFonts w:ascii="Segoe UI Emoji" w:hAnsi="Segoe UI Emoji" w:cs="Segoe UI Emoji"/>
+                <w:sz w:val="28"/>
+                <w:szCs w:val="28"/>
+              </w:rPr>
+              <w:t>✅</w:t>
+            </w:r>
+          </w:p>
+        </w:tc>
+        <w:tc>
+          <w:tcPr>
+            <w:tcW w:w="1870" w:type="dxa"/>
+            <w:vAlign w:val="center"/>
+          </w:tcPr>
+          <w:p>
+            <w:pPr>
+              <w:jc w:val="center"/>
+              <w:rPr>
+                <w:sz w:val="28"/>
+                <w:szCs w:val="28"/>
+              </w:rPr>
+            </w:pPr>
+            <w:r>
+              <w:rPr>
+                <w:rFonts w:ascii="Segoe UI Emoji" w:hAnsi="Segoe UI Emoji" w:cs="Segoe UI Emoji"/>
+                <w:sz w:val="28"/>
+                <w:szCs w:val="28"/>
+              </w:rPr>
+              <w:t>❌</w:t>
+            </w:r>
+          </w:p>
+        </w:tc>
+      </w:tr>
+      <w:tr>
+        <w:trPr>
+          <w:trHeight w:val="576"/>
+        </w:trPr>
+        <w:tc>
+          <w:tcPr>
+            <w:tcW w:w="805" w:type="dxa"/>
+            <w:vAlign w:val="center"/>
+          </w:tcPr>
+          <w:p>
+            <w:pPr>
+              <w:jc w:val="center"/>
+              <w:rPr>
+                <w:sz w:val="28"/>
+                <w:szCs w:val="28"/>
+              </w:rPr>
+            </w:pPr>
+            <w:r>
+              <w:rPr>
+                <w:sz w:val="28"/>
+                <w:szCs w:val="28"/>
+              </w:rPr>
+              <w:t>6</w:t>
+            </w:r>
+          </w:p>
+        </w:tc>
+        <w:tc>
+          <w:tcPr>
+            <w:tcW w:w="2935" w:type="dxa"/>
+            <w:vAlign w:val="center"/>
+          </w:tcPr>
+          <w:p>
+            <w:pPr>
+              <w:rPr>
+                <w:sz w:val="28"/>
+                <w:szCs w:val="28"/>
+              </w:rPr>
+            </w:pPr>
+            <w:r>
+              <w:rPr>
+                <w:sz w:val="28"/>
+                <w:szCs w:val="28"/>
+              </w:rPr>
+              <w:t>Manage users</w:t>
+            </w:r>
+          </w:p>
+        </w:tc>
+        <w:tc>
+          <w:tcPr>
+            <w:tcW w:w="1870" w:type="dxa"/>
+            <w:vAlign w:val="center"/>
+          </w:tcPr>
+          <w:p>
+            <w:pPr>
+              <w:jc w:val="center"/>
+              <w:rPr>
+                <w:sz w:val="28"/>
+                <w:szCs w:val="28"/>
+              </w:rPr>
+            </w:pPr>
+            <w:r>
+              <w:rPr>
+                <w:rFonts w:ascii="Segoe UI Emoji" w:hAnsi="Segoe UI Emoji" w:cs="Segoe UI Emoji"/>
+                <w:sz w:val="28"/>
+                <w:szCs w:val="28"/>
+              </w:rPr>
+              <w:t>✅</w:t>
+            </w:r>
+          </w:p>
+        </w:tc>
+        <w:tc>
+          <w:tcPr>
+            <w:tcW w:w="1870" w:type="dxa"/>
+            <w:vAlign w:val="center"/>
+          </w:tcPr>
+          <w:p>
+            <w:pPr>
+              <w:jc w:val="center"/>
+              <w:rPr>
+                <w:sz w:val="28"/>
+                <w:szCs w:val="28"/>
+              </w:rPr>
+            </w:pPr>
+            <w:r>
+              <w:rPr>
+                <w:rFonts w:ascii="Segoe UI Emoji" w:hAnsi="Segoe UI Emoji" w:cs="Segoe UI Emoji"/>
+                <w:sz w:val="28"/>
+                <w:szCs w:val="28"/>
+              </w:rPr>
+              <w:t>❌</w:t>
+            </w:r>
+            <w:r>
+              <w:rPr>
+                <w:sz w:val="28"/>
+                <w:szCs w:val="28"/>
+              </w:rPr>
+              <w:t>/Maybe</w:t>
+            </w:r>
+          </w:p>
+        </w:tc>
+        <w:tc>
+          <w:tcPr>
+            <w:tcW w:w="1870" w:type="dxa"/>
+            <w:vAlign w:val="center"/>
+          </w:tcPr>
+          <w:p>
+            <w:pPr>
+              <w:jc w:val="center"/>
+              <w:rPr>
+                <w:sz w:val="28"/>
+                <w:szCs w:val="28"/>
+              </w:rPr>
+            </w:pPr>
+            <w:r>
+              <w:rPr>
+                <w:rFonts w:ascii="Segoe UI Emoji" w:hAnsi="Segoe UI Emoji" w:cs="Segoe UI Emoji"/>
+                <w:sz w:val="28"/>
+                <w:szCs w:val="28"/>
+              </w:rPr>
+              <w:t>❌</w:t>
+            </w:r>
+          </w:p>
+        </w:tc>
+      </w:tr>
+      <w:tr>
+        <w:trPr>
+          <w:trHeight w:val="576"/>
+        </w:trPr>
+        <w:tc>
+          <w:tcPr>
+            <w:tcW w:w="805" w:type="dxa"/>
+            <w:vAlign w:val="center"/>
+          </w:tcPr>
+          <w:p>
+            <w:pPr>
+              <w:jc w:val="center"/>
+              <w:rPr>
+                <w:sz w:val="28"/>
+                <w:szCs w:val="28"/>
+              </w:rPr>
+            </w:pPr>
+            <w:r>
+              <w:rPr>
+                <w:sz w:val="28"/>
+                <w:szCs w:val="28"/>
+              </w:rPr>
+              <w:t>7</w:t>
+            </w:r>
+          </w:p>
+        </w:tc>
+        <w:tc>
+          <w:tcPr>
+            <w:tcW w:w="2935" w:type="dxa"/>
+            <w:vAlign w:val="center"/>
+          </w:tcPr>
+          <w:p>
+            <w:pPr>
+              <w:rPr>
+                <w:sz w:val="28"/>
+                <w:szCs w:val="28"/>
+              </w:rPr>
+            </w:pPr>
+            <w:r>
+              <w:rPr>
+                <w:sz w:val="28"/>
+                <w:szCs w:val="28"/>
+              </w:rPr>
+              <w:t>Borrow book</w:t>
+            </w:r>
+          </w:p>
+        </w:tc>
+        <w:tc>
+          <w:tcPr>
+            <w:tcW w:w="1870" w:type="dxa"/>
+            <w:vAlign w:val="center"/>
+          </w:tcPr>
+          <w:p>
+            <w:pPr>
+              <w:jc w:val="center"/>
+              <w:rPr>
+                <w:sz w:val="28"/>
+                <w:szCs w:val="28"/>
+              </w:rPr>
+            </w:pPr>
+            <w:r>
+              <w:rPr>
+                <w:rFonts w:ascii="Segoe UI Emoji" w:hAnsi="Segoe UI Emoji" w:cs="Segoe UI Emoji"/>
+                <w:sz w:val="28"/>
+                <w:szCs w:val="28"/>
+              </w:rPr>
+              <w:t>✅</w:t>
+            </w:r>
+          </w:p>
+        </w:tc>
+        <w:tc>
+          <w:tcPr>
+            <w:tcW w:w="1870" w:type="dxa"/>
+            <w:vAlign w:val="center"/>
+          </w:tcPr>
+          <w:p>
+            <w:pPr>
+              <w:jc w:val="center"/>
+              <w:rPr>
+                <w:sz w:val="28"/>
+                <w:szCs w:val="28"/>
+              </w:rPr>
+            </w:pPr>
+            <w:r>
+              <w:rPr>
+                <w:rFonts w:ascii="Segoe UI Emoji" w:hAnsi="Segoe UI Emoji" w:cs="Segoe UI Emoji"/>
+                <w:sz w:val="28"/>
+                <w:szCs w:val="28"/>
+              </w:rPr>
+              <w:t>✅</w:t>
+            </w:r>
+          </w:p>
+        </w:tc>
+        <w:tc>
+          <w:tcPr>
+            <w:tcW w:w="1870" w:type="dxa"/>
+            <w:vAlign w:val="center"/>
+          </w:tcPr>
+          <w:p>
+            <w:pPr>
+              <w:jc w:val="center"/>
+              <w:rPr>
+                <w:sz w:val="28"/>
+                <w:szCs w:val="28"/>
+              </w:rPr>
+            </w:pPr>
+            <w:r>
+              <w:rPr>
+                <w:rFonts w:ascii="Segoe UI Emoji" w:hAnsi="Segoe UI Emoji" w:cs="Segoe UI Emoji"/>
+                <w:sz w:val="28"/>
+                <w:szCs w:val="28"/>
+              </w:rPr>
+              <w:t>❌</w:t>
+            </w:r>
+          </w:p>
+        </w:tc>
+      </w:tr>
+      <w:tr>
+        <w:trPr>
+          <w:trHeight w:val="576"/>
+        </w:trPr>
+        <w:tc>
+          <w:tcPr>
+            <w:tcW w:w="805" w:type="dxa"/>
+            <w:vAlign w:val="center"/>
+          </w:tcPr>
+          <w:p>
+            <w:pPr>
+              <w:jc w:val="center"/>
+              <w:rPr>
+                <w:sz w:val="28"/>
+                <w:szCs w:val="28"/>
+              </w:rPr>
+            </w:pPr>
+            <w:r>
+              <w:rPr>
+                <w:sz w:val="28"/>
+                <w:szCs w:val="28"/>
+              </w:rPr>
+              <w:t>8</w:t>
+            </w:r>
+          </w:p>
+        </w:tc>
+        <w:tc>
+          <w:tcPr>
+            <w:tcW w:w="2935" w:type="dxa"/>
+            <w:vAlign w:val="center"/>
+          </w:tcPr>
+          <w:p>
+            <w:pPr>
+              <w:rPr>
+                <w:sz w:val="28"/>
+                <w:szCs w:val="28"/>
+              </w:rPr>
+            </w:pPr>
+            <w:r>
+              <w:rPr>
+                <w:sz w:val="28"/>
+                <w:szCs w:val="28"/>
+              </w:rPr>
+              <w:t>Return book</w:t>
+            </w:r>
+          </w:p>
+        </w:tc>
+        <w:tc>
+          <w:tcPr>
+            <w:tcW w:w="1870" w:type="dxa"/>
+            <w:vAlign w:val="center"/>
+          </w:tcPr>
+          <w:p>
+            <w:pPr>
+              <w:jc w:val="center"/>
+              <w:rPr>
+                <w:sz w:val="28"/>
+                <w:szCs w:val="28"/>
+              </w:rPr>
+            </w:pPr>
+            <w:r>
+              <w:rPr>
+                <w:rFonts w:ascii="Segoe UI Emoji" w:hAnsi="Segoe UI Emoji" w:cs="Segoe UI Emoji"/>
+                <w:sz w:val="28"/>
+                <w:szCs w:val="28"/>
+              </w:rPr>
+              <w:t>✅</w:t>
+            </w:r>
+          </w:p>
+        </w:tc>
+        <w:tc>
+          <w:tcPr>
+            <w:tcW w:w="1870" w:type="dxa"/>
+            <w:vAlign w:val="center"/>
+          </w:tcPr>
+          <w:p>
+            <w:pPr>
+              <w:jc w:val="center"/>
+              <w:rPr>
+                <w:sz w:val="28"/>
+                <w:szCs w:val="28"/>
+              </w:rPr>
+            </w:pPr>
+            <w:r>
+              <w:rPr>
+                <w:rFonts w:ascii="Segoe UI Emoji" w:hAnsi="Segoe UI Emoji" w:cs="Segoe UI Emoji"/>
+                <w:sz w:val="28"/>
+                <w:szCs w:val="28"/>
+              </w:rPr>
+              <w:t>✅</w:t>
+            </w:r>
+          </w:p>
+        </w:tc>
+        <w:tc>
+          <w:tcPr>
+            <w:tcW w:w="1870" w:type="dxa"/>
+            <w:vAlign w:val="center"/>
+          </w:tcPr>
+          <w:p>
+            <w:pPr>
+              <w:jc w:val="center"/>
+              <w:rPr>
+                <w:sz w:val="28"/>
+                <w:szCs w:val="28"/>
+              </w:rPr>
+            </w:pPr>
+            <w:r>
+              <w:rPr>
+                <w:rFonts w:ascii="Segoe UI Emoji" w:hAnsi="Segoe UI Emoji" w:cs="Segoe UI Emoji"/>
+                <w:sz w:val="28"/>
+                <w:szCs w:val="28"/>
+              </w:rPr>
+              <w:t>❌</w:t>
+            </w:r>
+          </w:p>
+        </w:tc>
+      </w:tr>
+      <w:tr>
+        <w:trPr>
+          <w:trHeight w:val="576"/>
+        </w:trPr>
+        <w:tc>
+          <w:tcPr>
+            <w:tcW w:w="805" w:type="dxa"/>
+            <w:vAlign w:val="center"/>
+          </w:tcPr>
+          <w:p>
+            <w:pPr>
+              <w:jc w:val="center"/>
+              <w:rPr>
+                <w:sz w:val="28"/>
+                <w:szCs w:val="28"/>
+              </w:rPr>
+            </w:pPr>
+            <w:r>
+              <w:rPr>
+                <w:sz w:val="28"/>
+                <w:szCs w:val="28"/>
+              </w:rPr>
+              <w:t>9</w:t>
+            </w:r>
+          </w:p>
+        </w:tc>
+        <w:tc>
+          <w:tcPr>
+            <w:tcW w:w="2935" w:type="dxa"/>
+            <w:vAlign w:val="center"/>
+          </w:tcPr>
+          <w:p>
+            <w:pPr>
+              <w:rPr>
+                <w:sz w:val="28"/>
+                <w:szCs w:val="28"/>
+              </w:rPr>
+            </w:pPr>
+            <w:r>
+              <w:rPr>
+                <w:sz w:val="28"/>
+                <w:szCs w:val="28"/>
+              </w:rPr>
+              <w:t>Renew loan</w:t>
+            </w:r>
+          </w:p>
+        </w:tc>
+        <w:tc>
+          <w:tcPr>
+            <w:tcW w:w="1870" w:type="dxa"/>
+            <w:vAlign w:val="center"/>
+          </w:tcPr>
+          <w:p>
+            <w:pPr>
+              <w:jc w:val="center"/>
+              <w:rPr>
+                <w:sz w:val="28"/>
+                <w:szCs w:val="28"/>
+              </w:rPr>
+            </w:pPr>
+            <w:r>
+              <w:rPr>
+                <w:rFonts w:ascii="Segoe UI Emoji" w:hAnsi="Segoe UI Emoji" w:cs="Segoe UI Emoji"/>
+                <w:sz w:val="28"/>
+                <w:szCs w:val="28"/>
+              </w:rPr>
+              <w:t>✅</w:t>
+            </w:r>
+          </w:p>
+        </w:tc>
+        <w:tc>
+          <w:tcPr>
+            <w:tcW w:w="1870" w:type="dxa"/>
+            <w:vAlign w:val="center"/>
+          </w:tcPr>
+          <w:p>
+            <w:pPr>
+              <w:jc w:val="center"/>
+              <w:rPr>
+                <w:sz w:val="28"/>
+                <w:szCs w:val="28"/>
+              </w:rPr>
+            </w:pPr>
+            <w:r>
+              <w:rPr>
+                <w:rFonts w:ascii="Segoe UI Emoji" w:hAnsi="Segoe UI Emoji" w:cs="Segoe UI Emoji"/>
+                <w:sz w:val="28"/>
+                <w:szCs w:val="28"/>
+              </w:rPr>
+              <w:t>✅</w:t>
+            </w:r>
+          </w:p>
+        </w:tc>
+        <w:tc>
+          <w:tcPr>
+            <w:tcW w:w="1870" w:type="dxa"/>
+            <w:vAlign w:val="center"/>
+          </w:tcPr>
+          <w:p>
+            <w:pPr>
+              <w:jc w:val="center"/>
+              <w:rPr>
+                <w:sz w:val="28"/>
+                <w:szCs w:val="28"/>
+              </w:rPr>
+            </w:pPr>
+            <w:r>
+              <w:rPr>
+                <w:rFonts w:ascii="Segoe UI Emoji" w:hAnsi="Segoe UI Emoji" w:cs="Segoe UI Emoji"/>
+                <w:sz w:val="28"/>
+                <w:szCs w:val="28"/>
+              </w:rPr>
+              <w:t>❌</w:t>
+            </w:r>
+          </w:p>
+        </w:tc>
+      </w:tr>
+      <w:tr>
+        <w:trPr>
+          <w:trHeight w:val="576"/>
+        </w:trPr>
+        <w:tc>
+          <w:tcPr>
+            <w:tcW w:w="805" w:type="dxa"/>
+            <w:vAlign w:val="center"/>
+          </w:tcPr>
+          <w:p>
+            <w:pPr>
+              <w:jc w:val="center"/>
+              <w:rPr>
+                <w:sz w:val="28"/>
+                <w:szCs w:val="28"/>
+              </w:rPr>
+            </w:pPr>
+            <w:r>
+              <w:rPr>
+                <w:sz w:val="28"/>
+                <w:szCs w:val="28"/>
+              </w:rPr>
+              <w:t>10</w:t>
+            </w:r>
+          </w:p>
+        </w:tc>
+        <w:tc>
+          <w:tcPr>
+            <w:tcW w:w="2935" w:type="dxa"/>
+            <w:vAlign w:val="center"/>
+          </w:tcPr>
+          <w:p>
+            <w:pPr>
+              <w:rPr>
+                <w:sz w:val="28"/>
+                <w:szCs w:val="28"/>
+              </w:rPr>
+            </w:pPr>
+            <w:r>
+              <w:rPr>
+                <w:sz w:val="28"/>
+                <w:szCs w:val="28"/>
+              </w:rPr>
+              <w:t>View own loans</w:t>
+            </w:r>
+          </w:p>
+        </w:tc>
+        <w:tc>
+          <w:tcPr>
+            <w:tcW w:w="1870" w:type="dxa"/>
+            <w:vAlign w:val="center"/>
+          </w:tcPr>
+          <w:p>
+            <w:pPr>
+              <w:jc w:val="center"/>
+              <w:rPr>
+                <w:sz w:val="28"/>
+                <w:szCs w:val="28"/>
+              </w:rPr>
+            </w:pPr>
+            <w:r>
+              <w:rPr>
+                <w:rFonts w:ascii="Segoe UI Emoji" w:hAnsi="Segoe UI Emoji" w:cs="Segoe UI Emoji"/>
+                <w:sz w:val="28"/>
+                <w:szCs w:val="28"/>
+              </w:rPr>
+              <w:t>✅</w:t>
+            </w:r>
+          </w:p>
+        </w:tc>
+        <w:tc>
+          <w:tcPr>
+            <w:tcW w:w="1870" w:type="dxa"/>
+            <w:vAlign w:val="center"/>
+          </w:tcPr>
+          <w:p>
+            <w:pPr>
+              <w:jc w:val="center"/>
+              <w:rPr>
+                <w:sz w:val="28"/>
+                <w:szCs w:val="28"/>
+              </w:rPr>
+            </w:pPr>
+            <w:r>
+              <w:rPr>
+                <w:rFonts w:ascii="Segoe UI Emoji" w:hAnsi="Segoe UI Emoji" w:cs="Segoe UI Emoji"/>
+                <w:sz w:val="28"/>
+                <w:szCs w:val="28"/>
+              </w:rPr>
+              <w:t>✅</w:t>
+            </w:r>
+          </w:p>
+        </w:tc>
+        <w:tc>
+          <w:tcPr>
+            <w:tcW w:w="1870" w:type="dxa"/>
+            <w:vAlign w:val="center"/>
+          </w:tcPr>
+          <w:p>
+            <w:pPr>
+              <w:jc w:val="center"/>
+              <w:rPr>
+                <w:sz w:val="28"/>
+                <w:szCs w:val="28"/>
+              </w:rPr>
+            </w:pPr>
+            <w:r>
+              <w:rPr>
+                <w:rFonts w:ascii="Segoe UI Emoji" w:hAnsi="Segoe UI Emoji" w:cs="Segoe UI Emoji"/>
+                <w:sz w:val="28"/>
+                <w:szCs w:val="28"/>
+              </w:rPr>
+              <w:t>✅</w:t>
+            </w:r>
+          </w:p>
+        </w:tc>
+      </w:tr>
+      <w:tr>
+        <w:trPr>
+          <w:trHeight w:val="576"/>
+        </w:trPr>
+        <w:tc>
+          <w:tcPr>
+            <w:tcW w:w="805" w:type="dxa"/>
+            <w:vAlign w:val="center"/>
+          </w:tcPr>
+          <w:p>
+            <w:pPr>
+              <w:jc w:val="center"/>
+              <w:rPr>
+                <w:sz w:val="28"/>
+                <w:szCs w:val="28"/>
+              </w:rPr>
+            </w:pPr>
+            <w:r>
+              <w:rPr>
+                <w:sz w:val="28"/>
+                <w:szCs w:val="28"/>
+              </w:rPr>
+              <w:t>11</w:t>
+            </w:r>
+          </w:p>
+        </w:tc>
+        <w:tc>
+          <w:tcPr>
+            <w:tcW w:w="2935" w:type="dxa"/>
+            <w:vAlign w:val="center"/>
+          </w:tcPr>
+          <w:p>
+            <w:pPr>
+              <w:rPr>
+                <w:sz w:val="28"/>
+                <w:szCs w:val="28"/>
+              </w:rPr>
+            </w:pPr>
+            <w:r>
+              <w:rPr>
+                <w:sz w:val="28"/>
+                <w:szCs w:val="28"/>
+              </w:rPr>
+              <w:t>View all loans</w:t>
+            </w:r>
+          </w:p>
+        </w:tc>
+        <w:tc>
+          <w:tcPr>
+            <w:tcW w:w="1870" w:type="dxa"/>
+            <w:vAlign w:val="center"/>
+          </w:tcPr>
+          <w:p>
+            <w:pPr>
+              <w:jc w:val="center"/>
+              <w:rPr>
+                <w:sz w:val="28"/>
+                <w:szCs w:val="28"/>
+              </w:rPr>
+            </w:pPr>
+            <w:r>
+              <w:rPr>
+                <w:rFonts w:ascii="Segoe UI Emoji" w:hAnsi="Segoe UI Emoji" w:cs="Segoe UI Emoji"/>
+                <w:sz w:val="28"/>
+                <w:szCs w:val="28"/>
+              </w:rPr>
+              <w:t>✅</w:t>
+            </w:r>
+          </w:p>
+        </w:tc>
+        <w:tc>
+          <w:tcPr>
+            <w:tcW w:w="1870" w:type="dxa"/>
+            <w:vAlign w:val="center"/>
+          </w:tcPr>
+          <w:p>
+            <w:pPr>
+              <w:jc w:val="center"/>
+              <w:rPr>
+                <w:sz w:val="28"/>
+                <w:szCs w:val="28"/>
+              </w:rPr>
+            </w:pPr>
+            <w:r>
+              <w:rPr>
+                <w:rFonts w:ascii="Segoe UI Emoji" w:hAnsi="Segoe UI Emoji" w:cs="Segoe UI Emoji"/>
+                <w:sz w:val="28"/>
+                <w:szCs w:val="28"/>
+              </w:rPr>
+              <w:t>✅</w:t>
+            </w:r>
+          </w:p>
+        </w:tc>
+        <w:tc>
+          <w:tcPr>
+            <w:tcW w:w="1870" w:type="dxa"/>
+            <w:vAlign w:val="center"/>
+          </w:tcPr>
+          <w:p>
+            <w:pPr>
+              <w:jc w:val="center"/>
+              <w:rPr>
+                <w:sz w:val="28"/>
+                <w:szCs w:val="28"/>
+              </w:rPr>
+            </w:pPr>
+            <w:r>
+              <w:rPr>
+                <w:rFonts w:ascii="Segoe UI Emoji" w:hAnsi="Segoe UI Emoji" w:cs="Segoe UI Emoji"/>
+                <w:sz w:val="28"/>
+                <w:szCs w:val="28"/>
+              </w:rPr>
+              <w:t>❌</w:t>
+            </w:r>
+          </w:p>
+        </w:tc>
+      </w:tr>
+      <w:tr>
+        <w:trPr>
+          <w:trHeight w:val="576"/>
+        </w:trPr>
+        <w:tc>
+          <w:tcPr>
+            <w:tcW w:w="805" w:type="dxa"/>
+            <w:vAlign w:val="center"/>
+          </w:tcPr>
+          <w:p>
+            <w:pPr>
+              <w:jc w:val="center"/>
+              <w:rPr>
+                <w:sz w:val="28"/>
+                <w:szCs w:val="28"/>
+              </w:rPr>
+            </w:pPr>
+            <w:r>
+              <w:rPr>
+                <w:sz w:val="28"/>
+                <w:szCs w:val="28"/>
+              </w:rPr>
+              <w:t>12</w:t>
+            </w:r>
+          </w:p>
+        </w:tc>
+        <w:tc>
+          <w:tcPr>
+            <w:tcW w:w="2935" w:type="dxa"/>
+            <w:vAlign w:val="center"/>
+          </w:tcPr>
+          <w:p>
+            <w:pPr>
+              <w:rPr>
+                <w:sz w:val="28"/>
+                <w:szCs w:val="28"/>
+              </w:rPr>
+            </w:pPr>
+            <w:r>
+              <w:rPr>
+                <w:sz w:val="28"/>
+                <w:szCs w:val="28"/>
+              </w:rPr>
+              <w:t>View own fines</w:t>
+            </w:r>
+          </w:p>
+        </w:tc>
+        <w:tc>
+          <w:tcPr>
+            <w:tcW w:w="1870" w:type="dxa"/>
+            <w:vAlign w:val="center"/>
+          </w:tcPr>
+          <w:p>
+            <w:pPr>
+              <w:jc w:val="center"/>
+              <w:rPr>
+                <w:sz w:val="28"/>
+                <w:szCs w:val="28"/>
+              </w:rPr>
+            </w:pPr>
+            <w:r>
+              <w:rPr>
+                <w:rFonts w:ascii="Segoe UI Emoji" w:hAnsi="Segoe UI Emoji" w:cs="Segoe UI Emoji"/>
+                <w:sz w:val="28"/>
+                <w:szCs w:val="28"/>
+              </w:rPr>
+              <w:t>✅</w:t>
+            </w:r>
+          </w:p>
+        </w:tc>
+        <w:tc>
+          <w:tcPr>
+            <w:tcW w:w="1870" w:type="dxa"/>
+            <w:vAlign w:val="center"/>
+          </w:tcPr>
+          <w:p>
+            <w:pPr>
+              <w:jc w:val="center"/>
+              <w:rPr>
+                <w:sz w:val="28"/>
+                <w:szCs w:val="28"/>
+              </w:rPr>
+            </w:pPr>
+            <w:r>
+              <w:rPr>
+                <w:rFonts w:ascii="Segoe UI Emoji" w:hAnsi="Segoe UI Emoji" w:cs="Segoe UI Emoji"/>
+                <w:sz w:val="28"/>
+                <w:szCs w:val="28"/>
+              </w:rPr>
+              <w:t>✅</w:t>
+            </w:r>
+          </w:p>
+        </w:tc>
+        <w:tc>
+          <w:tcPr>
+            <w:tcW w:w="1870" w:type="dxa"/>
+            <w:vAlign w:val="center"/>
+          </w:tcPr>
+          <w:p>
+            <w:pPr>
+              <w:jc w:val="center"/>
+              <w:rPr>
+                <w:sz w:val="28"/>
+                <w:szCs w:val="28"/>
+              </w:rPr>
+            </w:pPr>
+            <w:r>
+              <w:rPr>
+                <w:rFonts w:ascii="Segoe UI Emoji" w:hAnsi="Segoe UI Emoji" w:cs="Segoe UI Emoji"/>
+                <w:sz w:val="28"/>
+                <w:szCs w:val="28"/>
+              </w:rPr>
+              <w:t>✅</w:t>
+            </w:r>
+          </w:p>
+        </w:tc>
+      </w:tr>
+      <w:tr>
+        <w:trPr>
+          <w:trHeight w:val="576"/>
+        </w:trPr>
+        <w:tc>
+          <w:tcPr>
+            <w:tcW w:w="805" w:type="dxa"/>
+            <w:vAlign w:val="center"/>
+          </w:tcPr>
+          <w:p>
+            <w:pPr>
+              <w:jc w:val="center"/>
+              <w:rPr>
+                <w:sz w:val="28"/>
+                <w:szCs w:val="28"/>
+              </w:rPr>
+            </w:pPr>
+            <w:r>
+              <w:rPr>
+                <w:sz w:val="28"/>
+                <w:szCs w:val="28"/>
+              </w:rPr>
+              <w:t>13</w:t>
+            </w:r>
+          </w:p>
+        </w:tc>
+        <w:tc>
+          <w:tcPr>
+            <w:tcW w:w="2935" w:type="dxa"/>
+            <w:vAlign w:val="center"/>
+          </w:tcPr>
+          <w:p>
+            <w:pPr>
+              <w:rPr>
+                <w:sz w:val="28"/>
+                <w:szCs w:val="28"/>
+              </w:rPr>
+            </w:pPr>
+            <w:r>
+              <w:rPr>
+                <w:sz w:val="28"/>
+                <w:szCs w:val="28"/>
+              </w:rPr>
+              <w:t>Pay own fine</w:t>
+            </w:r>
+          </w:p>
+        </w:tc>
+        <w:tc>
+          <w:tcPr>
+            <w:tcW w:w="1870" w:type="dxa"/>
+            <w:vAlign w:val="center"/>
+          </w:tcPr>
+          <w:p>
+            <w:pPr>
+              <w:jc w:val="center"/>
+              <w:rPr>
+                <w:sz w:val="28"/>
+                <w:szCs w:val="28"/>
+              </w:rPr>
+            </w:pPr>
+            <w:r>
+              <w:rPr>
+                <w:rFonts w:ascii="Segoe UI Emoji" w:hAnsi="Segoe UI Emoji" w:cs="Segoe UI Emoji"/>
+                <w:sz w:val="28"/>
+                <w:szCs w:val="28"/>
+              </w:rPr>
+              <w:t>✅</w:t>
+            </w:r>
+          </w:p>
+        </w:tc>
+        <w:tc>
+          <w:tcPr>
+            <w:tcW w:w="1870" w:type="dxa"/>
+            <w:vAlign w:val="center"/>
+          </w:tcPr>
+          <w:p>
+            <w:pPr>
+              <w:jc w:val="center"/>
+              <w:rPr>
+                <w:sz w:val="28"/>
+                <w:szCs w:val="28"/>
+              </w:rPr>
+            </w:pPr>
+            <w:r>
+              <w:rPr>
+                <w:rFonts w:ascii="Segoe UI Emoji" w:hAnsi="Segoe UI Emoji" w:cs="Segoe UI Emoji"/>
+                <w:sz w:val="28"/>
+                <w:szCs w:val="28"/>
+              </w:rPr>
+              <w:t>✅</w:t>
+            </w:r>
+          </w:p>
+        </w:tc>
+        <w:tc>
+          <w:tcPr>
+            <w:tcW w:w="1870" w:type="dxa"/>
+            <w:vAlign w:val="center"/>
+          </w:tcPr>
+          <w:p>
+            <w:pPr>
+              <w:jc w:val="center"/>
+              <w:rPr>
+                <w:sz w:val="28"/>
+                <w:szCs w:val="28"/>
+              </w:rPr>
+            </w:pPr>
+            <w:r>
+              <w:rPr>
+                <w:rFonts w:ascii="Segoe UI Emoji" w:hAnsi="Segoe UI Emoji" w:cs="Segoe UI Emoji"/>
+                <w:sz w:val="28"/>
+                <w:szCs w:val="28"/>
+              </w:rPr>
+              <w:t>✅</w:t>
+            </w:r>
+          </w:p>
+        </w:tc>
+      </w:tr>
+      <w:tr>
+        <w:trPr>
+          <w:trHeight w:val="576"/>
+        </w:trPr>
+        <w:tc>
+          <w:tcPr>
+            <w:tcW w:w="805" w:type="dxa"/>
+            <w:vAlign w:val="center"/>
+          </w:tcPr>
+          <w:p>
+            <w:pPr>
+              <w:jc w:val="center"/>
+              <w:rPr>
+                <w:sz w:val="28"/>
+                <w:szCs w:val="28"/>
+              </w:rPr>
+            </w:pPr>
+            <w:r>
+              <w:rPr>
+                <w:sz w:val="28"/>
+                <w:szCs w:val="28"/>
+              </w:rPr>
+              <w:t>14</w:t>
+            </w:r>
+          </w:p>
+        </w:tc>
+        <w:tc>
+          <w:tcPr>
+            <w:tcW w:w="2935" w:type="dxa"/>
+            <w:vAlign w:val="center"/>
+          </w:tcPr>
+          <w:p>
+            <w:pPr>
+              <w:rPr>
+                <w:sz w:val="28"/>
+                <w:szCs w:val="28"/>
+              </w:rPr>
+            </w:pPr>
+            <w:r>
+              <w:rPr>
+                <w:sz w:val="28"/>
+                <w:szCs w:val="28"/>
+              </w:rPr>
+              <w:t>Waive fine</w:t>
+            </w:r>
+          </w:p>
+        </w:tc>
+        <w:tc>
+          <w:tcPr>
+            <w:tcW w:w="1870" w:type="dxa"/>
+            <w:vAlign w:val="center"/>
+          </w:tcPr>
+          <w:p>
+            <w:pPr>
+              <w:jc w:val="center"/>
+              <w:rPr>
+                <w:sz w:val="28"/>
+                <w:szCs w:val="28"/>
+              </w:rPr>
+            </w:pPr>
+            <w:r>
+              <w:rPr>
+                <w:rFonts w:ascii="Segoe UI Emoji" w:hAnsi="Segoe UI Emoji" w:cs="Segoe UI Emoji"/>
+                <w:sz w:val="28"/>
+                <w:szCs w:val="28"/>
+              </w:rPr>
+              <w:t>✅</w:t>
+            </w:r>
+          </w:p>
+        </w:tc>
+        <w:tc>
+          <w:tcPr>
+            <w:tcW w:w="1870" w:type="dxa"/>
+            <w:vAlign w:val="center"/>
+          </w:tcPr>
+          <w:p>
+            <w:pPr>
+              <w:jc w:val="center"/>
+              <w:rPr>
+                <w:sz w:val="28"/>
+                <w:szCs w:val="28"/>
+              </w:rPr>
+            </w:pPr>
+            <w:r>
+              <w:rPr>
+                <w:sz w:val="28"/>
+                <w:szCs w:val="28"/>
+              </w:rPr>
+              <w:t>Maybe</w:t>
+            </w:r>
+          </w:p>
+        </w:tc>
+        <w:tc>
+          <w:tcPr>
+            <w:tcW w:w="1870" w:type="dxa"/>
+            <w:vAlign w:val="center"/>
+          </w:tcPr>
+          <w:p>
+            <w:pPr>
+              <w:jc w:val="center"/>
+              <w:rPr>
+                <w:sz w:val="28"/>
+                <w:szCs w:val="28"/>
+              </w:rPr>
+            </w:pPr>
+            <w:r>
+              <w:rPr>
+                <w:rFonts w:ascii="Segoe UI Emoji" w:hAnsi="Segoe UI Emoji" w:cs="Segoe UI Emoji"/>
+                <w:sz w:val="28"/>
+                <w:szCs w:val="28"/>
+              </w:rPr>
+              <w:t>❌</w:t>
+            </w:r>
+          </w:p>
+        </w:tc>
+      </w:tr>
+      <w:tr>
+        <w:trPr>
+          <w:trHeight w:val="576"/>
+        </w:trPr>
+        <w:tc>
+          <w:tcPr>
+            <w:tcW w:w="805" w:type="dxa"/>
+            <w:vAlign w:val="center"/>
+          </w:tcPr>
+          <w:p>
+            <w:pPr>
+              <w:jc w:val="center"/>
+              <w:rPr>
+                <w:sz w:val="28"/>
+                <w:szCs w:val="28"/>
+              </w:rPr>
+            </w:pPr>
+            <w:r>
+              <w:rPr>
+                <w:sz w:val="28"/>
+                <w:szCs w:val="28"/>
+              </w:rPr>
+              <w:t>15</w:t>
+            </w:r>
+          </w:p>
+        </w:tc>
+        <w:tc>
+          <w:tcPr>
+            <w:tcW w:w="2935" w:type="dxa"/>
+            <w:vAlign w:val="center"/>
+          </w:tcPr>
+          <w:p>
+            <w:pPr>
+              <w:rPr>
+                <w:sz w:val="28"/>
+                <w:szCs w:val="28"/>
+              </w:rPr>
+            </w:pPr>
+            <w:r>
+              <w:rPr>
+                <w:sz w:val="28"/>
+                <w:szCs w:val="28"/>
+              </w:rPr>
+              <w:t>Manage roles</w:t>
+            </w:r>
+          </w:p>
+        </w:tc>
+        <w:tc>
+          <w:tcPr>
+            <w:tcW w:w="1870" w:type="dxa"/>
+            <w:vAlign w:val="center"/>
+          </w:tcPr>
+          <w:p>
+            <w:pPr>
+              <w:jc w:val="center"/>
+              <w:rPr>
+                <w:sz w:val="28"/>
+                <w:szCs w:val="28"/>
+              </w:rPr>
+            </w:pPr>
+            <w:r>
+              <w:rPr>
+                <w:rFonts w:ascii="Segoe UI Emoji" w:hAnsi="Segoe UI Emoji" w:cs="Segoe UI Emoji"/>
+                <w:sz w:val="28"/>
+                <w:szCs w:val="28"/>
+              </w:rPr>
+              <w:t>✅</w:t>
+            </w:r>
+          </w:p>
+        </w:tc>
+        <w:tc>
+          <w:tcPr>
+            <w:tcW w:w="1870" w:type="dxa"/>
+            <w:vAlign w:val="center"/>
+          </w:tcPr>
+          <w:p>
+            <w:pPr>
+              <w:jc w:val="center"/>
+              <w:rPr>
+                <w:sz w:val="28"/>
+                <w:szCs w:val="28"/>
+              </w:rPr>
+            </w:pPr>
+            <w:r>
+              <w:rPr>
+                <w:rFonts w:ascii="Segoe UI Emoji" w:hAnsi="Segoe UI Emoji" w:cs="Segoe UI Emoji"/>
+                <w:sz w:val="28"/>
+                <w:szCs w:val="28"/>
+              </w:rPr>
+              <w:t>❌</w:t>
+            </w:r>
+          </w:p>
+        </w:tc>
+        <w:tc>
+          <w:tcPr>
+            <w:tcW w:w="1870" w:type="dxa"/>
+            <w:vAlign w:val="center"/>
+          </w:tcPr>
+          <w:p>
+            <w:pPr>
+              <w:jc w:val="center"/>
+              <w:rPr>
+                <w:sz w:val="28"/>
+                <w:szCs w:val="28"/>
+              </w:rPr>
+            </w:pPr>
+            <w:r>
+              <w:rPr>
+                <w:rFonts w:ascii="Segoe UI Emoji" w:hAnsi="Segoe UI Emoji" w:cs="Segoe UI Emoji"/>
+                <w:sz w:val="28"/>
+                <w:szCs w:val="28"/>
+              </w:rPr>
+              <w:t>❌</w:t>
+            </w:r>
+          </w:p>
+        </w:tc>
+      </w:tr>
+      <w:tr>
+        <w:trPr>
+          <w:trHeight w:val="576"/>
+        </w:trPr>
+        <w:tc>
+          <w:tcPr>
+            <w:tcW w:w="805" w:type="dxa"/>
+            <w:vAlign w:val="center"/>
+          </w:tcPr>
+          <w:p>
+            <w:pPr>
+              <w:jc w:val="center"/>
+              <w:rPr>
+                <w:sz w:val="28"/>
+                <w:szCs w:val="28"/>
+              </w:rPr>
+            </w:pPr>
+            <w:r>
+              <w:rPr>
+                <w:sz w:val="28"/>
+                <w:szCs w:val="28"/>
+              </w:rPr>
+              <w:t>16</w:t>
+            </w:r>
+          </w:p>
+        </w:tc>
+        <w:tc>
+          <w:tcPr>
+            <w:tcW w:w="2935" w:type="dxa"/>
+            <w:vAlign w:val="center"/>
+          </w:tcPr>
+          <w:p>
+            <w:pPr>
+              <w:rPr>
+                <w:sz w:val="28"/>
+                <w:szCs w:val="28"/>
+              </w:rPr>
+            </w:pPr>
+          </w:p>
+        </w:tc>
+        <w:tc>
+          <w:tcPr>
+            <w:tcW w:w="1870" w:type="dxa"/>
+            <w:vAlign w:val="center"/>
+          </w:tcPr>
+          <w:p>
+            <w:pPr>
+              <w:jc w:val="center"/>
+              <w:rPr>
+                <w:sz w:val="28"/>
+                <w:szCs w:val="28"/>
+              </w:rPr>
+            </w:pPr>
+          </w:p>
+        </w:tc>
+        <w:tc>
+          <w:tcPr>
+            <w:tcW w:w="1870" w:type="dxa"/>
+            <w:vAlign w:val="center"/>
+          </w:tcPr>
+          <w:p>
+            <w:pPr>
+              <w:jc w:val="center"/>
+              <w:rPr>
+                <w:sz w:val="28"/>
+                <w:szCs w:val="28"/>
+              </w:rPr>
+            </w:pPr>
+          </w:p>
+        </w:tc>
+        <w:tc>
+          <w:tcPr>
+            <w:tcW w:w="1870" w:type="dxa"/>
+            <w:vAlign w:val="center"/>
+          </w:tcPr>
+          <w:p>
+            <w:pPr>
+              <w:jc w:val="center"/>
+              <w:rPr>
+                <w:sz w:val="28"/>
+                <w:szCs w:val="28"/>
+              </w:rPr>
+            </w:pPr>
+          </w:p>
+        </w:tc>
+      </w:tr>
+      <w:tr>
+        <w:trPr>
+          <w:trHeight w:val="576"/>
+        </w:trPr>
+        <w:tc>
+          <w:tcPr>
+            <w:tcW w:w="805" w:type="dxa"/>
+            <w:vAlign w:val="center"/>
+          </w:tcPr>
+          <w:p>
+            <w:pPr>
+              <w:jc w:val="center"/>
+              <w:rPr>
+                <w:sz w:val="28"/>
+                <w:szCs w:val="28"/>
+              </w:rPr>
+            </w:pPr>
+            <w:r>
+              <w:rPr>
+                <w:sz w:val="28"/>
+                <w:szCs w:val="28"/>
+              </w:rPr>
+              <w:t>17</w:t>
+            </w:r>
+          </w:p>
+        </w:tc>
+        <w:tc>
+          <w:tcPr>
+            <w:tcW w:w="2935" w:type="dxa"/>
+            <w:vAlign w:val="center"/>
+          </w:tcPr>
+          <w:p>
+            <w:pPr>
+              <w:rPr>
+                <w:sz w:val="28"/>
+                <w:szCs w:val="28"/>
+              </w:rPr>
+            </w:pPr>
+          </w:p>
+        </w:tc>
+        <w:tc>
+          <w:tcPr>
+            <w:tcW w:w="1870" w:type="dxa"/>
+            <w:vAlign w:val="center"/>
+          </w:tcPr>
+          <w:p>
+            <w:pPr>
+              <w:jc w:val="center"/>
+              <w:rPr>
+                <w:sz w:val="28"/>
+                <w:szCs w:val="28"/>
+              </w:rPr>
+            </w:pPr>
+          </w:p>
+        </w:tc>
+        <w:tc>
+          <w:tcPr>
+            <w:tcW w:w="1870" w:type="dxa"/>
+            <w:vAlign w:val="center"/>
+          </w:tcPr>
+          <w:p>
+            <w:pPr>
+              <w:jc w:val="center"/>
+              <w:rPr>
+                <w:sz w:val="28"/>
+                <w:szCs w:val="28"/>
+              </w:rPr>
+            </w:pPr>
+          </w:p>
+        </w:tc>
+        <w:tc>
+          <w:tcPr>
+            <w:tcW w:w="1870" w:type="dxa"/>
+            <w:vAlign w:val="center"/>
+          </w:tcPr>
+          <w:p>
+            <w:pPr>
+              <w:jc w:val="center"/>
+              <w:rPr>
+                <w:sz w:val="28"/>
+                <w:szCs w:val="28"/>
+              </w:rPr>
+            </w:pPr>
+          </w:p>
+        </w:tc>
+      </w:tr>
+    </w:tbl>
+    <w:p/>
     <w:sectPr>
       <w:headerReference w:type="default" r:id="rId8"/>
       <w:footerReference w:type="default" r:id="rId9"/>
@@ -20758,7 +22834,7 @@
 </file>
 
 <file path=word/endnotes.xml><?xml version="1.0" encoding="utf-8"?>
-<w:endnotes xmlns:wpc="http://schemas.microsoft.com/office/word/2010/wordprocessingCanvas" xmlns:cx="http://schemas.microsoft.com/office/drawing/2014/chartex" xmlns:cx1="http://schemas.microsoft.com/office/drawing/2015/9/8/chartex" xmlns:cx2="http://schemas.microsoft.com/office/drawing/2015/10/21/chartex" xmlns:cx3="http://schemas.microsoft.com/office/drawing/2016/5/9/chartex" xmlns:cx4="http://schemas.microsoft.com/office/drawing/2016/5/10/chartex" xmlns:cx5="http://schemas.microsoft.com/office/drawing/2016/5/11/chartex" xmlns:cx6="http://schemas.microsoft.com/office/drawing/2016/5/12/chartex" xmlns:cx7="http://schemas.microsoft.com/office/drawing/2016/5/13/chartex" xmlns:cx8="http://schemas.microsoft.com/office/drawing/2016/5/14/chartex" xmlns:mc="http://schemas.openxmlformats.org/markup-compatibility/2006" xmlns:aink="http://schemas.microsoft.com/office/drawing/2016/ink" xmlns:am3d="http://schemas.microsoft.com/office/drawing/2017/model3d" xmlns:o="urn:schemas-microsoft-com:office:office" xmlns:oel="http://schemas.microsoft.com/office/2019/extlst" xmlns:r="http://schemas.openxmlformats.org/officeDocument/2006/relationships" xmlns:m="http://schemas.openxmlformats.org/officeDocument/2006/math" xmlns:v="urn:schemas-microsoft-com:vml" xmlns:wp14="http://schemas.microsoft.com/office/word/2010/wordprocessingDrawing" xmlns:wp="http://schemas.openxmlformats.org/drawingml/2006/wordprocessingDrawing" xmlns:w10="urn:schemas-microsoft-com:office:word" xmlns:w="http://schemas.openxmlformats.org/wordprocessingml/2006/main" xmlns:w14="http://schemas.microsoft.com/office/word/2010/wordml" xmlns:w15="http://schemas.microsoft.com/office/word/2012/wordml" xmlns:w16cex="http://schemas.microsoft.com/office/word/2018/wordml/cex" xmlns:w16cid="http://schemas.microsoft.com/office/word/2016/wordml/cid" xmlns:w16="http://schemas.microsoft.com/office/word/2018/wordml" xmlns:w16du="http://schemas.microsoft.com/office/word/2023/wordml/word16du" xmlns:w16sdtdh="http://schemas.microsoft.com/office/word/2020/wordml/sdtdatahash" xmlns:w16sdtfl="http://schemas.microsoft.com/office/word/2024/wordml/sdtformatlock" xmlns:w16se="http://schemas.microsoft.com/office/word/2015/wordml/symex" xmlns:wpg="http://schemas.microsoft.com/office/word/2010/wordprocessingGroup" xmlns:wpi="http://schemas.microsoft.com/office/word/2010/wordprocessingInk" xmlns:wne="http://schemas.microsoft.com/office/word/2006/wordml" xmlns:wps="http://schemas.microsoft.com/office/word/2010/wordprocessingShape" mc:Ignorable="w14 w15 w16se w16cid w16 w16cex w16sdtdh w16sdtfl w16du wp14">
+<w:endnotes xmlns:wpc="http://schemas.microsoft.com/office/word/2010/wordprocessingCanvas" xmlns:cx="http://schemas.microsoft.com/office/drawing/2014/chartex" xmlns:cx1="http://schemas.microsoft.com/office/drawing/2015/9/8/chartex" xmlns:cx2="http://schemas.microsoft.com/office/drawing/2015/10/21/chartex" xmlns:cx3="http://schemas.microsoft.com/office/drawing/2016/5/9/chartex" xmlns:cx4="http://schemas.microsoft.com/office/drawing/2016/5/10/chartex" xmlns:cx5="http://schemas.microsoft.com/office/drawing/2016/5/11/chartex" xmlns:cx6="http://schemas.microsoft.com/office/drawing/2016/5/12/chartex" xmlns:cx7="http://schemas.microsoft.com/office/drawing/2016/5/13/chartex" xmlns:cx8="http://schemas.microsoft.com/office/drawing/2016/5/14/chartex" xmlns:mc="http://schemas.openxmlformats.org/markup-compatibility/2006" xmlns:aink="http://schemas.microsoft.com/office/drawing/2016/ink" xmlns:am3d="http://schemas.microsoft.com/office/drawing/2017/model3d" xmlns:o="urn:schemas-microsoft-com:office:office" xmlns:oel="http://schemas.microsoft.com/office/2019/extlst" xmlns:r="http://schemas.openxmlformats.org/officeDocument/2006/relationships" xmlns:m="http://schemas.openxmlformats.org/officeDocument/2006/math" xmlns:v="urn:schemas-microsoft-com:vml" xmlns:wp14="http://schemas.microsoft.com/office/word/2010/wordprocessingDrawing" xmlns:wp="http://schemas.openxmlformats.org/drawingml/2006/wordprocessingDrawing" xmlns:w10="urn:schemas-microsoft-com:office:word" xmlns:w="http://schemas.openxmlformats.org/wordprocessingml/2006/main" xmlns:w14="http://schemas.microsoft.com/office/word/2010/wordml" xmlns:w15="http://schemas.microsoft.com/office/word/2012/wordml" xmlns:w16cei="http://schemas.microsoft.com/office/word/2026/wordml/cei" xmlns:w16cex="http://schemas.microsoft.com/office/word/2018/wordml/cex" xmlns:w16cid="http://schemas.microsoft.com/office/word/2016/wordml/cid" xmlns:w16="http://schemas.microsoft.com/office/word/2018/wordml" xmlns:w16du="http://schemas.microsoft.com/office/word/2023/wordml/word16du" xmlns:w16sdtdh="http://schemas.microsoft.com/office/word/2020/wordml/sdtdatahash" xmlns:w16sdtfl="http://schemas.microsoft.com/office/word/2024/wordml/sdtformatlock" xmlns:w16se="http://schemas.microsoft.com/office/word/2015/wordml/symex" xmlns:wpg="http://schemas.microsoft.com/office/word/2010/wordprocessingGroup" xmlns:wpi="http://schemas.microsoft.com/office/word/2010/wordprocessingInk" xmlns:wne="http://schemas.microsoft.com/office/word/2006/wordml" xmlns:wps="http://schemas.microsoft.com/office/word/2010/wordprocessingShape" mc:Ignorable="w14 w15 w16se w16cid w16 w16cex w16sdtdh w16sdtfl w16du wp14">
   <w:endnote w:type="separator" w:id="-1">
     <w:p>
       <w:pPr>
@@ -20783,7 +22859,7 @@
 </file>
 
 <file path=word/footer1.xml><?xml version="1.0" encoding="utf-8"?>
-<w:ftr xmlns:wpc="http://schemas.microsoft.com/office/word/2010/wordprocessingCanvas" xmlns:cx="http://schemas.microsoft.com/office/drawing/2014/chartex" xmlns:cx1="http://schemas.microsoft.com/office/drawing/2015/9/8/chartex" xmlns:cx2="http://schemas.microsoft.com/office/drawing/2015/10/21/chartex" xmlns:cx3="http://schemas.microsoft.com/office/drawing/2016/5/9/chartex" xmlns:cx4="http://schemas.microsoft.com/office/drawing/2016/5/10/chartex" xmlns:cx5="http://schemas.microsoft.com/office/drawing/2016/5/11/chartex" xmlns:cx6="http://schemas.microsoft.com/office/drawing/2016/5/12/chartex" xmlns:cx7="http://schemas.microsoft.com/office/drawing/2016/5/13/chartex" xmlns:cx8="http://schemas.microsoft.com/office/drawing/2016/5/14/chartex" xmlns:mc="http://schemas.openxmlformats.org/markup-compatibility/2006" xmlns:aink="http://schemas.microsoft.com/office/drawing/2016/ink" xmlns:am3d="http://schemas.microsoft.com/office/drawing/2017/model3d" xmlns:o="urn:schemas-microsoft-com:office:office" xmlns:oel="http://schemas.microsoft.com/office/2019/extlst" xmlns:r="http://schemas.openxmlformats.org/officeDocument/2006/relationships" xmlns:m="http://schemas.openxmlformats.org/officeDocument/2006/math" xmlns:v="urn:schemas-microsoft-com:vml" xmlns:wp14="http://schemas.microsoft.com/office/word/2010/wordprocessingDrawing" xmlns:wp="http://schemas.openxmlformats.org/drawingml/2006/wordprocessingDrawing" xmlns:w10="urn:schemas-microsoft-com:office:word" xmlns:w="http://schemas.openxmlformats.org/wordprocessingml/2006/main" xmlns:w14="http://schemas.microsoft.com/office/word/2010/wordml" xmlns:w15="http://schemas.microsoft.com/office/word/2012/wordml" xmlns:w16cex="http://schemas.microsoft.com/office/word/2018/wordml/cex" xmlns:w16cid="http://schemas.microsoft.com/office/word/2016/wordml/cid" xmlns:w16="http://schemas.microsoft.com/office/word/2018/wordml" xmlns:w16du="http://schemas.microsoft.com/office/word/2023/wordml/word16du" xmlns:w16sdtdh="http://schemas.microsoft.com/office/word/2020/wordml/sdtdatahash" xmlns:w16sdtfl="http://schemas.microsoft.com/office/word/2024/wordml/sdtformatlock" xmlns:w16se="http://schemas.microsoft.com/office/word/2015/wordml/symex" xmlns:wpg="http://schemas.microsoft.com/office/word/2010/wordprocessingGroup" xmlns:wpi="http://schemas.microsoft.com/office/word/2010/wordprocessingInk" xmlns:wne="http://schemas.microsoft.com/office/word/2006/wordml" xmlns:wps="http://schemas.microsoft.com/office/word/2010/wordprocessingShape" mc:Ignorable="w14 w15 w16se w16cid w16 w16cex w16sdtdh w16sdtfl w16du wp14">
+<w:ftr xmlns:wpc="http://schemas.microsoft.com/office/word/2010/wordprocessingCanvas" xmlns:cx="http://schemas.microsoft.com/office/drawing/2014/chartex" xmlns:cx1="http://schemas.microsoft.com/office/drawing/2015/9/8/chartex" xmlns:cx2="http://schemas.microsoft.com/office/drawing/2015/10/21/chartex" xmlns:cx3="http://schemas.microsoft.com/office/drawing/2016/5/9/chartex" xmlns:cx4="http://schemas.microsoft.com/office/drawing/2016/5/10/chartex" xmlns:cx5="http://schemas.microsoft.com/office/drawing/2016/5/11/chartex" xmlns:cx6="http://schemas.microsoft.com/office/drawing/2016/5/12/chartex" xmlns:cx7="http://schemas.microsoft.com/office/drawing/2016/5/13/chartex" xmlns:cx8="http://schemas.microsoft.com/office/drawing/2016/5/14/chartex" xmlns:mc="http://schemas.openxmlformats.org/markup-compatibility/2006" xmlns:aink="http://schemas.microsoft.com/office/drawing/2016/ink" xmlns:am3d="http://schemas.microsoft.com/office/drawing/2017/model3d" xmlns:o="urn:schemas-microsoft-com:office:office" xmlns:oel="http://schemas.microsoft.com/office/2019/extlst" xmlns:r="http://schemas.openxmlformats.org/officeDocument/2006/relationships" xmlns:m="http://schemas.openxmlformats.org/officeDocument/2006/math" xmlns:v="urn:schemas-microsoft-com:vml" xmlns:wp14="http://schemas.microsoft.com/office/word/2010/wordprocessingDrawing" xmlns:wp="http://schemas.openxmlformats.org/drawingml/2006/wordprocessingDrawing" xmlns:w10="urn:schemas-microsoft-com:office:word" xmlns:w="http://schemas.openxmlformats.org/wordprocessingml/2006/main" xmlns:w14="http://schemas.microsoft.com/office/word/2010/wordml" xmlns:w15="http://schemas.microsoft.com/office/word/2012/wordml" xmlns:w16cei="http://schemas.microsoft.com/office/word/2026/wordml/cei" xmlns:w16cex="http://schemas.microsoft.com/office/word/2018/wordml/cex" xmlns:w16cid="http://schemas.microsoft.com/office/word/2016/wordml/cid" xmlns:w16="http://schemas.microsoft.com/office/word/2018/wordml" xmlns:w16du="http://schemas.microsoft.com/office/word/2023/wordml/word16du" xmlns:w16sdtdh="http://schemas.microsoft.com/office/word/2020/wordml/sdtdatahash" xmlns:w16sdtfl="http://schemas.microsoft.com/office/word/2024/wordml/sdtformatlock" xmlns:w16se="http://schemas.microsoft.com/office/word/2015/wordml/symex" xmlns:wpg="http://schemas.microsoft.com/office/word/2010/wordprocessingGroup" xmlns:wpi="http://schemas.microsoft.com/office/word/2010/wordprocessingInk" xmlns:wne="http://schemas.microsoft.com/office/word/2006/wordml" xmlns:wps="http://schemas.microsoft.com/office/word/2010/wordprocessingShape" mc:Ignorable="w14 w15 w16se w16cid w16 w16cex w16sdtdh w16sdtfl w16du wp14">
   <w:p>
     <w:pPr>
       <w:pStyle w:val="Footer"/>
@@ -20793,7 +22869,7 @@
 </file>
 
 <file path=word/footnotes.xml><?xml version="1.0" encoding="utf-8"?>
-<w:footnotes xmlns:wpc="http://schemas.microsoft.com/office/word/2010/wordprocessingCanvas" xmlns:cx="http://schemas.microsoft.com/office/drawing/2014/chartex" xmlns:cx1="http://schemas.microsoft.com/office/drawing/2015/9/8/chartex" xmlns:cx2="http://schemas.microsoft.com/office/drawing/2015/10/21/chartex" xmlns:cx3="http://schemas.microsoft.com/office/drawing/2016/5/9/chartex" xmlns:cx4="http://schemas.microsoft.com/office/drawing/2016/5/10/chartex" xmlns:cx5="http://schemas.microsoft.com/office/drawing/2016/5/11/chartex" xmlns:cx6="http://schemas.microsoft.com/office/drawing/2016/5/12/chartex" xmlns:cx7="http://schemas.microsoft.com/office/drawing/2016/5/13/chartex" xmlns:cx8="http://schemas.microsoft.com/office/drawing/2016/5/14/chartex" xmlns:mc="http://schemas.openxmlformats.org/markup-compatibility/2006" xmlns:aink="http://schemas.microsoft.com/office/drawing/2016/ink" xmlns:am3d="http://schemas.microsoft.com/office/drawing/2017/model3d" xmlns:o="urn:schemas-microsoft-com:office:office" xmlns:oel="http://schemas.microsoft.com/office/2019/extlst" xmlns:r="http://schemas.openxmlformats.org/officeDocument/2006/relationships" xmlns:m="http://schemas.openxmlformats.org/officeDocument/2006/math" xmlns:v="urn:schemas-microsoft-com:vml" xmlns:wp14="http://schemas.microsoft.com/office/word/2010/wordprocessingDrawing" xmlns:wp="http://schemas.openxmlformats.org/drawingml/2006/wordprocessingDrawing" xmlns:w10="urn:schemas-microsoft-com:office:word" xmlns:w="http://schemas.openxmlformats.org/wordprocessingml/2006/main" xmlns:w14="http://schemas.microsoft.com/office/word/2010/wordml" xmlns:w15="http://schemas.microsoft.com/office/word/2012/wordml" xmlns:w16cex="http://schemas.microsoft.com/office/word/2018/wordml/cex" xmlns:w16cid="http://schemas.microsoft.com/office/word/2016/wordml/cid" xmlns:w16="http://schemas.microsoft.com/office/word/2018/wordml" xmlns:w16du="http://schemas.microsoft.com/office/word/2023/wordml/word16du" xmlns:w16sdtdh="http://schemas.microsoft.com/office/word/2020/wordml/sdtdatahash" xmlns:w16sdtfl="http://schemas.microsoft.com/office/word/2024/wordml/sdtformatlock" xmlns:w16se="http://schemas.microsoft.com/office/word/2015/wordml/symex" xmlns:wpg="http://schemas.microsoft.com/office/word/2010/wordprocessingGroup" xmlns:wpi="http://schemas.microsoft.com/office/word/2010/wordprocessingInk" xmlns:wne="http://schemas.microsoft.com/office/word/2006/wordml" xmlns:wps="http://schemas.microsoft.com/office/word/2010/wordprocessingShape" mc:Ignorable="w14 w15 w16se w16cid w16 w16cex w16sdtdh w16sdtfl w16du wp14">
+<w:footnotes xmlns:wpc="http://schemas.microsoft.com/office/word/2010/wordprocessingCanvas" xmlns:cx="http://schemas.microsoft.com/office/drawing/2014/chartex" xmlns:cx1="http://schemas.microsoft.com/office/drawing/2015/9/8/chartex" xmlns:cx2="http://schemas.microsoft.com/office/drawing/2015/10/21/chartex" xmlns:cx3="http://schemas.microsoft.com/office/drawing/2016/5/9/chartex" xmlns:cx4="http://schemas.microsoft.com/office/drawing/2016/5/10/chartex" xmlns:cx5="http://schemas.microsoft.com/office/drawing/2016/5/11/chartex" xmlns:cx6="http://schemas.microsoft.com/office/drawing/2016/5/12/chartex" xmlns:cx7="http://schemas.microsoft.com/office/drawing/2016/5/13/chartex" xmlns:cx8="http://schemas.microsoft.com/office/drawing/2016/5/14/chartex" xmlns:mc="http://schemas.openxmlformats.org/markup-compatibility/2006" xmlns:aink="http://schemas.microsoft.com/office/drawing/2016/ink" xmlns:am3d="http://schemas.microsoft.com/office/drawing/2017/model3d" xmlns:o="urn:schemas-microsoft-com:office:office" xmlns:oel="http://schemas.microsoft.com/office/2019/extlst" xmlns:r="http://schemas.openxmlformats.org/officeDocument/2006/relationships" xmlns:m="http://schemas.openxmlformats.org/officeDocument/2006/math" xmlns:v="urn:schemas-microsoft-com:vml" xmlns:wp14="http://schemas.microsoft.com/office/word/2010/wordprocessingDrawing" xmlns:wp="http://schemas.openxmlformats.org/drawingml/2006/wordprocessingDrawing" xmlns:w10="urn:schemas-microsoft-com:office:word" xmlns:w="http://schemas.openxmlformats.org/wordprocessingml/2006/main" xmlns:w14="http://schemas.microsoft.com/office/word/2010/wordml" xmlns:w15="http://schemas.microsoft.com/office/word/2012/wordml" xmlns:w16cei="http://schemas.microsoft.com/office/word/2026/wordml/cei" xmlns:w16cex="http://schemas.microsoft.com/office/word/2018/wordml/cex" xmlns:w16cid="http://schemas.microsoft.com/office/word/2016/wordml/cid" xmlns:w16="http://schemas.microsoft.com/office/word/2018/wordml" xmlns:w16du="http://schemas.microsoft.com/office/word/2023/wordml/word16du" xmlns:w16sdtdh="http://schemas.microsoft.com/office/word/2020/wordml/sdtdatahash" xmlns:w16sdtfl="http://schemas.microsoft.com/office/word/2024/wordml/sdtformatlock" xmlns:w16se="http://schemas.microsoft.com/office/word/2015/wordml/symex" xmlns:wpg="http://schemas.microsoft.com/office/word/2010/wordprocessingGroup" xmlns:wpi="http://schemas.microsoft.com/office/word/2010/wordprocessingInk" xmlns:wne="http://schemas.microsoft.com/office/word/2006/wordml" xmlns:wps="http://schemas.microsoft.com/office/word/2010/wordprocessingShape" mc:Ignorable="w14 w15 w16se w16cid w16 w16cex w16sdtdh w16sdtfl w16du wp14">
   <w:footnote w:type="separator" w:id="-1">
     <w:p>
       <w:pPr>
@@ -20818,7 +22894,7 @@
 </file>
 
 <file path=word/header1.xml><?xml version="1.0" encoding="utf-8"?>
-<w:hdr xmlns:wpc="http://schemas.microsoft.com/office/word/2010/wordprocessingCanvas" xmlns:cx="http://schemas.microsoft.com/office/drawing/2014/chartex" xmlns:cx1="http://schemas.microsoft.com/office/drawing/2015/9/8/chartex" xmlns:cx2="http://schemas.microsoft.com/office/drawing/2015/10/21/chartex" xmlns:cx3="http://schemas.microsoft.com/office/drawing/2016/5/9/chartex" xmlns:cx4="http://schemas.microsoft.com/office/drawing/2016/5/10/chartex" xmlns:cx5="http://schemas.microsoft.com/office/drawing/2016/5/11/chartex" xmlns:cx6="http://schemas.microsoft.com/office/drawing/2016/5/12/chartex" xmlns:cx7="http://schemas.microsoft.com/office/drawing/2016/5/13/chartex" xmlns:cx8="http://schemas.microsoft.com/office/drawing/2016/5/14/chartex" xmlns:mc="http://schemas.openxmlformats.org/markup-compatibility/2006" xmlns:aink="http://schemas.microsoft.com/office/drawing/2016/ink" xmlns:am3d="http://schemas.microsoft.com/office/drawing/2017/model3d" xmlns:o="urn:schemas-microsoft-com:office:office" xmlns:oel="http://schemas.microsoft.com/office/2019/extlst" xmlns:r="http://schemas.openxmlformats.org/officeDocument/2006/relationships" xmlns:m="http://schemas.openxmlformats.org/officeDocument/2006/math" xmlns:v="urn:schemas-microsoft-com:vml" xmlns:wp14="http://schemas.microsoft.com/office/word/2010/wordprocessingDrawing" xmlns:wp="http://schemas.openxmlformats.org/drawingml/2006/wordprocessingDrawing" xmlns:w10="urn:schemas-microsoft-com:office:word" xmlns:w="http://schemas.openxmlformats.org/wordprocessingml/2006/main" xmlns:w14="http://schemas.microsoft.com/office/word/2010/wordml" xmlns:w15="http://schemas.microsoft.com/office/word/2012/wordml" xmlns:w16cex="http://schemas.microsoft.com/office/word/2018/wordml/cex" xmlns:w16cid="http://schemas.microsoft.com/office/word/2016/wordml/cid" xmlns:w16="http://schemas.microsoft.com/office/word/2018/wordml" xmlns:w16du="http://schemas.microsoft.com/office/word/2023/wordml/word16du" xmlns:w16sdtdh="http://schemas.microsoft.com/office/word/2020/wordml/sdtdatahash" xmlns:w16sdtfl="http://schemas.microsoft.com/office/word/2024/wordml/sdtformatlock" xmlns:w16se="http://schemas.microsoft.com/office/word/2015/wordml/symex" xmlns:wpg="http://schemas.microsoft.com/office/word/2010/wordprocessingGroup" xmlns:wpi="http://schemas.microsoft.com/office/word/2010/wordprocessingInk" xmlns:wne="http://schemas.microsoft.com/office/word/2006/wordml" xmlns:wps="http://schemas.microsoft.com/office/word/2010/wordprocessingShape" mc:Ignorable="w14 w15 w16se w16cid w16 w16cex w16sdtdh w16sdtfl w16du wp14">
+<w:hdr xmlns:wpc="http://schemas.microsoft.com/office/word/2010/wordprocessingCanvas" xmlns:cx="http://schemas.microsoft.com/office/drawing/2014/chartex" xmlns:cx1="http://schemas.microsoft.com/office/drawing/2015/9/8/chartex" xmlns:cx2="http://schemas.microsoft.com/office/drawing/2015/10/21/chartex" xmlns:cx3="http://schemas.microsoft.com/office/drawing/2016/5/9/chartex" xmlns:cx4="http://schemas.microsoft.com/office/drawing/2016/5/10/chartex" xmlns:cx5="http://schemas.microsoft.com/office/drawing/2016/5/11/chartex" xmlns:cx6="http://schemas.microsoft.com/office/drawing/2016/5/12/chartex" xmlns:cx7="http://schemas.microsoft.com/office/drawing/2016/5/13/chartex" xmlns:cx8="http://schemas.microsoft.com/office/drawing/2016/5/14/chartex" xmlns:mc="http://schemas.openxmlformats.org/markup-compatibility/2006" xmlns:aink="http://schemas.microsoft.com/office/drawing/2016/ink" xmlns:am3d="http://schemas.microsoft.com/office/drawing/2017/model3d" xmlns:o="urn:schemas-microsoft-com:office:office" xmlns:oel="http://schemas.microsoft.com/office/2019/extlst" xmlns:r="http://schemas.openxmlformats.org/officeDocument/2006/relationships" xmlns:m="http://schemas.openxmlformats.org/officeDocument/2006/math" xmlns:v="urn:schemas-microsoft-com:vml" xmlns:wp14="http://schemas.microsoft.com/office/word/2010/wordprocessingDrawing" xmlns:wp="http://schemas.openxmlformats.org/drawingml/2006/wordprocessingDrawing" xmlns:w10="urn:schemas-microsoft-com:office:word" xmlns:w="http://schemas.openxmlformats.org/wordprocessingml/2006/main" xmlns:w14="http://schemas.microsoft.com/office/word/2010/wordml" xmlns:w15="http://schemas.microsoft.com/office/word/2012/wordml" xmlns:w16cei="http://schemas.microsoft.com/office/word/2026/wordml/cei" xmlns:w16cex="http://schemas.microsoft.com/office/word/2018/wordml/cex" xmlns:w16cid="http://schemas.microsoft.com/office/word/2016/wordml/cid" xmlns:w16="http://schemas.microsoft.com/office/word/2018/wordml" xmlns:w16du="http://schemas.microsoft.com/office/word/2023/wordml/word16du" xmlns:w16sdtdh="http://schemas.microsoft.com/office/word/2020/wordml/sdtdatahash" xmlns:w16sdtfl="http://schemas.microsoft.com/office/word/2024/wordml/sdtformatlock" xmlns:w16se="http://schemas.microsoft.com/office/word/2015/wordml/symex" xmlns:wpg="http://schemas.microsoft.com/office/word/2010/wordprocessingGroup" xmlns:wpi="http://schemas.microsoft.com/office/word/2010/wordprocessingInk" xmlns:wne="http://schemas.microsoft.com/office/word/2006/wordml" xmlns:wps="http://schemas.microsoft.com/office/word/2010/wordprocessingShape" mc:Ignorable="w14 w15 w16se w16cid w16 w16cex w16sdtdh w16sdtfl w16du wp14">
   <w:p>
     <w:pPr>
       <w:pStyle w:val="Header"/>
@@ -20828,7 +22904,7 @@
 </file>
 
 <file path=word/numbering.xml><?xml version="1.0" encoding="utf-8"?>
-<w:numbering xmlns:wpc="http://schemas.microsoft.com/office/word/2010/wordprocessingCanvas" xmlns:cx="http://schemas.microsoft.com/office/drawing/2014/chartex" xmlns:cx1="http://schemas.microsoft.com/office/drawing/2015/9/8/chartex" xmlns:cx2="http://schemas.microsoft.com/office/drawing/2015/10/21/chartex" xmlns:cx3="http://schemas.microsoft.com/office/drawing/2016/5/9/chartex" xmlns:cx4="http://schemas.microsoft.com/office/drawing/2016/5/10/chartex" xmlns:cx5="http://schemas.microsoft.com/office/drawing/2016/5/11/chartex" xmlns:cx6="http://schemas.microsoft.com/office/drawing/2016/5/12/chartex" xmlns:cx7="http://schemas.microsoft.com/office/drawing/2016/5/13/chartex" xmlns:cx8="http://schemas.microsoft.com/office/drawing/2016/5/14/chartex" xmlns:mc="http://schemas.openxmlformats.org/markup-compatibility/2006" xmlns:aink="http://schemas.microsoft.com/office/drawing/2016/ink" xmlns:am3d="http://schemas.microsoft.com/office/drawing/2017/model3d" xmlns:o="urn:schemas-microsoft-com:office:office" xmlns:oel="http://schemas.microsoft.com/office/2019/extlst" xmlns:r="http://schemas.openxmlformats.org/officeDocument/2006/relationships" xmlns:m="http://schemas.openxmlformats.org/officeDocument/2006/math" xmlns:v="urn:schemas-microsoft-com:vml" xmlns:wp14="http://schemas.microsoft.com/office/word/2010/wordprocessingDrawing" xmlns:wp="http://schemas.openxmlformats.org/drawingml/2006/wordprocessingDrawing" xmlns:w10="urn:schemas-microsoft-com:office:word" xmlns:w="http://schemas.openxmlformats.org/wordprocessingml/2006/main" xmlns:w14="http://schemas.microsoft.com/office/word/2010/wordml" xmlns:w15="http://schemas.microsoft.com/office/word/2012/wordml" xmlns:w16cex="http://schemas.microsoft.com/office/word/2018/wordml/cex" xmlns:w16cid="http://schemas.microsoft.com/office/word/2016/wordml/cid" xmlns:w16="http://schemas.microsoft.com/office/word/2018/wordml" xmlns:w16du="http://schemas.microsoft.com/office/word/2023/wordml/word16du" xmlns:w16sdtdh="http://schemas.microsoft.com/office/word/2020/wordml/sdtdatahash" xmlns:w16sdtfl="http://schemas.microsoft.com/office/word/2024/wordml/sdtformatlock" xmlns:w16se="http://schemas.microsoft.com/office/word/2015/wordml/symex" xmlns:wpg="http://schemas.microsoft.com/office/word/2010/wordprocessingGroup" xmlns:wpi="http://schemas.microsoft.com/office/word/2010/wordprocessingInk" xmlns:wne="http://schemas.microsoft.com/office/word/2006/wordml" xmlns:wps="http://schemas.microsoft.com/office/word/2010/wordprocessingShape" mc:Ignorable="w14 w15 w16se w16cid w16 w16cex w16sdtdh w16sdtfl w16du wp14">
+<w:numbering xmlns:wpc="http://schemas.microsoft.com/office/word/2010/wordprocessingCanvas" xmlns:cx="http://schemas.microsoft.com/office/drawing/2014/chartex" xmlns:cx1="http://schemas.microsoft.com/office/drawing/2015/9/8/chartex" xmlns:cx2="http://schemas.microsoft.com/office/drawing/2015/10/21/chartex" xmlns:cx3="http://schemas.microsoft.com/office/drawing/2016/5/9/chartex" xmlns:cx4="http://schemas.microsoft.com/office/drawing/2016/5/10/chartex" xmlns:cx5="http://schemas.microsoft.com/office/drawing/2016/5/11/chartex" xmlns:cx6="http://schemas.microsoft.com/office/drawing/2016/5/12/chartex" xmlns:cx7="http://schemas.microsoft.com/office/drawing/2016/5/13/chartex" xmlns:cx8="http://schemas.microsoft.com/office/drawing/2016/5/14/chartex" xmlns:mc="http://schemas.openxmlformats.org/markup-compatibility/2006" xmlns:aink="http://schemas.microsoft.com/office/drawing/2016/ink" xmlns:am3d="http://schemas.microsoft.com/office/drawing/2017/model3d" xmlns:o="urn:schemas-microsoft-com:office:office" xmlns:oel="http://schemas.microsoft.com/office/2019/extlst" xmlns:r="http://schemas.openxmlformats.org/officeDocument/2006/relationships" xmlns:m="http://schemas.openxmlformats.org/officeDocument/2006/math" xmlns:v="urn:schemas-microsoft-com:vml" xmlns:wp14="http://schemas.microsoft.com/office/word/2010/wordprocessingDrawing" xmlns:wp="http://schemas.openxmlformats.org/drawingml/2006/wordprocessingDrawing" xmlns:w10="urn:schemas-microsoft-com:office:word" xmlns:w="http://schemas.openxmlformats.org/wordprocessingml/2006/main" xmlns:w14="http://schemas.microsoft.com/office/word/2010/wordml" xmlns:w15="http://schemas.microsoft.com/office/word/2012/wordml" xmlns:w16cei="http://schemas.microsoft.com/office/word/2026/wordml/cei" xmlns:w16cex="http://schemas.microsoft.com/office/word/2018/wordml/cex" xmlns:w16cid="http://schemas.microsoft.com/office/word/2016/wordml/cid" xmlns:w16="http://schemas.microsoft.com/office/word/2018/wordml" xmlns:w16du="http://schemas.microsoft.com/office/word/2023/wordml/word16du" xmlns:w16sdtdh="http://schemas.microsoft.com/office/word/2020/wordml/sdtdatahash" xmlns:w16sdtfl="http://schemas.microsoft.com/office/word/2024/wordml/sdtformatlock" xmlns:w16se="http://schemas.microsoft.com/office/word/2015/wordml/symex" xmlns:wpg="http://schemas.microsoft.com/office/word/2010/wordprocessingGroup" xmlns:wpi="http://schemas.microsoft.com/office/word/2010/wordprocessingInk" xmlns:wne="http://schemas.microsoft.com/office/word/2006/wordml" xmlns:wps="http://schemas.microsoft.com/office/word/2010/wordprocessingShape" mc:Ignorable="w14 w15 w16se w16cid w16 w16cex w16sdtdh w16sdtfl w16du wp14">
   <w:abstractNum w:abstractNumId="0" w15:restartNumberingAfterBreak="0">
     <w:nsid w:val="0C972420"/>
     <w:multiLevelType w:val="multilevel"/>
@@ -22925,7 +25001,7 @@
 </file>
 
 <file path=word/people.xml><?xml version="1.0" encoding="utf-8"?>
-<w15:people xmlns:wpc="http://schemas.microsoft.com/office/word/2010/wordprocessingCanvas" xmlns:cx="http://schemas.microsoft.com/office/drawing/2014/chartex" xmlns:cx1="http://schemas.microsoft.com/office/drawing/2015/9/8/chartex" xmlns:cx2="http://schemas.microsoft.com/office/drawing/2015/10/21/chartex" xmlns:cx3="http://schemas.microsoft.com/office/drawing/2016/5/9/chartex" xmlns:cx4="http://schemas.microsoft.com/office/drawing/2016/5/10/chartex" xmlns:cx5="http://schemas.microsoft.com/office/drawing/2016/5/11/chartex" xmlns:cx6="http://schemas.microsoft.com/office/drawing/2016/5/12/chartex" xmlns:cx7="http://schemas.microsoft.com/office/drawing/2016/5/13/chartex" xmlns:cx8="http://schemas.microsoft.com/office/drawing/2016/5/14/chartex" xmlns:mc="http://schemas.openxmlformats.org/markup-compatibility/2006" xmlns:aink="http://schemas.microsoft.com/office/drawing/2016/ink" xmlns:am3d="http://schemas.microsoft.com/office/drawing/2017/model3d" xmlns:o="urn:schemas-microsoft-com:office:office" xmlns:oel="http://schemas.microsoft.com/office/2019/extlst" xmlns:r="http://schemas.openxmlformats.org/officeDocument/2006/relationships" xmlns:m="http://schemas.openxmlformats.org/officeDocument/2006/math" xmlns:v="urn:schemas-microsoft-com:vml" xmlns:wp14="http://schemas.microsoft.com/office/word/2010/wordprocessingDrawing" xmlns:wp="http://schemas.openxmlformats.org/drawingml/2006/wordprocessingDrawing" xmlns:w10="urn:schemas-microsoft-com:office:word" xmlns:w="http://schemas.openxmlformats.org/wordprocessingml/2006/main" xmlns:w14="http://schemas.microsoft.com/office/word/2010/wordml" xmlns:w15="http://schemas.microsoft.com/office/word/2012/wordml" xmlns:w16cex="http://schemas.microsoft.com/office/word/2018/wordml/cex" xmlns:w16cid="http://schemas.microsoft.com/office/word/2016/wordml/cid" xmlns:w16="http://schemas.microsoft.com/office/word/2018/wordml" xmlns:w16du="http://schemas.microsoft.com/office/word/2023/wordml/word16du" xmlns:w16sdtdh="http://schemas.microsoft.com/office/word/2020/wordml/sdtdatahash" xmlns:w16sdtfl="http://schemas.microsoft.com/office/word/2024/wordml/sdtformatlock" xmlns:w16se="http://schemas.microsoft.com/office/word/2015/wordml/symex" xmlns:wpg="http://schemas.microsoft.com/office/word/2010/wordprocessingGroup" xmlns:wpi="http://schemas.microsoft.com/office/word/2010/wordprocessingInk" xmlns:wne="http://schemas.microsoft.com/office/word/2006/wordml" xmlns:wps="http://schemas.microsoft.com/office/word/2010/wordprocessingShape" mc:Ignorable="w14 w15 w16se w16cid w16 w16cex w16sdtdh w16sdtfl w16du wp14">
+<w15:people xmlns:wpc="http://schemas.microsoft.com/office/word/2010/wordprocessingCanvas" xmlns:cx="http://schemas.microsoft.com/office/drawing/2014/chartex" xmlns:cx1="http://schemas.microsoft.com/office/drawing/2015/9/8/chartex" xmlns:cx2="http://schemas.microsoft.com/office/drawing/2015/10/21/chartex" xmlns:cx3="http://schemas.microsoft.com/office/drawing/2016/5/9/chartex" xmlns:cx4="http://schemas.microsoft.com/office/drawing/2016/5/10/chartex" xmlns:cx5="http://schemas.microsoft.com/office/drawing/2016/5/11/chartex" xmlns:cx6="http://schemas.microsoft.com/office/drawing/2016/5/12/chartex" xmlns:cx7="http://schemas.microsoft.com/office/drawing/2016/5/13/chartex" xmlns:cx8="http://schemas.microsoft.com/office/drawing/2016/5/14/chartex" xmlns:mc="http://schemas.openxmlformats.org/markup-compatibility/2006" xmlns:aink="http://schemas.microsoft.com/office/drawing/2016/ink" xmlns:am3d="http://schemas.microsoft.com/office/drawing/2017/model3d" xmlns:o="urn:schemas-microsoft-com:office:office" xmlns:oel="http://schemas.microsoft.com/office/2019/extlst" xmlns:r="http://schemas.openxmlformats.org/officeDocument/2006/relationships" xmlns:m="http://schemas.openxmlformats.org/officeDocument/2006/math" xmlns:v="urn:schemas-microsoft-com:vml" xmlns:wp14="http://schemas.microsoft.com/office/word/2010/wordprocessingDrawing" xmlns:wp="http://schemas.openxmlformats.org/drawingml/2006/wordprocessingDrawing" xmlns:w10="urn:schemas-microsoft-com:office:word" xmlns:w="http://schemas.openxmlformats.org/wordprocessingml/2006/main" xmlns:w14="http://schemas.microsoft.com/office/word/2010/wordml" xmlns:w15="http://schemas.microsoft.com/office/word/2012/wordml" xmlns:w16cei="http://schemas.microsoft.com/office/word/2026/wordml/cei" xmlns:w16cex="http://schemas.microsoft.com/office/word/2018/wordml/cex" xmlns:w16cid="http://schemas.microsoft.com/office/word/2016/wordml/cid" xmlns:w16="http://schemas.microsoft.com/office/word/2018/wordml" xmlns:w16du="http://schemas.microsoft.com/office/word/2023/wordml/word16du" xmlns:w16sdtdh="http://schemas.microsoft.com/office/word/2020/wordml/sdtdatahash" xmlns:w16sdtfl="http://schemas.microsoft.com/office/word/2024/wordml/sdtformatlock" xmlns:w16se="http://schemas.microsoft.com/office/word/2015/wordml/symex" xmlns:wpg="http://schemas.microsoft.com/office/word/2010/wordprocessingGroup" xmlns:wpi="http://schemas.microsoft.com/office/word/2010/wordprocessingInk" xmlns:wne="http://schemas.microsoft.com/office/word/2006/wordml" xmlns:wps="http://schemas.microsoft.com/office/word/2010/wordprocessingShape" mc:Ignorable="w14 w15 w16se w16cid w16 w16cex w16sdtdh w16sdtfl w16du wp14">
   <w15:person w15:author="Erfan Mohammadzadeh">
     <w15:presenceInfo w15:providerId="Windows Live" w15:userId="5af7e3336257bc74"/>
   </w15:person>
@@ -23535,7 +25611,6 @@
   <w:style w:type="character" w:default="1" w:styleId="DefaultParagraphFont">
     <w:name w:val="Default Paragraph Font"/>
     <w:uiPriority w:val="1"/>
-    <w:semiHidden/>
     <w:unhideWhenUsed/>
   </w:style>
   <w:style w:type="table" w:default="1" w:styleId="TableNormal">

</xml_diff>

<commit_message>
Add authetication to UserMenu and loan service
</commit_message>
<xml_diff>
--- a/Optimization.docx
+++ b/Optimization.docx
@@ -205,7 +205,6 @@
         <w:t>_</w:t>
       </w:r>
       <w:proofErr w:type="spellStart"/>
-      <w:proofErr w:type="gramStart"/>
       <w:r>
         <w:rPr>
           <w:rFonts w:ascii="Consolas" w:hAnsi="Consolas" w:cs="Courier New"/>
@@ -234,7 +233,6 @@
         <w:t>Any</w:t>
       </w:r>
       <w:proofErr w:type="spellEnd"/>
-      <w:proofErr w:type="gramEnd"/>
       <w:r>
         <w:rPr>
           <w:rFonts w:ascii="Consolas" w:hAnsi="Consolas" w:cs="Courier New"/>
@@ -272,7 +270,6 @@
         <w:t xml:space="preserve"> </w:t>
       </w:r>
       <w:proofErr w:type="spellStart"/>
-      <w:proofErr w:type="gramStart"/>
       <w:r>
         <w:rPr>
           <w:rFonts w:ascii="Consolas" w:hAnsi="Consolas" w:cs="Courier New"/>
@@ -301,7 +298,6 @@
         <w:t>NationalCode</w:t>
       </w:r>
       <w:proofErr w:type="spellEnd"/>
-      <w:proofErr w:type="gramEnd"/>
       <w:r>
         <w:rPr>
           <w:rFonts w:ascii="Consolas" w:hAnsi="Consolas" w:cs="Courier New"/>
@@ -330,7 +326,6 @@
         <w:t xml:space="preserve"> </w:t>
       </w:r>
       <w:proofErr w:type="spellStart"/>
-      <w:proofErr w:type="gramStart"/>
       <w:r>
         <w:rPr>
           <w:rFonts w:ascii="Consolas" w:hAnsi="Consolas" w:cs="Courier New"/>
@@ -359,7 +354,6 @@
         <w:t>NationalCode</w:t>
       </w:r>
       <w:proofErr w:type="spellEnd"/>
-      <w:proofErr w:type="gramEnd"/>
       <w:r>
         <w:rPr>
           <w:rFonts w:ascii="Consolas" w:hAnsi="Consolas" w:cs="Courier New"/>
@@ -694,7 +688,6 @@
         <w:t>_</w:t>
       </w:r>
       <w:proofErr w:type="spellStart"/>
-      <w:proofErr w:type="gramStart"/>
       <w:r>
         <w:rPr>
           <w:rFonts w:ascii="Consolas" w:hAnsi="Consolas" w:cs="Courier New"/>
@@ -723,7 +716,6 @@
         <w:t>Any</w:t>
       </w:r>
       <w:proofErr w:type="spellEnd"/>
-      <w:proofErr w:type="gramEnd"/>
       <w:r>
         <w:rPr>
           <w:rFonts w:ascii="Consolas" w:hAnsi="Consolas" w:cs="Courier New"/>
@@ -761,7 +753,6 @@
         <w:t xml:space="preserve"> </w:t>
       </w:r>
       <w:proofErr w:type="spellStart"/>
-      <w:proofErr w:type="gramStart"/>
       <w:r>
         <w:rPr>
           <w:rFonts w:ascii="Consolas" w:hAnsi="Consolas" w:cs="Courier New"/>
@@ -790,7 +781,6 @@
         <w:t>NationalCode</w:t>
       </w:r>
       <w:proofErr w:type="spellEnd"/>
-      <w:proofErr w:type="gramEnd"/>
       <w:r>
         <w:rPr>
           <w:rFonts w:ascii="Consolas" w:hAnsi="Consolas" w:cs="Courier New"/>
@@ -819,7 +809,6 @@
         <w:t xml:space="preserve"> </w:t>
       </w:r>
       <w:proofErr w:type="spellStart"/>
-      <w:proofErr w:type="gramStart"/>
       <w:r>
         <w:rPr>
           <w:rFonts w:ascii="Consolas" w:hAnsi="Consolas" w:cs="Courier New"/>
@@ -848,7 +837,6 @@
         <w:t>NationalCode</w:t>
       </w:r>
       <w:proofErr w:type="spellEnd"/>
-      <w:proofErr w:type="gramEnd"/>
       <w:r>
         <w:rPr>
           <w:rFonts w:ascii="Consolas" w:hAnsi="Consolas" w:cs="Courier New"/>
@@ -1034,15 +1022,7 @@
         <w:t>generic private helper methods</w:t>
       </w:r>
       <w:r>
-        <w:t xml:space="preserve"> that operate on any List&lt;T&gt; where </w:t>
-      </w:r>
-      <w:proofErr w:type="gramStart"/>
-      <w:r>
-        <w:t>T :</w:t>
-      </w:r>
-      <w:proofErr w:type="gramEnd"/>
-      <w:r>
-        <w:t xml:space="preserve"> Person:</w:t>
+        <w:t xml:space="preserve"> that operate on any List&lt;T&gt; where T : Person:</w:t>
       </w:r>
     </w:p>
     <w:p>
@@ -1444,17 +1424,7 @@
           <w:sz w:val="17"/>
           <w:szCs w:val="17"/>
         </w:rPr>
-        <w:t xml:space="preserve"> </w:t>
-      </w:r>
-      <w:proofErr w:type="gramStart"/>
-      <w:r>
-        <w:rPr>
-          <w:rFonts w:ascii="Consolas" w:hAnsi="Consolas" w:cs="Courier New"/>
-          <w:color w:val="000000"/>
-          <w:sz w:val="17"/>
-          <w:szCs w:val="17"/>
-        </w:rPr>
-        <w:t xml:space="preserve">T </w:t>
+        <w:t xml:space="preserve"> T </w:t>
       </w:r>
       <w:r>
         <w:rPr>
@@ -1465,7 +1435,6 @@
         </w:rPr>
         <w:t>:</w:t>
       </w:r>
-      <w:proofErr w:type="gramEnd"/>
       <w:r>
         <w:rPr>
           <w:rFonts w:ascii="Consolas" w:hAnsi="Consolas" w:cs="Courier New"/>
@@ -1609,7 +1578,6 @@
         <w:t xml:space="preserve"> </w:t>
       </w:r>
       <w:proofErr w:type="spellStart"/>
-      <w:proofErr w:type="gramStart"/>
       <w:r>
         <w:rPr>
           <w:rFonts w:ascii="Consolas" w:hAnsi="Consolas" w:cs="Courier New"/>
@@ -1638,7 +1606,6 @@
         <w:t>Any</w:t>
       </w:r>
       <w:proofErr w:type="spellEnd"/>
-      <w:proofErr w:type="gramEnd"/>
       <w:r>
         <w:rPr>
           <w:rFonts w:ascii="Consolas" w:hAnsi="Consolas" w:cs="Courier New"/>
@@ -1676,7 +1643,6 @@
         <w:t xml:space="preserve"> </w:t>
       </w:r>
       <w:proofErr w:type="spellStart"/>
-      <w:proofErr w:type="gramStart"/>
       <w:r>
         <w:rPr>
           <w:rFonts w:ascii="Consolas" w:hAnsi="Consolas" w:cs="Courier New"/>
@@ -1723,7 +1689,6 @@
         </w:rPr>
         <w:t>!=</w:t>
       </w:r>
-      <w:proofErr w:type="gramEnd"/>
       <w:r>
         <w:rPr>
           <w:rFonts w:ascii="Consolas" w:hAnsi="Consolas" w:cs="Courier New"/>
@@ -1772,7 +1737,6 @@
         <w:t xml:space="preserve"> </w:t>
       </w:r>
       <w:proofErr w:type="spellStart"/>
-      <w:proofErr w:type="gramStart"/>
       <w:r>
         <w:rPr>
           <w:rFonts w:ascii="Consolas" w:hAnsi="Consolas" w:cs="Courier New"/>
@@ -1801,7 +1765,6 @@
         <w:t>NationalCode</w:t>
       </w:r>
       <w:proofErr w:type="spellEnd"/>
-      <w:proofErr w:type="gramEnd"/>
       <w:r>
         <w:rPr>
           <w:rFonts w:ascii="Consolas" w:hAnsi="Consolas" w:cs="Courier New"/>
@@ -1891,16 +1854,7 @@
           <w:sz w:val="17"/>
           <w:szCs w:val="17"/>
         </w:rPr>
-        <w:t xml:space="preserve"> </w:t>
-      </w:r>
-      <w:proofErr w:type="gramStart"/>
-      <w:r>
-        <w:rPr>
-          <w:rFonts w:ascii="Consolas" w:hAnsi="Consolas" w:cs="Courier New"/>
-          <w:sz w:val="17"/>
-          <w:szCs w:val="17"/>
-        </w:rPr>
-        <w:t xml:space="preserve">5. </w:t>
+        <w:t xml:space="preserve"> 5. </w:t>
       </w:r>
       <w:r>
         <w:rPr>
@@ -1911,7 +1865,6 @@
         </w:rPr>
         <w:t>}</w:t>
       </w:r>
-      <w:proofErr w:type="gramEnd"/>
     </w:p>
     <w:p>
       <w:pPr>
@@ -2354,17 +2307,7 @@
           <w:sz w:val="17"/>
           <w:szCs w:val="17"/>
         </w:rPr>
-        <w:t xml:space="preserve"> </w:t>
-      </w:r>
-      <w:proofErr w:type="gramStart"/>
-      <w:r>
-        <w:rPr>
-          <w:rFonts w:ascii="Consolas" w:hAnsi="Consolas" w:cs="Courier New"/>
-          <w:color w:val="000000"/>
-          <w:sz w:val="17"/>
-          <w:szCs w:val="17"/>
-        </w:rPr>
-        <w:t xml:space="preserve">T </w:t>
+        <w:t xml:space="preserve"> T </w:t>
       </w:r>
       <w:r>
         <w:rPr>
@@ -2375,7 +2318,6 @@
         </w:rPr>
         <w:t>:</w:t>
       </w:r>
-      <w:proofErr w:type="gramEnd"/>
       <w:r>
         <w:rPr>
           <w:rFonts w:ascii="Consolas" w:hAnsi="Consolas" w:cs="Courier New"/>
@@ -2519,7 +2461,6 @@
         <w:t xml:space="preserve"> </w:t>
       </w:r>
       <w:proofErr w:type="spellStart"/>
-      <w:proofErr w:type="gramStart"/>
       <w:r>
         <w:rPr>
           <w:rFonts w:ascii="Consolas" w:hAnsi="Consolas" w:cs="Courier New"/>
@@ -2548,7 +2489,6 @@
         <w:t>Any</w:t>
       </w:r>
       <w:proofErr w:type="spellEnd"/>
-      <w:proofErr w:type="gramEnd"/>
       <w:r>
         <w:rPr>
           <w:rFonts w:ascii="Consolas" w:hAnsi="Consolas" w:cs="Courier New"/>
@@ -2586,7 +2526,6 @@
         <w:t xml:space="preserve"> </w:t>
       </w:r>
       <w:proofErr w:type="spellStart"/>
-      <w:proofErr w:type="gramStart"/>
       <w:r>
         <w:rPr>
           <w:rFonts w:ascii="Consolas" w:hAnsi="Consolas" w:cs="Courier New"/>
@@ -2633,7 +2572,6 @@
         </w:rPr>
         <w:t>!=</w:t>
       </w:r>
-      <w:proofErr w:type="gramEnd"/>
       <w:r>
         <w:rPr>
           <w:rFonts w:ascii="Consolas" w:hAnsi="Consolas" w:cs="Courier New"/>
@@ -2682,7 +2620,6 @@
         <w:t xml:space="preserve"> </w:t>
       </w:r>
       <w:proofErr w:type="spellStart"/>
-      <w:proofErr w:type="gramStart"/>
       <w:r>
         <w:rPr>
           <w:rFonts w:ascii="Consolas" w:hAnsi="Consolas" w:cs="Courier New"/>
@@ -2729,7 +2666,6 @@
         <w:t>Equals</w:t>
       </w:r>
       <w:proofErr w:type="spellEnd"/>
-      <w:proofErr w:type="gramEnd"/>
       <w:r>
         <w:rPr>
           <w:rFonts w:ascii="Consolas" w:hAnsi="Consolas" w:cs="Courier New"/>
@@ -2840,7 +2776,6 @@
           <w:szCs w:val="17"/>
         </w:rPr>
       </w:pPr>
-      <w:proofErr w:type="gramStart"/>
       <w:r>
         <w:rPr>
           <w:rFonts w:ascii="Consolas" w:hAnsi="Consolas" w:cs="Courier New"/>
@@ -2858,29 +2793,24 @@
         </w:rPr>
         <w:t>}</w:t>
       </w:r>
-      <w:proofErr w:type="gramEnd"/>
     </w:p>
     <w:p>
       <w:r>
         <w:t xml:space="preserve">This assumes Id lives on Person (which it appears to, based on </w:t>
       </w:r>
       <w:proofErr w:type="spellStart"/>
-      <w:proofErr w:type="gramStart"/>
       <w:r>
         <w:t>author.Id</w:t>
       </w:r>
       <w:proofErr w:type="spellEnd"/>
-      <w:proofErr w:type="gramEnd"/>
       <w:r>
         <w:t xml:space="preserve"> and </w:t>
       </w:r>
       <w:proofErr w:type="spellStart"/>
-      <w:proofErr w:type="gramStart"/>
       <w:r>
         <w:t>member.Id</w:t>
       </w:r>
       <w:proofErr w:type="spellEnd"/>
-      <w:proofErr w:type="gramEnd"/>
       <w:r>
         <w:t xml:space="preserve"> both being used) — confirm this by checking </w:t>
       </w:r>
@@ -2977,7 +2907,6 @@
         <w:t>(</w:t>
       </w:r>
       <w:proofErr w:type="spellStart"/>
-      <w:proofErr w:type="gramStart"/>
       <w:r>
         <w:rPr>
           <w:rFonts w:ascii="Consolas" w:hAnsi="Consolas" w:cs="Courier New"/>
@@ -2997,7 +2926,6 @@
         </w:rPr>
         <w:t>(</w:t>
       </w:r>
-      <w:proofErr w:type="gramEnd"/>
       <w:r>
         <w:rPr>
           <w:rFonts w:ascii="Consolas" w:hAnsi="Consolas" w:cs="Courier New"/>
@@ -3026,7 +2954,6 @@
         <w:t xml:space="preserve"> </w:t>
       </w:r>
       <w:proofErr w:type="spellStart"/>
-      <w:proofErr w:type="gramStart"/>
       <w:r>
         <w:rPr>
           <w:rFonts w:ascii="Consolas" w:hAnsi="Consolas" w:cs="Courier New"/>
@@ -3055,7 +2982,6 @@
         <w:t>NationalCode</w:t>
       </w:r>
       <w:proofErr w:type="spellEnd"/>
-      <w:proofErr w:type="gramEnd"/>
       <w:r>
         <w:rPr>
           <w:rFonts w:ascii="Consolas" w:hAnsi="Consolas" w:cs="Courier New"/>
@@ -3277,7 +3203,6 @@
         <w:t>(</w:t>
       </w:r>
       <w:proofErr w:type="spellStart"/>
-      <w:proofErr w:type="gramStart"/>
       <w:r>
         <w:rPr>
           <w:rFonts w:ascii="Consolas" w:hAnsi="Consolas" w:cs="Courier New"/>
@@ -3306,7 +3231,6 @@
         <w:t>NationalCode</w:t>
       </w:r>
       <w:proofErr w:type="spellEnd"/>
-      <w:proofErr w:type="gramEnd"/>
       <w:r>
         <w:rPr>
           <w:rFonts w:ascii="Consolas" w:hAnsi="Consolas" w:cs="Courier New"/>
@@ -3389,7 +3313,6 @@
         <w:t xml:space="preserve"> </w:t>
       </w:r>
       <w:proofErr w:type="spellStart"/>
-      <w:proofErr w:type="gramStart"/>
       <w:r>
         <w:rPr>
           <w:rFonts w:ascii="Consolas" w:hAnsi="Consolas" w:cs="Courier New"/>
@@ -3409,7 +3332,6 @@
         </w:rPr>
         <w:t>(</w:t>
       </w:r>
-      <w:proofErr w:type="gramEnd"/>
       <w:r>
         <w:rPr>
           <w:rFonts w:ascii="Consolas" w:hAnsi="Consolas" w:cs="Courier New"/>
@@ -3438,7 +3360,6 @@
         <w:t xml:space="preserve"> </w:t>
       </w:r>
       <w:proofErr w:type="spellStart"/>
-      <w:proofErr w:type="gramStart"/>
       <w:r>
         <w:rPr>
           <w:rFonts w:ascii="Consolas" w:hAnsi="Consolas" w:cs="Courier New"/>
@@ -3467,7 +3388,6 @@
         <w:t>NationalCode</w:t>
       </w:r>
       <w:proofErr w:type="spellEnd"/>
-      <w:proofErr w:type="gramEnd"/>
       <w:r>
         <w:rPr>
           <w:rFonts w:ascii="Consolas" w:hAnsi="Consolas" w:cs="Courier New"/>
@@ -3680,15 +3600,7 @@
         <w:t>generic repository pattern</w:t>
       </w:r>
       <w:r>
-        <w:t xml:space="preserve"> (Repository&lt;T&gt; where </w:t>
-      </w:r>
-      <w:proofErr w:type="gramStart"/>
-      <w:r>
-        <w:t>T :</w:t>
-      </w:r>
-      <w:proofErr w:type="gramEnd"/>
-      <w:r>
-        <w:t xml:space="preserve"> Person with Add, Update, Remove, </w:t>
+        <w:t xml:space="preserve"> (Repository&lt;T&gt; where T : Person with Add, Update, Remove, </w:t>
       </w:r>
       <w:proofErr w:type="spellStart"/>
       <w:r>
@@ -3808,15 +3720,7 @@
       </w:r>
       <w:r>
         <w:br/>
-        <w:t>You can create a PersonService&lt;T&gt; where </w:t>
-      </w:r>
-      <w:proofErr w:type="gramStart"/>
-      <w:r>
-        <w:t>T :</w:t>
-      </w:r>
-      <w:proofErr w:type="gramEnd"/>
-      <w:r>
-        <w:t xml:space="preserve"> Person (or </w:t>
+        <w:t>You can create a PersonService&lt;T&gt; where T : Person (or </w:t>
       </w:r>
       <w:proofErr w:type="spellStart"/>
       <w:r>
@@ -4047,28 +3951,44 @@
           <w:sz w:val="17"/>
           <w:szCs w:val="17"/>
         </w:rPr>
+        <w:t xml:space="preserve"> T </w:t>
+      </w:r>
+      <w:r>
+        <w:rPr>
+          <w:rFonts w:ascii="Consolas" w:hAnsi="Consolas" w:cs="Courier New"/>
+          <w:color w:val="666600"/>
+          <w:sz w:val="17"/>
+          <w:szCs w:val="17"/>
+        </w:rPr>
+        <w:t>:</w:t>
+      </w:r>
+      <w:r>
+        <w:rPr>
+          <w:rFonts w:ascii="Consolas" w:hAnsi="Consolas" w:cs="Courier New"/>
+          <w:color w:val="000000"/>
+          <w:sz w:val="17"/>
+          <w:szCs w:val="17"/>
+        </w:rPr>
         <w:t xml:space="preserve"> </w:t>
       </w:r>
-      <w:proofErr w:type="gramStart"/>
-      <w:r>
-        <w:rPr>
-          <w:rFonts w:ascii="Consolas" w:hAnsi="Consolas" w:cs="Courier New"/>
-          <w:color w:val="000000"/>
-          <w:sz w:val="17"/>
-          <w:szCs w:val="17"/>
-        </w:rPr>
-        <w:t xml:space="preserve">T </w:t>
-      </w:r>
-      <w:r>
-        <w:rPr>
-          <w:rFonts w:ascii="Consolas" w:hAnsi="Consolas" w:cs="Courier New"/>
-          <w:color w:val="666600"/>
-          <w:sz w:val="17"/>
-          <w:szCs w:val="17"/>
-        </w:rPr>
-        <w:t>:</w:t>
-      </w:r>
-      <w:proofErr w:type="gramEnd"/>
+      <w:r>
+        <w:rPr>
+          <w:rFonts w:ascii="Consolas" w:hAnsi="Consolas" w:cs="Courier New"/>
+          <w:color w:val="660066"/>
+          <w:sz w:val="17"/>
+          <w:szCs w:val="17"/>
+        </w:rPr>
+        <w:t>Person</w:t>
+      </w:r>
+      <w:r>
+        <w:rPr>
+          <w:rFonts w:ascii="Consolas" w:hAnsi="Consolas" w:cs="Courier New"/>
+          <w:color w:val="666600"/>
+          <w:sz w:val="17"/>
+          <w:szCs w:val="17"/>
+        </w:rPr>
+        <w:t>,</w:t>
+      </w:r>
       <w:r>
         <w:rPr>
           <w:rFonts w:ascii="Consolas" w:hAnsi="Consolas" w:cs="Courier New"/>
@@ -4081,34 +4001,6 @@
       <w:r>
         <w:rPr>
           <w:rFonts w:ascii="Consolas" w:hAnsi="Consolas" w:cs="Courier New"/>
-          <w:color w:val="660066"/>
-          <w:sz w:val="17"/>
-          <w:szCs w:val="17"/>
-        </w:rPr>
-        <w:t>Person</w:t>
-      </w:r>
-      <w:r>
-        <w:rPr>
-          <w:rFonts w:ascii="Consolas" w:hAnsi="Consolas" w:cs="Courier New"/>
-          <w:color w:val="666600"/>
-          <w:sz w:val="17"/>
-          <w:szCs w:val="17"/>
-        </w:rPr>
-        <w:t>,</w:t>
-      </w:r>
-      <w:r>
-        <w:rPr>
-          <w:rFonts w:ascii="Consolas" w:hAnsi="Consolas" w:cs="Courier New"/>
-          <w:color w:val="000000"/>
-          <w:sz w:val="17"/>
-          <w:szCs w:val="17"/>
-        </w:rPr>
-        <w:t xml:space="preserve"> </w:t>
-      </w:r>
-      <w:proofErr w:type="gramStart"/>
-      <w:r>
-        <w:rPr>
-          <w:rFonts w:ascii="Consolas" w:hAnsi="Consolas" w:cs="Courier New"/>
           <w:color w:val="000088"/>
           <w:sz w:val="17"/>
           <w:szCs w:val="17"/>
@@ -4122,17 +4014,7 @@
           <w:sz w:val="17"/>
           <w:szCs w:val="17"/>
         </w:rPr>
-        <w:t>(</w:t>
-      </w:r>
-      <w:proofErr w:type="gramEnd"/>
-      <w:r>
-        <w:rPr>
-          <w:rFonts w:ascii="Consolas" w:hAnsi="Consolas" w:cs="Courier New"/>
-          <w:color w:val="666600"/>
-          <w:sz w:val="17"/>
-          <w:szCs w:val="17"/>
-        </w:rPr>
-        <w:t>)</w:t>
+        <w:t>()</w:t>
       </w:r>
     </w:p>
     <w:p>
@@ -4321,7 +4203,6 @@
         </w:rPr>
         <w:t xml:space="preserve"> </w:t>
       </w:r>
-      <w:proofErr w:type="gramStart"/>
       <w:r>
         <w:rPr>
           <w:rFonts w:ascii="Consolas" w:hAnsi="Consolas" w:cs="Courier New"/>
@@ -4338,17 +4219,7 @@
           <w:sz w:val="17"/>
           <w:szCs w:val="17"/>
         </w:rPr>
-        <w:t>(</w:t>
-      </w:r>
-      <w:proofErr w:type="gramEnd"/>
-      <w:r>
-        <w:rPr>
-          <w:rFonts w:ascii="Consolas" w:hAnsi="Consolas" w:cs="Courier New"/>
-          <w:color w:val="666600"/>
-          <w:sz w:val="17"/>
-          <w:szCs w:val="17"/>
-        </w:rPr>
-        <w:t>);</w:t>
+        <w:t>();</w:t>
       </w:r>
     </w:p>
     <w:p>
@@ -4539,7 +4410,6 @@
         </w:rPr>
         <w:t xml:space="preserve"> </w:t>
       </w:r>
-      <w:proofErr w:type="gramStart"/>
       <w:r>
         <w:rPr>
           <w:rFonts w:ascii="Consolas" w:hAnsi="Consolas" w:cs="Courier New"/>
@@ -4558,7 +4428,6 @@
         </w:rPr>
         <w:t>(</w:t>
       </w:r>
-      <w:proofErr w:type="gramEnd"/>
       <w:r>
         <w:rPr>
           <w:rFonts w:ascii="Consolas" w:hAnsi="Consolas" w:cs="Courier New"/>
@@ -4698,7 +4567,6 @@
         </w:rPr>
         <w:t xml:space="preserve"> </w:t>
       </w:r>
-      <w:proofErr w:type="gramStart"/>
       <w:r>
         <w:rPr>
           <w:rFonts w:ascii="Consolas" w:hAnsi="Consolas" w:cs="Courier New"/>
@@ -4726,7 +4594,6 @@
         </w:rPr>
         <w:t>)</w:t>
       </w:r>
-      <w:proofErr w:type="gramEnd"/>
       <w:r>
         <w:rPr>
           <w:rFonts w:ascii="Consolas" w:hAnsi="Consolas" w:cs="Courier New"/>
@@ -4736,7 +4603,6 @@
         </w:rPr>
         <w:t xml:space="preserve"> </w:t>
       </w:r>
-      <w:proofErr w:type="gramStart"/>
       <w:r>
         <w:rPr>
           <w:rFonts w:ascii="Consolas" w:hAnsi="Consolas" w:cs="Courier New"/>
@@ -4764,7 +4630,6 @@
         </w:rPr>
         <w:t>...</w:t>
       </w:r>
-      <w:proofErr w:type="gramEnd"/>
       <w:r>
         <w:rPr>
           <w:rFonts w:ascii="Consolas" w:hAnsi="Consolas" w:cs="Courier New"/>
@@ -4919,7 +4784,6 @@
         </w:rPr>
         <w:t xml:space="preserve"> </w:t>
       </w:r>
-      <w:proofErr w:type="gramStart"/>
       <w:r>
         <w:rPr>
           <w:rFonts w:ascii="Consolas" w:hAnsi="Consolas" w:cs="Courier New"/>
@@ -4938,7 +4802,6 @@
         </w:rPr>
         <w:t>(</w:t>
       </w:r>
-      <w:proofErr w:type="gramEnd"/>
       <w:r>
         <w:rPr>
           <w:rFonts w:ascii="Consolas" w:hAnsi="Consolas" w:cs="Courier New"/>
@@ -4993,7 +4856,6 @@
         </w:rPr>
         <w:t xml:space="preserve"> </w:t>
       </w:r>
-      <w:proofErr w:type="gramStart"/>
       <w:r>
         <w:rPr>
           <w:rFonts w:ascii="Consolas" w:hAnsi="Consolas" w:cs="Courier New"/>
@@ -5021,7 +4883,6 @@
         </w:rPr>
         <w:t>...</w:t>
       </w:r>
-      <w:proofErr w:type="gramEnd"/>
       <w:r>
         <w:rPr>
           <w:rFonts w:ascii="Consolas" w:hAnsi="Consolas" w:cs="Courier New"/>
@@ -5176,7 +5037,6 @@
         </w:rPr>
         <w:t xml:space="preserve"> </w:t>
       </w:r>
-      <w:proofErr w:type="gramStart"/>
       <w:r>
         <w:rPr>
           <w:rFonts w:ascii="Consolas" w:hAnsi="Consolas" w:cs="Courier New"/>
@@ -5195,7 +5055,6 @@
         </w:rPr>
         <w:t>(</w:t>
       </w:r>
-      <w:proofErr w:type="gramEnd"/>
       <w:r>
         <w:rPr>
           <w:rFonts w:ascii="Consolas" w:hAnsi="Consolas" w:cs="Courier New"/>
@@ -5322,7 +5181,6 @@
         </w:rPr>
         <w:t xml:space="preserve"> </w:t>
       </w:r>
-      <w:proofErr w:type="gramStart"/>
       <w:r>
         <w:rPr>
           <w:rFonts w:ascii="Consolas" w:hAnsi="Consolas" w:cs="Courier New"/>
@@ -5350,7 +5208,6 @@
         </w:rPr>
         <w:t>...</w:t>
       </w:r>
-      <w:proofErr w:type="gramEnd"/>
       <w:r>
         <w:rPr>
           <w:rFonts w:ascii="Consolas" w:hAnsi="Consolas" w:cs="Courier New"/>
@@ -5411,16 +5268,7 @@
           <w:sz w:val="17"/>
           <w:szCs w:val="17"/>
         </w:rPr>
-        <w:t xml:space="preserve"> </w:t>
-      </w:r>
-      <w:proofErr w:type="gramStart"/>
-      <w:r>
-        <w:rPr>
-          <w:rFonts w:ascii="Consolas" w:hAnsi="Consolas" w:cs="Courier New"/>
-          <w:sz w:val="17"/>
-          <w:szCs w:val="17"/>
-        </w:rPr>
-        <w:t xml:space="preserve">9. </w:t>
+        <w:t xml:space="preserve"> 9. </w:t>
       </w:r>
       <w:r>
         <w:rPr>
@@ -5431,7 +5279,6 @@
         </w:rPr>
         <w:t>}</w:t>
       </w:r>
-      <w:proofErr w:type="gramEnd"/>
     </w:p>
     <w:p>
       <w:r>
@@ -6049,17 +5896,7 @@
           <w:sz w:val="17"/>
           <w:szCs w:val="17"/>
         </w:rPr>
-        <w:t xml:space="preserve"> </w:t>
-      </w:r>
-      <w:proofErr w:type="gramStart"/>
-      <w:r>
-        <w:rPr>
-          <w:rFonts w:ascii="Consolas" w:hAnsi="Consolas" w:cs="Courier New"/>
-          <w:color w:val="000000"/>
-          <w:sz w:val="17"/>
-          <w:szCs w:val="17"/>
-        </w:rPr>
-        <w:t xml:space="preserve">T </w:t>
+        <w:t xml:space="preserve"> T </w:t>
       </w:r>
       <w:r>
         <w:rPr>
@@ -6070,7 +5907,6 @@
         </w:rPr>
         <w:t>:</w:t>
       </w:r>
-      <w:proofErr w:type="gramEnd"/>
       <w:r>
         <w:rPr>
           <w:rFonts w:ascii="Consolas" w:hAnsi="Consolas" w:cs="Courier New"/>
@@ -6140,17 +5976,7 @@
           <w:sz w:val="17"/>
           <w:szCs w:val="17"/>
         </w:rPr>
-        <w:t xml:space="preserve"> </w:t>
-      </w:r>
-      <w:proofErr w:type="gramStart"/>
-      <w:r>
-        <w:rPr>
-          <w:rFonts w:ascii="Consolas" w:hAnsi="Consolas" w:cs="Courier New"/>
-          <w:color w:val="000000"/>
-          <w:sz w:val="17"/>
-          <w:szCs w:val="17"/>
-        </w:rPr>
-        <w:t xml:space="preserve">   </w:t>
+        <w:t xml:space="preserve">    </w:t>
       </w:r>
       <w:r>
         <w:rPr>
@@ -6161,7 +5987,6 @@
         </w:rPr>
         <w:t>{</w:t>
       </w:r>
-      <w:proofErr w:type="gramEnd"/>
     </w:p>
     <w:p>
       <w:pPr>
@@ -6234,7 +6059,6 @@
         <w:t xml:space="preserve"> </w:t>
       </w:r>
       <w:proofErr w:type="spellStart"/>
-      <w:proofErr w:type="gramStart"/>
       <w:r>
         <w:rPr>
           <w:rFonts w:ascii="Consolas" w:hAnsi="Consolas" w:cs="Courier New"/>
@@ -6263,7 +6087,6 @@
         <w:t>Any</w:t>
       </w:r>
       <w:proofErr w:type="spellEnd"/>
-      <w:proofErr w:type="gramEnd"/>
       <w:r>
         <w:rPr>
           <w:rFonts w:ascii="Consolas" w:hAnsi="Consolas" w:cs="Courier New"/>
@@ -6301,7 +6124,6 @@
         <w:t xml:space="preserve"> </w:t>
       </w:r>
       <w:proofErr w:type="spellStart"/>
-      <w:proofErr w:type="gramStart"/>
       <w:r>
         <w:rPr>
           <w:rFonts w:ascii="Consolas" w:hAnsi="Consolas" w:cs="Courier New"/>
@@ -6348,7 +6170,6 @@
         </w:rPr>
         <w:t>!=</w:t>
       </w:r>
-      <w:proofErr w:type="gramEnd"/>
       <w:r>
         <w:rPr>
           <w:rFonts w:ascii="Consolas" w:hAnsi="Consolas" w:cs="Courier New"/>
@@ -6450,7 +6271,6 @@
         <w:t xml:space="preserve">                               </w:t>
       </w:r>
       <w:proofErr w:type="spellStart"/>
-      <w:proofErr w:type="gramStart"/>
       <w:r>
         <w:rPr>
           <w:rFonts w:ascii="Consolas" w:hAnsi="Consolas" w:cs="Courier New"/>
@@ -6479,7 +6299,6 @@
         <w:t>FirstName</w:t>
       </w:r>
       <w:proofErr w:type="spellEnd"/>
-      <w:proofErr w:type="gramEnd"/>
       <w:r>
         <w:rPr>
           <w:rFonts w:ascii="Consolas" w:hAnsi="Consolas" w:cs="Courier New"/>
@@ -6508,7 +6327,6 @@
         <w:t xml:space="preserve"> </w:t>
       </w:r>
       <w:proofErr w:type="spellStart"/>
-      <w:proofErr w:type="gramStart"/>
       <w:r>
         <w:rPr>
           <w:rFonts w:ascii="Consolas" w:hAnsi="Consolas" w:cs="Courier New"/>
@@ -6537,7 +6355,6 @@
         <w:t>FirstName</w:t>
       </w:r>
       <w:proofErr w:type="spellEnd"/>
-      <w:proofErr w:type="gramEnd"/>
       <w:r>
         <w:rPr>
           <w:rFonts w:ascii="Consolas" w:hAnsi="Consolas" w:cs="Courier New"/>
@@ -6619,7 +6436,6 @@
         <w:t xml:space="preserve">                               </w:t>
       </w:r>
       <w:proofErr w:type="spellStart"/>
-      <w:proofErr w:type="gramStart"/>
       <w:r>
         <w:rPr>
           <w:rFonts w:ascii="Consolas" w:hAnsi="Consolas" w:cs="Courier New"/>
@@ -6648,7 +6464,6 @@
         <w:t>LastName</w:t>
       </w:r>
       <w:proofErr w:type="spellEnd"/>
-      <w:proofErr w:type="gramEnd"/>
       <w:r>
         <w:rPr>
           <w:rFonts w:ascii="Consolas" w:hAnsi="Consolas" w:cs="Courier New"/>
@@ -6677,7 +6492,6 @@
         <w:t xml:space="preserve"> </w:t>
       </w:r>
       <w:proofErr w:type="spellStart"/>
-      <w:proofErr w:type="gramStart"/>
       <w:r>
         <w:rPr>
           <w:rFonts w:ascii="Consolas" w:hAnsi="Consolas" w:cs="Courier New"/>
@@ -6706,7 +6520,6 @@
         <w:t>LastName</w:t>
       </w:r>
       <w:proofErr w:type="spellEnd"/>
-      <w:proofErr w:type="gramEnd"/>
       <w:r>
         <w:rPr>
           <w:rFonts w:ascii="Consolas" w:hAnsi="Consolas" w:cs="Courier New"/>
@@ -6767,17 +6580,7 @@
           <w:sz w:val="17"/>
           <w:szCs w:val="17"/>
         </w:rPr>
-        <w:t xml:space="preserve">  </w:t>
-      </w:r>
-      <w:proofErr w:type="gramStart"/>
-      <w:r>
-        <w:rPr>
-          <w:rFonts w:ascii="Consolas" w:hAnsi="Consolas" w:cs="Courier New"/>
-          <w:color w:val="000000"/>
-          <w:sz w:val="17"/>
-          <w:szCs w:val="17"/>
-        </w:rPr>
-        <w:t xml:space="preserve">  </w:t>
+        <w:t xml:space="preserve">    </w:t>
       </w:r>
       <w:r>
         <w:rPr>
@@ -6788,7 +6591,6 @@
         </w:rPr>
         <w:t>}</w:t>
       </w:r>
-      <w:proofErr w:type="gramEnd"/>
     </w:p>
     <w:p>
       <w:pPr>
@@ -6825,7 +6627,6 @@
           <w:szCs w:val="17"/>
         </w:rPr>
       </w:pPr>
-      <w:proofErr w:type="gramStart"/>
       <w:r>
         <w:rPr>
           <w:rFonts w:ascii="Consolas" w:hAnsi="Consolas" w:cs="Courier New"/>
@@ -6843,7 +6644,6 @@
         </w:rPr>
         <w:t>}</w:t>
       </w:r>
-      <w:proofErr w:type="gramEnd"/>
     </w:p>
     <w:p>
       <w:pPr>
@@ -7062,7 +6862,6 @@
         <w:t xml:space="preserve"> </w:t>
       </w:r>
       <w:proofErr w:type="spellStart"/>
-      <w:proofErr w:type="gramStart"/>
       <w:r>
         <w:rPr>
           <w:rFonts w:ascii="Consolas" w:hAnsi="Consolas" w:cs="Courier New"/>
@@ -7082,7 +6881,6 @@
         </w:rPr>
         <w:t>(</w:t>
       </w:r>
-      <w:proofErr w:type="gramEnd"/>
       <w:r>
         <w:rPr>
           <w:rFonts w:ascii="Consolas" w:hAnsi="Consolas" w:cs="Courier New"/>
@@ -7220,7 +7018,6 @@
         </w:rPr>
         <w:t xml:space="preserve"> </w:t>
       </w:r>
-      <w:proofErr w:type="gramStart"/>
       <w:r>
         <w:rPr>
           <w:rFonts w:ascii="Consolas" w:hAnsi="Consolas" w:cs="Courier New"/>
@@ -7248,7 +7045,6 @@
         </w:rPr>
         <w:t>...</w:t>
       </w:r>
-      <w:proofErr w:type="gramEnd"/>
       <w:r>
         <w:rPr>
           <w:rFonts w:ascii="Consolas" w:hAnsi="Consolas" w:cs="Courier New"/>
@@ -7483,7 +7279,6 @@
         <w:t xml:space="preserve"> </w:t>
       </w:r>
       <w:proofErr w:type="spellStart"/>
-      <w:proofErr w:type="gramStart"/>
       <w:r>
         <w:rPr>
           <w:rFonts w:ascii="Consolas" w:hAnsi="Consolas" w:cs="Courier New"/>
@@ -7503,7 +7298,6 @@
         </w:rPr>
         <w:t>(</w:t>
       </w:r>
-      <w:proofErr w:type="gramEnd"/>
       <w:r>
         <w:rPr>
           <w:rFonts w:ascii="Consolas" w:hAnsi="Consolas" w:cs="Courier New"/>
@@ -7641,7 +7435,6 @@
         </w:rPr>
         <w:t xml:space="preserve"> </w:t>
       </w:r>
-      <w:proofErr w:type="gramStart"/>
       <w:r>
         <w:rPr>
           <w:rFonts w:ascii="Consolas" w:hAnsi="Consolas" w:cs="Courier New"/>
@@ -7669,7 +7462,6 @@
         </w:rPr>
         <w:t>...</w:t>
       </w:r>
-      <w:proofErr w:type="gramEnd"/>
       <w:r>
         <w:rPr>
           <w:rFonts w:ascii="Consolas" w:hAnsi="Consolas" w:cs="Courier New"/>
@@ -8183,7 +7975,6 @@
         <w:t>(</w:t>
       </w:r>
       <w:proofErr w:type="spellStart"/>
-      <w:proofErr w:type="gramStart"/>
       <w:r>
         <w:rPr>
           <w:rFonts w:ascii="Consolas" w:hAnsi="Consolas" w:cs="Courier New"/>
@@ -8212,7 +8003,6 @@
         <w:t>IsNullOrWhiteSpace</w:t>
       </w:r>
       <w:proofErr w:type="spellEnd"/>
-      <w:proofErr w:type="gramEnd"/>
       <w:r>
         <w:rPr>
           <w:rFonts w:ascii="Consolas" w:hAnsi="Consolas" w:cs="Courier New"/>
@@ -8358,25 +8148,14 @@
         </w:rPr>
         <w:t>T</w:t>
       </w:r>
-      <w:proofErr w:type="gramStart"/>
-      <w:r>
-        <w:rPr>
-          <w:rFonts w:ascii="Consolas" w:hAnsi="Consolas" w:cs="Courier New"/>
-          <w:color w:val="666600"/>
-          <w:sz w:val="17"/>
-          <w:szCs w:val="17"/>
-        </w:rPr>
-        <w:t>&gt;(</w:t>
-      </w:r>
-      <w:proofErr w:type="gramEnd"/>
-      <w:r>
-        <w:rPr>
-          <w:rFonts w:ascii="Consolas" w:hAnsi="Consolas" w:cs="Courier New"/>
-          <w:color w:val="666600"/>
-          <w:sz w:val="17"/>
-          <w:szCs w:val="17"/>
-        </w:rPr>
-        <w:t>);</w:t>
+      <w:r>
+        <w:rPr>
+          <w:rFonts w:ascii="Consolas" w:hAnsi="Consolas" w:cs="Courier New"/>
+          <w:color w:val="666600"/>
+          <w:sz w:val="17"/>
+          <w:szCs w:val="17"/>
+        </w:rPr>
+        <w:t>&gt;();</w:t>
       </w:r>
     </w:p>
     <w:p>
@@ -8503,7 +8282,6 @@
         <w:t xml:space="preserve"> </w:t>
       </w:r>
       <w:proofErr w:type="spellStart"/>
-      <w:proofErr w:type="gramStart"/>
       <w:r>
         <w:rPr>
           <w:rFonts w:ascii="Consolas" w:hAnsi="Consolas" w:cs="Courier New"/>
@@ -8532,7 +8310,6 @@
         <w:t>Where</w:t>
       </w:r>
       <w:proofErr w:type="spellEnd"/>
-      <w:proofErr w:type="gramEnd"/>
       <w:r>
         <w:rPr>
           <w:rFonts w:ascii="Consolas" w:hAnsi="Consolas" w:cs="Courier New"/>
@@ -8611,17 +8388,7 @@
           <w:sz w:val="17"/>
           <w:szCs w:val="17"/>
         </w:rPr>
-        <w:t xml:space="preserve"> </w:t>
-      </w:r>
-      <w:proofErr w:type="gramStart"/>
-      <w:r>
-        <w:rPr>
-          <w:rFonts w:ascii="Consolas" w:hAnsi="Consolas" w:cs="Courier New"/>
-          <w:color w:val="000000"/>
-          <w:sz w:val="17"/>
-          <w:szCs w:val="17"/>
-        </w:rPr>
-        <w:t xml:space="preserve">   </w:t>
+        <w:t xml:space="preserve">    </w:t>
       </w:r>
       <w:r>
         <w:rPr>
@@ -8632,7 +8399,6 @@
         </w:rPr>
         <w:t>{</w:t>
       </w:r>
-      <w:proofErr w:type="gramEnd"/>
     </w:p>
     <w:p>
       <w:pPr>
@@ -9973,35 +9739,7 @@
         <w:rPr>
           <w:strike/>
         </w:rPr>
-        <w:t xml:space="preserve"> </w:t>
-      </w:r>
-      <w:proofErr w:type="gramStart"/>
-      <w:r>
-        <w:rPr>
-          <w:strike/>
-        </w:rPr>
-        <w:t>{ get</w:t>
-      </w:r>
-      <w:proofErr w:type="gramEnd"/>
-      <w:r>
-        <w:rPr>
-          <w:strike/>
-        </w:rPr>
-        <w:t>; private set</w:t>
-      </w:r>
-      <w:proofErr w:type="gramStart"/>
-      <w:r>
-        <w:rPr>
-          <w:strike/>
-        </w:rPr>
-        <w:t>; }</w:t>
-      </w:r>
-      <w:proofErr w:type="gramEnd"/>
-      <w:r>
-        <w:rPr>
-          <w:strike/>
-        </w:rPr>
-        <w:t>.</w:t>
+        <w:t xml:space="preserve"> { get; private set; }.</w:t>
       </w:r>
     </w:p>
     <w:p>
@@ -22148,98 +21886,10 @@
     </w:tbl>
     <w:p/>
     <w:p/>
-    <w:p>
-      <w:pPr>
-        <w:pBdr>
-          <w:bottom w:val="double" w:sz="6" w:space="1" w:color="auto"/>
-        </w:pBdr>
-      </w:pPr>
-    </w:p>
-    <w:p>
-      <w:r>
-        <w:rPr>
-          <w:b/>
-          <w:bCs/>
-        </w:rPr>
-        <w:t>Example in </w:t>
-      </w:r>
-      <w:proofErr w:type="spellStart"/>
-      <w:r>
-        <w:t>MainMenu.cs</w:t>
-      </w:r>
-      <w:proofErr w:type="spellEnd"/>
-      <w:r>
-        <w:rPr>
-          <w:b/>
-          <w:bCs/>
-        </w:rPr>
-        <w:t>:</w:t>
-      </w:r>
-    </w:p>
-    <w:p>
-      <w:proofErr w:type="spellStart"/>
-      <w:r>
-        <w:t>csharp</w:t>
-      </w:r>
-      <w:proofErr w:type="spellEnd"/>
-    </w:p>
-    <w:p>
-      <w:r>
-        <w:t xml:space="preserve">public static void </w:t>
-      </w:r>
-      <w:proofErr w:type="spellStart"/>
-      <w:proofErr w:type="gramStart"/>
-      <w:r>
-        <w:t>MainMenuController</w:t>
-      </w:r>
-      <w:proofErr w:type="spellEnd"/>
-      <w:r>
-        <w:t>(</w:t>
-      </w:r>
-      <w:proofErr w:type="spellStart"/>
-      <w:proofErr w:type="gramEnd"/>
-      <w:r>
-        <w:t>AuthenticationService</w:t>
-      </w:r>
-      <w:proofErr w:type="spellEnd"/>
-      <w:r>
-        <w:t xml:space="preserve"> </w:t>
-      </w:r>
-      <w:proofErr w:type="spellStart"/>
-      <w:r>
-        <w:t>authService</w:t>
-      </w:r>
-      <w:proofErr w:type="spellEnd"/>
-      <w:r>
-        <w:t>, ...)</w:t>
-      </w:r>
-    </w:p>
-    <w:p>
-      <w:r>
-        <w:t>{</w:t>
-      </w:r>
-    </w:p>
-    <w:p>
-      <w:r>
-        <w:t xml:space="preserve">    if </w:t>
-      </w:r>
-      <w:proofErr w:type="gramStart"/>
-      <w:r>
-        <w:t>(!</w:t>
-      </w:r>
-      <w:proofErr w:type="spellStart"/>
-      <w:r>
-        <w:t>authService.IsAuthenticated</w:t>
-      </w:r>
-      <w:proofErr w:type="spellEnd"/>
-      <w:proofErr w:type="gramEnd"/>
-      <w:r>
-        <w:t>())</w:t>
-      </w:r>
-    </w:p>
-    <w:p>
-      <w:r>
-        <w:t xml:space="preserve">    {</w:t>
+    <w:p/>
+    <w:p>
+      <w:r>
+        <w:t xml:space="preserve">        // Always show Books and Loans</w:t>
       </w:r>
     </w:p>
     <w:p>
@@ -22248,522 +21898,385 @@
       </w:r>
       <w:proofErr w:type="spellStart"/>
       <w:r>
+        <w:t>Console.WriteLine</w:t>
+      </w:r>
+      <w:proofErr w:type="spellEnd"/>
+      <w:r>
+        <w:t>("1. Books");</w:t>
+      </w:r>
+    </w:p>
+    <w:p>
+      <w:r>
+        <w:t xml:space="preserve">        </w:t>
+      </w:r>
+      <w:proofErr w:type="spellStart"/>
+      <w:r>
+        <w:t>Console.WriteLine</w:t>
+      </w:r>
+      <w:proofErr w:type="spellEnd"/>
+      <w:r>
+        <w:t>("2. Loans");</w:t>
+      </w:r>
+    </w:p>
+    <w:p/>
+    <w:p>
+      <w:r>
+        <w:t xml:space="preserve">        // Only show Authors and Fines to Admins and Managers</w:t>
+      </w:r>
+    </w:p>
+    <w:p>
+      <w:r>
+        <w:t xml:space="preserve">        if (</w:t>
+      </w:r>
+      <w:proofErr w:type="spellStart"/>
+      <w:r>
+        <w:t>authService.HasAnyRole</w:t>
+      </w:r>
+      <w:proofErr w:type="spellEnd"/>
+      <w:r>
+        <w:t>("Admin", "Manager"))</w:t>
+      </w:r>
+    </w:p>
+    <w:p>
+      <w:r>
+        <w:t xml:space="preserve">            </w:t>
+      </w:r>
+      <w:proofErr w:type="spellStart"/>
+      <w:r>
+        <w:t>Console.WriteLine</w:t>
+      </w:r>
+      <w:proofErr w:type="spellEnd"/>
+      <w:r>
+        <w:t>("3. Authors");</w:t>
+      </w:r>
+    </w:p>
+    <w:p/>
+    <w:p>
+      <w:r>
+        <w:t xml:space="preserve">        if (</w:t>
+      </w:r>
+      <w:proofErr w:type="spellStart"/>
+      <w:r>
+        <w:t>authService.HasAnyRole</w:t>
+      </w:r>
+      <w:proofErr w:type="spellEnd"/>
+      <w:r>
+        <w:t>("Admin", "Manager"))</w:t>
+      </w:r>
+    </w:p>
+    <w:p>
+      <w:r>
+        <w:t xml:space="preserve">            </w:t>
+      </w:r>
+      <w:proofErr w:type="spellStart"/>
+      <w:r>
+        <w:t>Console.WriteLine</w:t>
+      </w:r>
+      <w:proofErr w:type="spellEnd"/>
+      <w:r>
+        <w:t>("4. Fines");</w:t>
+      </w:r>
+    </w:p>
+    <w:p/>
+    <w:p>
+      <w:r>
+        <w:t xml:space="preserve">        // Only show User Management to Admins</w:t>
+      </w:r>
+    </w:p>
+    <w:p>
+      <w:r>
+        <w:t xml:space="preserve">        if (</w:t>
+      </w:r>
+      <w:proofErr w:type="spellStart"/>
+      <w:r>
+        <w:t>authService.HasRole</w:t>
+      </w:r>
+      <w:proofErr w:type="spellEnd"/>
+      <w:r>
+        <w:t>("Admin"))</w:t>
+      </w:r>
+    </w:p>
+    <w:p>
+      <w:r>
+        <w:t xml:space="preserve">            </w:t>
+      </w:r>
+      <w:proofErr w:type="spellStart"/>
+      <w:r>
+        <w:t>Console.WriteLine</w:t>
+      </w:r>
+      <w:proofErr w:type="spellEnd"/>
+      <w:r>
+        <w:t>("5. User Management");</w:t>
+      </w:r>
+    </w:p>
+    <w:p/>
+    <w:p>
+      <w:r>
+        <w:t xml:space="preserve">        // Logout is always shown</w:t>
+      </w:r>
+    </w:p>
+    <w:p>
+      <w:r>
+        <w:t xml:space="preserve">        </w:t>
+      </w:r>
+      <w:proofErr w:type="spellStart"/>
+      <w:r>
+        <w:t>Console.WriteLine</w:t>
+      </w:r>
+      <w:proofErr w:type="spellEnd"/>
+      <w:r>
+        <w:t>("6. Logout");</w:t>
+      </w:r>
+    </w:p>
+    <w:p>
+      <w:r>
+        <w:t xml:space="preserve">        </w:t>
+      </w:r>
+      <w:proofErr w:type="spellStart"/>
+      <w:r>
+        <w:t>Console.WriteLine</w:t>
+      </w:r>
+      <w:proofErr w:type="spellEnd"/>
+      <w:r>
+        <w:t>("7. Exit");</w:t>
+      </w:r>
+    </w:p>
+    <w:p>
+      <w:r>
+        <w:lastRenderedPageBreak/>
+        <w:t xml:space="preserve">        Console.WriteLine("==================================================================");</w:t>
+      </w:r>
+    </w:p>
+    <w:p>
+      <w:r>
+        <w:t xml:space="preserve">        </w:t>
+      </w:r>
+      <w:proofErr w:type="spellStart"/>
+      <w:r>
+        <w:t>Console.Write</w:t>
+      </w:r>
+      <w:proofErr w:type="spellEnd"/>
+      <w:r>
+        <w:t>("Please Enter a number: ");</w:t>
+      </w:r>
+    </w:p>
+    <w:p/>
+    <w:p>
+      <w:r>
+        <w:t xml:space="preserve">        var option = </w:t>
+      </w:r>
+      <w:proofErr w:type="spellStart"/>
+      <w:r>
+        <w:t>Console.ReadLine</w:t>
+      </w:r>
+      <w:proofErr w:type="spellEnd"/>
+      <w:r>
+        <w:t>();</w:t>
+      </w:r>
+    </w:p>
+    <w:p>
+      <w:r>
+        <w:t xml:space="preserve">        if (!</w:t>
+      </w:r>
+      <w:proofErr w:type="spellStart"/>
+      <w:r>
+        <w:t>int.TryParse</w:t>
+      </w:r>
+      <w:proofErr w:type="spellEnd"/>
+      <w:r>
+        <w:t>(option, out var result)) continue;</w:t>
+      </w:r>
+    </w:p>
+    <w:p/>
+    <w:p>
+      <w:r>
+        <w:t xml:space="preserve">        // Map the display numbers to actual options</w:t>
+      </w:r>
+    </w:p>
+    <w:p>
+      <w:r>
+        <w:t xml:space="preserve">        switch (result)</w:t>
+      </w:r>
+    </w:p>
+    <w:p>
+      <w:r>
+        <w:t xml:space="preserve">        {</w:t>
+      </w:r>
+    </w:p>
+    <w:p>
+      <w:r>
+        <w:t xml:space="preserve">            case 1: </w:t>
+      </w:r>
+      <w:proofErr w:type="spellStart"/>
+      <w:r>
+        <w:t>BookMenu.BookMenuController</w:t>
+      </w:r>
+      <w:proofErr w:type="spellEnd"/>
+      <w:r>
+        <w:t>(...); break;</w:t>
+      </w:r>
+    </w:p>
+    <w:p>
+      <w:r>
+        <w:t xml:space="preserve">            case 2: </w:t>
+      </w:r>
+      <w:proofErr w:type="spellStart"/>
+      <w:r>
+        <w:t>LoanMenu.LoanMenuController</w:t>
+      </w:r>
+      <w:proofErr w:type="spellEnd"/>
+      <w:r>
+        <w:t>(...); break;</w:t>
+      </w:r>
+    </w:p>
+    <w:p>
+      <w:r>
+        <w:t xml:space="preserve">            case 3 when </w:t>
+      </w:r>
+      <w:proofErr w:type="spellStart"/>
+      <w:r>
+        <w:t>authService.HasAnyRole</w:t>
+      </w:r>
+      <w:proofErr w:type="spellEnd"/>
+      <w:r>
+        <w:t xml:space="preserve">("Admin", "Manager"): </w:t>
+      </w:r>
+      <w:proofErr w:type="spellStart"/>
+      <w:r>
+        <w:t>AuthorMenu.AuthorMenuController</w:t>
+      </w:r>
+      <w:proofErr w:type="spellEnd"/>
+      <w:r>
+        <w:t>(...); break;</w:t>
+      </w:r>
+    </w:p>
+    <w:p>
+      <w:r>
+        <w:t xml:space="preserve">            case 4 when </w:t>
+      </w:r>
+      <w:proofErr w:type="spellStart"/>
+      <w:r>
+        <w:t>authService.HasAnyRole</w:t>
+      </w:r>
+      <w:proofErr w:type="spellEnd"/>
+      <w:r>
+        <w:t xml:space="preserve">("Admin", "Manager"): </w:t>
+      </w:r>
+      <w:proofErr w:type="spellStart"/>
+      <w:r>
+        <w:t>FineMenu.FineMenuController</w:t>
+      </w:r>
+      <w:proofErr w:type="spellEnd"/>
+      <w:r>
+        <w:t>(...); break;</w:t>
+      </w:r>
+    </w:p>
+    <w:p>
+      <w:r>
+        <w:t xml:space="preserve">            case 5 when </w:t>
+      </w:r>
+      <w:proofErr w:type="spellStart"/>
+      <w:r>
+        <w:t>authService.HasRole</w:t>
+      </w:r>
+      <w:proofErr w:type="spellEnd"/>
+      <w:r>
+        <w:t xml:space="preserve">("Admin"): </w:t>
+      </w:r>
+      <w:proofErr w:type="spellStart"/>
+      <w:r>
+        <w:t>UserMenu.UserMenuController</w:t>
+      </w:r>
+      <w:proofErr w:type="spellEnd"/>
+      <w:r>
+        <w:t>(...); break;</w:t>
+      </w:r>
+    </w:p>
+    <w:p>
+      <w:r>
+        <w:t xml:space="preserve">            case 6: </w:t>
+      </w:r>
+    </w:p>
+    <w:p>
+      <w:r>
+        <w:t xml:space="preserve">                </w:t>
+      </w:r>
+      <w:proofErr w:type="spellStart"/>
+      <w:r>
+        <w:t>authService.Logout</w:t>
+      </w:r>
+      <w:proofErr w:type="spellEnd"/>
+      <w:r>
+        <w:t>();</w:t>
+      </w:r>
+    </w:p>
+    <w:p>
+      <w:r>
+        <w:t xml:space="preserve">                // Return to login screen</w:t>
+      </w:r>
+    </w:p>
+    <w:p>
+      <w:r>
+        <w:t xml:space="preserve">                </w:t>
+      </w:r>
+      <w:proofErr w:type="spellStart"/>
+      <w:r>
+        <w:t>continueProgram</w:t>
+      </w:r>
+      <w:proofErr w:type="spellEnd"/>
+      <w:r>
+        <w:t xml:space="preserve"> = false; </w:t>
+      </w:r>
+    </w:p>
+    <w:p>
+      <w:r>
+        <w:t xml:space="preserve">                break;</w:t>
+      </w:r>
+    </w:p>
+    <w:p>
+      <w:r>
+        <w:t xml:space="preserve">            case 7: </w:t>
+      </w:r>
+      <w:proofErr w:type="spellStart"/>
+      <w:r>
+        <w:t>continueProgram</w:t>
+      </w:r>
+      <w:proofErr w:type="spellEnd"/>
+      <w:r>
+        <w:t xml:space="preserve"> = false; break;</w:t>
+      </w:r>
+    </w:p>
+    <w:p>
+      <w:r>
+        <w:t xml:space="preserve">            default: </w:t>
+      </w:r>
+    </w:p>
+    <w:p>
+      <w:r>
+        <w:t xml:space="preserve">                </w:t>
+      </w:r>
+      <w:proofErr w:type="spellStart"/>
+      <w:r>
         <w:t>ConsoleHelper.ShowError</w:t>
       </w:r>
       <w:proofErr w:type="spellEnd"/>
       <w:r>
-        <w:t>("You are not logged in.");</w:t>
-      </w:r>
-    </w:p>
-    <w:p>
-      <w:r>
-        <w:t xml:space="preserve">        return;</w:t>
-      </w:r>
-    </w:p>
-    <w:p>
-      <w:r>
-        <w:t xml:space="preserve">    }</w:t>
-      </w:r>
-    </w:p>
-    <w:p/>
-    <w:p>
-      <w:r>
-        <w:t xml:space="preserve">    var </w:t>
-      </w:r>
-      <w:proofErr w:type="spellStart"/>
-      <w:r>
-        <w:t>continueProgram</w:t>
-      </w:r>
-      <w:proofErr w:type="spellEnd"/>
-      <w:r>
-        <w:t xml:space="preserve"> = true;</w:t>
-      </w:r>
-    </w:p>
-    <w:p>
-      <w:r>
-        <w:t xml:space="preserve">    while (</w:t>
-      </w:r>
-      <w:proofErr w:type="spellStart"/>
-      <w:r>
-        <w:t>continueProgram</w:t>
-      </w:r>
-      <w:proofErr w:type="spellEnd"/>
-      <w:r>
-        <w:t>)</w:t>
-      </w:r>
-    </w:p>
-    <w:p>
-      <w:r>
-        <w:t xml:space="preserve">    {</w:t>
-      </w:r>
-    </w:p>
-    <w:p>
-      <w:r>
-        <w:t xml:space="preserve">        </w:t>
-      </w:r>
-      <w:proofErr w:type="spellStart"/>
-      <w:r>
-        <w:t>Console.Clear</w:t>
-      </w:r>
-      <w:proofErr w:type="spellEnd"/>
-      <w:r>
-        <w:t>();</w:t>
-      </w:r>
-    </w:p>
-    <w:p>
-      <w:r>
-        <w:t xml:space="preserve">        </w:t>
-      </w:r>
-      <w:proofErr w:type="spellStart"/>
-      <w:r>
-        <w:t>Console.WriteLine</w:t>
-      </w:r>
-      <w:proofErr w:type="spellEnd"/>
-      <w:r>
-        <w:t>("============================ MAIN MENU ============================");</w:t>
-      </w:r>
-    </w:p>
-    <w:p>
-      <w:r>
-        <w:t xml:space="preserve">        </w:t>
-      </w:r>
-      <w:proofErr w:type="spellStart"/>
-      <w:r>
-        <w:t>Console.WriteLine</w:t>
-      </w:r>
-      <w:proofErr w:type="spellEnd"/>
-      <w:r>
-        <w:t>($"Welcome, {</w:t>
-      </w:r>
-      <w:proofErr w:type="spellStart"/>
-      <w:r>
-        <w:t>authService.GetCurrentUser</w:t>
-      </w:r>
-      <w:proofErr w:type="spellEnd"/>
-      <w:r>
-        <w:t>(</w:t>
-      </w:r>
-      <w:proofErr w:type="gramStart"/>
-      <w:r>
-        <w:t>)?.</w:t>
-      </w:r>
-      <w:proofErr w:type="spellStart"/>
-      <w:proofErr w:type="gramEnd"/>
-      <w:r>
-        <w:t>FullName</w:t>
-      </w:r>
-      <w:proofErr w:type="spellEnd"/>
-      <w:r>
-        <w:t>}");</w:t>
-      </w:r>
-    </w:p>
-    <w:p/>
-    <w:p>
-      <w:r>
-        <w:t xml:space="preserve">        // Always show Books and Loans</w:t>
+        <w:t>("Invalid selection or insufficient permissions.");</w:t>
+      </w:r>
+    </w:p>
+    <w:p>
+      <w:r>
+        <w:t xml:space="preserve">                break;</w:t>
+      </w:r>
+    </w:p>
+    <w:p>
+      <w:r>
+        <w:t xml:space="preserve">        }</w:t>
       </w:r>
     </w:p>
     <w:p>
       <w:r>
         <w:lastRenderedPageBreak/>
-        <w:t xml:space="preserve">        </w:t>
-      </w:r>
-      <w:proofErr w:type="spellStart"/>
-      <w:r>
-        <w:t>Console.WriteLine</w:t>
-      </w:r>
-      <w:proofErr w:type="spellEnd"/>
-      <w:r>
-        <w:t>("1. Books");</w:t>
-      </w:r>
-    </w:p>
-    <w:p>
-      <w:r>
-        <w:t xml:space="preserve">        </w:t>
-      </w:r>
-      <w:proofErr w:type="spellStart"/>
-      <w:r>
-        <w:t>Console.WriteLine</w:t>
-      </w:r>
-      <w:proofErr w:type="spellEnd"/>
-      <w:r>
-        <w:t>("2. Loans");</w:t>
-      </w:r>
-    </w:p>
-    <w:p/>
-    <w:p>
-      <w:r>
-        <w:t xml:space="preserve">        // Only show Authors and Fines to Admins and Managers</w:t>
-      </w:r>
-    </w:p>
-    <w:p>
-      <w:r>
-        <w:t xml:space="preserve">        if (</w:t>
-      </w:r>
-      <w:proofErr w:type="spellStart"/>
-      <w:r>
-        <w:t>authService.HasAnyRole</w:t>
-      </w:r>
-      <w:proofErr w:type="spellEnd"/>
-      <w:r>
-        <w:t>("Admin", "Manager"))</w:t>
-      </w:r>
-    </w:p>
-    <w:p>
-      <w:r>
-        <w:t xml:space="preserve">            </w:t>
-      </w:r>
-      <w:proofErr w:type="spellStart"/>
-      <w:r>
-        <w:t>Console.WriteLine</w:t>
-      </w:r>
-      <w:proofErr w:type="spellEnd"/>
-      <w:r>
-        <w:t>("3. Authors");</w:t>
-      </w:r>
-    </w:p>
-    <w:p/>
-    <w:p>
-      <w:r>
-        <w:t xml:space="preserve">        if (</w:t>
-      </w:r>
-      <w:proofErr w:type="spellStart"/>
-      <w:r>
-        <w:t>authService.HasAnyRole</w:t>
-      </w:r>
-      <w:proofErr w:type="spellEnd"/>
-      <w:r>
-        <w:t>("Admin", "Manager"))</w:t>
-      </w:r>
-    </w:p>
-    <w:p>
-      <w:r>
-        <w:t xml:space="preserve">            </w:t>
-      </w:r>
-      <w:proofErr w:type="spellStart"/>
-      <w:r>
-        <w:t>Console.WriteLine</w:t>
-      </w:r>
-      <w:proofErr w:type="spellEnd"/>
-      <w:r>
-        <w:t>("4. Fines");</w:t>
-      </w:r>
-    </w:p>
-    <w:p/>
-    <w:p>
-      <w:r>
-        <w:t xml:space="preserve">        // Only show User Management to Admins</w:t>
-      </w:r>
-    </w:p>
-    <w:p>
-      <w:r>
-        <w:t xml:space="preserve">        if (</w:t>
-      </w:r>
-      <w:proofErr w:type="spellStart"/>
-      <w:r>
-        <w:t>authService.HasRole</w:t>
-      </w:r>
-      <w:proofErr w:type="spellEnd"/>
-      <w:r>
-        <w:t>("Admin"))</w:t>
-      </w:r>
-    </w:p>
-    <w:p>
-      <w:r>
-        <w:t xml:space="preserve">            </w:t>
-      </w:r>
-      <w:proofErr w:type="spellStart"/>
-      <w:r>
-        <w:t>Console.WriteLine</w:t>
-      </w:r>
-      <w:proofErr w:type="spellEnd"/>
-      <w:r>
-        <w:t>("5. User Management");</w:t>
-      </w:r>
-    </w:p>
-    <w:p/>
-    <w:p>
-      <w:r>
-        <w:t xml:space="preserve">        // Logout is always shown</w:t>
-      </w:r>
-    </w:p>
-    <w:p>
-      <w:r>
-        <w:t xml:space="preserve">        </w:t>
-      </w:r>
-      <w:proofErr w:type="spellStart"/>
-      <w:r>
-        <w:t>Console.WriteLine</w:t>
-      </w:r>
-      <w:proofErr w:type="spellEnd"/>
-      <w:r>
-        <w:t>("6. Logout");</w:t>
-      </w:r>
-    </w:p>
-    <w:p>
-      <w:r>
-        <w:t xml:space="preserve">        </w:t>
-      </w:r>
-      <w:proofErr w:type="spellStart"/>
-      <w:r>
-        <w:t>Console.WriteLine</w:t>
-      </w:r>
-      <w:proofErr w:type="spellEnd"/>
-      <w:r>
-        <w:t>("7. Exit");</w:t>
-      </w:r>
-    </w:p>
-    <w:p>
-      <w:r>
-        <w:t xml:space="preserve">        Console.WriteLine("==================================================================");</w:t>
-      </w:r>
-    </w:p>
-    <w:p>
-      <w:r>
-        <w:t xml:space="preserve">        </w:t>
-      </w:r>
-      <w:proofErr w:type="spellStart"/>
-      <w:r>
-        <w:t>Console.Write</w:t>
-      </w:r>
-      <w:proofErr w:type="spellEnd"/>
-      <w:r>
-        <w:t>("Please Enter a number: ");</w:t>
-      </w:r>
-    </w:p>
-    <w:p/>
-    <w:p>
-      <w:r>
-        <w:t xml:space="preserve">        var option = </w:t>
-      </w:r>
-      <w:proofErr w:type="spellStart"/>
-      <w:r>
-        <w:t>Console.ReadLine</w:t>
-      </w:r>
-      <w:proofErr w:type="spellEnd"/>
-      <w:r>
-        <w:t>();</w:t>
-      </w:r>
-    </w:p>
-    <w:p>
-      <w:r>
-        <w:t xml:space="preserve">        if </w:t>
-      </w:r>
-      <w:proofErr w:type="gramStart"/>
-      <w:r>
-        <w:t>(!</w:t>
-      </w:r>
-      <w:proofErr w:type="spellStart"/>
-      <w:r>
-        <w:t>int</w:t>
-      </w:r>
-      <w:proofErr w:type="gramEnd"/>
-      <w:r>
-        <w:t>.</w:t>
-      </w:r>
-      <w:proofErr w:type="gramStart"/>
-      <w:r>
-        <w:t>TryParse</w:t>
-      </w:r>
-      <w:proofErr w:type="spellEnd"/>
-      <w:r>
-        <w:t>(</w:t>
-      </w:r>
-      <w:proofErr w:type="gramEnd"/>
-      <w:r>
-        <w:t>option, out var result)) continue;</w:t>
-      </w:r>
-    </w:p>
-    <w:p/>
-    <w:p>
-      <w:r>
-        <w:t xml:space="preserve">        // Map the display numbers to actual options</w:t>
-      </w:r>
-    </w:p>
-    <w:p>
-      <w:r>
-        <w:t xml:space="preserve">        switch (result)</w:t>
-      </w:r>
-    </w:p>
-    <w:p>
-      <w:r>
-        <w:t xml:space="preserve">        {</w:t>
-      </w:r>
-    </w:p>
-    <w:p>
-      <w:r>
-        <w:lastRenderedPageBreak/>
-        <w:t xml:space="preserve">            case 1: </w:t>
-      </w:r>
-      <w:proofErr w:type="spellStart"/>
-      <w:r>
-        <w:t>BookMenu.BookMenuController</w:t>
-      </w:r>
-      <w:proofErr w:type="spellEnd"/>
-      <w:r>
-        <w:t>(...); break;</w:t>
-      </w:r>
-    </w:p>
-    <w:p>
-      <w:r>
-        <w:t xml:space="preserve">            case 2: </w:t>
-      </w:r>
-      <w:proofErr w:type="spellStart"/>
-      <w:r>
-        <w:t>LoanMenu.LoanMenuController</w:t>
-      </w:r>
-      <w:proofErr w:type="spellEnd"/>
-      <w:r>
-        <w:t>(...); break;</w:t>
-      </w:r>
-    </w:p>
-    <w:p>
-      <w:r>
-        <w:t xml:space="preserve">            case 3 when </w:t>
-      </w:r>
-      <w:proofErr w:type="spellStart"/>
-      <w:r>
-        <w:t>authService.HasAnyRole</w:t>
-      </w:r>
-      <w:proofErr w:type="spellEnd"/>
-      <w:r>
-        <w:t xml:space="preserve">("Admin", "Manager"): </w:t>
-      </w:r>
-      <w:proofErr w:type="spellStart"/>
-      <w:r>
-        <w:t>AuthorMenu.AuthorMenuController</w:t>
-      </w:r>
-      <w:proofErr w:type="spellEnd"/>
-      <w:r>
-        <w:t>(...); break;</w:t>
-      </w:r>
-    </w:p>
-    <w:p>
-      <w:r>
-        <w:t xml:space="preserve">            case 4 when </w:t>
-      </w:r>
-      <w:proofErr w:type="spellStart"/>
-      <w:r>
-        <w:t>authService.HasAnyRole</w:t>
-      </w:r>
-      <w:proofErr w:type="spellEnd"/>
-      <w:r>
-        <w:t xml:space="preserve">("Admin", "Manager"): </w:t>
-      </w:r>
-      <w:proofErr w:type="spellStart"/>
-      <w:r>
-        <w:t>FineMenu.FineMenuController</w:t>
-      </w:r>
-      <w:proofErr w:type="spellEnd"/>
-      <w:r>
-        <w:t>(...); break;</w:t>
-      </w:r>
-    </w:p>
-    <w:p>
-      <w:r>
-        <w:t xml:space="preserve">            case 5 when </w:t>
-      </w:r>
-      <w:proofErr w:type="spellStart"/>
-      <w:r>
-        <w:t>authService.HasRole</w:t>
-      </w:r>
-      <w:proofErr w:type="spellEnd"/>
-      <w:r>
-        <w:t xml:space="preserve">("Admin"): </w:t>
-      </w:r>
-      <w:proofErr w:type="spellStart"/>
-      <w:r>
-        <w:t>UserMenu.UserMenuController</w:t>
-      </w:r>
-      <w:proofErr w:type="spellEnd"/>
-      <w:r>
-        <w:t>(...); break;</w:t>
-      </w:r>
-    </w:p>
-    <w:p>
-      <w:r>
-        <w:t xml:space="preserve">            case 6: </w:t>
-      </w:r>
-    </w:p>
-    <w:p>
-      <w:r>
-        <w:t xml:space="preserve">                </w:t>
-      </w:r>
-      <w:proofErr w:type="spellStart"/>
-      <w:r>
-        <w:t>authService.Logout</w:t>
-      </w:r>
-      <w:proofErr w:type="spellEnd"/>
-      <w:r>
-        <w:t>();</w:t>
-      </w:r>
-    </w:p>
-    <w:p>
-      <w:r>
-        <w:t xml:space="preserve">                // Return to login screen</w:t>
-      </w:r>
-    </w:p>
-    <w:p>
-      <w:r>
-        <w:t xml:space="preserve">                </w:t>
-      </w:r>
-      <w:proofErr w:type="spellStart"/>
-      <w:r>
-        <w:t>continueProgram</w:t>
-      </w:r>
-      <w:proofErr w:type="spellEnd"/>
-      <w:r>
-        <w:t xml:space="preserve"> = false; </w:t>
-      </w:r>
-    </w:p>
-    <w:p>
-      <w:r>
-        <w:t xml:space="preserve">                break;</w:t>
-      </w:r>
-    </w:p>
-    <w:p>
-      <w:r>
-        <w:t xml:space="preserve">            case 7: </w:t>
-      </w:r>
-      <w:proofErr w:type="spellStart"/>
-      <w:r>
-        <w:t>continueProgram</w:t>
-      </w:r>
-      <w:proofErr w:type="spellEnd"/>
-      <w:r>
-        <w:t xml:space="preserve"> = false; break;</w:t>
-      </w:r>
-    </w:p>
-    <w:p>
-      <w:r>
-        <w:t xml:space="preserve">            default: </w:t>
-      </w:r>
-    </w:p>
-    <w:p>
-      <w:r>
-        <w:t xml:space="preserve">                </w:t>
-      </w:r>
-      <w:proofErr w:type="spellStart"/>
-      <w:r>
-        <w:t>ConsoleHelper.ShowError</w:t>
-      </w:r>
-      <w:proofErr w:type="spellEnd"/>
-      <w:r>
-        <w:t>("Invalid selection or insufficient permissions.");</w:t>
-      </w:r>
-    </w:p>
-    <w:p>
-      <w:r>
-        <w:t xml:space="preserve">                break;</w:t>
-      </w:r>
-    </w:p>
-    <w:p>
-      <w:r>
-        <w:t xml:space="preserve">        }</w:t>
-      </w:r>
-    </w:p>
-    <w:p>
-      <w:r>
         <w:t xml:space="preserve">    }</w:t>
       </w:r>
     </w:p>
@@ -22843,7 +22356,6 @@
         <w:t xml:space="preserve">private static int </w:t>
       </w:r>
       <w:proofErr w:type="spellStart"/>
-      <w:proofErr w:type="gramStart"/>
       <w:r>
         <w:t>AuthorMenuList</w:t>
       </w:r>
@@ -22852,7 +22364,6 @@
         <w:t>(</w:t>
       </w:r>
       <w:proofErr w:type="spellStart"/>
-      <w:proofErr w:type="gramEnd"/>
       <w:r>
         <w:t>AuthenticationService</w:t>
       </w:r>
@@ -22886,7 +22397,6 @@
     </w:p>
     <w:p>
       <w:r>
-        <w:lastRenderedPageBreak/>
         <w:t xml:space="preserve">        </w:t>
       </w:r>
       <w:proofErr w:type="spellStart"/>
@@ -23063,12 +22573,10 @@
         <w:t xml:space="preserve">        if (</w:t>
       </w:r>
       <w:proofErr w:type="spellStart"/>
-      <w:proofErr w:type="gramStart"/>
       <w:r>
         <w:t>int.TryParse</w:t>
       </w:r>
       <w:proofErr w:type="spellEnd"/>
-      <w:proofErr w:type="gramEnd"/>
       <w:r>
         <w:t>(option, out var result))</w:t>
       </w:r>
@@ -23098,28 +22606,15 @@
     </w:p>
     <w:p>
       <w:r>
-        <w:t xml:space="preserve">            if </w:t>
-      </w:r>
-      <w:proofErr w:type="gramStart"/>
-      <w:r>
-        <w:t>(!</w:t>
+        <w:t xml:space="preserve">            if (!</w:t>
       </w:r>
       <w:proofErr w:type="spellStart"/>
       <w:r>
         <w:t>authService.HasRole</w:t>
       </w:r>
       <w:proofErr w:type="spellEnd"/>
-      <w:proofErr w:type="gramEnd"/>
-      <w:r>
-        <w:t xml:space="preserve">("Admin") &amp;&amp; </w:t>
-      </w:r>
-      <w:proofErr w:type="gramStart"/>
-      <w:r>
-        <w:t>result !</w:t>
-      </w:r>
-      <w:proofErr w:type="gramEnd"/>
-      <w:r>
-        <w:t>= 3 &amp;&amp; result &gt;= 1 &amp;&amp; result &lt;= 7) return result;</w:t>
+      <w:r>
+        <w:t>("Admin") &amp;&amp; result != 3 &amp;&amp; result &gt;= 1 &amp;&amp; result &lt;= 7) return result;</w:t>
       </w:r>
     </w:p>
     <w:p>
@@ -23156,7 +22651,6 @@
     </w:p>
     <w:p>
       <w:r>
-        <w:lastRenderedPageBreak/>
         <w:t>}</w:t>
       </w:r>
     </w:p>
@@ -23272,48 +22766,72 @@
         <w:t xml:space="preserve">&gt; </w:t>
       </w:r>
       <w:proofErr w:type="spellStart"/>
-      <w:proofErr w:type="gramStart"/>
       <w:r>
         <w:t>RemoveBook</w:t>
       </w:r>
       <w:proofErr w:type="spellEnd"/>
       <w:r>
+        <w:t xml:space="preserve">(int </w:t>
+      </w:r>
+      <w:proofErr w:type="spellStart"/>
+      <w:r>
+        <w:t>bookId</w:t>
+      </w:r>
+      <w:proofErr w:type="spellEnd"/>
+      <w:r>
+        <w:t xml:space="preserve">, int </w:t>
+      </w:r>
+      <w:proofErr w:type="spellStart"/>
+      <w:r>
+        <w:t>currentUserId</w:t>
+      </w:r>
+      <w:proofErr w:type="spellEnd"/>
+      <w:r>
+        <w:t>)</w:t>
+      </w:r>
+    </w:p>
+    <w:p>
+      <w:r>
+        <w:t>{</w:t>
+      </w:r>
+    </w:p>
+    <w:p>
+      <w:r>
+        <w:t xml:space="preserve">    // Check if the current user has permission to remove books</w:t>
+      </w:r>
+    </w:p>
+    <w:p>
+      <w:r>
+        <w:t xml:space="preserve">    var </w:t>
+      </w:r>
+      <w:proofErr w:type="spellStart"/>
+      <w:r>
+        <w:t>currentUser</w:t>
+      </w:r>
+      <w:proofErr w:type="spellEnd"/>
+      <w:r>
+        <w:t xml:space="preserve"> = _</w:t>
+      </w:r>
+      <w:proofErr w:type="spellStart"/>
+      <w:r>
+        <w:t>userRepository.FindById</w:t>
+      </w:r>
+      <w:proofErr w:type="spellEnd"/>
+      <w:r>
         <w:t>(</w:t>
       </w:r>
-      <w:proofErr w:type="gramEnd"/>
-      <w:r>
-        <w:t xml:space="preserve">int </w:t>
-      </w:r>
-      <w:proofErr w:type="spellStart"/>
-      <w:r>
-        <w:t>bookId</w:t>
-      </w:r>
-      <w:proofErr w:type="spellEnd"/>
-      <w:r>
-        <w:t xml:space="preserve">, int </w:t>
-      </w:r>
       <w:proofErr w:type="spellStart"/>
       <w:r>
         <w:t>currentUserId</w:t>
       </w:r>
       <w:proofErr w:type="spellEnd"/>
       <w:r>
-        <w:t>)</w:t>
-      </w:r>
-    </w:p>
-    <w:p>
-      <w:r>
-        <w:t>{</w:t>
-      </w:r>
-    </w:p>
-    <w:p>
-      <w:r>
-        <w:t xml:space="preserve">    // Check if the current user has permission to remove books</w:t>
-      </w:r>
-    </w:p>
-    <w:p>
-      <w:r>
-        <w:t xml:space="preserve">    var </w:t>
+        <w:t>);</w:t>
+      </w:r>
+    </w:p>
+    <w:p>
+      <w:r>
+        <w:t xml:space="preserve">    if (</w:t>
       </w:r>
       <w:proofErr w:type="spellStart"/>
       <w:r>
@@ -23321,43 +22839,9 @@
       </w:r>
       <w:proofErr w:type="spellEnd"/>
       <w:r>
-        <w:t xml:space="preserve"> = _</w:t>
-      </w:r>
-      <w:proofErr w:type="spellStart"/>
-      <w:r>
-        <w:t>userRepository.FindById</w:t>
-      </w:r>
-      <w:proofErr w:type="spellEnd"/>
-      <w:r>
-        <w:t>(</w:t>
-      </w:r>
-      <w:proofErr w:type="spellStart"/>
-      <w:r>
-        <w:t>currentUserId</w:t>
-      </w:r>
-      <w:proofErr w:type="spellEnd"/>
-      <w:r>
-        <w:t>);</w:t>
-      </w:r>
-    </w:p>
-    <w:p>
-      <w:r>
-        <w:t xml:space="preserve">    if (</w:t>
-      </w:r>
-      <w:proofErr w:type="spellStart"/>
-      <w:r>
-        <w:t>currentUser</w:t>
-      </w:r>
-      <w:proofErr w:type="spellEnd"/>
-      <w:r>
-        <w:t xml:space="preserve"> is null |</w:t>
-      </w:r>
-      <w:proofErr w:type="gramStart"/>
-      <w:r>
-        <w:t>| !</w:t>
-      </w:r>
-      <w:proofErr w:type="spellStart"/>
-      <w:proofErr w:type="gramEnd"/>
+        <w:t xml:space="preserve"> is null || !</w:t>
+      </w:r>
+      <w:proofErr w:type="spellStart"/>
       <w:r>
         <w:t>currentUser.IsInRole</w:t>
       </w:r>
@@ -23426,15 +22910,7 @@
     </w:p>
     <w:p>
       <w:r>
-        <w:t xml:space="preserve">public bool </w:t>
-      </w:r>
-      <w:proofErr w:type="gramStart"/>
-      <w:r>
-        <w:t>IsInRole(</w:t>
-      </w:r>
-      <w:proofErr w:type="gramEnd"/>
-      <w:r>
-        <w:t xml:space="preserve">string </w:t>
+        <w:t xml:space="preserve">public bool IsInRole(string </w:t>
       </w:r>
       <w:proofErr w:type="spellStart"/>
       <w:r>
@@ -23471,12 +22947,10 @@
         <w:t xml:space="preserve"> =&gt; </w:t>
       </w:r>
       <w:proofErr w:type="spellStart"/>
-      <w:proofErr w:type="gramStart"/>
       <w:r>
         <w:t>ur.Role.Name</w:t>
       </w:r>
       <w:proofErr w:type="spellEnd"/>
-      <w:proofErr w:type="gramEnd"/>
       <w:r>
         <w:t xml:space="preserve"> == </w:t>
       </w:r>
@@ -23518,15 +22992,7 @@
     </w:p>
     <w:p>
       <w:r>
-        <w:t xml:space="preserve">When a </w:t>
-      </w:r>
-      <w:proofErr w:type="gramStart"/>
-      <w:r>
-        <w:t>Member</w:t>
-      </w:r>
-      <w:proofErr w:type="gramEnd"/>
-      <w:r>
-        <w:t xml:space="preserve"> logs in, they should only see their own data.</w:t>
+        <w:t>When a Member logs in, they should only see their own data.</w:t>
       </w:r>
     </w:p>
     <w:p>
@@ -23535,7 +23001,6 @@
           <w:b/>
           <w:bCs/>
         </w:rPr>
-        <w:lastRenderedPageBreak/>
         <w:t>Example in </w:t>
       </w:r>
       <w:proofErr w:type="spellStart"/>
@@ -23563,7 +23028,6 @@
         <w:t xml:space="preserve">private static void </w:t>
       </w:r>
       <w:proofErr w:type="spellStart"/>
-      <w:proofErr w:type="gramStart"/>
       <w:r>
         <w:t>ViewUserLoans</w:t>
       </w:r>
@@ -23572,7 +23036,6 @@
         <w:t>(</w:t>
       </w:r>
       <w:proofErr w:type="spellStart"/>
-      <w:proofErr w:type="gramEnd"/>
       <w:r>
         <w:t>AuthenticationService</w:t>
       </w:r>
@@ -23647,15 +23110,7 @@
     <w:p/>
     <w:p>
       <w:r>
-        <w:t xml:space="preserve">    // If the user is a </w:t>
-      </w:r>
-      <w:proofErr w:type="gramStart"/>
-      <w:r>
-        <w:t>Member</w:t>
-      </w:r>
-      <w:proofErr w:type="gramEnd"/>
-      <w:r>
-        <w:t>, they can only view their own loans</w:t>
+        <w:t xml:space="preserve">    // If the user is a Member, they can only view their own loans</w:t>
       </w:r>
     </w:p>
     <w:p>
@@ -23668,14 +23123,9 @@
       </w:r>
       <w:proofErr w:type="spellEnd"/>
       <w:r>
-        <w:t>("Member") &amp;</w:t>
-      </w:r>
-      <w:proofErr w:type="gramStart"/>
-      <w:r>
-        <w:t>&amp; !</w:t>
-      </w:r>
-      <w:proofErr w:type="spellStart"/>
-      <w:proofErr w:type="gramEnd"/>
+        <w:t>("Member") &amp;&amp; !</w:t>
+      </w:r>
+      <w:proofErr w:type="spellStart"/>
       <w:r>
         <w:t>authService.HasAnyRole</w:t>
       </w:r>

</xml_diff>

<commit_message>
Replace validation messages groups
</commit_message>
<xml_diff>
--- a/Optimization.docx
+++ b/Optimization.docx
@@ -205,6 +205,7 @@
         <w:t>_</w:t>
       </w:r>
       <w:proofErr w:type="spellStart"/>
+      <w:proofErr w:type="gramStart"/>
       <w:r>
         <w:rPr>
           <w:rFonts w:ascii="Consolas" w:hAnsi="Consolas" w:cs="Courier New"/>
@@ -233,6 +234,7 @@
         <w:t>Any</w:t>
       </w:r>
       <w:proofErr w:type="spellEnd"/>
+      <w:proofErr w:type="gramEnd"/>
       <w:r>
         <w:rPr>
           <w:rFonts w:ascii="Consolas" w:hAnsi="Consolas" w:cs="Courier New"/>
@@ -270,6 +272,7 @@
         <w:t xml:space="preserve"> </w:t>
       </w:r>
       <w:proofErr w:type="spellStart"/>
+      <w:proofErr w:type="gramStart"/>
       <w:r>
         <w:rPr>
           <w:rFonts w:ascii="Consolas" w:hAnsi="Consolas" w:cs="Courier New"/>
@@ -298,6 +301,7 @@
         <w:t>NationalCode</w:t>
       </w:r>
       <w:proofErr w:type="spellEnd"/>
+      <w:proofErr w:type="gramEnd"/>
       <w:r>
         <w:rPr>
           <w:rFonts w:ascii="Consolas" w:hAnsi="Consolas" w:cs="Courier New"/>
@@ -326,6 +330,7 @@
         <w:t xml:space="preserve"> </w:t>
       </w:r>
       <w:proofErr w:type="spellStart"/>
+      <w:proofErr w:type="gramStart"/>
       <w:r>
         <w:rPr>
           <w:rFonts w:ascii="Consolas" w:hAnsi="Consolas" w:cs="Courier New"/>
@@ -354,6 +359,7 @@
         <w:t>NationalCode</w:t>
       </w:r>
       <w:proofErr w:type="spellEnd"/>
+      <w:proofErr w:type="gramEnd"/>
       <w:r>
         <w:rPr>
           <w:rFonts w:ascii="Consolas" w:hAnsi="Consolas" w:cs="Courier New"/>
@@ -688,6 +694,7 @@
         <w:t>_</w:t>
       </w:r>
       <w:proofErr w:type="spellStart"/>
+      <w:proofErr w:type="gramStart"/>
       <w:r>
         <w:rPr>
           <w:rFonts w:ascii="Consolas" w:hAnsi="Consolas" w:cs="Courier New"/>
@@ -716,6 +723,7 @@
         <w:t>Any</w:t>
       </w:r>
       <w:proofErr w:type="spellEnd"/>
+      <w:proofErr w:type="gramEnd"/>
       <w:r>
         <w:rPr>
           <w:rFonts w:ascii="Consolas" w:hAnsi="Consolas" w:cs="Courier New"/>
@@ -753,6 +761,7 @@
         <w:t xml:space="preserve"> </w:t>
       </w:r>
       <w:proofErr w:type="spellStart"/>
+      <w:proofErr w:type="gramStart"/>
       <w:r>
         <w:rPr>
           <w:rFonts w:ascii="Consolas" w:hAnsi="Consolas" w:cs="Courier New"/>
@@ -781,6 +790,7 @@
         <w:t>NationalCode</w:t>
       </w:r>
       <w:proofErr w:type="spellEnd"/>
+      <w:proofErr w:type="gramEnd"/>
       <w:r>
         <w:rPr>
           <w:rFonts w:ascii="Consolas" w:hAnsi="Consolas" w:cs="Courier New"/>
@@ -809,6 +819,7 @@
         <w:t xml:space="preserve"> </w:t>
       </w:r>
       <w:proofErr w:type="spellStart"/>
+      <w:proofErr w:type="gramStart"/>
       <w:r>
         <w:rPr>
           <w:rFonts w:ascii="Consolas" w:hAnsi="Consolas" w:cs="Courier New"/>
@@ -837,6 +848,7 @@
         <w:t>NationalCode</w:t>
       </w:r>
       <w:proofErr w:type="spellEnd"/>
+      <w:proofErr w:type="gramEnd"/>
       <w:r>
         <w:rPr>
           <w:rFonts w:ascii="Consolas" w:hAnsi="Consolas" w:cs="Courier New"/>
@@ -1022,7 +1034,15 @@
         <w:t>generic private helper methods</w:t>
       </w:r>
       <w:r>
-        <w:t xml:space="preserve"> that operate on any List&lt;T&gt; where T : Person:</w:t>
+        <w:t xml:space="preserve"> that operate on any List&lt;T&gt; where </w:t>
+      </w:r>
+      <w:proofErr w:type="gramStart"/>
+      <w:r>
+        <w:t>T :</w:t>
+      </w:r>
+      <w:proofErr w:type="gramEnd"/>
+      <w:r>
+        <w:t xml:space="preserve"> Person:</w:t>
       </w:r>
     </w:p>
     <w:p>
@@ -1424,7 +1444,17 @@
           <w:sz w:val="17"/>
           <w:szCs w:val="17"/>
         </w:rPr>
-        <w:t xml:space="preserve"> T </w:t>
+        <w:t xml:space="preserve"> </w:t>
+      </w:r>
+      <w:proofErr w:type="gramStart"/>
+      <w:r>
+        <w:rPr>
+          <w:rFonts w:ascii="Consolas" w:hAnsi="Consolas" w:cs="Courier New"/>
+          <w:color w:val="000000"/>
+          <w:sz w:val="17"/>
+          <w:szCs w:val="17"/>
+        </w:rPr>
+        <w:t xml:space="preserve">T </w:t>
       </w:r>
       <w:r>
         <w:rPr>
@@ -1435,6 +1465,7 @@
         </w:rPr>
         <w:t>:</w:t>
       </w:r>
+      <w:proofErr w:type="gramEnd"/>
       <w:r>
         <w:rPr>
           <w:rFonts w:ascii="Consolas" w:hAnsi="Consolas" w:cs="Courier New"/>
@@ -1578,6 +1609,7 @@
         <w:t xml:space="preserve"> </w:t>
       </w:r>
       <w:proofErr w:type="spellStart"/>
+      <w:proofErr w:type="gramStart"/>
       <w:r>
         <w:rPr>
           <w:rFonts w:ascii="Consolas" w:hAnsi="Consolas" w:cs="Courier New"/>
@@ -1606,6 +1638,7 @@
         <w:t>Any</w:t>
       </w:r>
       <w:proofErr w:type="spellEnd"/>
+      <w:proofErr w:type="gramEnd"/>
       <w:r>
         <w:rPr>
           <w:rFonts w:ascii="Consolas" w:hAnsi="Consolas" w:cs="Courier New"/>
@@ -1643,6 +1676,7 @@
         <w:t xml:space="preserve"> </w:t>
       </w:r>
       <w:proofErr w:type="spellStart"/>
+      <w:proofErr w:type="gramStart"/>
       <w:r>
         <w:rPr>
           <w:rFonts w:ascii="Consolas" w:hAnsi="Consolas" w:cs="Courier New"/>
@@ -1689,6 +1723,7 @@
         </w:rPr>
         <w:t>!=</w:t>
       </w:r>
+      <w:proofErr w:type="gramEnd"/>
       <w:r>
         <w:rPr>
           <w:rFonts w:ascii="Consolas" w:hAnsi="Consolas" w:cs="Courier New"/>
@@ -1737,6 +1772,7 @@
         <w:t xml:space="preserve"> </w:t>
       </w:r>
       <w:proofErr w:type="spellStart"/>
+      <w:proofErr w:type="gramStart"/>
       <w:r>
         <w:rPr>
           <w:rFonts w:ascii="Consolas" w:hAnsi="Consolas" w:cs="Courier New"/>
@@ -1765,6 +1801,7 @@
         <w:t>NationalCode</w:t>
       </w:r>
       <w:proofErr w:type="spellEnd"/>
+      <w:proofErr w:type="gramEnd"/>
       <w:r>
         <w:rPr>
           <w:rFonts w:ascii="Consolas" w:hAnsi="Consolas" w:cs="Courier New"/>
@@ -1854,7 +1891,16 @@
           <w:sz w:val="17"/>
           <w:szCs w:val="17"/>
         </w:rPr>
-        <w:t xml:space="preserve"> 5. </w:t>
+        <w:t xml:space="preserve"> </w:t>
+      </w:r>
+      <w:proofErr w:type="gramStart"/>
+      <w:r>
+        <w:rPr>
+          <w:rFonts w:ascii="Consolas" w:hAnsi="Consolas" w:cs="Courier New"/>
+          <w:sz w:val="17"/>
+          <w:szCs w:val="17"/>
+        </w:rPr>
+        <w:t xml:space="preserve">5. </w:t>
       </w:r>
       <w:r>
         <w:rPr>
@@ -1865,6 +1911,7 @@
         </w:rPr>
         <w:t>}</w:t>
       </w:r>
+      <w:proofErr w:type="gramEnd"/>
     </w:p>
     <w:p>
       <w:pPr>
@@ -2307,7 +2354,17 @@
           <w:sz w:val="17"/>
           <w:szCs w:val="17"/>
         </w:rPr>
-        <w:t xml:space="preserve"> T </w:t>
+        <w:t xml:space="preserve"> </w:t>
+      </w:r>
+      <w:proofErr w:type="gramStart"/>
+      <w:r>
+        <w:rPr>
+          <w:rFonts w:ascii="Consolas" w:hAnsi="Consolas" w:cs="Courier New"/>
+          <w:color w:val="000000"/>
+          <w:sz w:val="17"/>
+          <w:szCs w:val="17"/>
+        </w:rPr>
+        <w:t xml:space="preserve">T </w:t>
       </w:r>
       <w:r>
         <w:rPr>
@@ -2318,6 +2375,7 @@
         </w:rPr>
         <w:t>:</w:t>
       </w:r>
+      <w:proofErr w:type="gramEnd"/>
       <w:r>
         <w:rPr>
           <w:rFonts w:ascii="Consolas" w:hAnsi="Consolas" w:cs="Courier New"/>
@@ -2461,6 +2519,7 @@
         <w:t xml:space="preserve"> </w:t>
       </w:r>
       <w:proofErr w:type="spellStart"/>
+      <w:proofErr w:type="gramStart"/>
       <w:r>
         <w:rPr>
           <w:rFonts w:ascii="Consolas" w:hAnsi="Consolas" w:cs="Courier New"/>
@@ -2489,6 +2548,7 @@
         <w:t>Any</w:t>
       </w:r>
       <w:proofErr w:type="spellEnd"/>
+      <w:proofErr w:type="gramEnd"/>
       <w:r>
         <w:rPr>
           <w:rFonts w:ascii="Consolas" w:hAnsi="Consolas" w:cs="Courier New"/>
@@ -2526,6 +2586,7 @@
         <w:t xml:space="preserve"> </w:t>
       </w:r>
       <w:proofErr w:type="spellStart"/>
+      <w:proofErr w:type="gramStart"/>
       <w:r>
         <w:rPr>
           <w:rFonts w:ascii="Consolas" w:hAnsi="Consolas" w:cs="Courier New"/>
@@ -2572,6 +2633,7 @@
         </w:rPr>
         <w:t>!=</w:t>
       </w:r>
+      <w:proofErr w:type="gramEnd"/>
       <w:r>
         <w:rPr>
           <w:rFonts w:ascii="Consolas" w:hAnsi="Consolas" w:cs="Courier New"/>
@@ -2620,6 +2682,7 @@
         <w:t xml:space="preserve"> </w:t>
       </w:r>
       <w:proofErr w:type="spellStart"/>
+      <w:proofErr w:type="gramStart"/>
       <w:r>
         <w:rPr>
           <w:rFonts w:ascii="Consolas" w:hAnsi="Consolas" w:cs="Courier New"/>
@@ -2666,6 +2729,7 @@
         <w:t>Equals</w:t>
       </w:r>
       <w:proofErr w:type="spellEnd"/>
+      <w:proofErr w:type="gramEnd"/>
       <w:r>
         <w:rPr>
           <w:rFonts w:ascii="Consolas" w:hAnsi="Consolas" w:cs="Courier New"/>
@@ -2776,6 +2840,7 @@
           <w:szCs w:val="17"/>
         </w:rPr>
       </w:pPr>
+      <w:proofErr w:type="gramStart"/>
       <w:r>
         <w:rPr>
           <w:rFonts w:ascii="Consolas" w:hAnsi="Consolas" w:cs="Courier New"/>
@@ -2793,24 +2858,29 @@
         </w:rPr>
         <w:t>}</w:t>
       </w:r>
+      <w:proofErr w:type="gramEnd"/>
     </w:p>
     <w:p>
       <w:r>
         <w:t xml:space="preserve">This assumes Id lives on Person (which it appears to, based on </w:t>
       </w:r>
       <w:proofErr w:type="spellStart"/>
+      <w:proofErr w:type="gramStart"/>
       <w:r>
         <w:t>author.Id</w:t>
       </w:r>
       <w:proofErr w:type="spellEnd"/>
+      <w:proofErr w:type="gramEnd"/>
       <w:r>
         <w:t xml:space="preserve"> and </w:t>
       </w:r>
       <w:proofErr w:type="spellStart"/>
+      <w:proofErr w:type="gramStart"/>
       <w:r>
         <w:t>member.Id</w:t>
       </w:r>
       <w:proofErr w:type="spellEnd"/>
+      <w:proofErr w:type="gramEnd"/>
       <w:r>
         <w:t xml:space="preserve"> both being used) — confirm this by checking </w:t>
       </w:r>
@@ -2907,6 +2977,7 @@
         <w:t>(</w:t>
       </w:r>
       <w:proofErr w:type="spellStart"/>
+      <w:proofErr w:type="gramStart"/>
       <w:r>
         <w:rPr>
           <w:rFonts w:ascii="Consolas" w:hAnsi="Consolas" w:cs="Courier New"/>
@@ -2926,6 +2997,7 @@
         </w:rPr>
         <w:t>(</w:t>
       </w:r>
+      <w:proofErr w:type="gramEnd"/>
       <w:r>
         <w:rPr>
           <w:rFonts w:ascii="Consolas" w:hAnsi="Consolas" w:cs="Courier New"/>
@@ -2954,6 +3026,7 @@
         <w:t xml:space="preserve"> </w:t>
       </w:r>
       <w:proofErr w:type="spellStart"/>
+      <w:proofErr w:type="gramStart"/>
       <w:r>
         <w:rPr>
           <w:rFonts w:ascii="Consolas" w:hAnsi="Consolas" w:cs="Courier New"/>
@@ -2982,6 +3055,7 @@
         <w:t>NationalCode</w:t>
       </w:r>
       <w:proofErr w:type="spellEnd"/>
+      <w:proofErr w:type="gramEnd"/>
       <w:r>
         <w:rPr>
           <w:rFonts w:ascii="Consolas" w:hAnsi="Consolas" w:cs="Courier New"/>
@@ -3203,6 +3277,7 @@
         <w:t>(</w:t>
       </w:r>
       <w:proofErr w:type="spellStart"/>
+      <w:proofErr w:type="gramStart"/>
       <w:r>
         <w:rPr>
           <w:rFonts w:ascii="Consolas" w:hAnsi="Consolas" w:cs="Courier New"/>
@@ -3231,6 +3306,7 @@
         <w:t>NationalCode</w:t>
       </w:r>
       <w:proofErr w:type="spellEnd"/>
+      <w:proofErr w:type="gramEnd"/>
       <w:r>
         <w:rPr>
           <w:rFonts w:ascii="Consolas" w:hAnsi="Consolas" w:cs="Courier New"/>
@@ -3313,6 +3389,7 @@
         <w:t xml:space="preserve"> </w:t>
       </w:r>
       <w:proofErr w:type="spellStart"/>
+      <w:proofErr w:type="gramStart"/>
       <w:r>
         <w:rPr>
           <w:rFonts w:ascii="Consolas" w:hAnsi="Consolas" w:cs="Courier New"/>
@@ -3332,6 +3409,7 @@
         </w:rPr>
         <w:t>(</w:t>
       </w:r>
+      <w:proofErr w:type="gramEnd"/>
       <w:r>
         <w:rPr>
           <w:rFonts w:ascii="Consolas" w:hAnsi="Consolas" w:cs="Courier New"/>
@@ -3360,6 +3438,7 @@
         <w:t xml:space="preserve"> </w:t>
       </w:r>
       <w:proofErr w:type="spellStart"/>
+      <w:proofErr w:type="gramStart"/>
       <w:r>
         <w:rPr>
           <w:rFonts w:ascii="Consolas" w:hAnsi="Consolas" w:cs="Courier New"/>
@@ -3388,6 +3467,7 @@
         <w:t>NationalCode</w:t>
       </w:r>
       <w:proofErr w:type="spellEnd"/>
+      <w:proofErr w:type="gramEnd"/>
       <w:r>
         <w:rPr>
           <w:rFonts w:ascii="Consolas" w:hAnsi="Consolas" w:cs="Courier New"/>
@@ -3600,7 +3680,15 @@
         <w:t>generic repository pattern</w:t>
       </w:r>
       <w:r>
-        <w:t xml:space="preserve"> (Repository&lt;T&gt; where T : Person with Add, Update, Remove, </w:t>
+        <w:t xml:space="preserve"> (Repository&lt;T&gt; where </w:t>
+      </w:r>
+      <w:proofErr w:type="gramStart"/>
+      <w:r>
+        <w:t>T :</w:t>
+      </w:r>
+      <w:proofErr w:type="gramEnd"/>
+      <w:r>
+        <w:t xml:space="preserve"> Person with Add, Update, Remove, </w:t>
       </w:r>
       <w:proofErr w:type="spellStart"/>
       <w:r>
@@ -3720,7 +3808,15 @@
       </w:r>
       <w:r>
         <w:br/>
-        <w:t>You can create a PersonService&lt;T&gt; where T : Person (or </w:t>
+        <w:t>You can create a PersonService&lt;T&gt; where </w:t>
+      </w:r>
+      <w:proofErr w:type="gramStart"/>
+      <w:r>
+        <w:t>T :</w:t>
+      </w:r>
+      <w:proofErr w:type="gramEnd"/>
+      <w:r>
+        <w:t xml:space="preserve"> Person (or </w:t>
       </w:r>
       <w:proofErr w:type="spellStart"/>
       <w:r>
@@ -3951,7 +4047,17 @@
           <w:sz w:val="17"/>
           <w:szCs w:val="17"/>
         </w:rPr>
-        <w:t xml:space="preserve"> T </w:t>
+        <w:t xml:space="preserve"> </w:t>
+      </w:r>
+      <w:proofErr w:type="gramStart"/>
+      <w:r>
+        <w:rPr>
+          <w:rFonts w:ascii="Consolas" w:hAnsi="Consolas" w:cs="Courier New"/>
+          <w:color w:val="000000"/>
+          <w:sz w:val="17"/>
+          <w:szCs w:val="17"/>
+        </w:rPr>
+        <w:t xml:space="preserve">T </w:t>
       </w:r>
       <w:r>
         <w:rPr>
@@ -3962,6 +4068,7 @@
         </w:rPr>
         <w:t>:</w:t>
       </w:r>
+      <w:proofErr w:type="gramEnd"/>
       <w:r>
         <w:rPr>
           <w:rFonts w:ascii="Consolas" w:hAnsi="Consolas" w:cs="Courier New"/>
@@ -3998,6 +4105,7 @@
         </w:rPr>
         <w:t xml:space="preserve"> </w:t>
       </w:r>
+      <w:proofErr w:type="gramStart"/>
       <w:r>
         <w:rPr>
           <w:rFonts w:ascii="Consolas" w:hAnsi="Consolas" w:cs="Courier New"/>
@@ -4014,7 +4122,17 @@
           <w:sz w:val="17"/>
           <w:szCs w:val="17"/>
         </w:rPr>
-        <w:t>()</w:t>
+        <w:t>(</w:t>
+      </w:r>
+      <w:proofErr w:type="gramEnd"/>
+      <w:r>
+        <w:rPr>
+          <w:rFonts w:ascii="Consolas" w:hAnsi="Consolas" w:cs="Courier New"/>
+          <w:color w:val="666600"/>
+          <w:sz w:val="17"/>
+          <w:szCs w:val="17"/>
+        </w:rPr>
+        <w:t>)</w:t>
       </w:r>
     </w:p>
     <w:p>
@@ -4203,6 +4321,7 @@
         </w:rPr>
         <w:t xml:space="preserve"> </w:t>
       </w:r>
+      <w:proofErr w:type="gramStart"/>
       <w:r>
         <w:rPr>
           <w:rFonts w:ascii="Consolas" w:hAnsi="Consolas" w:cs="Courier New"/>
@@ -4219,7 +4338,17 @@
           <w:sz w:val="17"/>
           <w:szCs w:val="17"/>
         </w:rPr>
-        <w:t>();</w:t>
+        <w:t>(</w:t>
+      </w:r>
+      <w:proofErr w:type="gramEnd"/>
+      <w:r>
+        <w:rPr>
+          <w:rFonts w:ascii="Consolas" w:hAnsi="Consolas" w:cs="Courier New"/>
+          <w:color w:val="666600"/>
+          <w:sz w:val="17"/>
+          <w:szCs w:val="17"/>
+        </w:rPr>
+        <w:t>);</w:t>
       </w:r>
     </w:p>
     <w:p>
@@ -4410,6 +4539,7 @@
         </w:rPr>
         <w:t xml:space="preserve"> </w:t>
       </w:r>
+      <w:proofErr w:type="gramStart"/>
       <w:r>
         <w:rPr>
           <w:rFonts w:ascii="Consolas" w:hAnsi="Consolas" w:cs="Courier New"/>
@@ -4428,6 +4558,7 @@
         </w:rPr>
         <w:t>(</w:t>
       </w:r>
+      <w:proofErr w:type="gramEnd"/>
       <w:r>
         <w:rPr>
           <w:rFonts w:ascii="Consolas" w:hAnsi="Consolas" w:cs="Courier New"/>
@@ -4567,6 +4698,7 @@
         </w:rPr>
         <w:t xml:space="preserve"> </w:t>
       </w:r>
+      <w:proofErr w:type="gramStart"/>
       <w:r>
         <w:rPr>
           <w:rFonts w:ascii="Consolas" w:hAnsi="Consolas" w:cs="Courier New"/>
@@ -4594,6 +4726,7 @@
         </w:rPr>
         <w:t>)</w:t>
       </w:r>
+      <w:proofErr w:type="gramEnd"/>
       <w:r>
         <w:rPr>
           <w:rFonts w:ascii="Consolas" w:hAnsi="Consolas" w:cs="Courier New"/>
@@ -4603,6 +4736,7 @@
         </w:rPr>
         <w:t xml:space="preserve"> </w:t>
       </w:r>
+      <w:proofErr w:type="gramStart"/>
       <w:r>
         <w:rPr>
           <w:rFonts w:ascii="Consolas" w:hAnsi="Consolas" w:cs="Courier New"/>
@@ -4630,6 +4764,7 @@
         </w:rPr>
         <w:t>...</w:t>
       </w:r>
+      <w:proofErr w:type="gramEnd"/>
       <w:r>
         <w:rPr>
           <w:rFonts w:ascii="Consolas" w:hAnsi="Consolas" w:cs="Courier New"/>
@@ -4784,6 +4919,7 @@
         </w:rPr>
         <w:t xml:space="preserve"> </w:t>
       </w:r>
+      <w:proofErr w:type="gramStart"/>
       <w:r>
         <w:rPr>
           <w:rFonts w:ascii="Consolas" w:hAnsi="Consolas" w:cs="Courier New"/>
@@ -4802,6 +4938,7 @@
         </w:rPr>
         <w:t>(</w:t>
       </w:r>
+      <w:proofErr w:type="gramEnd"/>
       <w:r>
         <w:rPr>
           <w:rFonts w:ascii="Consolas" w:hAnsi="Consolas" w:cs="Courier New"/>
@@ -4856,6 +4993,7 @@
         </w:rPr>
         <w:t xml:space="preserve"> </w:t>
       </w:r>
+      <w:proofErr w:type="gramStart"/>
       <w:r>
         <w:rPr>
           <w:rFonts w:ascii="Consolas" w:hAnsi="Consolas" w:cs="Courier New"/>
@@ -4883,6 +5021,7 @@
         </w:rPr>
         <w:t>...</w:t>
       </w:r>
+      <w:proofErr w:type="gramEnd"/>
       <w:r>
         <w:rPr>
           <w:rFonts w:ascii="Consolas" w:hAnsi="Consolas" w:cs="Courier New"/>
@@ -5037,6 +5176,7 @@
         </w:rPr>
         <w:t xml:space="preserve"> </w:t>
       </w:r>
+      <w:proofErr w:type="gramStart"/>
       <w:r>
         <w:rPr>
           <w:rFonts w:ascii="Consolas" w:hAnsi="Consolas" w:cs="Courier New"/>
@@ -5055,6 +5195,7 @@
         </w:rPr>
         <w:t>(</w:t>
       </w:r>
+      <w:proofErr w:type="gramEnd"/>
       <w:r>
         <w:rPr>
           <w:rFonts w:ascii="Consolas" w:hAnsi="Consolas" w:cs="Courier New"/>
@@ -5181,6 +5322,7 @@
         </w:rPr>
         <w:t xml:space="preserve"> </w:t>
       </w:r>
+      <w:proofErr w:type="gramStart"/>
       <w:r>
         <w:rPr>
           <w:rFonts w:ascii="Consolas" w:hAnsi="Consolas" w:cs="Courier New"/>
@@ -5208,6 +5350,7 @@
         </w:rPr>
         <w:t>...</w:t>
       </w:r>
+      <w:proofErr w:type="gramEnd"/>
       <w:r>
         <w:rPr>
           <w:rFonts w:ascii="Consolas" w:hAnsi="Consolas" w:cs="Courier New"/>
@@ -5268,7 +5411,16 @@
           <w:sz w:val="17"/>
           <w:szCs w:val="17"/>
         </w:rPr>
-        <w:t xml:space="preserve"> 9. </w:t>
+        <w:t xml:space="preserve"> </w:t>
+      </w:r>
+      <w:proofErr w:type="gramStart"/>
+      <w:r>
+        <w:rPr>
+          <w:rFonts w:ascii="Consolas" w:hAnsi="Consolas" w:cs="Courier New"/>
+          <w:sz w:val="17"/>
+          <w:szCs w:val="17"/>
+        </w:rPr>
+        <w:t xml:space="preserve">9. </w:t>
       </w:r>
       <w:r>
         <w:rPr>
@@ -5279,6 +5431,7 @@
         </w:rPr>
         <w:t>}</w:t>
       </w:r>
+      <w:proofErr w:type="gramEnd"/>
     </w:p>
     <w:p>
       <w:r>
@@ -5896,7 +6049,17 @@
           <w:sz w:val="17"/>
           <w:szCs w:val="17"/>
         </w:rPr>
-        <w:t xml:space="preserve"> T </w:t>
+        <w:t xml:space="preserve"> </w:t>
+      </w:r>
+      <w:proofErr w:type="gramStart"/>
+      <w:r>
+        <w:rPr>
+          <w:rFonts w:ascii="Consolas" w:hAnsi="Consolas" w:cs="Courier New"/>
+          <w:color w:val="000000"/>
+          <w:sz w:val="17"/>
+          <w:szCs w:val="17"/>
+        </w:rPr>
+        <w:t xml:space="preserve">T </w:t>
       </w:r>
       <w:r>
         <w:rPr>
@@ -5907,6 +6070,7 @@
         </w:rPr>
         <w:t>:</w:t>
       </w:r>
+      <w:proofErr w:type="gramEnd"/>
       <w:r>
         <w:rPr>
           <w:rFonts w:ascii="Consolas" w:hAnsi="Consolas" w:cs="Courier New"/>
@@ -5976,7 +6140,17 @@
           <w:sz w:val="17"/>
           <w:szCs w:val="17"/>
         </w:rPr>
-        <w:t xml:space="preserve">    </w:t>
+        <w:t xml:space="preserve"> </w:t>
+      </w:r>
+      <w:proofErr w:type="gramStart"/>
+      <w:r>
+        <w:rPr>
+          <w:rFonts w:ascii="Consolas" w:hAnsi="Consolas" w:cs="Courier New"/>
+          <w:color w:val="000000"/>
+          <w:sz w:val="17"/>
+          <w:szCs w:val="17"/>
+        </w:rPr>
+        <w:t xml:space="preserve">   </w:t>
       </w:r>
       <w:r>
         <w:rPr>
@@ -5987,6 +6161,7 @@
         </w:rPr>
         <w:t>{</w:t>
       </w:r>
+      <w:proofErr w:type="gramEnd"/>
     </w:p>
     <w:p>
       <w:pPr>
@@ -6059,6 +6234,7 @@
         <w:t xml:space="preserve"> </w:t>
       </w:r>
       <w:proofErr w:type="spellStart"/>
+      <w:proofErr w:type="gramStart"/>
       <w:r>
         <w:rPr>
           <w:rFonts w:ascii="Consolas" w:hAnsi="Consolas" w:cs="Courier New"/>
@@ -6087,6 +6263,7 @@
         <w:t>Any</w:t>
       </w:r>
       <w:proofErr w:type="spellEnd"/>
+      <w:proofErr w:type="gramEnd"/>
       <w:r>
         <w:rPr>
           <w:rFonts w:ascii="Consolas" w:hAnsi="Consolas" w:cs="Courier New"/>
@@ -6124,6 +6301,7 @@
         <w:t xml:space="preserve"> </w:t>
       </w:r>
       <w:proofErr w:type="spellStart"/>
+      <w:proofErr w:type="gramStart"/>
       <w:r>
         <w:rPr>
           <w:rFonts w:ascii="Consolas" w:hAnsi="Consolas" w:cs="Courier New"/>
@@ -6170,6 +6348,7 @@
         </w:rPr>
         <w:t>!=</w:t>
       </w:r>
+      <w:proofErr w:type="gramEnd"/>
       <w:r>
         <w:rPr>
           <w:rFonts w:ascii="Consolas" w:hAnsi="Consolas" w:cs="Courier New"/>
@@ -6271,6 +6450,7 @@
         <w:t xml:space="preserve">                               </w:t>
       </w:r>
       <w:proofErr w:type="spellStart"/>
+      <w:proofErr w:type="gramStart"/>
       <w:r>
         <w:rPr>
           <w:rFonts w:ascii="Consolas" w:hAnsi="Consolas" w:cs="Courier New"/>
@@ -6299,6 +6479,7 @@
         <w:t>FirstName</w:t>
       </w:r>
       <w:proofErr w:type="spellEnd"/>
+      <w:proofErr w:type="gramEnd"/>
       <w:r>
         <w:rPr>
           <w:rFonts w:ascii="Consolas" w:hAnsi="Consolas" w:cs="Courier New"/>
@@ -6327,6 +6508,7 @@
         <w:t xml:space="preserve"> </w:t>
       </w:r>
       <w:proofErr w:type="spellStart"/>
+      <w:proofErr w:type="gramStart"/>
       <w:r>
         <w:rPr>
           <w:rFonts w:ascii="Consolas" w:hAnsi="Consolas" w:cs="Courier New"/>
@@ -6355,6 +6537,7 @@
         <w:t>FirstName</w:t>
       </w:r>
       <w:proofErr w:type="spellEnd"/>
+      <w:proofErr w:type="gramEnd"/>
       <w:r>
         <w:rPr>
           <w:rFonts w:ascii="Consolas" w:hAnsi="Consolas" w:cs="Courier New"/>
@@ -6436,6 +6619,7 @@
         <w:t xml:space="preserve">                               </w:t>
       </w:r>
       <w:proofErr w:type="spellStart"/>
+      <w:proofErr w:type="gramStart"/>
       <w:r>
         <w:rPr>
           <w:rFonts w:ascii="Consolas" w:hAnsi="Consolas" w:cs="Courier New"/>
@@ -6464,6 +6648,7 @@
         <w:t>LastName</w:t>
       </w:r>
       <w:proofErr w:type="spellEnd"/>
+      <w:proofErr w:type="gramEnd"/>
       <w:r>
         <w:rPr>
           <w:rFonts w:ascii="Consolas" w:hAnsi="Consolas" w:cs="Courier New"/>
@@ -6492,6 +6677,7 @@
         <w:t xml:space="preserve"> </w:t>
       </w:r>
       <w:proofErr w:type="spellStart"/>
+      <w:proofErr w:type="gramStart"/>
       <w:r>
         <w:rPr>
           <w:rFonts w:ascii="Consolas" w:hAnsi="Consolas" w:cs="Courier New"/>
@@ -6520,6 +6706,7 @@
         <w:t>LastName</w:t>
       </w:r>
       <w:proofErr w:type="spellEnd"/>
+      <w:proofErr w:type="gramEnd"/>
       <w:r>
         <w:rPr>
           <w:rFonts w:ascii="Consolas" w:hAnsi="Consolas" w:cs="Courier New"/>
@@ -6580,7 +6767,17 @@
           <w:sz w:val="17"/>
           <w:szCs w:val="17"/>
         </w:rPr>
-        <w:t xml:space="preserve">    </w:t>
+        <w:t xml:space="preserve">  </w:t>
+      </w:r>
+      <w:proofErr w:type="gramStart"/>
+      <w:r>
+        <w:rPr>
+          <w:rFonts w:ascii="Consolas" w:hAnsi="Consolas" w:cs="Courier New"/>
+          <w:color w:val="000000"/>
+          <w:sz w:val="17"/>
+          <w:szCs w:val="17"/>
+        </w:rPr>
+        <w:t xml:space="preserve">  </w:t>
       </w:r>
       <w:r>
         <w:rPr>
@@ -6591,6 +6788,7 @@
         </w:rPr>
         <w:t>}</w:t>
       </w:r>
+      <w:proofErr w:type="gramEnd"/>
     </w:p>
     <w:p>
       <w:pPr>
@@ -6627,6 +6825,7 @@
           <w:szCs w:val="17"/>
         </w:rPr>
       </w:pPr>
+      <w:proofErr w:type="gramStart"/>
       <w:r>
         <w:rPr>
           <w:rFonts w:ascii="Consolas" w:hAnsi="Consolas" w:cs="Courier New"/>
@@ -6644,6 +6843,7 @@
         </w:rPr>
         <w:t>}</w:t>
       </w:r>
+      <w:proofErr w:type="gramEnd"/>
     </w:p>
     <w:p>
       <w:pPr>
@@ -6862,6 +7062,7 @@
         <w:t xml:space="preserve"> </w:t>
       </w:r>
       <w:proofErr w:type="spellStart"/>
+      <w:proofErr w:type="gramStart"/>
       <w:r>
         <w:rPr>
           <w:rFonts w:ascii="Consolas" w:hAnsi="Consolas" w:cs="Courier New"/>
@@ -6881,6 +7082,7 @@
         </w:rPr>
         <w:t>(</w:t>
       </w:r>
+      <w:proofErr w:type="gramEnd"/>
       <w:r>
         <w:rPr>
           <w:rFonts w:ascii="Consolas" w:hAnsi="Consolas" w:cs="Courier New"/>
@@ -7018,6 +7220,7 @@
         </w:rPr>
         <w:t xml:space="preserve"> </w:t>
       </w:r>
+      <w:proofErr w:type="gramStart"/>
       <w:r>
         <w:rPr>
           <w:rFonts w:ascii="Consolas" w:hAnsi="Consolas" w:cs="Courier New"/>
@@ -7045,6 +7248,7 @@
         </w:rPr>
         <w:t>...</w:t>
       </w:r>
+      <w:proofErr w:type="gramEnd"/>
       <w:r>
         <w:rPr>
           <w:rFonts w:ascii="Consolas" w:hAnsi="Consolas" w:cs="Courier New"/>
@@ -7279,6 +7483,7 @@
         <w:t xml:space="preserve"> </w:t>
       </w:r>
       <w:proofErr w:type="spellStart"/>
+      <w:proofErr w:type="gramStart"/>
       <w:r>
         <w:rPr>
           <w:rFonts w:ascii="Consolas" w:hAnsi="Consolas" w:cs="Courier New"/>
@@ -7298,6 +7503,7 @@
         </w:rPr>
         <w:t>(</w:t>
       </w:r>
+      <w:proofErr w:type="gramEnd"/>
       <w:r>
         <w:rPr>
           <w:rFonts w:ascii="Consolas" w:hAnsi="Consolas" w:cs="Courier New"/>
@@ -7435,6 +7641,7 @@
         </w:rPr>
         <w:t xml:space="preserve"> </w:t>
       </w:r>
+      <w:proofErr w:type="gramStart"/>
       <w:r>
         <w:rPr>
           <w:rFonts w:ascii="Consolas" w:hAnsi="Consolas" w:cs="Courier New"/>
@@ -7462,6 +7669,7 @@
         </w:rPr>
         <w:t>...</w:t>
       </w:r>
+      <w:proofErr w:type="gramEnd"/>
       <w:r>
         <w:rPr>
           <w:rFonts w:ascii="Consolas" w:hAnsi="Consolas" w:cs="Courier New"/>
@@ -7975,6 +8183,7 @@
         <w:t>(</w:t>
       </w:r>
       <w:proofErr w:type="spellStart"/>
+      <w:proofErr w:type="gramStart"/>
       <w:r>
         <w:rPr>
           <w:rFonts w:ascii="Consolas" w:hAnsi="Consolas" w:cs="Courier New"/>
@@ -8003,6 +8212,7 @@
         <w:t>IsNullOrWhiteSpace</w:t>
       </w:r>
       <w:proofErr w:type="spellEnd"/>
+      <w:proofErr w:type="gramEnd"/>
       <w:r>
         <w:rPr>
           <w:rFonts w:ascii="Consolas" w:hAnsi="Consolas" w:cs="Courier New"/>
@@ -8148,14 +8358,25 @@
         </w:rPr>
         <w:t>T</w:t>
       </w:r>
-      <w:r>
-        <w:rPr>
-          <w:rFonts w:ascii="Consolas" w:hAnsi="Consolas" w:cs="Courier New"/>
-          <w:color w:val="666600"/>
-          <w:sz w:val="17"/>
-          <w:szCs w:val="17"/>
-        </w:rPr>
-        <w:t>&gt;();</w:t>
+      <w:proofErr w:type="gramStart"/>
+      <w:r>
+        <w:rPr>
+          <w:rFonts w:ascii="Consolas" w:hAnsi="Consolas" w:cs="Courier New"/>
+          <w:color w:val="666600"/>
+          <w:sz w:val="17"/>
+          <w:szCs w:val="17"/>
+        </w:rPr>
+        <w:t>&gt;(</w:t>
+      </w:r>
+      <w:proofErr w:type="gramEnd"/>
+      <w:r>
+        <w:rPr>
+          <w:rFonts w:ascii="Consolas" w:hAnsi="Consolas" w:cs="Courier New"/>
+          <w:color w:val="666600"/>
+          <w:sz w:val="17"/>
+          <w:szCs w:val="17"/>
+        </w:rPr>
+        <w:t>);</w:t>
       </w:r>
     </w:p>
     <w:p>
@@ -8282,6 +8503,7 @@
         <w:t xml:space="preserve"> </w:t>
       </w:r>
       <w:proofErr w:type="spellStart"/>
+      <w:proofErr w:type="gramStart"/>
       <w:r>
         <w:rPr>
           <w:rFonts w:ascii="Consolas" w:hAnsi="Consolas" w:cs="Courier New"/>
@@ -8310,6 +8532,7 @@
         <w:t>Where</w:t>
       </w:r>
       <w:proofErr w:type="spellEnd"/>
+      <w:proofErr w:type="gramEnd"/>
       <w:r>
         <w:rPr>
           <w:rFonts w:ascii="Consolas" w:hAnsi="Consolas" w:cs="Courier New"/>
@@ -8388,7 +8611,17 @@
           <w:sz w:val="17"/>
           <w:szCs w:val="17"/>
         </w:rPr>
-        <w:t xml:space="preserve">    </w:t>
+        <w:t xml:space="preserve"> </w:t>
+      </w:r>
+      <w:proofErr w:type="gramStart"/>
+      <w:r>
+        <w:rPr>
+          <w:rFonts w:ascii="Consolas" w:hAnsi="Consolas" w:cs="Courier New"/>
+          <w:color w:val="000000"/>
+          <w:sz w:val="17"/>
+          <w:szCs w:val="17"/>
+        </w:rPr>
+        <w:t xml:space="preserve">   </w:t>
       </w:r>
       <w:r>
         <w:rPr>
@@ -8399,6 +8632,7 @@
         </w:rPr>
         <w:t>{</w:t>
       </w:r>
+      <w:proofErr w:type="gramEnd"/>
     </w:p>
     <w:p>
       <w:pPr>
@@ -8695,6 +8929,7 @@
         <w:t xml:space="preserve"> </w:t>
       </w:r>
       <w:proofErr w:type="spellStart"/>
+      <w:proofErr w:type="gramStart"/>
       <w:r>
         <w:rPr>
           <w:rFonts w:ascii="Consolas" w:hAnsi="Consolas" w:cs="Courier New"/>
@@ -8723,6 +8958,7 @@
         <w:t>Contains</w:t>
       </w:r>
       <w:proofErr w:type="spellEnd"/>
+      <w:proofErr w:type="gramEnd"/>
       <w:r>
         <w:rPr>
           <w:rFonts w:ascii="Consolas" w:hAnsi="Consolas" w:cs="Courier New"/>
@@ -8850,7 +9086,17 @@
           <w:sz w:val="17"/>
           <w:szCs w:val="17"/>
         </w:rPr>
-        <w:t xml:space="preserve">    </w:t>
+        <w:t xml:space="preserve">  </w:t>
+      </w:r>
+      <w:proofErr w:type="gramStart"/>
+      <w:r>
+        <w:rPr>
+          <w:rFonts w:ascii="Consolas" w:hAnsi="Consolas" w:cs="Courier New"/>
+          <w:color w:val="000000"/>
+          <w:sz w:val="17"/>
+          <w:szCs w:val="17"/>
+        </w:rPr>
+        <w:t xml:space="preserve">  </w:t>
       </w:r>
       <w:r>
         <w:rPr>
@@ -8872,6 +9118,7 @@
         <w:t>ToList</w:t>
       </w:r>
       <w:proofErr w:type="spellEnd"/>
+      <w:proofErr w:type="gramEnd"/>
       <w:r>
         <w:rPr>
           <w:rFonts w:ascii="Consolas" w:hAnsi="Consolas" w:cs="Courier New"/>
@@ -8917,6 +9164,7 @@
           <w:szCs w:val="17"/>
         </w:rPr>
       </w:pPr>
+      <w:proofErr w:type="gramStart"/>
       <w:r>
         <w:rPr>
           <w:rFonts w:ascii="Consolas" w:hAnsi="Consolas" w:cs="Courier New"/>
@@ -8934,6 +9182,7 @@
         </w:rPr>
         <w:t>}</w:t>
       </w:r>
+      <w:proofErr w:type="gramEnd"/>
     </w:p>
     <w:p>
       <w:pPr>
@@ -9157,6 +9406,7 @@
         <w:t> </w:t>
       </w:r>
       <w:proofErr w:type="spellStart"/>
+      <w:proofErr w:type="gramStart"/>
       <w:r>
         <w:rPr>
           <w:strike/>
@@ -9168,13 +9418,21 @@
         <w:rPr>
           <w:strike/>
         </w:rPr>
-        <w:t>(), </w:t>
-      </w:r>
-      <w:proofErr w:type="spellStart"/>
+        <w:t>(</w:t>
+      </w:r>
+      <w:proofErr w:type="gramEnd"/>
       <w:r>
         <w:rPr>
           <w:strike/>
         </w:rPr>
+        <w:t>), </w:t>
+      </w:r>
+      <w:proofErr w:type="spellStart"/>
+      <w:proofErr w:type="gramStart"/>
+      <w:r>
+        <w:rPr>
+          <w:strike/>
+        </w:rPr>
         <w:t>ReturnBook</w:t>
       </w:r>
       <w:proofErr w:type="spellEnd"/>
@@ -9182,13 +9440,21 @@
         <w:rPr>
           <w:strike/>
         </w:rPr>
-        <w:t>(), </w:t>
-      </w:r>
-      <w:proofErr w:type="spellStart"/>
+        <w:t>(</w:t>
+      </w:r>
+      <w:proofErr w:type="gramEnd"/>
       <w:r>
         <w:rPr>
           <w:strike/>
         </w:rPr>
+        <w:t>), </w:t>
+      </w:r>
+      <w:proofErr w:type="spellStart"/>
+      <w:proofErr w:type="gramStart"/>
+      <w:r>
+        <w:rPr>
+          <w:strike/>
+        </w:rPr>
         <w:t>RenewLoan</w:t>
       </w:r>
       <w:proofErr w:type="spellEnd"/>
@@ -9196,7 +9462,14 @@
         <w:rPr>
           <w:strike/>
         </w:rPr>
-        <w:t>().</w:t>
+        <w:t>(</w:t>
+      </w:r>
+      <w:proofErr w:type="gramEnd"/>
+      <w:r>
+        <w:rPr>
+          <w:strike/>
+        </w:rPr>
+        <w:t>).</w:t>
       </w:r>
     </w:p>
     <w:p>
@@ -9522,6 +9795,7 @@
         <w:t> in Book. When a book is borrowed, you call </w:t>
       </w:r>
       <w:proofErr w:type="spellStart"/>
+      <w:proofErr w:type="gramStart"/>
       <w:r>
         <w:rPr>
           <w:strike/>
@@ -9533,7 +9807,14 @@
         <w:rPr>
           <w:strike/>
         </w:rPr>
-        <w:t>().</w:t>
+        <w:t>(</w:t>
+      </w:r>
+      <w:proofErr w:type="gramEnd"/>
+      <w:r>
+        <w:rPr>
+          <w:strike/>
+        </w:rPr>
+        <w:t>).</w:t>
       </w:r>
     </w:p>
     <w:p>
@@ -9739,7 +10020,35 @@
         <w:rPr>
           <w:strike/>
         </w:rPr>
-        <w:t xml:space="preserve"> { get; private set; }.</w:t>
+        <w:t xml:space="preserve"> </w:t>
+      </w:r>
+      <w:proofErr w:type="gramStart"/>
+      <w:r>
+        <w:rPr>
+          <w:strike/>
+        </w:rPr>
+        <w:t>{ get</w:t>
+      </w:r>
+      <w:proofErr w:type="gramEnd"/>
+      <w:r>
+        <w:rPr>
+          <w:strike/>
+        </w:rPr>
+        <w:t>; private set</w:t>
+      </w:r>
+      <w:proofErr w:type="gramStart"/>
+      <w:r>
+        <w:rPr>
+          <w:strike/>
+        </w:rPr>
+        <w:t>; }</w:t>
+      </w:r>
+      <w:proofErr w:type="gramEnd"/>
+      <w:r>
+        <w:rPr>
+          <w:strike/>
+        </w:rPr>
+        <w:t>.</w:t>
       </w:r>
     </w:p>
     <w:p>
@@ -9910,12 +10219,17 @@
         <w:t>if (</w:t>
       </w:r>
       <w:proofErr w:type="spellStart"/>
+      <w:proofErr w:type="gramStart"/>
       <w:r>
         <w:t>CurrentUser.Role</w:t>
       </w:r>
       <w:proofErr w:type="spellEnd"/>
       <w:r>
-        <w:t xml:space="preserve"> != </w:t>
+        <w:t xml:space="preserve"> !</w:t>
+      </w:r>
+      <w:proofErr w:type="gramEnd"/>
+      <w:r>
+        <w:t xml:space="preserve">= </w:t>
       </w:r>
       <w:proofErr w:type="spellStart"/>
       <w:r>
@@ -9923,7 +10237,23 @@
       </w:r>
       <w:proofErr w:type="spellEnd"/>
       <w:r>
-        <w:t>) { Hide/Disable "Manage Users" or "Remove Book" }.</w:t>
+        <w:t xml:space="preserve">) </w:t>
+      </w:r>
+      <w:proofErr w:type="gramStart"/>
+      <w:r>
+        <w:t>{ Hide</w:t>
+      </w:r>
+      <w:proofErr w:type="gramEnd"/>
+      <w:r>
+        <w:t>/Disable "Manage Users" or "Remove Book</w:t>
+      </w:r>
+      <w:proofErr w:type="gramStart"/>
+      <w:r>
+        <w:t>" }</w:t>
+      </w:r>
+      <w:proofErr w:type="gramEnd"/>
+      <w:r>
+        <w:t>.</w:t>
       </w:r>
     </w:p>
     <w:p>
@@ -10155,12 +10485,17 @@
         <w:t> </w:t>
       </w:r>
       <w:proofErr w:type="spellStart"/>
+      <w:proofErr w:type="gramStart"/>
       <w:r>
         <w:t>GetOverdueLoans</w:t>
       </w:r>
       <w:proofErr w:type="spellEnd"/>
       <w:r>
-        <w:t>() in </w:t>
+        <w:t>(</w:t>
+      </w:r>
+      <w:proofErr w:type="gramEnd"/>
+      <w:r>
+        <w:t>) in </w:t>
       </w:r>
       <w:proofErr w:type="spellStart"/>
       <w:r>
@@ -10194,7 +10529,15 @@
         </w:numPr>
       </w:pPr>
       <w:r>
-        <w:t>You can view Author details and Book details, but can you view a Member's history?</w:t>
+        <w:t xml:space="preserve">You can view Author details and Book details, but can you view a </w:t>
+      </w:r>
+      <w:proofErr w:type="gramStart"/>
+      <w:r>
+        <w:t>Member's</w:t>
+      </w:r>
+      <w:proofErr w:type="gramEnd"/>
+      <w:r>
+        <w:t xml:space="preserve"> history?</w:t>
       </w:r>
     </w:p>
     <w:p>
@@ -10364,13 +10707,23 @@
       </w:r>
       <w:proofErr w:type="spellEnd"/>
       <w:r>
-        <w:t> static class or a </w:t>
-      </w:r>
-      <w:proofErr w:type="spellStart"/>
+        <w:t xml:space="preserve"> static class or </w:t>
+      </w:r>
+      <w:proofErr w:type="gramStart"/>
+      <w:r>
+        <w:t>a</w:t>
+      </w:r>
+      <w:proofErr w:type="gramEnd"/>
+      <w:r>
+        <w:t> </w:t>
+      </w:r>
+      <w:proofErr w:type="spellStart"/>
+      <w:proofErr w:type="gramStart"/>
       <w:r>
         <w:t>appsettings.json</w:t>
       </w:r>
       <w:proofErr w:type="spellEnd"/>
+      <w:proofErr w:type="gramEnd"/>
       <w:r>
         <w:t> (if you integrate it early) to read these values. This makes the system flexible.</w:t>
       </w:r>
@@ -10682,6 +11035,7 @@
         <w:t xml:space="preserve"> </w:t>
       </w:r>
       <w:proofErr w:type="spellStart"/>
+      <w:proofErr w:type="gramStart"/>
       <w:r>
         <w:rPr>
           <w:rFonts w:ascii="Consolas" w:hAnsi="Consolas" w:cs="Courier New"/>
@@ -10728,6 +11082,7 @@
         <w:t>Concurrent</w:t>
       </w:r>
       <w:proofErr w:type="spellEnd"/>
+      <w:proofErr w:type="gramEnd"/>
       <w:r>
         <w:rPr>
           <w:rFonts w:ascii="Consolas" w:hAnsi="Consolas" w:cs="Courier New"/>
@@ -10800,6 +11155,7 @@
         <w:t xml:space="preserve"> </w:t>
       </w:r>
       <w:proofErr w:type="spellStart"/>
+      <w:proofErr w:type="gramStart"/>
       <w:r>
         <w:rPr>
           <w:rFonts w:ascii="Consolas" w:hAnsi="Consolas" w:cs="Courier New"/>
@@ -10846,6 +11202,7 @@
         <w:t>Entities</w:t>
       </w:r>
       <w:proofErr w:type="spellEnd"/>
+      <w:proofErr w:type="gramEnd"/>
       <w:r>
         <w:rPr>
           <w:rFonts w:ascii="Consolas" w:hAnsi="Consolas" w:cs="Courier New"/>
@@ -10918,6 +11275,7 @@
         <w:t xml:space="preserve"> </w:t>
       </w:r>
       <w:proofErr w:type="spellStart"/>
+      <w:proofErr w:type="gramStart"/>
       <w:r>
         <w:rPr>
           <w:rFonts w:ascii="Consolas" w:hAnsi="Consolas" w:cs="Courier New"/>
@@ -10964,6 +11322,7 @@
         <w:t>Interfaces</w:t>
       </w:r>
       <w:proofErr w:type="spellEnd"/>
+      <w:proofErr w:type="gramEnd"/>
       <w:r>
         <w:rPr>
           <w:rFonts w:ascii="Consolas" w:hAnsi="Consolas" w:cs="Courier New"/>
@@ -11089,6 +11448,7 @@
         <w:t xml:space="preserve"> </w:t>
       </w:r>
       <w:proofErr w:type="spellStart"/>
+      <w:proofErr w:type="gramStart"/>
       <w:r>
         <w:rPr>
           <w:rFonts w:ascii="Consolas" w:hAnsi="Consolas" w:cs="Courier New"/>
@@ -11153,6 +11513,7 @@
         <w:t>InMemory</w:t>
       </w:r>
       <w:proofErr w:type="spellEnd"/>
+      <w:proofErr w:type="gramEnd"/>
       <w:r>
         <w:rPr>
           <w:rFonts w:ascii="Consolas" w:hAnsi="Consolas" w:cs="Courier New"/>
@@ -11296,6 +11657,7 @@
         <w:t xml:space="preserve"> </w:t>
       </w:r>
       <w:proofErr w:type="spellStart"/>
+      <w:proofErr w:type="gramStart"/>
       <w:r>
         <w:rPr>
           <w:rFonts w:ascii="Consolas" w:hAnsi="Consolas" w:cs="Courier New"/>
@@ -11324,6 +11686,7 @@
         </w:rPr>
         <w:t>:</w:t>
       </w:r>
+      <w:proofErr w:type="gramEnd"/>
       <w:r>
         <w:rPr>
           <w:rFonts w:ascii="Consolas" w:hAnsi="Consolas" w:cs="Courier New"/>
@@ -11580,6 +11943,7 @@
         </w:rPr>
         <w:t xml:space="preserve"> </w:t>
       </w:r>
+      <w:proofErr w:type="gramStart"/>
       <w:r>
         <w:rPr>
           <w:rFonts w:ascii="Consolas" w:hAnsi="Consolas" w:cs="Courier New"/>
@@ -11596,7 +11960,17 @@
           <w:sz w:val="17"/>
           <w:szCs w:val="17"/>
         </w:rPr>
-        <w:t>();</w:t>
+        <w:t>(</w:t>
+      </w:r>
+      <w:proofErr w:type="gramEnd"/>
+      <w:r>
+        <w:rPr>
+          <w:rFonts w:ascii="Consolas" w:hAnsi="Consolas" w:cs="Courier New"/>
+          <w:color w:val="666600"/>
+          <w:sz w:val="17"/>
+          <w:szCs w:val="17"/>
+        </w:rPr>
+        <w:t>);</w:t>
       </w:r>
     </w:p>
     <w:p>
@@ -11913,6 +12287,7 @@
         <w:t xml:space="preserve"> </w:t>
       </w:r>
       <w:proofErr w:type="spellStart"/>
+      <w:proofErr w:type="gramStart"/>
       <w:r>
         <w:rPr>
           <w:rFonts w:ascii="Consolas" w:hAnsi="Consolas" w:cs="Courier New"/>
@@ -11932,6 +12307,7 @@
         </w:rPr>
         <w:t>(</w:t>
       </w:r>
+      <w:proofErr w:type="gramEnd"/>
       <w:r>
         <w:rPr>
           <w:rFonts w:ascii="Consolas" w:hAnsi="Consolas" w:cs="Courier New"/>
@@ -12010,7 +12386,17 @@
           <w:sz w:val="17"/>
           <w:szCs w:val="17"/>
         </w:rPr>
-        <w:t xml:space="preserve">    </w:t>
+        <w:t xml:space="preserve"> </w:t>
+      </w:r>
+      <w:proofErr w:type="gramStart"/>
+      <w:r>
+        <w:rPr>
+          <w:rFonts w:ascii="Consolas" w:hAnsi="Consolas" w:cs="Courier New"/>
+          <w:color w:val="000000"/>
+          <w:sz w:val="17"/>
+          <w:szCs w:val="17"/>
+        </w:rPr>
+        <w:t xml:space="preserve">   </w:t>
       </w:r>
       <w:r>
         <w:rPr>
@@ -12021,6 +12407,7 @@
         </w:rPr>
         <w:t>{</w:t>
       </w:r>
+      <w:proofErr w:type="gramEnd"/>
     </w:p>
     <w:p>
       <w:pPr>
@@ -12075,6 +12462,7 @@
         <w:t xml:space="preserve">        </w:t>
       </w:r>
       <w:proofErr w:type="spellStart"/>
+      <w:proofErr w:type="gramStart"/>
       <w:r>
         <w:rPr>
           <w:rFonts w:ascii="Consolas" w:hAnsi="Consolas" w:cs="Courier New"/>
@@ -12103,6 +12491,7 @@
         <w:t>Id</w:t>
       </w:r>
       <w:proofErr w:type="spellEnd"/>
+      <w:proofErr w:type="gramEnd"/>
       <w:r>
         <w:rPr>
           <w:rFonts w:ascii="Consolas" w:hAnsi="Consolas" w:cs="Courier New"/>
@@ -12269,6 +12658,7 @@
         <w:t>[</w:t>
       </w:r>
       <w:proofErr w:type="spellStart"/>
+      <w:proofErr w:type="gramStart"/>
       <w:r>
         <w:rPr>
           <w:rFonts w:ascii="Consolas" w:hAnsi="Consolas" w:cs="Courier New"/>
@@ -12297,6 +12687,7 @@
         <w:t>Id</w:t>
       </w:r>
       <w:proofErr w:type="spellEnd"/>
+      <w:proofErr w:type="gramEnd"/>
       <w:r>
         <w:rPr>
           <w:rFonts w:ascii="Consolas" w:hAnsi="Consolas" w:cs="Courier New"/>
@@ -12520,7 +12911,17 @@
           <w:sz w:val="17"/>
           <w:szCs w:val="17"/>
         </w:rPr>
-        <w:t xml:space="preserve">    </w:t>
+        <w:t xml:space="preserve">  </w:t>
+      </w:r>
+      <w:proofErr w:type="gramStart"/>
+      <w:r>
+        <w:rPr>
+          <w:rFonts w:ascii="Consolas" w:hAnsi="Consolas" w:cs="Courier New"/>
+          <w:color w:val="000000"/>
+          <w:sz w:val="17"/>
+          <w:szCs w:val="17"/>
+        </w:rPr>
+        <w:t xml:space="preserve">  </w:t>
       </w:r>
       <w:r>
         <w:rPr>
@@ -12531,6 +12932,7 @@
         </w:rPr>
         <w:t>}</w:t>
       </w:r>
+      <w:proofErr w:type="gramEnd"/>
     </w:p>
     <w:p>
       <w:pPr>
@@ -12701,6 +13103,7 @@
         <w:t xml:space="preserve"> </w:t>
       </w:r>
       <w:proofErr w:type="spellStart"/>
+      <w:proofErr w:type="gramStart"/>
       <w:r>
         <w:rPr>
           <w:rFonts w:ascii="Consolas" w:hAnsi="Consolas" w:cs="Courier New"/>
@@ -12720,6 +13123,7 @@
         </w:rPr>
         <w:t>(</w:t>
       </w:r>
+      <w:proofErr w:type="gramEnd"/>
       <w:r>
         <w:rPr>
           <w:rFonts w:ascii="Consolas" w:hAnsi="Consolas" w:cs="Courier New"/>
@@ -12798,7 +13202,17 @@
           <w:sz w:val="17"/>
           <w:szCs w:val="17"/>
         </w:rPr>
-        <w:t xml:space="preserve">    </w:t>
+        <w:t xml:space="preserve"> </w:t>
+      </w:r>
+      <w:proofErr w:type="gramStart"/>
+      <w:r>
+        <w:rPr>
+          <w:rFonts w:ascii="Consolas" w:hAnsi="Consolas" w:cs="Courier New"/>
+          <w:color w:val="000000"/>
+          <w:sz w:val="17"/>
+          <w:szCs w:val="17"/>
+        </w:rPr>
+        <w:t xml:space="preserve">   </w:t>
       </w:r>
       <w:r>
         <w:rPr>
@@ -12809,6 +13223,7 @@
         </w:rPr>
         <w:t>{</w:t>
       </w:r>
+      <w:proofErr w:type="gramEnd"/>
     </w:p>
     <w:p>
       <w:pPr>
@@ -12863,6 +13278,7 @@
         <w:t xml:space="preserve">        _</w:t>
       </w:r>
       <w:proofErr w:type="spellStart"/>
+      <w:proofErr w:type="gramStart"/>
       <w:r>
         <w:rPr>
           <w:rFonts w:ascii="Consolas" w:hAnsi="Consolas" w:cs="Courier New"/>
@@ -12891,6 +13307,7 @@
         <w:t>TryGetValue</w:t>
       </w:r>
       <w:proofErr w:type="spellEnd"/>
+      <w:proofErr w:type="gramEnd"/>
       <w:r>
         <w:rPr>
           <w:rFonts w:ascii="Consolas" w:hAnsi="Consolas" w:cs="Courier New"/>
@@ -13150,7 +13567,17 @@
           <w:sz w:val="17"/>
           <w:szCs w:val="17"/>
         </w:rPr>
-        <w:t xml:space="preserve">    </w:t>
+        <w:t xml:space="preserve">  </w:t>
+      </w:r>
+      <w:proofErr w:type="gramStart"/>
+      <w:r>
+        <w:rPr>
+          <w:rFonts w:ascii="Consolas" w:hAnsi="Consolas" w:cs="Courier New"/>
+          <w:color w:val="000000"/>
+          <w:sz w:val="17"/>
+          <w:szCs w:val="17"/>
+        </w:rPr>
+        <w:t xml:space="preserve">  </w:t>
       </w:r>
       <w:r>
         <w:rPr>
@@ -13161,6 +13588,7 @@
         </w:rPr>
         <w:t>}</w:t>
       </w:r>
+      <w:proofErr w:type="gramEnd"/>
     </w:p>
     <w:p>
       <w:pPr>
@@ -13197,6 +13625,7 @@
           <w:szCs w:val="17"/>
         </w:rPr>
       </w:pPr>
+      <w:proofErr w:type="gramStart"/>
       <w:r>
         <w:rPr>
           <w:rFonts w:ascii="Consolas" w:hAnsi="Consolas" w:cs="Courier New"/>
@@ -13214,6 +13643,7 @@
         </w:rPr>
         <w:t>}</w:t>
       </w:r>
+      <w:proofErr w:type="gramEnd"/>
     </w:p>
     <w:p>
       <w:pPr>
@@ -13243,10 +13673,12 @@
         <w:t xml:space="preserve"> Menus shouldn't manually instantiate service implementations or repositories. A Dependency Injection (DI) container should manage object lifetimes and inject interface dependencies directly. Configure the Microsoft DI Container (</w:t>
       </w:r>
       <w:proofErr w:type="spellStart"/>
+      <w:proofErr w:type="gramStart"/>
       <w:r>
         <w:t>Microsoft.Extensions.DependencyInjection</w:t>
       </w:r>
       <w:proofErr w:type="spellEnd"/>
+      <w:proofErr w:type="gramEnd"/>
       <w:r>
         <w:t>) to wire up services, repositories, and menus</w:t>
       </w:r>
@@ -13316,6 +13748,7 @@
         <w:t xml:space="preserve"> </w:t>
       </w:r>
       <w:proofErr w:type="spellStart"/>
+      <w:proofErr w:type="gramStart"/>
       <w:r>
         <w:rPr>
           <w:rFonts w:ascii="Consolas" w:hAnsi="Consolas" w:cs="Courier New"/>
@@ -13362,6 +13795,7 @@
         <w:t>DependencyInjection</w:t>
       </w:r>
       <w:proofErr w:type="spellEnd"/>
+      <w:proofErr w:type="gramEnd"/>
       <w:r>
         <w:rPr>
           <w:rFonts w:ascii="Consolas" w:hAnsi="Consolas" w:cs="Courier New"/>
@@ -13434,6 +13868,7 @@
         <w:t xml:space="preserve"> </w:t>
       </w:r>
       <w:proofErr w:type="spellStart"/>
+      <w:proofErr w:type="gramStart"/>
       <w:r>
         <w:rPr>
           <w:rFonts w:ascii="Consolas" w:hAnsi="Consolas" w:cs="Courier New"/>
@@ -13480,6 +13915,7 @@
         <w:t>Contracts</w:t>
       </w:r>
       <w:proofErr w:type="spellEnd"/>
+      <w:proofErr w:type="gramEnd"/>
       <w:r>
         <w:rPr>
           <w:rFonts w:ascii="Consolas" w:hAnsi="Consolas" w:cs="Courier New"/>
@@ -13552,6 +13988,7 @@
         <w:t xml:space="preserve"> </w:t>
       </w:r>
       <w:proofErr w:type="spellStart"/>
+      <w:proofErr w:type="gramStart"/>
       <w:r>
         <w:rPr>
           <w:rFonts w:ascii="Consolas" w:hAnsi="Consolas" w:cs="Courier New"/>
@@ -13598,6 +14035,7 @@
         <w:t>Services</w:t>
       </w:r>
       <w:proofErr w:type="spellEnd"/>
+      <w:proofErr w:type="gramEnd"/>
       <w:r>
         <w:rPr>
           <w:rFonts w:ascii="Consolas" w:hAnsi="Consolas" w:cs="Courier New"/>
@@ -13670,6 +14108,7 @@
         <w:t xml:space="preserve"> </w:t>
       </w:r>
       <w:proofErr w:type="spellStart"/>
+      <w:proofErr w:type="gramStart"/>
       <w:r>
         <w:rPr>
           <w:rFonts w:ascii="Consolas" w:hAnsi="Consolas" w:cs="Courier New"/>
@@ -13716,6 +14155,7 @@
         <w:t>Interfaces</w:t>
       </w:r>
       <w:proofErr w:type="spellEnd"/>
+      <w:proofErr w:type="gramEnd"/>
       <w:r>
         <w:rPr>
           <w:rFonts w:ascii="Consolas" w:hAnsi="Consolas" w:cs="Courier New"/>
@@ -13788,6 +14228,7 @@
         <w:t xml:space="preserve"> </w:t>
       </w:r>
       <w:proofErr w:type="spellStart"/>
+      <w:proofErr w:type="gramStart"/>
       <w:r>
         <w:rPr>
           <w:rFonts w:ascii="Consolas" w:hAnsi="Consolas" w:cs="Courier New"/>
@@ -13852,6 +14293,7 @@
         <w:t>InMemory</w:t>
       </w:r>
       <w:proofErr w:type="spellEnd"/>
+      <w:proofErr w:type="gramEnd"/>
       <w:r>
         <w:rPr>
           <w:rFonts w:ascii="Consolas" w:hAnsi="Consolas" w:cs="Courier New"/>
@@ -13924,6 +14366,7 @@
         <w:t xml:space="preserve"> </w:t>
       </w:r>
       <w:proofErr w:type="spellStart"/>
+      <w:proofErr w:type="gramStart"/>
       <w:r>
         <w:rPr>
           <w:rFonts w:ascii="Consolas" w:hAnsi="Consolas" w:cs="Courier New"/>
@@ -13988,6 +14431,7 @@
         <w:t>Menus</w:t>
       </w:r>
       <w:proofErr w:type="spellEnd"/>
+      <w:proofErr w:type="gramEnd"/>
       <w:r>
         <w:rPr>
           <w:rFonts w:ascii="Consolas" w:hAnsi="Consolas" w:cs="Courier New"/>
@@ -14150,6 +14594,7 @@
         <w:t xml:space="preserve"> </w:t>
       </w:r>
       <w:proofErr w:type="spellStart"/>
+      <w:proofErr w:type="gramStart"/>
       <w:r>
         <w:rPr>
           <w:rFonts w:ascii="Consolas" w:hAnsi="Consolas" w:cs="Courier New"/>
@@ -14167,7 +14612,17 @@
           <w:sz w:val="17"/>
           <w:szCs w:val="17"/>
         </w:rPr>
-        <w:t>();</w:t>
+        <w:t>(</w:t>
+      </w:r>
+      <w:proofErr w:type="gramEnd"/>
+      <w:r>
+        <w:rPr>
+          <w:rFonts w:ascii="Consolas" w:hAnsi="Consolas" w:cs="Courier New"/>
+          <w:color w:val="666600"/>
+          <w:sz w:val="17"/>
+          <w:szCs w:val="17"/>
+        </w:rPr>
+        <w:t>);</w:t>
       </w:r>
     </w:p>
     <w:p>
@@ -14320,6 +14775,7 @@
         <w:t xml:space="preserve">11. </w:t>
       </w:r>
       <w:proofErr w:type="spellStart"/>
+      <w:proofErr w:type="gramStart"/>
       <w:r>
         <w:rPr>
           <w:rFonts w:ascii="Consolas" w:hAnsi="Consolas" w:cs="Courier New"/>
@@ -14348,6 +14804,7 @@
         <w:t>AddSingleton</w:t>
       </w:r>
       <w:proofErr w:type="spellEnd"/>
+      <w:proofErr w:type="gramEnd"/>
       <w:r>
         <w:rPr>
           <w:rFonts w:ascii="Consolas" w:hAnsi="Consolas" w:cs="Courier New"/>
@@ -14397,14 +14854,25 @@
         <w:t>InMemoryAuthorRepository</w:t>
       </w:r>
       <w:proofErr w:type="spellEnd"/>
-      <w:r>
-        <w:rPr>
-          <w:rFonts w:ascii="Consolas" w:hAnsi="Consolas" w:cs="Courier New"/>
-          <w:color w:val="666600"/>
-          <w:sz w:val="17"/>
-          <w:szCs w:val="17"/>
-        </w:rPr>
-        <w:t>&gt;();</w:t>
+      <w:proofErr w:type="gramStart"/>
+      <w:r>
+        <w:rPr>
+          <w:rFonts w:ascii="Consolas" w:hAnsi="Consolas" w:cs="Courier New"/>
+          <w:color w:val="666600"/>
+          <w:sz w:val="17"/>
+          <w:szCs w:val="17"/>
+        </w:rPr>
+        <w:t>&gt;(</w:t>
+      </w:r>
+      <w:proofErr w:type="gramEnd"/>
+      <w:r>
+        <w:rPr>
+          <w:rFonts w:ascii="Consolas" w:hAnsi="Consolas" w:cs="Courier New"/>
+          <w:color w:val="666600"/>
+          <w:sz w:val="17"/>
+          <w:szCs w:val="17"/>
+        </w:rPr>
+        <w:t>);</w:t>
       </w:r>
     </w:p>
     <w:p>
@@ -14451,6 +14919,7 @@
         <w:t xml:space="preserve">12. </w:t>
       </w:r>
       <w:proofErr w:type="spellStart"/>
+      <w:proofErr w:type="gramStart"/>
       <w:r>
         <w:rPr>
           <w:rFonts w:ascii="Consolas" w:hAnsi="Consolas" w:cs="Courier New"/>
@@ -14479,6 +14948,7 @@
         <w:t>AddSingleton</w:t>
       </w:r>
       <w:proofErr w:type="spellEnd"/>
+      <w:proofErr w:type="gramEnd"/>
       <w:r>
         <w:rPr>
           <w:rFonts w:ascii="Consolas" w:hAnsi="Consolas" w:cs="Courier New"/>
@@ -14528,14 +14998,25 @@
         <w:t>InMemoryBookRepository</w:t>
       </w:r>
       <w:proofErr w:type="spellEnd"/>
-      <w:r>
-        <w:rPr>
-          <w:rFonts w:ascii="Consolas" w:hAnsi="Consolas" w:cs="Courier New"/>
-          <w:color w:val="666600"/>
-          <w:sz w:val="17"/>
-          <w:szCs w:val="17"/>
-        </w:rPr>
-        <w:t>&gt;();</w:t>
+      <w:proofErr w:type="gramStart"/>
+      <w:r>
+        <w:rPr>
+          <w:rFonts w:ascii="Consolas" w:hAnsi="Consolas" w:cs="Courier New"/>
+          <w:color w:val="666600"/>
+          <w:sz w:val="17"/>
+          <w:szCs w:val="17"/>
+        </w:rPr>
+        <w:t>&gt;(</w:t>
+      </w:r>
+      <w:proofErr w:type="gramEnd"/>
+      <w:r>
+        <w:rPr>
+          <w:rFonts w:ascii="Consolas" w:hAnsi="Consolas" w:cs="Courier New"/>
+          <w:color w:val="666600"/>
+          <w:sz w:val="17"/>
+          <w:szCs w:val="17"/>
+        </w:rPr>
+        <w:t>);</w:t>
       </w:r>
     </w:p>
     <w:p>
@@ -14582,6 +15063,7 @@
         <w:t xml:space="preserve">13. </w:t>
       </w:r>
       <w:proofErr w:type="spellStart"/>
+      <w:proofErr w:type="gramStart"/>
       <w:r>
         <w:rPr>
           <w:rFonts w:ascii="Consolas" w:hAnsi="Consolas" w:cs="Courier New"/>
@@ -14610,6 +15092,7 @@
         <w:t>AddSingleton</w:t>
       </w:r>
       <w:proofErr w:type="spellEnd"/>
+      <w:proofErr w:type="gramEnd"/>
       <w:r>
         <w:rPr>
           <w:rFonts w:ascii="Consolas" w:hAnsi="Consolas" w:cs="Courier New"/>
@@ -14659,14 +15142,25 @@
         <w:t>InMemoryLoanRepository</w:t>
       </w:r>
       <w:proofErr w:type="spellEnd"/>
-      <w:r>
-        <w:rPr>
-          <w:rFonts w:ascii="Consolas" w:hAnsi="Consolas" w:cs="Courier New"/>
-          <w:color w:val="666600"/>
-          <w:sz w:val="17"/>
-          <w:szCs w:val="17"/>
-        </w:rPr>
-        <w:t>&gt;();</w:t>
+      <w:proofErr w:type="gramStart"/>
+      <w:r>
+        <w:rPr>
+          <w:rFonts w:ascii="Consolas" w:hAnsi="Consolas" w:cs="Courier New"/>
+          <w:color w:val="666600"/>
+          <w:sz w:val="17"/>
+          <w:szCs w:val="17"/>
+        </w:rPr>
+        <w:t>&gt;(</w:t>
+      </w:r>
+      <w:proofErr w:type="gramEnd"/>
+      <w:r>
+        <w:rPr>
+          <w:rFonts w:ascii="Consolas" w:hAnsi="Consolas" w:cs="Courier New"/>
+          <w:color w:val="666600"/>
+          <w:sz w:val="17"/>
+          <w:szCs w:val="17"/>
+        </w:rPr>
+        <w:t>);</w:t>
       </w:r>
     </w:p>
     <w:p>
@@ -14713,6 +15207,7 @@
         <w:t xml:space="preserve">14. </w:t>
       </w:r>
       <w:proofErr w:type="spellStart"/>
+      <w:proofErr w:type="gramStart"/>
       <w:r>
         <w:rPr>
           <w:rFonts w:ascii="Consolas" w:hAnsi="Consolas" w:cs="Courier New"/>
@@ -14741,6 +15236,7 @@
         <w:t>AddSingleton</w:t>
       </w:r>
       <w:proofErr w:type="spellEnd"/>
+      <w:proofErr w:type="gramEnd"/>
       <w:r>
         <w:rPr>
           <w:rFonts w:ascii="Consolas" w:hAnsi="Consolas" w:cs="Courier New"/>
@@ -14790,14 +15286,25 @@
         <w:t>InMemoryUserRepository</w:t>
       </w:r>
       <w:proofErr w:type="spellEnd"/>
-      <w:r>
-        <w:rPr>
-          <w:rFonts w:ascii="Consolas" w:hAnsi="Consolas" w:cs="Courier New"/>
-          <w:color w:val="666600"/>
-          <w:sz w:val="17"/>
-          <w:szCs w:val="17"/>
-        </w:rPr>
-        <w:t>&gt;();</w:t>
+      <w:proofErr w:type="gramStart"/>
+      <w:r>
+        <w:rPr>
+          <w:rFonts w:ascii="Consolas" w:hAnsi="Consolas" w:cs="Courier New"/>
+          <w:color w:val="666600"/>
+          <w:sz w:val="17"/>
+          <w:szCs w:val="17"/>
+        </w:rPr>
+        <w:t>&gt;(</w:t>
+      </w:r>
+      <w:proofErr w:type="gramEnd"/>
+      <w:r>
+        <w:rPr>
+          <w:rFonts w:ascii="Consolas" w:hAnsi="Consolas" w:cs="Courier New"/>
+          <w:color w:val="666600"/>
+          <w:sz w:val="17"/>
+          <w:szCs w:val="17"/>
+        </w:rPr>
+        <w:t>);</w:t>
       </w:r>
     </w:p>
     <w:p>
@@ -14950,6 +15457,7 @@
         <w:t xml:space="preserve">17. </w:t>
       </w:r>
       <w:proofErr w:type="spellStart"/>
+      <w:proofErr w:type="gramStart"/>
       <w:r>
         <w:rPr>
           <w:rFonts w:ascii="Consolas" w:hAnsi="Consolas" w:cs="Courier New"/>
@@ -14978,6 +15486,7 @@
         <w:t>AddTransient</w:t>
       </w:r>
       <w:proofErr w:type="spellEnd"/>
+      <w:proofErr w:type="gramEnd"/>
       <w:r>
         <w:rPr>
           <w:rFonts w:ascii="Consolas" w:hAnsi="Consolas" w:cs="Courier New"/>
@@ -15027,14 +15536,25 @@
         <w:t>AuthorManagementService</w:t>
       </w:r>
       <w:proofErr w:type="spellEnd"/>
-      <w:r>
-        <w:rPr>
-          <w:rFonts w:ascii="Consolas" w:hAnsi="Consolas" w:cs="Courier New"/>
-          <w:color w:val="666600"/>
-          <w:sz w:val="17"/>
-          <w:szCs w:val="17"/>
-        </w:rPr>
-        <w:t>&gt;();</w:t>
+      <w:proofErr w:type="gramStart"/>
+      <w:r>
+        <w:rPr>
+          <w:rFonts w:ascii="Consolas" w:hAnsi="Consolas" w:cs="Courier New"/>
+          <w:color w:val="666600"/>
+          <w:sz w:val="17"/>
+          <w:szCs w:val="17"/>
+        </w:rPr>
+        <w:t>&gt;(</w:t>
+      </w:r>
+      <w:proofErr w:type="gramEnd"/>
+      <w:r>
+        <w:rPr>
+          <w:rFonts w:ascii="Consolas" w:hAnsi="Consolas" w:cs="Courier New"/>
+          <w:color w:val="666600"/>
+          <w:sz w:val="17"/>
+          <w:szCs w:val="17"/>
+        </w:rPr>
+        <w:t>);</w:t>
       </w:r>
     </w:p>
     <w:p>
@@ -15081,6 +15601,7 @@
         <w:t xml:space="preserve">18. </w:t>
       </w:r>
       <w:proofErr w:type="spellStart"/>
+      <w:proofErr w:type="gramStart"/>
       <w:r>
         <w:rPr>
           <w:rFonts w:ascii="Consolas" w:hAnsi="Consolas" w:cs="Courier New"/>
@@ -15109,6 +15630,7 @@
         <w:t>AddTransient</w:t>
       </w:r>
       <w:proofErr w:type="spellEnd"/>
+      <w:proofErr w:type="gramEnd"/>
       <w:r>
         <w:rPr>
           <w:rFonts w:ascii="Consolas" w:hAnsi="Consolas" w:cs="Courier New"/>
@@ -15158,14 +15680,25 @@
         <w:t>BookManagementService</w:t>
       </w:r>
       <w:proofErr w:type="spellEnd"/>
-      <w:r>
-        <w:rPr>
-          <w:rFonts w:ascii="Consolas" w:hAnsi="Consolas" w:cs="Courier New"/>
-          <w:color w:val="666600"/>
-          <w:sz w:val="17"/>
-          <w:szCs w:val="17"/>
-        </w:rPr>
-        <w:t>&gt;();</w:t>
+      <w:proofErr w:type="gramStart"/>
+      <w:r>
+        <w:rPr>
+          <w:rFonts w:ascii="Consolas" w:hAnsi="Consolas" w:cs="Courier New"/>
+          <w:color w:val="666600"/>
+          <w:sz w:val="17"/>
+          <w:szCs w:val="17"/>
+        </w:rPr>
+        <w:t>&gt;(</w:t>
+      </w:r>
+      <w:proofErr w:type="gramEnd"/>
+      <w:r>
+        <w:rPr>
+          <w:rFonts w:ascii="Consolas" w:hAnsi="Consolas" w:cs="Courier New"/>
+          <w:color w:val="666600"/>
+          <w:sz w:val="17"/>
+          <w:szCs w:val="17"/>
+        </w:rPr>
+        <w:t>);</w:t>
       </w:r>
     </w:p>
     <w:p>
@@ -15212,6 +15745,7 @@
         <w:t xml:space="preserve">19. </w:t>
       </w:r>
       <w:proofErr w:type="spellStart"/>
+      <w:proofErr w:type="gramStart"/>
       <w:r>
         <w:rPr>
           <w:rFonts w:ascii="Consolas" w:hAnsi="Consolas" w:cs="Courier New"/>
@@ -15240,6 +15774,7 @@
         <w:t>AddTransient</w:t>
       </w:r>
       <w:proofErr w:type="spellEnd"/>
+      <w:proofErr w:type="gramEnd"/>
       <w:r>
         <w:rPr>
           <w:rFonts w:ascii="Consolas" w:hAnsi="Consolas" w:cs="Courier New"/>
@@ -15289,14 +15824,25 @@
         <w:t>LoanManagementService</w:t>
       </w:r>
       <w:proofErr w:type="spellEnd"/>
-      <w:r>
-        <w:rPr>
-          <w:rFonts w:ascii="Consolas" w:hAnsi="Consolas" w:cs="Courier New"/>
-          <w:color w:val="666600"/>
-          <w:sz w:val="17"/>
-          <w:szCs w:val="17"/>
-        </w:rPr>
-        <w:t>&gt;();</w:t>
+      <w:proofErr w:type="gramStart"/>
+      <w:r>
+        <w:rPr>
+          <w:rFonts w:ascii="Consolas" w:hAnsi="Consolas" w:cs="Courier New"/>
+          <w:color w:val="666600"/>
+          <w:sz w:val="17"/>
+          <w:szCs w:val="17"/>
+        </w:rPr>
+        <w:t>&gt;(</w:t>
+      </w:r>
+      <w:proofErr w:type="gramEnd"/>
+      <w:r>
+        <w:rPr>
+          <w:rFonts w:ascii="Consolas" w:hAnsi="Consolas" w:cs="Courier New"/>
+          <w:color w:val="666600"/>
+          <w:sz w:val="17"/>
+          <w:szCs w:val="17"/>
+        </w:rPr>
+        <w:t>);</w:t>
       </w:r>
     </w:p>
     <w:p>
@@ -15343,6 +15889,7 @@
         <w:t xml:space="preserve">20. </w:t>
       </w:r>
       <w:proofErr w:type="spellStart"/>
+      <w:proofErr w:type="gramStart"/>
       <w:r>
         <w:rPr>
           <w:rFonts w:ascii="Consolas" w:hAnsi="Consolas" w:cs="Courier New"/>
@@ -15371,6 +15918,7 @@
         <w:t>AddTransient</w:t>
       </w:r>
       <w:proofErr w:type="spellEnd"/>
+      <w:proofErr w:type="gramEnd"/>
       <w:r>
         <w:rPr>
           <w:rFonts w:ascii="Consolas" w:hAnsi="Consolas" w:cs="Courier New"/>
@@ -15420,14 +15968,25 @@
         <w:t>UserManagementService</w:t>
       </w:r>
       <w:proofErr w:type="spellEnd"/>
-      <w:r>
-        <w:rPr>
-          <w:rFonts w:ascii="Consolas" w:hAnsi="Consolas" w:cs="Courier New"/>
-          <w:color w:val="666600"/>
-          <w:sz w:val="17"/>
-          <w:szCs w:val="17"/>
-        </w:rPr>
-        <w:t>&gt;();</w:t>
+      <w:proofErr w:type="gramStart"/>
+      <w:r>
+        <w:rPr>
+          <w:rFonts w:ascii="Consolas" w:hAnsi="Consolas" w:cs="Courier New"/>
+          <w:color w:val="666600"/>
+          <w:sz w:val="17"/>
+          <w:szCs w:val="17"/>
+        </w:rPr>
+        <w:t>&gt;(</w:t>
+      </w:r>
+      <w:proofErr w:type="gramEnd"/>
+      <w:r>
+        <w:rPr>
+          <w:rFonts w:ascii="Consolas" w:hAnsi="Consolas" w:cs="Courier New"/>
+          <w:color w:val="666600"/>
+          <w:sz w:val="17"/>
+          <w:szCs w:val="17"/>
+        </w:rPr>
+        <w:t>);</w:t>
       </w:r>
     </w:p>
     <w:p>
@@ -15580,6 +16139,7 @@
         <w:t xml:space="preserve">23. </w:t>
       </w:r>
       <w:proofErr w:type="spellStart"/>
+      <w:proofErr w:type="gramStart"/>
       <w:r>
         <w:rPr>
           <w:rFonts w:ascii="Consolas" w:hAnsi="Consolas" w:cs="Courier New"/>
@@ -15608,6 +16168,7 @@
         <w:t>AddTransient</w:t>
       </w:r>
       <w:proofErr w:type="spellEnd"/>
+      <w:proofErr w:type="gramEnd"/>
       <w:r>
         <w:rPr>
           <w:rFonts w:ascii="Consolas" w:hAnsi="Consolas" w:cs="Courier New"/>
@@ -15628,14 +16189,25 @@
         <w:t>MainMenu</w:t>
       </w:r>
       <w:proofErr w:type="spellEnd"/>
-      <w:r>
-        <w:rPr>
-          <w:rFonts w:ascii="Consolas" w:hAnsi="Consolas" w:cs="Courier New"/>
-          <w:color w:val="666600"/>
-          <w:sz w:val="17"/>
-          <w:szCs w:val="17"/>
-        </w:rPr>
-        <w:t>&gt;();</w:t>
+      <w:proofErr w:type="gramStart"/>
+      <w:r>
+        <w:rPr>
+          <w:rFonts w:ascii="Consolas" w:hAnsi="Consolas" w:cs="Courier New"/>
+          <w:color w:val="666600"/>
+          <w:sz w:val="17"/>
+          <w:szCs w:val="17"/>
+        </w:rPr>
+        <w:t>&gt;(</w:t>
+      </w:r>
+      <w:proofErr w:type="gramEnd"/>
+      <w:r>
+        <w:rPr>
+          <w:rFonts w:ascii="Consolas" w:hAnsi="Consolas" w:cs="Courier New"/>
+          <w:color w:val="666600"/>
+          <w:sz w:val="17"/>
+          <w:szCs w:val="17"/>
+        </w:rPr>
+        <w:t>);</w:t>
       </w:r>
     </w:p>
     <w:p>
@@ -15771,6 +16343,7 @@
         <w:t xml:space="preserve"> </w:t>
       </w:r>
       <w:proofErr w:type="spellStart"/>
+      <w:proofErr w:type="gramStart"/>
       <w:r>
         <w:rPr>
           <w:rFonts w:ascii="Consolas" w:hAnsi="Consolas" w:cs="Courier New"/>
@@ -15799,6 +16372,7 @@
         <w:t>BuildServiceProvider</w:t>
       </w:r>
       <w:proofErr w:type="spellEnd"/>
+      <w:proofErr w:type="gramEnd"/>
       <w:r>
         <w:rPr>
           <w:rFonts w:ascii="Consolas" w:hAnsi="Consolas" w:cs="Courier New"/>
@@ -16015,6 +16589,7 @@
         <w:t xml:space="preserve"> </w:t>
       </w:r>
       <w:proofErr w:type="spellStart"/>
+      <w:proofErr w:type="gramStart"/>
       <w:r>
         <w:rPr>
           <w:rFonts w:ascii="Consolas" w:hAnsi="Consolas" w:cs="Courier New"/>
@@ -16043,6 +16618,7 @@
         <w:t>GetRequiredService</w:t>
       </w:r>
       <w:proofErr w:type="spellEnd"/>
+      <w:proofErr w:type="gramEnd"/>
       <w:r>
         <w:rPr>
           <w:rFonts w:ascii="Consolas" w:hAnsi="Consolas" w:cs="Courier New"/>
@@ -16063,14 +16639,25 @@
         <w:t>MainMenu</w:t>
       </w:r>
       <w:proofErr w:type="spellEnd"/>
-      <w:r>
-        <w:rPr>
-          <w:rFonts w:ascii="Consolas" w:hAnsi="Consolas" w:cs="Courier New"/>
-          <w:color w:val="666600"/>
-          <w:sz w:val="17"/>
-          <w:szCs w:val="17"/>
-        </w:rPr>
-        <w:t>&gt;();</w:t>
+      <w:proofErr w:type="gramStart"/>
+      <w:r>
+        <w:rPr>
+          <w:rFonts w:ascii="Consolas" w:hAnsi="Consolas" w:cs="Courier New"/>
+          <w:color w:val="666600"/>
+          <w:sz w:val="17"/>
+          <w:szCs w:val="17"/>
+        </w:rPr>
+        <w:t>&gt;(</w:t>
+      </w:r>
+      <w:proofErr w:type="gramEnd"/>
+      <w:r>
+        <w:rPr>
+          <w:rFonts w:ascii="Consolas" w:hAnsi="Consolas" w:cs="Courier New"/>
+          <w:color w:val="666600"/>
+          <w:sz w:val="17"/>
+          <w:szCs w:val="17"/>
+        </w:rPr>
+        <w:t>);</w:t>
       </w:r>
     </w:p>
     <w:p>
@@ -19825,12 +20412,14 @@
               <w:rPr>
                 <w:sz w:val="28"/>
                 <w:szCs w:val="28"/>
+                <w:u w:val="single"/>
               </w:rPr>
             </w:pPr>
             <w:r>
               <w:rPr>
                 <w:sz w:val="28"/>
                 <w:szCs w:val="28"/>
+                <w:u w:val="single"/>
               </w:rPr>
               <w:t>View available books</w:t>
             </w:r>
@@ -19838,6 +20427,7 @@
               <w:rPr>
                 <w:sz w:val="28"/>
                 <w:szCs w:val="28"/>
+                <w:u w:val="single"/>
               </w:rPr>
               <w:t>/authors/ etc.</w:t>
             </w:r>
@@ -19949,12 +20539,14 @@
               <w:rPr>
                 <w:sz w:val="28"/>
                 <w:szCs w:val="28"/>
+                <w:u w:val="single"/>
               </w:rPr>
             </w:pPr>
             <w:r>
               <w:rPr>
                 <w:sz w:val="28"/>
                 <w:szCs w:val="28"/>
+                <w:u w:val="single"/>
               </w:rPr>
               <w:t>Add book</w:t>
             </w:r>
@@ -20066,12 +20658,14 @@
               <w:rPr>
                 <w:sz w:val="28"/>
                 <w:szCs w:val="28"/>
+                <w:u w:val="single"/>
               </w:rPr>
             </w:pPr>
             <w:r>
               <w:rPr>
                 <w:sz w:val="28"/>
                 <w:szCs w:val="28"/>
+                <w:u w:val="single"/>
               </w:rPr>
               <w:t>Edit book</w:t>
             </w:r>
@@ -20183,12 +20777,14 @@
               <w:rPr>
                 <w:sz w:val="28"/>
                 <w:szCs w:val="28"/>
+                <w:u w:val="single"/>
               </w:rPr>
             </w:pPr>
             <w:r>
               <w:rPr>
                 <w:sz w:val="28"/>
                 <w:szCs w:val="28"/>
+                <w:u w:val="single"/>
               </w:rPr>
               <w:t>Remove book</w:t>
             </w:r>
@@ -20300,12 +20896,14 @@
               <w:rPr>
                 <w:sz w:val="28"/>
                 <w:szCs w:val="28"/>
+                <w:u w:val="single"/>
               </w:rPr>
             </w:pPr>
             <w:r>
               <w:rPr>
                 <w:sz w:val="28"/>
                 <w:szCs w:val="28"/>
+                <w:u w:val="single"/>
               </w:rPr>
               <w:t>Manage</w:t>
             </w:r>
@@ -20313,6 +20911,7 @@
               <w:rPr>
                 <w:sz w:val="28"/>
                 <w:szCs w:val="28"/>
+                <w:u w:val="single"/>
               </w:rPr>
               <w:t xml:space="preserve"> </w:t>
             </w:r>
@@ -20320,6 +20919,7 @@
               <w:rPr>
                 <w:sz w:val="28"/>
                 <w:szCs w:val="28"/>
+                <w:u w:val="single"/>
               </w:rPr>
               <w:t>author</w:t>
             </w:r>
@@ -20364,6 +20964,7 @@
             <w:r>
               <w:rPr>
                 <w:rFonts w:ascii="Segoe UI Emoji" w:hAnsi="Segoe UI Emoji" w:cs="Segoe UI Emoji"/>
+                <w:color w:val="7030A0"/>
                 <w:sz w:val="28"/>
                 <w:szCs w:val="28"/>
               </w:rPr>
@@ -20431,12 +21032,14 @@
               <w:rPr>
                 <w:sz w:val="28"/>
                 <w:szCs w:val="28"/>
+                <w:u w:val="single"/>
               </w:rPr>
             </w:pPr>
             <w:r>
               <w:rPr>
                 <w:sz w:val="28"/>
                 <w:szCs w:val="28"/>
+                <w:u w:val="single"/>
               </w:rPr>
               <w:t>Manage translator</w:t>
             </w:r>
@@ -20483,6 +21086,7 @@
             <w:r>
               <w:rPr>
                 <w:rFonts w:ascii="Segoe UI Emoji" w:hAnsi="Segoe UI Emoji" w:cs="Segoe UI Emoji"/>
+                <w:color w:val="7030A0"/>
                 <w:sz w:val="28"/>
                 <w:szCs w:val="28"/>
               </w:rPr>
@@ -20551,12 +21155,14 @@
               <w:rPr>
                 <w:sz w:val="28"/>
                 <w:szCs w:val="28"/>
+                <w:u w:val="single"/>
               </w:rPr>
             </w:pPr>
             <w:r>
               <w:rPr>
                 <w:sz w:val="28"/>
                 <w:szCs w:val="28"/>
+                <w:u w:val="single"/>
               </w:rPr>
               <w:t>Manage users</w:t>
             </w:r>
@@ -22076,15 +22682,31 @@
     </w:p>
     <w:p>
       <w:r>
-        <w:t xml:space="preserve">        if (!</w:t>
-      </w:r>
-      <w:proofErr w:type="spellStart"/>
-      <w:r>
-        <w:t>int.TryParse</w:t>
-      </w:r>
-      <w:proofErr w:type="spellEnd"/>
-      <w:r>
-        <w:t>(option, out var result)) continue;</w:t>
+        <w:t xml:space="preserve">        if </w:t>
+      </w:r>
+      <w:proofErr w:type="gramStart"/>
+      <w:r>
+        <w:t>(!</w:t>
+      </w:r>
+      <w:proofErr w:type="spellStart"/>
+      <w:r>
+        <w:t>int</w:t>
+      </w:r>
+      <w:proofErr w:type="gramEnd"/>
+      <w:r>
+        <w:t>.</w:t>
+      </w:r>
+      <w:proofErr w:type="gramStart"/>
+      <w:r>
+        <w:t>TryParse</w:t>
+      </w:r>
+      <w:proofErr w:type="spellEnd"/>
+      <w:r>
+        <w:t>(</w:t>
+      </w:r>
+      <w:proofErr w:type="gramEnd"/>
+      <w:r>
+        <w:t>option, out var result)) continue;</w:t>
       </w:r>
     </w:p>
     <w:p/>
@@ -22288,7 +22910,7 @@
     <w:p>
       <w:r>
         <w:pict w14:anchorId="0F28D481">
-          <v:rect id="_x0000_i1051" style="width:0;height:.75pt" o:hralign="center" o:hrstd="t" o:hr="t" fillcolor="#a0a0a0" stroked="f"/>
+          <v:rect id="_x0000_i1031" style="width:0;height:.75pt" o:hralign="center" o:hrstd="t" o:hr="t" fillcolor="#a0a0a0" stroked="f"/>
         </w:pict>
       </w:r>
     </w:p>
@@ -22356,6 +22978,7 @@
         <w:t xml:space="preserve">private static int </w:t>
       </w:r>
       <w:proofErr w:type="spellStart"/>
+      <w:proofErr w:type="gramStart"/>
       <w:r>
         <w:t>AuthorMenuList</w:t>
       </w:r>
@@ -22364,6 +22987,7 @@
         <w:t>(</w:t>
       </w:r>
       <w:proofErr w:type="spellStart"/>
+      <w:proofErr w:type="gramEnd"/>
       <w:r>
         <w:t>AuthenticationService</w:t>
       </w:r>
@@ -22573,10 +23197,12 @@
         <w:t xml:space="preserve">        if (</w:t>
       </w:r>
       <w:proofErr w:type="spellStart"/>
+      <w:proofErr w:type="gramStart"/>
       <w:r>
         <w:t>int.TryParse</w:t>
       </w:r>
       <w:proofErr w:type="spellEnd"/>
+      <w:proofErr w:type="gramEnd"/>
       <w:r>
         <w:t>(option, out var result))</w:t>
       </w:r>
@@ -22606,15 +23232,28 @@
     </w:p>
     <w:p>
       <w:r>
-        <w:t xml:space="preserve">            if (!</w:t>
+        <w:t xml:space="preserve">            if </w:t>
+      </w:r>
+      <w:proofErr w:type="gramStart"/>
+      <w:r>
+        <w:t>(!</w:t>
       </w:r>
       <w:proofErr w:type="spellStart"/>
       <w:r>
         <w:t>authService.HasRole</w:t>
       </w:r>
       <w:proofErr w:type="spellEnd"/>
-      <w:r>
-        <w:t>("Admin") &amp;&amp; result != 3 &amp;&amp; result &gt;= 1 &amp;&amp; result &lt;= 7) return result;</w:t>
+      <w:proofErr w:type="gramEnd"/>
+      <w:r>
+        <w:t xml:space="preserve">("Admin") &amp;&amp; </w:t>
+      </w:r>
+      <w:proofErr w:type="gramStart"/>
+      <w:r>
+        <w:t>result !</w:t>
+      </w:r>
+      <w:proofErr w:type="gramEnd"/>
+      <w:r>
+        <w:t>= 3 &amp;&amp; result &gt;= 1 &amp;&amp; result &lt;= 7) return result;</w:t>
       </w:r>
     </w:p>
     <w:p>
@@ -22657,7 +23296,7 @@
     <w:p>
       <w:r>
         <w:pict w14:anchorId="2C6D1BED">
-          <v:rect id="_x0000_i1052" style="width:0;height:.75pt" o:hralign="center" o:hrstd="t" o:hr="t" fillcolor="#a0a0a0" stroked="f"/>
+          <v:rect id="_x0000_i1032" style="width:0;height:.75pt" o:hralign="center" o:hrstd="t" o:hr="t" fillcolor="#a0a0a0" stroked="f"/>
         </w:pict>
       </w:r>
     </w:p>
@@ -22766,12 +23405,17 @@
         <w:t xml:space="preserve">&gt; </w:t>
       </w:r>
       <w:proofErr w:type="spellStart"/>
+      <w:proofErr w:type="gramStart"/>
       <w:r>
         <w:t>RemoveBook</w:t>
       </w:r>
       <w:proofErr w:type="spellEnd"/>
       <w:r>
-        <w:t xml:space="preserve">(int </w:t>
+        <w:t>(</w:t>
+      </w:r>
+      <w:proofErr w:type="gramEnd"/>
+      <w:r>
+        <w:t xml:space="preserve">int </w:t>
       </w:r>
       <w:proofErr w:type="spellStart"/>
       <w:r>
@@ -22839,9 +23483,14 @@
       </w:r>
       <w:proofErr w:type="spellEnd"/>
       <w:r>
-        <w:t xml:space="preserve"> is null || !</w:t>
-      </w:r>
-      <w:proofErr w:type="spellStart"/>
+        <w:t xml:space="preserve"> is null |</w:t>
+      </w:r>
+      <w:proofErr w:type="gramStart"/>
+      <w:r>
+        <w:t>| !</w:t>
+      </w:r>
+      <w:proofErr w:type="spellStart"/>
+      <w:proofErr w:type="gramEnd"/>
       <w:r>
         <w:t>currentUser.IsInRole</w:t>
       </w:r>
@@ -22910,7 +23559,15 @@
     </w:p>
     <w:p>
       <w:r>
-        <w:t xml:space="preserve">public bool IsInRole(string </w:t>
+        <w:t xml:space="preserve">public bool </w:t>
+      </w:r>
+      <w:proofErr w:type="gramStart"/>
+      <w:r>
+        <w:t>IsInRole(</w:t>
+      </w:r>
+      <w:proofErr w:type="gramEnd"/>
+      <w:r>
+        <w:t xml:space="preserve">string </w:t>
       </w:r>
       <w:proofErr w:type="spellStart"/>
       <w:r>
@@ -22947,10 +23604,12 @@
         <w:t xml:space="preserve"> =&gt; </w:t>
       </w:r>
       <w:proofErr w:type="spellStart"/>
+      <w:proofErr w:type="gramStart"/>
       <w:r>
         <w:t>ur.Role.Name</w:t>
       </w:r>
       <w:proofErr w:type="spellEnd"/>
+      <w:proofErr w:type="gramEnd"/>
       <w:r>
         <w:t xml:space="preserve"> == </w:t>
       </w:r>
@@ -22971,7 +23630,7 @@
     <w:p>
       <w:r>
         <w:pict w14:anchorId="70D51C60">
-          <v:rect id="_x0000_i1053" style="width:0;height:.75pt" o:hralign="center" o:hrstd="t" o:hr="t" fillcolor="#a0a0a0" stroked="f"/>
+          <v:rect id="_x0000_i1033" style="width:0;height:.75pt" o:hralign="center" o:hrstd="t" o:hr="t" fillcolor="#a0a0a0" stroked="f"/>
         </w:pict>
       </w:r>
     </w:p>
@@ -22992,7 +23651,15 @@
     </w:p>
     <w:p>
       <w:r>
-        <w:t>When a Member logs in, they should only see their own data.</w:t>
+        <w:t xml:space="preserve">When a </w:t>
+      </w:r>
+      <w:proofErr w:type="gramStart"/>
+      <w:r>
+        <w:t>Member</w:t>
+      </w:r>
+      <w:proofErr w:type="gramEnd"/>
+      <w:r>
+        <w:t xml:space="preserve"> logs in, they should only see their own data.</w:t>
       </w:r>
     </w:p>
     <w:p>
@@ -23028,6 +23695,7 @@
         <w:t xml:space="preserve">private static void </w:t>
       </w:r>
       <w:proofErr w:type="spellStart"/>
+      <w:proofErr w:type="gramStart"/>
       <w:r>
         <w:t>ViewUserLoans</w:t>
       </w:r>
@@ -23036,6 +23704,7 @@
         <w:t>(</w:t>
       </w:r>
       <w:proofErr w:type="spellStart"/>
+      <w:proofErr w:type="gramEnd"/>
       <w:r>
         <w:t>AuthenticationService</w:t>
       </w:r>
@@ -23110,7 +23779,15 @@
     <w:p/>
     <w:p>
       <w:r>
-        <w:t xml:space="preserve">    // If the user is a Member, they can only view their own loans</w:t>
+        <w:t xml:space="preserve">    // If the user is a </w:t>
+      </w:r>
+      <w:proofErr w:type="gramStart"/>
+      <w:r>
+        <w:t>Member</w:t>
+      </w:r>
+      <w:proofErr w:type="gramEnd"/>
+      <w:r>
+        <w:t>, they can only view their own loans</w:t>
       </w:r>
     </w:p>
     <w:p>
@@ -23123,9 +23800,14 @@
       </w:r>
       <w:proofErr w:type="spellEnd"/>
       <w:r>
-        <w:t>("Member") &amp;&amp; !</w:t>
-      </w:r>
-      <w:proofErr w:type="spellStart"/>
+        <w:t>("Member") &amp;</w:t>
+      </w:r>
+      <w:proofErr w:type="gramStart"/>
+      <w:r>
+        <w:t>&amp; !</w:t>
+      </w:r>
+      <w:proofErr w:type="spellStart"/>
+      <w:proofErr w:type="gramEnd"/>
       <w:r>
         <w:t>authService.HasAnyRole</w:t>
       </w:r>
@@ -26066,6 +26748,7 @@
   <w:style w:type="character" w:default="1" w:styleId="DefaultParagraphFont">
     <w:name w:val="Default Paragraph Font"/>
     <w:uiPriority w:val="1"/>
+    <w:semiHidden/>
     <w:unhideWhenUsed/>
   </w:style>
   <w:style w:type="table" w:default="1" w:styleId="TableNormal">

</xml_diff>

<commit_message>
Fix Fine files based on authentication
</commit_message>
<xml_diff>
--- a/Optimization.docx
+++ b/Optimization.docx
@@ -21275,12 +21275,14 @@
               <w:rPr>
                 <w:sz w:val="28"/>
                 <w:szCs w:val="28"/>
+                <w:u w:val="single"/>
               </w:rPr>
             </w:pPr>
             <w:r>
               <w:rPr>
                 <w:sz w:val="28"/>
                 <w:szCs w:val="28"/>
+                <w:u w:val="single"/>
               </w:rPr>
               <w:t>Borrow book</w:t>
             </w:r>
@@ -21392,12 +21394,14 @@
               <w:rPr>
                 <w:sz w:val="28"/>
                 <w:szCs w:val="28"/>
+                <w:u w:val="single"/>
               </w:rPr>
             </w:pPr>
             <w:r>
               <w:rPr>
                 <w:sz w:val="28"/>
                 <w:szCs w:val="28"/>
+                <w:u w:val="single"/>
               </w:rPr>
               <w:t>Return book</w:t>
             </w:r>
@@ -21509,12 +21513,14 @@
               <w:rPr>
                 <w:sz w:val="28"/>
                 <w:szCs w:val="28"/>
+                <w:u w:val="single"/>
               </w:rPr>
             </w:pPr>
             <w:r>
               <w:rPr>
                 <w:sz w:val="28"/>
                 <w:szCs w:val="28"/>
+                <w:u w:val="single"/>
               </w:rPr>
               <w:t>Renew loan</w:t>
             </w:r>
@@ -21626,12 +21632,14 @@
               <w:rPr>
                 <w:sz w:val="28"/>
                 <w:szCs w:val="28"/>
+                <w:u w:val="single"/>
               </w:rPr>
             </w:pPr>
             <w:r>
               <w:rPr>
                 <w:sz w:val="28"/>
                 <w:szCs w:val="28"/>
+                <w:u w:val="single"/>
               </w:rPr>
               <w:t>View own loans</w:t>
             </w:r>
@@ -21743,12 +21751,14 @@
               <w:rPr>
                 <w:sz w:val="28"/>
                 <w:szCs w:val="28"/>
+                <w:u w:val="single"/>
               </w:rPr>
             </w:pPr>
             <w:r>
               <w:rPr>
                 <w:sz w:val="28"/>
                 <w:szCs w:val="28"/>
+                <w:u w:val="single"/>
               </w:rPr>
               <w:t>View all loans</w:t>
             </w:r>
@@ -21860,12 +21870,14 @@
               <w:rPr>
                 <w:sz w:val="28"/>
                 <w:szCs w:val="28"/>
+                <w:u w:val="single"/>
               </w:rPr>
             </w:pPr>
             <w:r>
               <w:rPr>
                 <w:sz w:val="28"/>
                 <w:szCs w:val="28"/>
+                <w:u w:val="single"/>
               </w:rPr>
               <w:t>View own fines</w:t>
             </w:r>
@@ -21978,12 +21990,14 @@
               <w:rPr>
                 <w:sz w:val="28"/>
                 <w:szCs w:val="28"/>
+                <w:u w:val="single"/>
               </w:rPr>
             </w:pPr>
             <w:r>
               <w:rPr>
                 <w:sz w:val="28"/>
                 <w:szCs w:val="28"/>
+                <w:u w:val="single"/>
               </w:rPr>
               <w:t>Pay own fine</w:t>
             </w:r>
@@ -22095,12 +22109,14 @@
               <w:rPr>
                 <w:sz w:val="28"/>
                 <w:szCs w:val="28"/>
+                <w:u w:val="single"/>
               </w:rPr>
             </w:pPr>
             <w:r>
               <w:rPr>
                 <w:sz w:val="28"/>
                 <w:szCs w:val="28"/>
+                <w:u w:val="single"/>
               </w:rPr>
               <w:t>Waive fine</w:t>
             </w:r>

</xml_diff>